<commit_message>
Fix v2 data: phase vocabulary, safetyNotes keys, schemaVersion, bio_1_4 removed
- Normalize framework[].phase to 5-value controlled vocabulary
  (1,445 occurrences across 42 files; DQB Update/Closure/Completion
  variants collapsed to canonical DQB Creation per teacher-authorized
  NGSS phase set)
- Fix safetyNotes key corruption (quoted-key form '"safety<N>otes"' to '"safetyNotes"', 95 occurrences across 39 files)
- Add missing top-level schemaVersion '1.0.0' (38 files, via existing backfill_contract.js)
- Remove obsolete bio_1_4 (pre-v2 Chemicals of Life); canonical is bio_1_2
- Fix internal Sub-Strand 1.4 to 1.2 in bio_1_2 (1 occurrence)
- Regenerate all 126 docx + 42 JSON exports from corrected source data
- Confirmed: summaryTablePrompt.explained present in all phys_3_4 and phys_4_2 lessons (partner's report finding #4 already resolved)

Resolves contract checker findings (ARES-v2-data-issues).
</commit_message>
<xml_diff>
--- a/data/outputs/v2/Biology/SS1.1_Cell_Structure/Biology_Cell_Structure_CBE_LessonSequence.docx
+++ b/data/outputs/v2/Biology/SS1.1_Cell_Structure/Biology_Cell_Structure_CBE_LessonSequence.docx
@@ -3085,7 +3085,25 @@
             </w:tcMar>
             <w:vAlign w:val="top"/>
           </w:tcPr>
-          <w:p/>
+          <w:p>
+            <w:pPr>
+              <w:spacing w:after="40" w:before="0"/>
+              <w:jc w:val="left"/>
+            </w:pPr>
+            <w:r>
+              <w:rPr>
+                <w:rFonts w:ascii="Arial" w:cs="Arial" w:eastAsia="Arial" w:hAnsi="Arial"/>
+                <w:b w:val="false"/>
+                <w:bCs w:val="false"/>
+                <w:i w:val="false"/>
+                <w:iCs w:val="false"/>
+                <w:color w:val="000000"/>
+                <w:sz w:val="18"/>
+                <w:szCs w:val="18"/>
+              </w:rPr>
+              <w:t xml:space="preserve">No hazardous materials are used in this lesson. If a teacher uses a real photograph of a wound, ensure images are not graphic or distressing. Remind learners that anyone who feels uncomfortable viewing injury images may look away and the teacher will describe the image verbally instead.</w:t>
+            </w:r>
+          </w:p>
         </w:tc>
       </w:tr>
     </w:tbl>
@@ -3459,7 +3477,7 @@
             <w:pPr>
               <w:spacing w:after="20" w:before="0"/>
             </w:pPr>
-            <w:hyperlink w:history="1" r:id="rIdqkt4sjfptvj3eq82wvxlw">
+            <w:hyperlink w:history="1" r:id="rIddp8imfnep_txdbo2_5jbt">
               <w:r>
                 <w:rPr>
                   <w:rFonts w:ascii="Arial" w:cs="Arial" w:eastAsia="Arial" w:hAnsi="Arial"/>
@@ -3492,7 +3510,7 @@
               <w:spacing w:after="10" w:before="0"/>
               <w:ind w:left="120"/>
             </w:pPr>
-            <w:hyperlink w:history="1" r:id="rIdzfpswdshduitavwulqje4">
+            <w:hyperlink w:history="1" r:id="rIdmcvksnhdy1e59cywn_ehl">
               <w:r>
                 <w:rPr>
                   <w:rFonts w:ascii="Arial" w:cs="Arial" w:eastAsia="Arial" w:hAnsi="Arial"/>
@@ -3537,7 +3555,7 @@
             <w:pPr>
               <w:spacing w:after="20" w:before="0"/>
             </w:pPr>
-            <w:hyperlink w:history="1" r:id="rId9jgmww9nz1nef3gwzzmqn">
+            <w:hyperlink w:history="1" r:id="rIdw1pb-bw-appsshqfhlhod">
               <w:r>
                 <w:rPr>
                   <w:rFonts w:ascii="Arial" w:cs="Arial" w:eastAsia="Arial" w:hAnsi="Arial"/>
@@ -3570,7 +3588,7 @@
               <w:spacing w:after="10" w:before="0"/>
               <w:ind w:left="120"/>
             </w:pPr>
-            <w:hyperlink w:history="1" r:id="rId-qecuekph2iey8jw8s86k">
+            <w:hyperlink w:history="1" r:id="rIdgvqb8mcgrwyo3a_c0bv2t">
               <w:r>
                 <w:rPr>
                   <w:rFonts w:ascii="Arial" w:cs="Arial" w:eastAsia="Arial" w:hAnsi="Arial"/>
@@ -3765,7 +3783,7 @@
             <w:pPr>
               <w:spacing w:after="20" w:before="0"/>
             </w:pPr>
-            <w:hyperlink w:history="1" r:id="rIdmrkixogiswcmrozccz0jv">
+            <w:hyperlink w:history="1" r:id="rId94gji-53xbczwnzszi_ct">
               <w:r>
                 <w:rPr>
                   <w:rFonts w:ascii="Arial" w:cs="Arial" w:eastAsia="Arial" w:hAnsi="Arial"/>
@@ -3798,7 +3816,7 @@
               <w:spacing w:after="10" w:before="0"/>
               <w:ind w:left="120"/>
             </w:pPr>
-            <w:hyperlink w:history="1" r:id="rIdieliojxao3ncqci_bbdch">
+            <w:hyperlink w:history="1" r:id="rIdjo29bsnmcmzmpno6ynspx">
               <w:r>
                 <w:rPr>
                   <w:rFonts w:ascii="Arial" w:cs="Arial" w:eastAsia="Arial" w:hAnsi="Arial"/>
@@ -3843,7 +3861,7 @@
             <w:pPr>
               <w:spacing w:after="20" w:before="0"/>
             </w:pPr>
-            <w:hyperlink w:history="1" r:id="rIdkxm28foed9nogczvrl74e">
+            <w:hyperlink w:history="1" r:id="rIdbop9uc1zvnwujj4tyw7qg">
               <w:r>
                 <w:rPr>
                   <w:rFonts w:ascii="Arial" w:cs="Arial" w:eastAsia="Arial" w:hAnsi="Arial"/>
@@ -3876,7 +3894,7 @@
               <w:spacing w:after="10" w:before="0"/>
               <w:ind w:left="120"/>
             </w:pPr>
-            <w:hyperlink w:history="1" r:id="rIdo9av9xrb8_2jqvsp-fnhd">
+            <w:hyperlink w:history="1" r:id="rIdyxd5f6t1fs_1wagymuvd9">
               <w:r>
                 <w:rPr>
                   <w:rFonts w:ascii="Arial" w:cs="Arial" w:eastAsia="Arial" w:hAnsi="Arial"/>
@@ -4071,7 +4089,7 @@
             <w:pPr>
               <w:spacing w:after="20" w:before="0"/>
             </w:pPr>
-            <w:hyperlink w:history="1" r:id="rIdm9etjktxlgelfa9avtxft">
+            <w:hyperlink w:history="1" r:id="rIdbigzxvfxep-occoo4fzv0">
               <w:r>
                 <w:rPr>
                   <w:rFonts w:ascii="Arial" w:cs="Arial" w:eastAsia="Arial" w:hAnsi="Arial"/>
@@ -4104,7 +4122,7 @@
               <w:spacing w:after="10" w:before="0"/>
               <w:ind w:left="120"/>
             </w:pPr>
-            <w:hyperlink w:history="1" r:id="rIdclomg84saoeuz9p8_v80d">
+            <w:hyperlink w:history="1" r:id="rIdm_jxqq6h4grl5ynmhv94q">
               <w:r>
                 <w:rPr>
                   <w:rFonts w:ascii="Arial" w:cs="Arial" w:eastAsia="Arial" w:hAnsi="Arial"/>
@@ -4149,7 +4167,7 @@
             <w:pPr>
               <w:spacing w:after="20" w:before="0"/>
             </w:pPr>
-            <w:hyperlink w:history="1" r:id="rIdpumdcrhovjqisvuhjfkda">
+            <w:hyperlink w:history="1" r:id="rIdsx5v33qbophlj4zoiuvyd">
               <w:r>
                 <w:rPr>
                   <w:rFonts w:ascii="Arial" w:cs="Arial" w:eastAsia="Arial" w:hAnsi="Arial"/>
@@ -4182,7 +4200,7 @@
               <w:spacing w:after="10" w:before="0"/>
               <w:ind w:left="120"/>
             </w:pPr>
-            <w:hyperlink w:history="1" r:id="rIdttycxyaiodx5hsr0jmkf9">
+            <w:hyperlink w:history="1" r:id="rIdnr1orudewrbgctggd4hrm">
               <w:r>
                 <w:rPr>
                   <w:rFonts w:ascii="Arial" w:cs="Arial" w:eastAsia="Arial" w:hAnsi="Arial"/>
@@ -4377,7 +4395,7 @@
             <w:pPr>
               <w:spacing w:after="20" w:before="0"/>
             </w:pPr>
-            <w:hyperlink w:history="1" r:id="rId_rmjbgsow5lypzkfcnd4l">
+            <w:hyperlink w:history="1" r:id="rIdy_bhil0ei30nvthh7zohj">
               <w:r>
                 <w:rPr>
                   <w:rFonts w:ascii="Arial" w:cs="Arial" w:eastAsia="Arial" w:hAnsi="Arial"/>
@@ -4410,7 +4428,7 @@
               <w:spacing w:after="10" w:before="0"/>
               <w:ind w:left="120"/>
             </w:pPr>
-            <w:hyperlink w:history="1" r:id="rIdbpsd4or2zjtu_mpts6fzw">
+            <w:hyperlink w:history="1" r:id="rIdusghysfrylitvwctj0a2q">
               <w:r>
                 <w:rPr>
                   <w:rFonts w:ascii="Arial" w:cs="Arial" w:eastAsia="Arial" w:hAnsi="Arial"/>
@@ -4455,7 +4473,7 @@
             <w:pPr>
               <w:spacing w:after="20" w:before="0"/>
             </w:pPr>
-            <w:hyperlink w:history="1" r:id="rIdeoofzmip2e_yacbzxfopg">
+            <w:hyperlink w:history="1" r:id="rIdl05v7zl4lzepk5fn-6g41">
               <w:r>
                 <w:rPr>
                   <w:rFonts w:ascii="Arial" w:cs="Arial" w:eastAsia="Arial" w:hAnsi="Arial"/>
@@ -4488,7 +4506,7 @@
               <w:spacing w:after="10" w:before="0"/>
               <w:ind w:left="120"/>
             </w:pPr>
-            <w:hyperlink w:history="1" r:id="rId1igtwiokmvhu11joothv1">
+            <w:hyperlink w:history="1" r:id="rIdxih_ug-yl3yxyssmzviq2">
               <w:r>
                 <w:rPr>
                   <w:rFonts w:ascii="Arial" w:cs="Arial" w:eastAsia="Arial" w:hAnsi="Arial"/>
@@ -4683,7 +4701,7 @@
             <w:pPr>
               <w:spacing w:after="20" w:before="0"/>
             </w:pPr>
-            <w:hyperlink w:history="1" r:id="rIdjkb2fvwzwhwx8sk0zn-kl">
+            <w:hyperlink w:history="1" r:id="rId2grdwrrdejf5hw0sm-rh2">
               <w:r>
                 <w:rPr>
                   <w:rFonts w:ascii="Arial" w:cs="Arial" w:eastAsia="Arial" w:hAnsi="Arial"/>
@@ -4716,7 +4734,7 @@
               <w:spacing w:after="10" w:before="0"/>
               <w:ind w:left="120"/>
             </w:pPr>
-            <w:hyperlink w:history="1" r:id="rIdhlupzm42vdslfjnxpycnu">
+            <w:hyperlink w:history="1" r:id="rIdbsb7l06b_clnvg-o2l3ta">
               <w:r>
                 <w:rPr>
                   <w:rFonts w:ascii="Arial" w:cs="Arial" w:eastAsia="Arial" w:hAnsi="Arial"/>
@@ -4761,7 +4779,7 @@
             <w:pPr>
               <w:spacing w:after="20" w:before="0"/>
             </w:pPr>
-            <w:hyperlink w:history="1" r:id="rIdwo1vsoq0si86rt3ggj7js">
+            <w:hyperlink w:history="1" r:id="rId3gmdlhfjiygwnuevsweli">
               <w:r>
                 <w:rPr>
                   <w:rFonts w:ascii="Arial" w:cs="Arial" w:eastAsia="Arial" w:hAnsi="Arial"/>
@@ -4794,7 +4812,7 @@
               <w:spacing w:after="10" w:before="0"/>
               <w:ind w:left="120"/>
             </w:pPr>
-            <w:hyperlink w:history="1" r:id="rIduj3aeg9k1cbsjyvtqcybu">
+            <w:hyperlink w:history="1" r:id="rId8vhwi1_n_mggxng01ouzb">
               <w:r>
                 <w:rPr>
                   <w:rFonts w:ascii="Arial" w:cs="Arial" w:eastAsia="Arial" w:hAnsi="Arial"/>
@@ -6233,32 +6251,32 @@
         <w:tc>
           <w:tcPr>
             <w:tcW w:type="dxa" w:w="1520"/>
-            <w:shd w:fill="F2F2F2" w:color="auto" w:val="clear"/>
-            <w:tcMar>
-              <w:top w:type="dxa" w:w="60"/>
-              <w:left w:type="dxa" w:w="120"/>
-              <w:bottom w:type="dxa" w:w="60"/>
-              <w:right w:type="dxa" w:w="120"/>
-            </w:tcMar>
-            <w:vAlign w:val="top"/>
-          </w:tcPr>
-          <w:p>
-            <w:pPr>
-              <w:spacing w:after="40" w:before="0"/>
-              <w:jc w:val="left"/>
-            </w:pPr>
-            <w:r>
-              <w:rPr>
-                <w:rFonts w:ascii="Arial" w:cs="Arial" w:eastAsia="Arial" w:hAnsi="Arial"/>
-                <w:b/>
-                <w:bCs/>
-                <w:i w:val="false"/>
-                <w:iCs w:val="false"/>
-                <w:color w:val="000000"/>
-                <w:sz w:val="18"/>
-                <w:szCs w:val="18"/>
-              </w:rPr>
-              <w:t xml:space="preserve">1 — PREDICT</w:t>
+            <w:shd w:fill="EAD1F5" w:color="auto" w:val="clear"/>
+            <w:tcMar>
+              <w:top w:type="dxa" w:w="60"/>
+              <w:left w:type="dxa" w:w="120"/>
+              <w:bottom w:type="dxa" w:w="60"/>
+              <w:right w:type="dxa" w:w="120"/>
+            </w:tcMar>
+            <w:vAlign w:val="top"/>
+          </w:tcPr>
+          <w:p>
+            <w:pPr>
+              <w:spacing w:after="40" w:before="0"/>
+              <w:jc w:val="left"/>
+            </w:pPr>
+            <w:r>
+              <w:rPr>
+                <w:rFonts w:ascii="Arial" w:cs="Arial" w:eastAsia="Arial" w:hAnsi="Arial"/>
+                <w:b/>
+                <w:bCs/>
+                <w:i w:val="false"/>
+                <w:iCs w:val="false"/>
+                <w:color w:val="000000"/>
+                <w:sz w:val="18"/>
+                <w:szCs w:val="18"/>
+              </w:rPr>
+              <w:t xml:space="preserve">Predict Phase</w:t>
             </w:r>
           </w:p>
           <w:p>
@@ -6281,7 +6299,7 @@
             <w:pPr>
               <w:spacing w:after="20" w:before="0"/>
             </w:pPr>
-            <w:hyperlink w:history="1" r:id="rIda2ncoh8s29uj-tub5j3rl">
+            <w:hyperlink w:history="1" r:id="rIdaw8wt423yk6ey3ozsqfyr">
               <w:r>
                 <w:rPr>
                   <w:rFonts w:ascii="Arial" w:cs="Arial" w:eastAsia="Arial" w:hAnsi="Arial"/>
@@ -6314,7 +6332,7 @@
               <w:spacing w:after="10" w:before="0"/>
               <w:ind w:left="120"/>
             </w:pPr>
-            <w:hyperlink w:history="1" r:id="rId6o-wvl_oop38teogb5xfd">
+            <w:hyperlink w:history="1" r:id="rIdieclf7525uqnigjwvem3t">
               <w:r>
                 <w:rPr>
                   <w:rFonts w:ascii="Arial" w:cs="Arial" w:eastAsia="Arial" w:hAnsi="Arial"/>
@@ -6359,7 +6377,7 @@
             <w:pPr>
               <w:spacing w:after="20" w:before="0"/>
             </w:pPr>
-            <w:hyperlink w:history="1" r:id="rId95w-trvosokh-txu9qxnj">
+            <w:hyperlink w:history="1" r:id="rIdb8e20djznt5bz8uwcozoc">
               <w:r>
                 <w:rPr>
                   <w:rFonts w:ascii="Arial" w:cs="Arial" w:eastAsia="Arial" w:hAnsi="Arial"/>
@@ -6392,7 +6410,7 @@
               <w:spacing w:after="10" w:before="0"/>
               <w:ind w:left="120"/>
             </w:pPr>
-            <w:hyperlink w:history="1" r:id="rId_yhsggczp3wduenuw69rt">
+            <w:hyperlink w:history="1" r:id="rIdpfvyjyvagz_osbgdjheek">
               <w:r>
                 <w:rPr>
                   <w:rFonts w:ascii="Arial" w:cs="Arial" w:eastAsia="Arial" w:hAnsi="Arial"/>
@@ -6539,32 +6557,32 @@
         <w:tc>
           <w:tcPr>
             <w:tcW w:type="dxa" w:w="1520"/>
-            <w:shd w:fill="F2F2F2" w:color="auto" w:val="clear"/>
-            <w:tcMar>
-              <w:top w:type="dxa" w:w="60"/>
-              <w:left w:type="dxa" w:w="120"/>
-              <w:bottom w:type="dxa" w:w="60"/>
-              <w:right w:type="dxa" w:w="120"/>
-            </w:tcMar>
-            <w:vAlign w:val="top"/>
-          </w:tcPr>
-          <w:p>
-            <w:pPr>
-              <w:spacing w:after="40" w:before="0"/>
-              <w:jc w:val="left"/>
-            </w:pPr>
-            <w:r>
-              <w:rPr>
-                <w:rFonts w:ascii="Arial" w:cs="Arial" w:eastAsia="Arial" w:hAnsi="Arial"/>
-                <w:b/>
-                <w:bCs/>
-                <w:i w:val="false"/>
-                <w:iCs w:val="false"/>
-                <w:color w:val="000000"/>
-                <w:sz w:val="18"/>
-                <w:szCs w:val="18"/>
-              </w:rPr>
-              <w:t xml:space="preserve">2 — OBSERVE</w:t>
+            <w:shd w:fill="D9EEF1" w:color="auto" w:val="clear"/>
+            <w:tcMar>
+              <w:top w:type="dxa" w:w="60"/>
+              <w:left w:type="dxa" w:w="120"/>
+              <w:bottom w:type="dxa" w:w="60"/>
+              <w:right w:type="dxa" w:w="120"/>
+            </w:tcMar>
+            <w:vAlign w:val="top"/>
+          </w:tcPr>
+          <w:p>
+            <w:pPr>
+              <w:spacing w:after="40" w:before="0"/>
+              <w:jc w:val="left"/>
+            </w:pPr>
+            <w:r>
+              <w:rPr>
+                <w:rFonts w:ascii="Arial" w:cs="Arial" w:eastAsia="Arial" w:hAnsi="Arial"/>
+                <w:b/>
+                <w:bCs/>
+                <w:i w:val="false"/>
+                <w:iCs w:val="false"/>
+                <w:color w:val="000000"/>
+                <w:sz w:val="18"/>
+                <w:szCs w:val="18"/>
+              </w:rPr>
+              <w:t xml:space="preserve">Observe Phase</w:t>
             </w:r>
           </w:p>
           <w:p>
@@ -6587,7 +6605,7 @@
             <w:pPr>
               <w:spacing w:after="20" w:before="0"/>
             </w:pPr>
-            <w:hyperlink w:history="1" r:id="rIdhvqw2crj3v9r5zhlkjhh5">
+            <w:hyperlink w:history="1" r:id="rId_ebevwxxfzs4vnhgls4gc">
               <w:r>
                 <w:rPr>
                   <w:rFonts w:ascii="Arial" w:cs="Arial" w:eastAsia="Arial" w:hAnsi="Arial"/>
@@ -6620,7 +6638,7 @@
               <w:spacing w:after="10" w:before="0"/>
               <w:ind w:left="120"/>
             </w:pPr>
-            <w:hyperlink w:history="1" r:id="rIdrm5runjiytq8hpi0d651j">
+            <w:hyperlink w:history="1" r:id="rId_ebkneteddeov4yzmhrxs">
               <w:r>
                 <w:rPr>
                   <w:rFonts w:ascii="Arial" w:cs="Arial" w:eastAsia="Arial" w:hAnsi="Arial"/>
@@ -6665,7 +6683,7 @@
             <w:pPr>
               <w:spacing w:after="20" w:before="0"/>
             </w:pPr>
-            <w:hyperlink w:history="1" r:id="rIdgtskrerkytyjtoiira4ga">
+            <w:hyperlink w:history="1" r:id="rIdmdhcv7upf47gf4u6ezycb">
               <w:r>
                 <w:rPr>
                   <w:rFonts w:ascii="Arial" w:cs="Arial" w:eastAsia="Arial" w:hAnsi="Arial"/>
@@ -6698,7 +6716,7 @@
               <w:spacing w:after="10" w:before="0"/>
               <w:ind w:left="120"/>
             </w:pPr>
-            <w:hyperlink w:history="1" r:id="rIdfaqbieskf9tpgkt-_pcb-">
+            <w:hyperlink w:history="1" r:id="rIdsiylrzip308-4kqlh0p8u">
               <w:r>
                 <w:rPr>
                   <w:rFonts w:ascii="Arial" w:cs="Arial" w:eastAsia="Arial" w:hAnsi="Arial"/>
@@ -6845,32 +6863,32 @@
         <w:tc>
           <w:tcPr>
             <w:tcW w:type="dxa" w:w="1520"/>
-            <w:shd w:fill="F2F2F2" w:color="auto" w:val="clear"/>
-            <w:tcMar>
-              <w:top w:type="dxa" w:w="60"/>
-              <w:left w:type="dxa" w:w="120"/>
-              <w:bottom w:type="dxa" w:w="60"/>
-              <w:right w:type="dxa" w:w="120"/>
-            </w:tcMar>
-            <w:vAlign w:val="top"/>
-          </w:tcPr>
-          <w:p>
-            <w:pPr>
-              <w:spacing w:after="40" w:before="0"/>
-              <w:jc w:val="left"/>
-            </w:pPr>
-            <w:r>
-              <w:rPr>
-                <w:rFonts w:ascii="Arial" w:cs="Arial" w:eastAsia="Arial" w:hAnsi="Arial"/>
-                <w:b/>
-                <w:bCs/>
-                <w:i w:val="false"/>
-                <w:iCs w:val="false"/>
-                <w:color w:val="000000"/>
-                <w:sz w:val="18"/>
-                <w:szCs w:val="18"/>
-              </w:rPr>
-              <w:t xml:space="preserve">3 — EXPLAIN</w:t>
+            <w:shd w:fill="E2EFDA" w:color="auto" w:val="clear"/>
+            <w:tcMar>
+              <w:top w:type="dxa" w:w="60"/>
+              <w:left w:type="dxa" w:w="120"/>
+              <w:bottom w:type="dxa" w:w="60"/>
+              <w:right w:type="dxa" w:w="120"/>
+            </w:tcMar>
+            <w:vAlign w:val="top"/>
+          </w:tcPr>
+          <w:p>
+            <w:pPr>
+              <w:spacing w:after="40" w:before="0"/>
+              <w:jc w:val="left"/>
+            </w:pPr>
+            <w:r>
+              <w:rPr>
+                <w:rFonts w:ascii="Arial" w:cs="Arial" w:eastAsia="Arial" w:hAnsi="Arial"/>
+                <w:b/>
+                <w:bCs/>
+                <w:i w:val="false"/>
+                <w:iCs w:val="false"/>
+                <w:color w:val="000000"/>
+                <w:sz w:val="18"/>
+                <w:szCs w:val="18"/>
+              </w:rPr>
+              <w:t xml:space="preserve">Explain Phase</w:t>
             </w:r>
           </w:p>
           <w:p>
@@ -6893,7 +6911,7 @@
             <w:pPr>
               <w:spacing w:after="20" w:before="0"/>
             </w:pPr>
-            <w:hyperlink w:history="1" r:id="rIdwgiehwvjjtzuynb-oyu94">
+            <w:hyperlink w:history="1" r:id="rIdanu6uldn2sopaf354dgnh">
               <w:r>
                 <w:rPr>
                   <w:rFonts w:ascii="Arial" w:cs="Arial" w:eastAsia="Arial" w:hAnsi="Arial"/>
@@ -6926,7 +6944,7 @@
               <w:spacing w:after="10" w:before="0"/>
               <w:ind w:left="120"/>
             </w:pPr>
-            <w:hyperlink w:history="1" r:id="rIdfktzr_tbfax668bda8x0g">
+            <w:hyperlink w:history="1" r:id="rId95njhgjlmfucr-qzkbs97">
               <w:r>
                 <w:rPr>
                   <w:rFonts w:ascii="Arial" w:cs="Arial" w:eastAsia="Arial" w:hAnsi="Arial"/>
@@ -6971,7 +6989,7 @@
             <w:pPr>
               <w:spacing w:after="20" w:before="0"/>
             </w:pPr>
-            <w:hyperlink w:history="1" r:id="rId4j8fgvtzqlbflgmw9uoos">
+            <w:hyperlink w:history="1" r:id="rId2_tampgjgvwir5vjjqzl-">
               <w:r>
                 <w:rPr>
                   <w:rFonts w:ascii="Arial" w:cs="Arial" w:eastAsia="Arial" w:hAnsi="Arial"/>
@@ -7004,7 +7022,7 @@
               <w:spacing w:after="10" w:before="0"/>
               <w:ind w:left="120"/>
             </w:pPr>
-            <w:hyperlink w:history="1" r:id="rIdiw3miuon_z8ge2nnlkl6w">
+            <w:hyperlink w:history="1" r:id="rId8_xy121yiyal0suao0778">
               <w:r>
                 <w:rPr>
                   <w:rFonts w:ascii="Arial" w:cs="Arial" w:eastAsia="Arial" w:hAnsi="Arial"/>
@@ -7151,32 +7169,32 @@
         <w:tc>
           <w:tcPr>
             <w:tcW w:type="dxa" w:w="1520"/>
-            <w:shd w:fill="F2F2F2" w:color="auto" w:val="clear"/>
-            <w:tcMar>
-              <w:top w:type="dxa" w:w="60"/>
-              <w:left w:type="dxa" w:w="120"/>
-              <w:bottom w:type="dxa" w:w="60"/>
-              <w:right w:type="dxa" w:w="120"/>
-            </w:tcMar>
-            <w:vAlign w:val="top"/>
-          </w:tcPr>
-          <w:p>
-            <w:pPr>
-              <w:spacing w:after="40" w:before="0"/>
-              <w:jc w:val="left"/>
-            </w:pPr>
-            <w:r>
-              <w:rPr>
-                <w:rFonts w:ascii="Arial" w:cs="Arial" w:eastAsia="Arial" w:hAnsi="Arial"/>
-                <w:b/>
-                <w:bCs/>
-                <w:i w:val="false"/>
-                <w:iCs w:val="false"/>
-                <w:color w:val="000000"/>
-                <w:sz w:val="18"/>
-                <w:szCs w:val="18"/>
-              </w:rPr>
-              <w:t xml:space="preserve">4 — DRIVING QUESTION BOARD (DQB) UPDATE</w:t>
+            <w:shd w:fill="FCE4D6" w:color="auto" w:val="clear"/>
+            <w:tcMar>
+              <w:top w:type="dxa" w:w="60"/>
+              <w:left w:type="dxa" w:w="120"/>
+              <w:bottom w:type="dxa" w:w="60"/>
+              <w:right w:type="dxa" w:w="120"/>
+            </w:tcMar>
+            <w:vAlign w:val="top"/>
+          </w:tcPr>
+          <w:p>
+            <w:pPr>
+              <w:spacing w:after="40" w:before="0"/>
+              <w:jc w:val="left"/>
+            </w:pPr>
+            <w:r>
+              <w:rPr>
+                <w:rFonts w:ascii="Arial" w:cs="Arial" w:eastAsia="Arial" w:hAnsi="Arial"/>
+                <w:b/>
+                <w:bCs/>
+                <w:i w:val="false"/>
+                <w:iCs w:val="false"/>
+                <w:color w:val="000000"/>
+                <w:sz w:val="18"/>
+                <w:szCs w:val="18"/>
+              </w:rPr>
+              <w:t xml:space="preserve">Driving Question Board (DQB) Creation</w:t>
             </w:r>
           </w:p>
           <w:p>
@@ -7199,7 +7217,7 @@
             <w:pPr>
               <w:spacing w:after="20" w:before="0"/>
             </w:pPr>
-            <w:hyperlink w:history="1" r:id="rIdqoyvk0zfmvflge4vxgrzm">
+            <w:hyperlink w:history="1" r:id="rIdi1pfojkphs8rzig5pahav">
               <w:r>
                 <w:rPr>
                   <w:rFonts w:ascii="Arial" w:cs="Arial" w:eastAsia="Arial" w:hAnsi="Arial"/>
@@ -7232,7 +7250,7 @@
               <w:spacing w:after="10" w:before="0"/>
               <w:ind w:left="120"/>
             </w:pPr>
-            <w:hyperlink w:history="1" r:id="rIdlmfbppnkolsrixrtsxps5">
+            <w:hyperlink w:history="1" r:id="rIdfu71eqo29-jcnxzcn9mjx">
               <w:r>
                 <w:rPr>
                   <w:rFonts w:ascii="Arial" w:cs="Arial" w:eastAsia="Arial" w:hAnsi="Arial"/>
@@ -7277,7 +7295,7 @@
             <w:pPr>
               <w:spacing w:after="20" w:before="0"/>
             </w:pPr>
-            <w:hyperlink w:history="1" r:id="rIdq-fpegadpqb-dozixnis-">
+            <w:hyperlink w:history="1" r:id="rIderv1d-wxcc8_bbpbueeui">
               <w:r>
                 <w:rPr>
                   <w:rFonts w:ascii="Arial" w:cs="Arial" w:eastAsia="Arial" w:hAnsi="Arial"/>
@@ -7310,7 +7328,7 @@
               <w:spacing w:after="10" w:before="0"/>
               <w:ind w:left="120"/>
             </w:pPr>
-            <w:hyperlink w:history="1" r:id="rIde8yr9c4mglcy2z9tg4qyq">
+            <w:hyperlink w:history="1" r:id="rIdawnzk7-rytodx3j9uxb8r">
               <w:r>
                 <w:rPr>
                   <w:rFonts w:ascii="Arial" w:cs="Arial" w:eastAsia="Arial" w:hAnsi="Arial"/>
@@ -7457,32 +7475,32 @@
         <w:tc>
           <w:tcPr>
             <w:tcW w:type="dxa" w:w="1520"/>
-            <w:shd w:fill="F2F2F2" w:color="auto" w:val="clear"/>
-            <w:tcMar>
-              <w:top w:type="dxa" w:w="60"/>
-              <w:left w:type="dxa" w:w="120"/>
-              <w:bottom w:type="dxa" w:w="60"/>
-              <w:right w:type="dxa" w:w="120"/>
-            </w:tcMar>
-            <w:vAlign w:val="top"/>
-          </w:tcPr>
-          <w:p>
-            <w:pPr>
-              <w:spacing w:after="40" w:before="0"/>
-              <w:jc w:val="left"/>
-            </w:pPr>
-            <w:r>
-              <w:rPr>
-                <w:rFonts w:ascii="Arial" w:cs="Arial" w:eastAsia="Arial" w:hAnsi="Arial"/>
-                <w:b/>
-                <w:bCs/>
-                <w:i w:val="false"/>
-                <w:iCs w:val="false"/>
-                <w:color w:val="000000"/>
-                <w:sz w:val="18"/>
-                <w:szCs w:val="18"/>
-              </w:rPr>
-              <w:t xml:space="preserve">5 — MODEL BUILDING</w:t>
+            <w:shd w:fill="D5E8F0" w:color="auto" w:val="clear"/>
+            <w:tcMar>
+              <w:top w:type="dxa" w:w="60"/>
+              <w:left w:type="dxa" w:w="120"/>
+              <w:bottom w:type="dxa" w:w="60"/>
+              <w:right w:type="dxa" w:w="120"/>
+            </w:tcMar>
+            <w:vAlign w:val="top"/>
+          </w:tcPr>
+          <w:p>
+            <w:pPr>
+              <w:spacing w:after="40" w:before="0"/>
+              <w:jc w:val="left"/>
+            </w:pPr>
+            <w:r>
+              <w:rPr>
+                <w:rFonts w:ascii="Arial" w:cs="Arial" w:eastAsia="Arial" w:hAnsi="Arial"/>
+                <w:b/>
+                <w:bCs/>
+                <w:i w:val="false"/>
+                <w:iCs w:val="false"/>
+                <w:color w:val="000000"/>
+                <w:sz w:val="18"/>
+                <w:szCs w:val="18"/>
+              </w:rPr>
+              <w:t xml:space="preserve">Model Building Phase</w:t>
             </w:r>
           </w:p>
           <w:p>
@@ -7505,7 +7523,7 @@
             <w:pPr>
               <w:spacing w:after="20" w:before="0"/>
             </w:pPr>
-            <w:hyperlink w:history="1" r:id="rId4ls9-zxx_5zn4xjynr0cu">
+            <w:hyperlink w:history="1" r:id="rIdtlbocusdycuhe4nbkuoxg">
               <w:r>
                 <w:rPr>
                   <w:rFonts w:ascii="Arial" w:cs="Arial" w:eastAsia="Arial" w:hAnsi="Arial"/>
@@ -7538,7 +7556,7 @@
               <w:spacing w:after="10" w:before="0"/>
               <w:ind w:left="120"/>
             </w:pPr>
-            <w:hyperlink w:history="1" r:id="rIdo_jqk-oev1jlxao3bqcfq">
+            <w:hyperlink w:history="1" r:id="rIdyjpj7ejjqwbywvxfiycq_">
               <w:r>
                 <w:rPr>
                   <w:rFonts w:ascii="Arial" w:cs="Arial" w:eastAsia="Arial" w:hAnsi="Arial"/>
@@ -7583,7 +7601,7 @@
             <w:pPr>
               <w:spacing w:after="20" w:before="0"/>
             </w:pPr>
-            <w:hyperlink w:history="1" r:id="rIdxe62vsn5opik58bppl-fy">
+            <w:hyperlink w:history="1" r:id="rIdxztrievl4jkx4hlppqyh1">
               <w:r>
                 <w:rPr>
                   <w:rFonts w:ascii="Arial" w:cs="Arial" w:eastAsia="Arial" w:hAnsi="Arial"/>
@@ -7616,7 +7634,7 @@
               <w:spacing w:after="10" w:before="0"/>
               <w:ind w:left="120"/>
             </w:pPr>
-            <w:hyperlink w:history="1" r:id="rIdakejhsivjvioevuj_5kf4">
+            <w:hyperlink w:history="1" r:id="rIdtcrl6affp9x_qbax46t3h">
               <w:r>
                 <w:rPr>
                   <w:rFonts w:ascii="Arial" w:cs="Arial" w:eastAsia="Arial" w:hAnsi="Arial"/>
@@ -8711,7 +8729,25 @@
             </w:tcMar>
             <w:vAlign w:val="top"/>
           </w:tcPr>
-          <w:p/>
+          <w:p>
+            <w:pPr>
+              <w:spacing w:after="40" w:before="0"/>
+              <w:jc w:val="left"/>
+            </w:pPr>
+            <w:r>
+              <w:rPr>
+                <w:rFonts w:ascii="Arial" w:cs="Arial" w:eastAsia="Arial" w:hAnsi="Arial"/>
+                <w:b w:val="false"/>
+                <w:bCs w:val="false"/>
+                <w:i w:val="false"/>
+                <w:iCs w:val="false"/>
+                <w:color w:val="000000"/>
+                <w:sz w:val="18"/>
+                <w:szCs w:val="18"/>
+              </w:rPr>
+              <w:t xml:space="preserve">No hazardous materials are used in this lesson. Diagrams and tables only. Remind learners that E. coli is used as a conceptual example; no live bacterial cultures are present. General classroom conduct rules apply.</w:t>
+            </w:r>
+          </w:p>
         </w:tc>
       </w:tr>
     </w:tbl>
@@ -9085,7 +9121,7 @@
             <w:pPr>
               <w:spacing w:after="20" w:before="0"/>
             </w:pPr>
-            <w:hyperlink w:history="1" r:id="rIdpuz6tybrlku27y3xamyv6">
+            <w:hyperlink w:history="1" r:id="rIdcj51-y6g_ymom8y9s5jtu">
               <w:r>
                 <w:rPr>
                   <w:rFonts w:ascii="Arial" w:cs="Arial" w:eastAsia="Arial" w:hAnsi="Arial"/>
@@ -9118,7 +9154,7 @@
               <w:spacing w:after="10" w:before="0"/>
               <w:ind w:left="120"/>
             </w:pPr>
-            <w:hyperlink w:history="1" r:id="rIdu-4gfgzwyls60flwo3-zc">
+            <w:hyperlink w:history="1" r:id="rIdpqq3d_wzwhnpgfp3mz0za">
               <w:r>
                 <w:rPr>
                   <w:rFonts w:ascii="Arial" w:cs="Arial" w:eastAsia="Arial" w:hAnsi="Arial"/>
@@ -9163,7 +9199,7 @@
             <w:pPr>
               <w:spacing w:after="20" w:before="0"/>
             </w:pPr>
-            <w:hyperlink w:history="1" r:id="rIdlheyztfll8krkedgiaayp">
+            <w:hyperlink w:history="1" r:id="rIdegefib4b-72dl2jrxeapv">
               <w:r>
                 <w:rPr>
                   <w:rFonts w:ascii="Arial" w:cs="Arial" w:eastAsia="Arial" w:hAnsi="Arial"/>
@@ -9196,7 +9232,7 @@
               <w:spacing w:after="10" w:before="0"/>
               <w:ind w:left="120"/>
             </w:pPr>
-            <w:hyperlink w:history="1" r:id="rIdbch1udiptnaszrtcfyago">
+            <w:hyperlink w:history="1" r:id="rIdjfhptqw_1qul-4fwhkmfb">
               <w:r>
                 <w:rPr>
                   <w:rFonts w:ascii="Arial" w:cs="Arial" w:eastAsia="Arial" w:hAnsi="Arial"/>
@@ -9391,7 +9427,7 @@
             <w:pPr>
               <w:spacing w:after="20" w:before="0"/>
             </w:pPr>
-            <w:hyperlink w:history="1" r:id="rIdmnwgmujufcnb5tnnh32sk">
+            <w:hyperlink w:history="1" r:id="rIdqzldpgop1dejnlldb91u_">
               <w:r>
                 <w:rPr>
                   <w:rFonts w:ascii="Arial" w:cs="Arial" w:eastAsia="Arial" w:hAnsi="Arial"/>
@@ -9424,7 +9460,7 @@
               <w:spacing w:after="10" w:before="0"/>
               <w:ind w:left="120"/>
             </w:pPr>
-            <w:hyperlink w:history="1" r:id="rIdjff7q1zdvesnbskkapr3q">
+            <w:hyperlink w:history="1" r:id="rIdvjna7su7c7-7ljmp5bddr">
               <w:r>
                 <w:rPr>
                   <w:rFonts w:ascii="Arial" w:cs="Arial" w:eastAsia="Arial" w:hAnsi="Arial"/>
@@ -9469,7 +9505,7 @@
             <w:pPr>
               <w:spacing w:after="20" w:before="0"/>
             </w:pPr>
-            <w:hyperlink w:history="1" r:id="rIdx51u7lucgzzbhctojanqk">
+            <w:hyperlink w:history="1" r:id="rIdppjzhnuq3-p6cbyznir8g">
               <w:r>
                 <w:rPr>
                   <w:rFonts w:ascii="Arial" w:cs="Arial" w:eastAsia="Arial" w:hAnsi="Arial"/>
@@ -9502,7 +9538,7 @@
               <w:spacing w:after="10" w:before="0"/>
               <w:ind w:left="120"/>
             </w:pPr>
-            <w:hyperlink w:history="1" r:id="rIdznvaz3tafh5jti8yozc9q">
+            <w:hyperlink w:history="1" r:id="rIdi8_9-kjvxbfhhuxoeprpm">
               <w:r>
                 <w:rPr>
                   <w:rFonts w:ascii="Arial" w:cs="Arial" w:eastAsia="Arial" w:hAnsi="Arial"/>
@@ -9697,7 +9733,7 @@
             <w:pPr>
               <w:spacing w:after="20" w:before="0"/>
             </w:pPr>
-            <w:hyperlink w:history="1" r:id="rIdwkxkmaeepgwthialdpihx">
+            <w:hyperlink w:history="1" r:id="rIdtvyz-cbuku8qdi1ly3wke">
               <w:r>
                 <w:rPr>
                   <w:rFonts w:ascii="Arial" w:cs="Arial" w:eastAsia="Arial" w:hAnsi="Arial"/>
@@ -9730,7 +9766,7 @@
               <w:spacing w:after="10" w:before="0"/>
               <w:ind w:left="120"/>
             </w:pPr>
-            <w:hyperlink w:history="1" r:id="rIdwsryyos8mwwsztjczr34x">
+            <w:hyperlink w:history="1" r:id="rId4e2d_v9v5ur6gaaxqtvth">
               <w:r>
                 <w:rPr>
                   <w:rFonts w:ascii="Arial" w:cs="Arial" w:eastAsia="Arial" w:hAnsi="Arial"/>
@@ -9775,7 +9811,7 @@
             <w:pPr>
               <w:spacing w:after="20" w:before="0"/>
             </w:pPr>
-            <w:hyperlink w:history="1" r:id="rId5rbnxnm2eyuc_28ojguox">
+            <w:hyperlink w:history="1" r:id="rIdcv28rxcbaqtsrnxzhivob">
               <w:r>
                 <w:rPr>
                   <w:rFonts w:ascii="Arial" w:cs="Arial" w:eastAsia="Arial" w:hAnsi="Arial"/>
@@ -9808,7 +9844,7 @@
               <w:spacing w:after="10" w:before="0"/>
               <w:ind w:left="120"/>
             </w:pPr>
-            <w:hyperlink w:history="1" r:id="rId-yxtu-1gtq1ojed7wg3fo">
+            <w:hyperlink w:history="1" r:id="rIdptuy_zcuhtfsdsnrs-qlm">
               <w:r>
                 <w:rPr>
                   <w:rFonts w:ascii="Arial" w:cs="Arial" w:eastAsia="Arial" w:hAnsi="Arial"/>
@@ -10003,7 +10039,7 @@
             <w:pPr>
               <w:spacing w:after="20" w:before="0"/>
             </w:pPr>
-            <w:hyperlink w:history="1" r:id="rIdc6agyjakmgphpdrel1gwg">
+            <w:hyperlink w:history="1" r:id="rIdhsw9mddbowlxkzny_ou8v">
               <w:r>
                 <w:rPr>
                   <w:rFonts w:ascii="Arial" w:cs="Arial" w:eastAsia="Arial" w:hAnsi="Arial"/>
@@ -10036,7 +10072,7 @@
               <w:spacing w:after="10" w:before="0"/>
               <w:ind w:left="120"/>
             </w:pPr>
-            <w:hyperlink w:history="1" r:id="rIdjp5bizyclnsxiikfltbei">
+            <w:hyperlink w:history="1" r:id="rIdwsfeuk9vfhf1d94w6wfgq">
               <w:r>
                 <w:rPr>
                   <w:rFonts w:ascii="Arial" w:cs="Arial" w:eastAsia="Arial" w:hAnsi="Arial"/>
@@ -10081,7 +10117,7 @@
             <w:pPr>
               <w:spacing w:after="20" w:before="0"/>
             </w:pPr>
-            <w:hyperlink w:history="1" r:id="rIdhrvbluizcfqtatvifioz5">
+            <w:hyperlink w:history="1" r:id="rId2bem13tej9_dpnbbrnvxw">
               <w:r>
                 <w:rPr>
                   <w:rFonts w:ascii="Arial" w:cs="Arial" w:eastAsia="Arial" w:hAnsi="Arial"/>
@@ -10114,7 +10150,7 @@
               <w:spacing w:after="10" w:before="0"/>
               <w:ind w:left="120"/>
             </w:pPr>
-            <w:hyperlink w:history="1" r:id="rId5bcsgevgejv79yeap1fqd">
+            <w:hyperlink w:history="1" r:id="rIdywbslcfcoaztwavdhvkob">
               <w:r>
                 <w:rPr>
                   <w:rFonts w:ascii="Arial" w:cs="Arial" w:eastAsia="Arial" w:hAnsi="Arial"/>
@@ -10309,7 +10345,7 @@
             <w:pPr>
               <w:spacing w:after="20" w:before="0"/>
             </w:pPr>
-            <w:hyperlink w:history="1" r:id="rId2m4igt45yt5ru05a5o9wo">
+            <w:hyperlink w:history="1" r:id="rIdfdeotyxj6vbz0rm8idm8_">
               <w:r>
                 <w:rPr>
                   <w:rFonts w:ascii="Arial" w:cs="Arial" w:eastAsia="Arial" w:hAnsi="Arial"/>
@@ -10342,7 +10378,7 @@
               <w:spacing w:after="10" w:before="0"/>
               <w:ind w:left="120"/>
             </w:pPr>
-            <w:hyperlink w:history="1" r:id="rIdolef6cv0hr5lxxhrpclzo">
+            <w:hyperlink w:history="1" r:id="rId7y9dfoqdn_lrppcfliw6h">
               <w:r>
                 <w:rPr>
                   <w:rFonts w:ascii="Arial" w:cs="Arial" w:eastAsia="Arial" w:hAnsi="Arial"/>
@@ -10387,7 +10423,7 @@
             <w:pPr>
               <w:spacing w:after="20" w:before="0"/>
             </w:pPr>
-            <w:hyperlink w:history="1" r:id="rId4juazwjsj_v4y0kp8merd">
+            <w:hyperlink w:history="1" r:id="rIdmiubsaca_swc2rjgn3ai8">
               <w:r>
                 <w:rPr>
                   <w:rFonts w:ascii="Arial" w:cs="Arial" w:eastAsia="Arial" w:hAnsi="Arial"/>
@@ -10420,7 +10456,7 @@
               <w:spacing w:after="10" w:before="0"/>
               <w:ind w:left="120"/>
             </w:pPr>
-            <w:hyperlink w:history="1" r:id="rIdit5g6r66qnttzu_0tsyzy">
+            <w:hyperlink w:history="1" r:id="rIdutx8rxhhpbyd-tuqz0gjl">
               <w:r>
                 <w:rPr>
                   <w:rFonts w:ascii="Arial" w:cs="Arial" w:eastAsia="Arial" w:hAnsi="Arial"/>
@@ -11859,32 +11895,32 @@
         <w:tc>
           <w:tcPr>
             <w:tcW w:type="dxa" w:w="1520"/>
-            <w:shd w:fill="F2F2F2" w:color="auto" w:val="clear"/>
-            <w:tcMar>
-              <w:top w:type="dxa" w:w="60"/>
-              <w:left w:type="dxa" w:w="120"/>
-              <w:bottom w:type="dxa" w:w="60"/>
-              <w:right w:type="dxa" w:w="120"/>
-            </w:tcMar>
-            <w:vAlign w:val="top"/>
-          </w:tcPr>
-          <w:p>
-            <w:pPr>
-              <w:spacing w:after="40" w:before="0"/>
-              <w:jc w:val="left"/>
-            </w:pPr>
-            <w:r>
-              <w:rPr>
-                <w:rFonts w:ascii="Arial" w:cs="Arial" w:eastAsia="Arial" w:hAnsi="Arial"/>
-                <w:b/>
-                <w:bCs/>
-                <w:i w:val="false"/>
-                <w:iCs w:val="false"/>
-                <w:color w:val="000000"/>
-                <w:sz w:val="18"/>
-                <w:szCs w:val="18"/>
-              </w:rPr>
-              <w:t xml:space="preserve">Phase 1 — Predict</w:t>
+            <w:shd w:fill="EAD1F5" w:color="auto" w:val="clear"/>
+            <w:tcMar>
+              <w:top w:type="dxa" w:w="60"/>
+              <w:left w:type="dxa" w:w="120"/>
+              <w:bottom w:type="dxa" w:w="60"/>
+              <w:right w:type="dxa" w:w="120"/>
+            </w:tcMar>
+            <w:vAlign w:val="top"/>
+          </w:tcPr>
+          <w:p>
+            <w:pPr>
+              <w:spacing w:after="40" w:before="0"/>
+              <w:jc w:val="left"/>
+            </w:pPr>
+            <w:r>
+              <w:rPr>
+                <w:rFonts w:ascii="Arial" w:cs="Arial" w:eastAsia="Arial" w:hAnsi="Arial"/>
+                <w:b/>
+                <w:bCs/>
+                <w:i w:val="false"/>
+                <w:iCs w:val="false"/>
+                <w:color w:val="000000"/>
+                <w:sz w:val="18"/>
+                <w:szCs w:val="18"/>
+              </w:rPr>
+              <w:t xml:space="preserve">Predict Phase</w:t>
             </w:r>
           </w:p>
           <w:p>
@@ -11907,7 +11943,7 @@
             <w:pPr>
               <w:spacing w:after="20" w:before="0"/>
             </w:pPr>
-            <w:hyperlink w:history="1" r:id="rIdxyzq9krxeqwlawxef1-sm">
+            <w:hyperlink w:history="1" r:id="rIdqejmfz_74qzdmtql_vw91">
               <w:r>
                 <w:rPr>
                   <w:rFonts w:ascii="Arial" w:cs="Arial" w:eastAsia="Arial" w:hAnsi="Arial"/>
@@ -11940,7 +11976,7 @@
               <w:spacing w:after="10" w:before="0"/>
               <w:ind w:left="120"/>
             </w:pPr>
-            <w:hyperlink w:history="1" r:id="rIdv9ozr95ep96edcwqxz97v">
+            <w:hyperlink w:history="1" r:id="rIdqo72qeugph1y9hsycg1zb">
               <w:r>
                 <w:rPr>
                   <w:rFonts w:ascii="Arial" w:cs="Arial" w:eastAsia="Arial" w:hAnsi="Arial"/>
@@ -11985,7 +12021,7 @@
             <w:pPr>
               <w:spacing w:after="20" w:before="0"/>
             </w:pPr>
-            <w:hyperlink w:history="1" r:id="rIdmibzyvykfjbsqsm95o6sd">
+            <w:hyperlink w:history="1" r:id="rIdbms9yw_qck8xkxesw3kvo">
               <w:r>
                 <w:rPr>
                   <w:rFonts w:ascii="Arial" w:cs="Arial" w:eastAsia="Arial" w:hAnsi="Arial"/>
@@ -12018,7 +12054,7 @@
               <w:spacing w:after="10" w:before="0"/>
               <w:ind w:left="120"/>
             </w:pPr>
-            <w:hyperlink w:history="1" r:id="rIdfffacg2-g9kig3ou0xqwx">
+            <w:hyperlink w:history="1" r:id="rIdn36rkcb0-l2pqlop3xniy">
               <w:r>
                 <w:rPr>
                   <w:rFonts w:ascii="Arial" w:cs="Arial" w:eastAsia="Arial" w:hAnsi="Arial"/>
@@ -12165,32 +12201,32 @@
         <w:tc>
           <w:tcPr>
             <w:tcW w:type="dxa" w:w="1520"/>
-            <w:shd w:fill="F2F2F2" w:color="auto" w:val="clear"/>
-            <w:tcMar>
-              <w:top w:type="dxa" w:w="60"/>
-              <w:left w:type="dxa" w:w="120"/>
-              <w:bottom w:type="dxa" w:w="60"/>
-              <w:right w:type="dxa" w:w="120"/>
-            </w:tcMar>
-            <w:vAlign w:val="top"/>
-          </w:tcPr>
-          <w:p>
-            <w:pPr>
-              <w:spacing w:after="40" w:before="0"/>
-              <w:jc w:val="left"/>
-            </w:pPr>
-            <w:r>
-              <w:rPr>
-                <w:rFonts w:ascii="Arial" w:cs="Arial" w:eastAsia="Arial" w:hAnsi="Arial"/>
-                <w:b/>
-                <w:bCs/>
-                <w:i w:val="false"/>
-                <w:iCs w:val="false"/>
-                <w:color w:val="000000"/>
-                <w:sz w:val="18"/>
-                <w:szCs w:val="18"/>
-              </w:rPr>
-              <w:t xml:space="preserve">Phase 2 — Observe</w:t>
+            <w:shd w:fill="D9EEF1" w:color="auto" w:val="clear"/>
+            <w:tcMar>
+              <w:top w:type="dxa" w:w="60"/>
+              <w:left w:type="dxa" w:w="120"/>
+              <w:bottom w:type="dxa" w:w="60"/>
+              <w:right w:type="dxa" w:w="120"/>
+            </w:tcMar>
+            <w:vAlign w:val="top"/>
+          </w:tcPr>
+          <w:p>
+            <w:pPr>
+              <w:spacing w:after="40" w:before="0"/>
+              <w:jc w:val="left"/>
+            </w:pPr>
+            <w:r>
+              <w:rPr>
+                <w:rFonts w:ascii="Arial" w:cs="Arial" w:eastAsia="Arial" w:hAnsi="Arial"/>
+                <w:b/>
+                <w:bCs/>
+                <w:i w:val="false"/>
+                <w:iCs w:val="false"/>
+                <w:color w:val="000000"/>
+                <w:sz w:val="18"/>
+                <w:szCs w:val="18"/>
+              </w:rPr>
+              <w:t xml:space="preserve">Observe Phase</w:t>
             </w:r>
           </w:p>
           <w:p>
@@ -12213,7 +12249,7 @@
             <w:pPr>
               <w:spacing w:after="20" w:before="0"/>
             </w:pPr>
-            <w:hyperlink w:history="1" r:id="rIdiais5rvoesnvf1c7mx5fu">
+            <w:hyperlink w:history="1" r:id="rIdchhfipyrdkeuw8_fegwbq">
               <w:r>
                 <w:rPr>
                   <w:rFonts w:ascii="Arial" w:cs="Arial" w:eastAsia="Arial" w:hAnsi="Arial"/>
@@ -12246,7 +12282,7 @@
               <w:spacing w:after="10" w:before="0"/>
               <w:ind w:left="120"/>
             </w:pPr>
-            <w:hyperlink w:history="1" r:id="rIdwyjup-dmcwv7qv4xbnhye">
+            <w:hyperlink w:history="1" r:id="rId8m9mjxcajl1jtns5yhorq">
               <w:r>
                 <w:rPr>
                   <w:rFonts w:ascii="Arial" w:cs="Arial" w:eastAsia="Arial" w:hAnsi="Arial"/>
@@ -12291,7 +12327,7 @@
             <w:pPr>
               <w:spacing w:after="20" w:before="0"/>
             </w:pPr>
-            <w:hyperlink w:history="1" r:id="rIdvagl0dlertbkncez8j54i">
+            <w:hyperlink w:history="1" r:id="rIdd7iitpaxp3shbc1vqva-l">
               <w:r>
                 <w:rPr>
                   <w:rFonts w:ascii="Arial" w:cs="Arial" w:eastAsia="Arial" w:hAnsi="Arial"/>
@@ -12324,7 +12360,7 @@
               <w:spacing w:after="10" w:before="0"/>
               <w:ind w:left="120"/>
             </w:pPr>
-            <w:hyperlink w:history="1" r:id="rId0_e_9fhivoi_dqdtseomv">
+            <w:hyperlink w:history="1" r:id="rIdswdn1b95kotxkxz-krp93">
               <w:r>
                 <w:rPr>
                   <w:rFonts w:ascii="Arial" w:cs="Arial" w:eastAsia="Arial" w:hAnsi="Arial"/>
@@ -12471,32 +12507,32 @@
         <w:tc>
           <w:tcPr>
             <w:tcW w:type="dxa" w:w="1520"/>
-            <w:shd w:fill="F2F2F2" w:color="auto" w:val="clear"/>
-            <w:tcMar>
-              <w:top w:type="dxa" w:w="60"/>
-              <w:left w:type="dxa" w:w="120"/>
-              <w:bottom w:type="dxa" w:w="60"/>
-              <w:right w:type="dxa" w:w="120"/>
-            </w:tcMar>
-            <w:vAlign w:val="top"/>
-          </w:tcPr>
-          <w:p>
-            <w:pPr>
-              <w:spacing w:after="40" w:before="0"/>
-              <w:jc w:val="left"/>
-            </w:pPr>
-            <w:r>
-              <w:rPr>
-                <w:rFonts w:ascii="Arial" w:cs="Arial" w:eastAsia="Arial" w:hAnsi="Arial"/>
-                <w:b/>
-                <w:bCs/>
-                <w:i w:val="false"/>
-                <w:iCs w:val="false"/>
-                <w:color w:val="000000"/>
-                <w:sz w:val="18"/>
-                <w:szCs w:val="18"/>
-              </w:rPr>
-              <w:t xml:space="preserve">Phase 3 — Explain</w:t>
+            <w:shd w:fill="E2EFDA" w:color="auto" w:val="clear"/>
+            <w:tcMar>
+              <w:top w:type="dxa" w:w="60"/>
+              <w:left w:type="dxa" w:w="120"/>
+              <w:bottom w:type="dxa" w:w="60"/>
+              <w:right w:type="dxa" w:w="120"/>
+            </w:tcMar>
+            <w:vAlign w:val="top"/>
+          </w:tcPr>
+          <w:p>
+            <w:pPr>
+              <w:spacing w:after="40" w:before="0"/>
+              <w:jc w:val="left"/>
+            </w:pPr>
+            <w:r>
+              <w:rPr>
+                <w:rFonts w:ascii="Arial" w:cs="Arial" w:eastAsia="Arial" w:hAnsi="Arial"/>
+                <w:b/>
+                <w:bCs/>
+                <w:i w:val="false"/>
+                <w:iCs w:val="false"/>
+                <w:color w:val="000000"/>
+                <w:sz w:val="18"/>
+                <w:szCs w:val="18"/>
+              </w:rPr>
+              <w:t xml:space="preserve">Explain Phase</w:t>
             </w:r>
           </w:p>
           <w:p>
@@ -12519,7 +12555,7 @@
             <w:pPr>
               <w:spacing w:after="20" w:before="0"/>
             </w:pPr>
-            <w:hyperlink w:history="1" r:id="rIdrw8vfedsndf9qnkdnaziq">
+            <w:hyperlink w:history="1" r:id="rIdjdzppknj82qvd9xmawfxi">
               <w:r>
                 <w:rPr>
                   <w:rFonts w:ascii="Arial" w:cs="Arial" w:eastAsia="Arial" w:hAnsi="Arial"/>
@@ -12552,7 +12588,7 @@
               <w:spacing w:after="10" w:before="0"/>
               <w:ind w:left="120"/>
             </w:pPr>
-            <w:hyperlink w:history="1" r:id="rIdtez6avfmot02tuxpa03ti">
+            <w:hyperlink w:history="1" r:id="rIdcljwosq_1sosfdapjz0gx">
               <w:r>
                 <w:rPr>
                   <w:rFonts w:ascii="Arial" w:cs="Arial" w:eastAsia="Arial" w:hAnsi="Arial"/>
@@ -12597,7 +12633,7 @@
             <w:pPr>
               <w:spacing w:after="20" w:before="0"/>
             </w:pPr>
-            <w:hyperlink w:history="1" r:id="rId849bpwcd-uph0p9gr81el">
+            <w:hyperlink w:history="1" r:id="rIdmyhwtskdoonym0w4ee0-0">
               <w:r>
                 <w:rPr>
                   <w:rFonts w:ascii="Arial" w:cs="Arial" w:eastAsia="Arial" w:hAnsi="Arial"/>
@@ -12630,7 +12666,7 @@
               <w:spacing w:after="10" w:before="0"/>
               <w:ind w:left="120"/>
             </w:pPr>
-            <w:hyperlink w:history="1" r:id="rIdmmnvi4zvpibxqe9h9uher">
+            <w:hyperlink w:history="1" r:id="rIdkmb1apo4bqe1kstotk-qy">
               <w:r>
                 <w:rPr>
                   <w:rFonts w:ascii="Arial" w:cs="Arial" w:eastAsia="Arial" w:hAnsi="Arial"/>
@@ -13166,32 +13202,32 @@
         <w:tc>
           <w:tcPr>
             <w:tcW w:type="dxa" w:w="1520"/>
-            <w:shd w:fill="F2F2F2" w:color="auto" w:val="clear"/>
-            <w:tcMar>
-              <w:top w:type="dxa" w:w="60"/>
-              <w:left w:type="dxa" w:w="120"/>
-              <w:bottom w:type="dxa" w:w="60"/>
-              <w:right w:type="dxa" w:w="120"/>
-            </w:tcMar>
-            <w:vAlign w:val="top"/>
-          </w:tcPr>
-          <w:p>
-            <w:pPr>
-              <w:spacing w:after="40" w:before="0"/>
-              <w:jc w:val="left"/>
-            </w:pPr>
-            <w:r>
-              <w:rPr>
-                <w:rFonts w:ascii="Arial" w:cs="Arial" w:eastAsia="Arial" w:hAnsi="Arial"/>
-                <w:b/>
-                <w:bCs/>
-                <w:i w:val="false"/>
-                <w:iCs w:val="false"/>
-                <w:color w:val="000000"/>
-                <w:sz w:val="18"/>
-                <w:szCs w:val="18"/>
-              </w:rPr>
-              <w:t xml:space="preserve">Phase 4 — Driving Question Board (DQB) Update</w:t>
+            <w:shd w:fill="FCE4D6" w:color="auto" w:val="clear"/>
+            <w:tcMar>
+              <w:top w:type="dxa" w:w="60"/>
+              <w:left w:type="dxa" w:w="120"/>
+              <w:bottom w:type="dxa" w:w="60"/>
+              <w:right w:type="dxa" w:w="120"/>
+            </w:tcMar>
+            <w:vAlign w:val="top"/>
+          </w:tcPr>
+          <w:p>
+            <w:pPr>
+              <w:spacing w:after="40" w:before="0"/>
+              <w:jc w:val="left"/>
+            </w:pPr>
+            <w:r>
+              <w:rPr>
+                <w:rFonts w:ascii="Arial" w:cs="Arial" w:eastAsia="Arial" w:hAnsi="Arial"/>
+                <w:b/>
+                <w:bCs/>
+                <w:i w:val="false"/>
+                <w:iCs w:val="false"/>
+                <w:color w:val="000000"/>
+                <w:sz w:val="18"/>
+                <w:szCs w:val="18"/>
+              </w:rPr>
+              <w:t xml:space="preserve">Driving Question Board (DQB) Creation</w:t>
             </w:r>
           </w:p>
           <w:p>
@@ -13214,7 +13250,7 @@
             <w:pPr>
               <w:spacing w:after="20" w:before="0"/>
             </w:pPr>
-            <w:hyperlink w:history="1" r:id="rIdywewa21s65kcdovqcrvkb">
+            <w:hyperlink w:history="1" r:id="rId8c0fnnlkqf9ucl7_ezoeg">
               <w:r>
                 <w:rPr>
                   <w:rFonts w:ascii="Arial" w:cs="Arial" w:eastAsia="Arial" w:hAnsi="Arial"/>
@@ -13247,7 +13283,7 @@
               <w:spacing w:after="10" w:before="0"/>
               <w:ind w:left="120"/>
             </w:pPr>
-            <w:hyperlink w:history="1" r:id="rIdwdqbrkbavsz81rpnrayti">
+            <w:hyperlink w:history="1" r:id="rIdmefgzrxcoptx9ispt1kh4">
               <w:r>
                 <w:rPr>
                   <w:rFonts w:ascii="Arial" w:cs="Arial" w:eastAsia="Arial" w:hAnsi="Arial"/>
@@ -13292,7 +13328,7 @@
             <w:pPr>
               <w:spacing w:after="20" w:before="0"/>
             </w:pPr>
-            <w:hyperlink w:history="1" r:id="rIdhksfamwusfurjdv97lqyo">
+            <w:hyperlink w:history="1" r:id="rIdqgwi850qhehagzfsh6apy">
               <w:r>
                 <w:rPr>
                   <w:rFonts w:ascii="Arial" w:cs="Arial" w:eastAsia="Arial" w:hAnsi="Arial"/>
@@ -13325,7 +13361,7 @@
               <w:spacing w:after="10" w:before="0"/>
               <w:ind w:left="120"/>
             </w:pPr>
-            <w:hyperlink w:history="1" r:id="rIdtmps3isylxloruykj-vns">
+            <w:hyperlink w:history="1" r:id="rIdrx_nk9rlwfgze1ljzlpby">
               <w:r>
                 <w:rPr>
                   <w:rFonts w:ascii="Arial" w:cs="Arial" w:eastAsia="Arial" w:hAnsi="Arial"/>
@@ -13472,32 +13508,32 @@
         <w:tc>
           <w:tcPr>
             <w:tcW w:type="dxa" w:w="1520"/>
-            <w:shd w:fill="F2F2F2" w:color="auto" w:val="clear"/>
-            <w:tcMar>
-              <w:top w:type="dxa" w:w="60"/>
-              <w:left w:type="dxa" w:w="120"/>
-              <w:bottom w:type="dxa" w:w="60"/>
-              <w:right w:type="dxa" w:w="120"/>
-            </w:tcMar>
-            <w:vAlign w:val="top"/>
-          </w:tcPr>
-          <w:p>
-            <w:pPr>
-              <w:spacing w:after="40" w:before="0"/>
-              <w:jc w:val="left"/>
-            </w:pPr>
-            <w:r>
-              <w:rPr>
-                <w:rFonts w:ascii="Arial" w:cs="Arial" w:eastAsia="Arial" w:hAnsi="Arial"/>
-                <w:b/>
-                <w:bCs/>
-                <w:i w:val="false"/>
-                <w:iCs w:val="false"/>
-                <w:color w:val="000000"/>
-                <w:sz w:val="18"/>
-                <w:szCs w:val="18"/>
-              </w:rPr>
-              <w:t xml:space="preserve">Phase 5 — Model Building</w:t>
+            <w:shd w:fill="D5E8F0" w:color="auto" w:val="clear"/>
+            <w:tcMar>
+              <w:top w:type="dxa" w:w="60"/>
+              <w:left w:type="dxa" w:w="120"/>
+              <w:bottom w:type="dxa" w:w="60"/>
+              <w:right w:type="dxa" w:w="120"/>
+            </w:tcMar>
+            <w:vAlign w:val="top"/>
+          </w:tcPr>
+          <w:p>
+            <w:pPr>
+              <w:spacing w:after="40" w:before="0"/>
+              <w:jc w:val="left"/>
+            </w:pPr>
+            <w:r>
+              <w:rPr>
+                <w:rFonts w:ascii="Arial" w:cs="Arial" w:eastAsia="Arial" w:hAnsi="Arial"/>
+                <w:b/>
+                <w:bCs/>
+                <w:i w:val="false"/>
+                <w:iCs w:val="false"/>
+                <w:color w:val="000000"/>
+                <w:sz w:val="18"/>
+                <w:szCs w:val="18"/>
+              </w:rPr>
+              <w:t xml:space="preserve">Model Building Phase</w:t>
             </w:r>
           </w:p>
           <w:p>
@@ -13520,7 +13556,7 @@
             <w:pPr>
               <w:spacing w:after="20" w:before="0"/>
             </w:pPr>
-            <w:hyperlink w:history="1" r:id="rIdgmf2eju2admpqzq-xjapu">
+            <w:hyperlink w:history="1" r:id="rIdhfrhsm7lik3au5cqm31uf">
               <w:r>
                 <w:rPr>
                   <w:rFonts w:ascii="Arial" w:cs="Arial" w:eastAsia="Arial" w:hAnsi="Arial"/>
@@ -13553,7 +13589,7 @@
               <w:spacing w:after="10" w:before="0"/>
               <w:ind w:left="120"/>
             </w:pPr>
-            <w:hyperlink w:history="1" r:id="rIdkvkrvlxqnwbufb0yt4_c5">
+            <w:hyperlink w:history="1" r:id="rIdcuhfnbtnhzybym9nslkrt">
               <w:r>
                 <w:rPr>
                   <w:rFonts w:ascii="Arial" w:cs="Arial" w:eastAsia="Arial" w:hAnsi="Arial"/>
@@ -13598,7 +13634,7 @@
             <w:pPr>
               <w:spacing w:after="20" w:before="0"/>
             </w:pPr>
-            <w:hyperlink w:history="1" r:id="rIdns2mvy0kcnn9gcpvhiqab">
+            <w:hyperlink w:history="1" r:id="rId8ydd0e614swvb1okztaoq">
               <w:r>
                 <w:rPr>
                   <w:rFonts w:ascii="Arial" w:cs="Arial" w:eastAsia="Arial" w:hAnsi="Arial"/>
@@ -13631,7 +13667,7 @@
               <w:spacing w:after="10" w:before="0"/>
               <w:ind w:left="120"/>
             </w:pPr>
-            <w:hyperlink w:history="1" r:id="rIdrcg3enzbaihnmmab9gbjg">
+            <w:hyperlink w:history="1" r:id="rIdzhezbw-i7f8vrr04sfm3m">
               <w:r>
                 <w:rPr>
                   <w:rFonts w:ascii="Arial" w:cs="Arial" w:eastAsia="Arial" w:hAnsi="Arial"/>
@@ -15070,32 +15106,32 @@
         <w:tc>
           <w:tcPr>
             <w:tcW w:type="dxa" w:w="1520"/>
-            <w:shd w:fill="F2F2F2" w:color="auto" w:val="clear"/>
-            <w:tcMar>
-              <w:top w:type="dxa" w:w="60"/>
-              <w:left w:type="dxa" w:w="120"/>
-              <w:bottom w:type="dxa" w:w="60"/>
-              <w:right w:type="dxa" w:w="120"/>
-            </w:tcMar>
-            <w:vAlign w:val="top"/>
-          </w:tcPr>
-          <w:p>
-            <w:pPr>
-              <w:spacing w:after="40" w:before="0"/>
-              <w:jc w:val="left"/>
-            </w:pPr>
-            <w:r>
-              <w:rPr>
-                <w:rFonts w:ascii="Arial" w:cs="Arial" w:eastAsia="Arial" w:hAnsi="Arial"/>
-                <w:b/>
-                <w:bCs/>
-                <w:i w:val="false"/>
-                <w:iCs w:val="false"/>
-                <w:color w:val="000000"/>
-                <w:sz w:val="18"/>
-                <w:szCs w:val="18"/>
-              </w:rPr>
-              <w:t xml:space="preserve">Phase 1 — Predict</w:t>
+            <w:shd w:fill="EAD1F5" w:color="auto" w:val="clear"/>
+            <w:tcMar>
+              <w:top w:type="dxa" w:w="60"/>
+              <w:left w:type="dxa" w:w="120"/>
+              <w:bottom w:type="dxa" w:w="60"/>
+              <w:right w:type="dxa" w:w="120"/>
+            </w:tcMar>
+            <w:vAlign w:val="top"/>
+          </w:tcPr>
+          <w:p>
+            <w:pPr>
+              <w:spacing w:after="40" w:before="0"/>
+              <w:jc w:val="left"/>
+            </w:pPr>
+            <w:r>
+              <w:rPr>
+                <w:rFonts w:ascii="Arial" w:cs="Arial" w:eastAsia="Arial" w:hAnsi="Arial"/>
+                <w:b/>
+                <w:bCs/>
+                <w:i w:val="false"/>
+                <w:iCs w:val="false"/>
+                <w:color w:val="000000"/>
+                <w:sz w:val="18"/>
+                <w:szCs w:val="18"/>
+              </w:rPr>
+              <w:t xml:space="preserve">Predict Phase</w:t>
             </w:r>
           </w:p>
           <w:p>
@@ -15118,7 +15154,7 @@
             <w:pPr>
               <w:spacing w:after="20" w:before="0"/>
             </w:pPr>
-            <w:hyperlink w:history="1" r:id="rIdzhu1lkdz-cawyviuuervg">
+            <w:hyperlink w:history="1" r:id="rId3qjnixrur_cw4ijljtw0n">
               <w:r>
                 <w:rPr>
                   <w:rFonts w:ascii="Arial" w:cs="Arial" w:eastAsia="Arial" w:hAnsi="Arial"/>
@@ -15151,7 +15187,7 @@
               <w:spacing w:after="10" w:before="0"/>
               <w:ind w:left="120"/>
             </w:pPr>
-            <w:hyperlink w:history="1" r:id="rIdpiy0v1svtk8wko1op44ii">
+            <w:hyperlink w:history="1" r:id="rId5t0kweanmaezg-gn--wp6">
               <w:r>
                 <w:rPr>
                   <w:rFonts w:ascii="Arial" w:cs="Arial" w:eastAsia="Arial" w:hAnsi="Arial"/>
@@ -15196,7 +15232,7 @@
             <w:pPr>
               <w:spacing w:after="20" w:before="0"/>
             </w:pPr>
-            <w:hyperlink w:history="1" r:id="rIdcvcdeawns0zu3bcwn3k_s">
+            <w:hyperlink w:history="1" r:id="rIdul2eciu0y8zer9nqldbax">
               <w:r>
                 <w:rPr>
                   <w:rFonts w:ascii="Arial" w:cs="Arial" w:eastAsia="Arial" w:hAnsi="Arial"/>
@@ -15229,7 +15265,7 @@
               <w:spacing w:after="10" w:before="0"/>
               <w:ind w:left="120"/>
             </w:pPr>
-            <w:hyperlink w:history="1" r:id="rIdjuzitdkkoyi1u3mkbb24y">
+            <w:hyperlink w:history="1" r:id="rIdxjso_jb9vvbwg5cvvrdhd">
               <w:r>
                 <w:rPr>
                   <w:rFonts w:ascii="Arial" w:cs="Arial" w:eastAsia="Arial" w:hAnsi="Arial"/>
@@ -15376,32 +15412,32 @@
         <w:tc>
           <w:tcPr>
             <w:tcW w:type="dxa" w:w="1520"/>
-            <w:shd w:fill="F2F2F2" w:color="auto" w:val="clear"/>
-            <w:tcMar>
-              <w:top w:type="dxa" w:w="60"/>
-              <w:left w:type="dxa" w:w="120"/>
-              <w:bottom w:type="dxa" w:w="60"/>
-              <w:right w:type="dxa" w:w="120"/>
-            </w:tcMar>
-            <w:vAlign w:val="top"/>
-          </w:tcPr>
-          <w:p>
-            <w:pPr>
-              <w:spacing w:after="40" w:before="0"/>
-              <w:jc w:val="left"/>
-            </w:pPr>
-            <w:r>
-              <w:rPr>
-                <w:rFonts w:ascii="Arial" w:cs="Arial" w:eastAsia="Arial" w:hAnsi="Arial"/>
-                <w:b/>
-                <w:bCs/>
-                <w:i w:val="false"/>
-                <w:iCs w:val="false"/>
-                <w:color w:val="000000"/>
-                <w:sz w:val="18"/>
-                <w:szCs w:val="18"/>
-              </w:rPr>
-              <w:t xml:space="preserve">Phase 2 — Observe</w:t>
+            <w:shd w:fill="D9EEF1" w:color="auto" w:val="clear"/>
+            <w:tcMar>
+              <w:top w:type="dxa" w:w="60"/>
+              <w:left w:type="dxa" w:w="120"/>
+              <w:bottom w:type="dxa" w:w="60"/>
+              <w:right w:type="dxa" w:w="120"/>
+            </w:tcMar>
+            <w:vAlign w:val="top"/>
+          </w:tcPr>
+          <w:p>
+            <w:pPr>
+              <w:spacing w:after="40" w:before="0"/>
+              <w:jc w:val="left"/>
+            </w:pPr>
+            <w:r>
+              <w:rPr>
+                <w:rFonts w:ascii="Arial" w:cs="Arial" w:eastAsia="Arial" w:hAnsi="Arial"/>
+                <w:b/>
+                <w:bCs/>
+                <w:i w:val="false"/>
+                <w:iCs w:val="false"/>
+                <w:color w:val="000000"/>
+                <w:sz w:val="18"/>
+                <w:szCs w:val="18"/>
+              </w:rPr>
+              <w:t xml:space="preserve">Observe Phase</w:t>
             </w:r>
           </w:p>
           <w:p>
@@ -15424,7 +15460,7 @@
             <w:pPr>
               <w:spacing w:after="20" w:before="0"/>
             </w:pPr>
-            <w:hyperlink w:history="1" r:id="rIdnnewt9ny6a0g_f28ahhgh">
+            <w:hyperlink w:history="1" r:id="rIdgaa0svtuqp2znzrpn8-zl">
               <w:r>
                 <w:rPr>
                   <w:rFonts w:ascii="Arial" w:cs="Arial" w:eastAsia="Arial" w:hAnsi="Arial"/>
@@ -15457,7 +15493,7 @@
               <w:spacing w:after="10" w:before="0"/>
               <w:ind w:left="120"/>
             </w:pPr>
-            <w:hyperlink w:history="1" r:id="rId4zjw6_g1k7dor9rlycy6p">
+            <w:hyperlink w:history="1" r:id="rIdabwkb8zsutuci9uyte_nz">
               <w:r>
                 <w:rPr>
                   <w:rFonts w:ascii="Arial" w:cs="Arial" w:eastAsia="Arial" w:hAnsi="Arial"/>
@@ -15502,7 +15538,7 @@
             <w:pPr>
               <w:spacing w:after="20" w:before="0"/>
             </w:pPr>
-            <w:hyperlink w:history="1" r:id="rIdxiwfihajk9nkwndsymkny">
+            <w:hyperlink w:history="1" r:id="rIdagx2x-elei8kpmfnfrlif">
               <w:r>
                 <w:rPr>
                   <w:rFonts w:ascii="Arial" w:cs="Arial" w:eastAsia="Arial" w:hAnsi="Arial"/>
@@ -15535,7 +15571,7 @@
               <w:spacing w:after="10" w:before="0"/>
               <w:ind w:left="120"/>
             </w:pPr>
-            <w:hyperlink w:history="1" r:id="rIdr-boctknq0vnpeqzhmn6h">
+            <w:hyperlink w:history="1" r:id="rId19l4b4zfc_jp6fyvyx1dn">
               <w:r>
                 <w:rPr>
                   <w:rFonts w:ascii="Arial" w:cs="Arial" w:eastAsia="Arial" w:hAnsi="Arial"/>
@@ -15682,32 +15718,32 @@
         <w:tc>
           <w:tcPr>
             <w:tcW w:type="dxa" w:w="1520"/>
-            <w:shd w:fill="F2F2F2" w:color="auto" w:val="clear"/>
-            <w:tcMar>
-              <w:top w:type="dxa" w:w="60"/>
-              <w:left w:type="dxa" w:w="120"/>
-              <w:bottom w:type="dxa" w:w="60"/>
-              <w:right w:type="dxa" w:w="120"/>
-            </w:tcMar>
-            <w:vAlign w:val="top"/>
-          </w:tcPr>
-          <w:p>
-            <w:pPr>
-              <w:spacing w:after="40" w:before="0"/>
-              <w:jc w:val="left"/>
-            </w:pPr>
-            <w:r>
-              <w:rPr>
-                <w:rFonts w:ascii="Arial" w:cs="Arial" w:eastAsia="Arial" w:hAnsi="Arial"/>
-                <w:b/>
-                <w:bCs/>
-                <w:i w:val="false"/>
-                <w:iCs w:val="false"/>
-                <w:color w:val="000000"/>
-                <w:sz w:val="18"/>
-                <w:szCs w:val="18"/>
-              </w:rPr>
-              <w:t xml:space="preserve">Phase 3 — Explain</w:t>
+            <w:shd w:fill="E2EFDA" w:color="auto" w:val="clear"/>
+            <w:tcMar>
+              <w:top w:type="dxa" w:w="60"/>
+              <w:left w:type="dxa" w:w="120"/>
+              <w:bottom w:type="dxa" w:w="60"/>
+              <w:right w:type="dxa" w:w="120"/>
+            </w:tcMar>
+            <w:vAlign w:val="top"/>
+          </w:tcPr>
+          <w:p>
+            <w:pPr>
+              <w:spacing w:after="40" w:before="0"/>
+              <w:jc w:val="left"/>
+            </w:pPr>
+            <w:r>
+              <w:rPr>
+                <w:rFonts w:ascii="Arial" w:cs="Arial" w:eastAsia="Arial" w:hAnsi="Arial"/>
+                <w:b/>
+                <w:bCs/>
+                <w:i w:val="false"/>
+                <w:iCs w:val="false"/>
+                <w:color w:val="000000"/>
+                <w:sz w:val="18"/>
+                <w:szCs w:val="18"/>
+              </w:rPr>
+              <w:t xml:space="preserve">Explain Phase</w:t>
             </w:r>
           </w:p>
           <w:p>
@@ -15730,7 +15766,7 @@
             <w:pPr>
               <w:spacing w:after="20" w:before="0"/>
             </w:pPr>
-            <w:hyperlink w:history="1" r:id="rIdxk3hzibjppv2ievtjmxxt">
+            <w:hyperlink w:history="1" r:id="rIdfayys_urcsot5flaefema">
               <w:r>
                 <w:rPr>
                   <w:rFonts w:ascii="Arial" w:cs="Arial" w:eastAsia="Arial" w:hAnsi="Arial"/>
@@ -15763,7 +15799,7 @@
               <w:spacing w:after="10" w:before="0"/>
               <w:ind w:left="120"/>
             </w:pPr>
-            <w:hyperlink w:history="1" r:id="rIdbhba0-_nq5jsxz_baxpa_">
+            <w:hyperlink w:history="1" r:id="rIdh4u_udgkbtc3h8dqzsuyl">
               <w:r>
                 <w:rPr>
                   <w:rFonts w:ascii="Arial" w:cs="Arial" w:eastAsia="Arial" w:hAnsi="Arial"/>
@@ -15808,7 +15844,7 @@
             <w:pPr>
               <w:spacing w:after="20" w:before="0"/>
             </w:pPr>
-            <w:hyperlink w:history="1" r:id="rIdk5xqxdcqotxjnfgh9poxn">
+            <w:hyperlink w:history="1" r:id="rIdknzjffg5ne4uh8d4npm6r">
               <w:r>
                 <w:rPr>
                   <w:rFonts w:ascii="Arial" w:cs="Arial" w:eastAsia="Arial" w:hAnsi="Arial"/>
@@ -15841,7 +15877,7 @@
               <w:spacing w:after="10" w:before="0"/>
               <w:ind w:left="120"/>
             </w:pPr>
-            <w:hyperlink w:history="1" r:id="rIdaywncqqb74i0wcfw2qkk4">
+            <w:hyperlink w:history="1" r:id="rIdi32kijg-bi91inbxznopo">
               <w:r>
                 <w:rPr>
                   <w:rFonts w:ascii="Arial" w:cs="Arial" w:eastAsia="Arial" w:hAnsi="Arial"/>
@@ -15988,32 +16024,32 @@
         <w:tc>
           <w:tcPr>
             <w:tcW w:type="dxa" w:w="1520"/>
-            <w:shd w:fill="F2F2F2" w:color="auto" w:val="clear"/>
-            <w:tcMar>
-              <w:top w:type="dxa" w:w="60"/>
-              <w:left w:type="dxa" w:w="120"/>
-              <w:bottom w:type="dxa" w:w="60"/>
-              <w:right w:type="dxa" w:w="120"/>
-            </w:tcMar>
-            <w:vAlign w:val="top"/>
-          </w:tcPr>
-          <w:p>
-            <w:pPr>
-              <w:spacing w:after="40" w:before="0"/>
-              <w:jc w:val="left"/>
-            </w:pPr>
-            <w:r>
-              <w:rPr>
-                <w:rFonts w:ascii="Arial" w:cs="Arial" w:eastAsia="Arial" w:hAnsi="Arial"/>
-                <w:b/>
-                <w:bCs/>
-                <w:i w:val="false"/>
-                <w:iCs w:val="false"/>
-                <w:color w:val="000000"/>
-                <w:sz w:val="18"/>
-                <w:szCs w:val="18"/>
-              </w:rPr>
-              <w:t xml:space="preserve">Phase 4 — Driving Question Board (DQB) Update</w:t>
+            <w:shd w:fill="FCE4D6" w:color="auto" w:val="clear"/>
+            <w:tcMar>
+              <w:top w:type="dxa" w:w="60"/>
+              <w:left w:type="dxa" w:w="120"/>
+              <w:bottom w:type="dxa" w:w="60"/>
+              <w:right w:type="dxa" w:w="120"/>
+            </w:tcMar>
+            <w:vAlign w:val="top"/>
+          </w:tcPr>
+          <w:p>
+            <w:pPr>
+              <w:spacing w:after="40" w:before="0"/>
+              <w:jc w:val="left"/>
+            </w:pPr>
+            <w:r>
+              <w:rPr>
+                <w:rFonts w:ascii="Arial" w:cs="Arial" w:eastAsia="Arial" w:hAnsi="Arial"/>
+                <w:b/>
+                <w:bCs/>
+                <w:i w:val="false"/>
+                <w:iCs w:val="false"/>
+                <w:color w:val="000000"/>
+                <w:sz w:val="18"/>
+                <w:szCs w:val="18"/>
+              </w:rPr>
+              <w:t xml:space="preserve">Driving Question Board (DQB) Creation</w:t>
             </w:r>
           </w:p>
           <w:p>
@@ -16036,7 +16072,7 @@
             <w:pPr>
               <w:spacing w:after="20" w:before="0"/>
             </w:pPr>
-            <w:hyperlink w:history="1" r:id="rId8ilngmsoo1kodurksw4w7">
+            <w:hyperlink w:history="1" r:id="rIdw_rzmjnpm5xxjp4bcu1ib">
               <w:r>
                 <w:rPr>
                   <w:rFonts w:ascii="Arial" w:cs="Arial" w:eastAsia="Arial" w:hAnsi="Arial"/>
@@ -16069,7 +16105,7 @@
               <w:spacing w:after="10" w:before="0"/>
               <w:ind w:left="120"/>
             </w:pPr>
-            <w:hyperlink w:history="1" r:id="rIdpyx4quayl6gjmxbsmzrrt">
+            <w:hyperlink w:history="1" r:id="rId96pbftvzok1dfy7as5szj">
               <w:r>
                 <w:rPr>
                   <w:rFonts w:ascii="Arial" w:cs="Arial" w:eastAsia="Arial" w:hAnsi="Arial"/>
@@ -16114,7 +16150,7 @@
             <w:pPr>
               <w:spacing w:after="20" w:before="0"/>
             </w:pPr>
-            <w:hyperlink w:history="1" r:id="rId2ep_ckwkfx5jc5xk-qlbe">
+            <w:hyperlink w:history="1" r:id="rIdc9crvjxeo9wn29npwcdah">
               <w:r>
                 <w:rPr>
                   <w:rFonts w:ascii="Arial" w:cs="Arial" w:eastAsia="Arial" w:hAnsi="Arial"/>
@@ -16147,7 +16183,7 @@
               <w:spacing w:after="10" w:before="0"/>
               <w:ind w:left="120"/>
             </w:pPr>
-            <w:hyperlink w:history="1" r:id="rId4nlt3zhmcssvlrxjwupna">
+            <w:hyperlink w:history="1" r:id="rIdxnashcsttv0kiwuer4wif">
               <w:r>
                 <w:rPr>
                   <w:rFonts w:ascii="Arial" w:cs="Arial" w:eastAsia="Arial" w:hAnsi="Arial"/>
@@ -16294,32 +16330,32 @@
         <w:tc>
           <w:tcPr>
             <w:tcW w:type="dxa" w:w="1520"/>
-            <w:shd w:fill="F2F2F2" w:color="auto" w:val="clear"/>
-            <w:tcMar>
-              <w:top w:type="dxa" w:w="60"/>
-              <w:left w:type="dxa" w:w="120"/>
-              <w:bottom w:type="dxa" w:w="60"/>
-              <w:right w:type="dxa" w:w="120"/>
-            </w:tcMar>
-            <w:vAlign w:val="top"/>
-          </w:tcPr>
-          <w:p>
-            <w:pPr>
-              <w:spacing w:after="40" w:before="0"/>
-              <w:jc w:val="left"/>
-            </w:pPr>
-            <w:r>
-              <w:rPr>
-                <w:rFonts w:ascii="Arial" w:cs="Arial" w:eastAsia="Arial" w:hAnsi="Arial"/>
-                <w:b/>
-                <w:bCs/>
-                <w:i w:val="false"/>
-                <w:iCs w:val="false"/>
-                <w:color w:val="000000"/>
-                <w:sz w:val="18"/>
-                <w:szCs w:val="18"/>
-              </w:rPr>
-              <w:t xml:space="preserve">Phase 5 — Model Building</w:t>
+            <w:shd w:fill="D5E8F0" w:color="auto" w:val="clear"/>
+            <w:tcMar>
+              <w:top w:type="dxa" w:w="60"/>
+              <w:left w:type="dxa" w:w="120"/>
+              <w:bottom w:type="dxa" w:w="60"/>
+              <w:right w:type="dxa" w:w="120"/>
+            </w:tcMar>
+            <w:vAlign w:val="top"/>
+          </w:tcPr>
+          <w:p>
+            <w:pPr>
+              <w:spacing w:after="40" w:before="0"/>
+              <w:jc w:val="left"/>
+            </w:pPr>
+            <w:r>
+              <w:rPr>
+                <w:rFonts w:ascii="Arial" w:cs="Arial" w:eastAsia="Arial" w:hAnsi="Arial"/>
+                <w:b/>
+                <w:bCs/>
+                <w:i w:val="false"/>
+                <w:iCs w:val="false"/>
+                <w:color w:val="000000"/>
+                <w:sz w:val="18"/>
+                <w:szCs w:val="18"/>
+              </w:rPr>
+              <w:t xml:space="preserve">Model Building Phase</w:t>
             </w:r>
           </w:p>
           <w:p>
@@ -16342,7 +16378,7 @@
             <w:pPr>
               <w:spacing w:after="20" w:before="0"/>
             </w:pPr>
-            <w:hyperlink w:history="1" r:id="rIdbf_ipdkgnbnayk97t9rsj">
+            <w:hyperlink w:history="1" r:id="rIdw4qfnitouf0uqld1yvtju">
               <w:r>
                 <w:rPr>
                   <w:rFonts w:ascii="Arial" w:cs="Arial" w:eastAsia="Arial" w:hAnsi="Arial"/>
@@ -16375,7 +16411,7 @@
               <w:spacing w:after="10" w:before="0"/>
               <w:ind w:left="120"/>
             </w:pPr>
-            <w:hyperlink w:history="1" r:id="rId8wtbv_0emaf_ngkwohubv">
+            <w:hyperlink w:history="1" r:id="rId_wbcg_g08gyb64pzyhzue">
               <w:r>
                 <w:rPr>
                   <w:rFonts w:ascii="Arial" w:cs="Arial" w:eastAsia="Arial" w:hAnsi="Arial"/>
@@ -16420,7 +16456,7 @@
             <w:pPr>
               <w:spacing w:after="20" w:before="0"/>
             </w:pPr>
-            <w:hyperlink w:history="1" r:id="rIdiym7gueys3crdef3ppp90">
+            <w:hyperlink w:history="1" r:id="rIdhayg2_sbaddj7ydn72sg4">
               <w:r>
                 <w:rPr>
                   <w:rFonts w:ascii="Arial" w:cs="Arial" w:eastAsia="Arial" w:hAnsi="Arial"/>
@@ -16453,7 +16489,7 @@
               <w:spacing w:after="10" w:before="0"/>
               <w:ind w:left="120"/>
             </w:pPr>
-            <w:hyperlink w:history="1" r:id="rIdl1g38krtroj2vpd9pg63o">
+            <w:hyperlink w:history="1" r:id="rIdhw5ijzbwojlvphvgfbmyg">
               <w:r>
                 <w:rPr>
                   <w:rFonts w:ascii="Arial" w:cs="Arial" w:eastAsia="Arial" w:hAnsi="Arial"/>
@@ -17892,32 +17928,32 @@
         <w:tc>
           <w:tcPr>
             <w:tcW w:type="dxa" w:w="1520"/>
-            <w:shd w:fill="F2F2F2" w:color="auto" w:val="clear"/>
-            <w:tcMar>
-              <w:top w:type="dxa" w:w="60"/>
-              <w:left w:type="dxa" w:w="120"/>
-              <w:bottom w:type="dxa" w:w="60"/>
-              <w:right w:type="dxa" w:w="120"/>
-            </w:tcMar>
-            <w:vAlign w:val="top"/>
-          </w:tcPr>
-          <w:p>
-            <w:pPr>
-              <w:spacing w:after="40" w:before="0"/>
-              <w:jc w:val="left"/>
-            </w:pPr>
-            <w:r>
-              <w:rPr>
-                <w:rFonts w:ascii="Arial" w:cs="Arial" w:eastAsia="Arial" w:hAnsi="Arial"/>
-                <w:b/>
-                <w:bCs/>
-                <w:i w:val="false"/>
-                <w:iCs w:val="false"/>
-                <w:color w:val="000000"/>
-                <w:sz w:val="18"/>
-                <w:szCs w:val="18"/>
-              </w:rPr>
-              <w:t xml:space="preserve">Phase 1 — Predict</w:t>
+            <w:shd w:fill="EAD1F5" w:color="auto" w:val="clear"/>
+            <w:tcMar>
+              <w:top w:type="dxa" w:w="60"/>
+              <w:left w:type="dxa" w:w="120"/>
+              <w:bottom w:type="dxa" w:w="60"/>
+              <w:right w:type="dxa" w:w="120"/>
+            </w:tcMar>
+            <w:vAlign w:val="top"/>
+          </w:tcPr>
+          <w:p>
+            <w:pPr>
+              <w:spacing w:after="40" w:before="0"/>
+              <w:jc w:val="left"/>
+            </w:pPr>
+            <w:r>
+              <w:rPr>
+                <w:rFonts w:ascii="Arial" w:cs="Arial" w:eastAsia="Arial" w:hAnsi="Arial"/>
+                <w:b/>
+                <w:bCs/>
+                <w:i w:val="false"/>
+                <w:iCs w:val="false"/>
+                <w:color w:val="000000"/>
+                <w:sz w:val="18"/>
+                <w:szCs w:val="18"/>
+              </w:rPr>
+              <w:t xml:space="preserve">Predict Phase</w:t>
             </w:r>
           </w:p>
           <w:p>
@@ -17940,7 +17976,7 @@
             <w:pPr>
               <w:spacing w:after="20" w:before="0"/>
             </w:pPr>
-            <w:hyperlink w:history="1" r:id="rIdytn15ipxtxd-yxfv1cfuu">
+            <w:hyperlink w:history="1" r:id="rIdoamy6wgpoksqh9-n6g7lz">
               <w:r>
                 <w:rPr>
                   <w:rFonts w:ascii="Arial" w:cs="Arial" w:eastAsia="Arial" w:hAnsi="Arial"/>
@@ -17973,7 +18009,7 @@
               <w:spacing w:after="10" w:before="0"/>
               <w:ind w:left="120"/>
             </w:pPr>
-            <w:hyperlink w:history="1" r:id="rIdgdayj7wtl-8bbp_tptoum">
+            <w:hyperlink w:history="1" r:id="rIdtmzaf60udg_mkwvwxoc60">
               <w:r>
                 <w:rPr>
                   <w:rFonts w:ascii="Arial" w:cs="Arial" w:eastAsia="Arial" w:hAnsi="Arial"/>
@@ -18018,7 +18054,7 @@
             <w:pPr>
               <w:spacing w:after="20" w:before="0"/>
             </w:pPr>
-            <w:hyperlink w:history="1" r:id="rIdwp3encs95hocmwv_stasi">
+            <w:hyperlink w:history="1" r:id="rIdvyfsphw9zho9caemwnz4n">
               <w:r>
                 <w:rPr>
                   <w:rFonts w:ascii="Arial" w:cs="Arial" w:eastAsia="Arial" w:hAnsi="Arial"/>
@@ -18051,7 +18087,7 @@
               <w:spacing w:after="10" w:before="0"/>
               <w:ind w:left="120"/>
             </w:pPr>
-            <w:hyperlink w:history="1" r:id="rIdycw88ov8ukcjo3zlc-ieh">
+            <w:hyperlink w:history="1" r:id="rIdd31jmliwuzzd9_fxgtimv">
               <w:r>
                 <w:rPr>
                   <w:rFonts w:ascii="Arial" w:cs="Arial" w:eastAsia="Arial" w:hAnsi="Arial"/>
@@ -18198,32 +18234,32 @@
         <w:tc>
           <w:tcPr>
             <w:tcW w:type="dxa" w:w="1520"/>
-            <w:shd w:fill="F2F2F2" w:color="auto" w:val="clear"/>
-            <w:tcMar>
-              <w:top w:type="dxa" w:w="60"/>
-              <w:left w:type="dxa" w:w="120"/>
-              <w:bottom w:type="dxa" w:w="60"/>
-              <w:right w:type="dxa" w:w="120"/>
-            </w:tcMar>
-            <w:vAlign w:val="top"/>
-          </w:tcPr>
-          <w:p>
-            <w:pPr>
-              <w:spacing w:after="40" w:before="0"/>
-              <w:jc w:val="left"/>
-            </w:pPr>
-            <w:r>
-              <w:rPr>
-                <w:rFonts w:ascii="Arial" w:cs="Arial" w:eastAsia="Arial" w:hAnsi="Arial"/>
-                <w:b/>
-                <w:bCs/>
-                <w:i w:val="false"/>
-                <w:iCs w:val="false"/>
-                <w:color w:val="000000"/>
-                <w:sz w:val="18"/>
-                <w:szCs w:val="18"/>
-              </w:rPr>
-              <w:t xml:space="preserve">Phase 2 — Observe</w:t>
+            <w:shd w:fill="D9EEF1" w:color="auto" w:val="clear"/>
+            <w:tcMar>
+              <w:top w:type="dxa" w:w="60"/>
+              <w:left w:type="dxa" w:w="120"/>
+              <w:bottom w:type="dxa" w:w="60"/>
+              <w:right w:type="dxa" w:w="120"/>
+            </w:tcMar>
+            <w:vAlign w:val="top"/>
+          </w:tcPr>
+          <w:p>
+            <w:pPr>
+              <w:spacing w:after="40" w:before="0"/>
+              <w:jc w:val="left"/>
+            </w:pPr>
+            <w:r>
+              <w:rPr>
+                <w:rFonts w:ascii="Arial" w:cs="Arial" w:eastAsia="Arial" w:hAnsi="Arial"/>
+                <w:b/>
+                <w:bCs/>
+                <w:i w:val="false"/>
+                <w:iCs w:val="false"/>
+                <w:color w:val="000000"/>
+                <w:sz w:val="18"/>
+                <w:szCs w:val="18"/>
+              </w:rPr>
+              <w:t xml:space="preserve">Observe Phase</w:t>
             </w:r>
           </w:p>
           <w:p>
@@ -18246,7 +18282,7 @@
             <w:pPr>
               <w:spacing w:after="20" w:before="0"/>
             </w:pPr>
-            <w:hyperlink w:history="1" r:id="rIduedg5xhnc8tsxoaed211d">
+            <w:hyperlink w:history="1" r:id="rIda8n5okbft9hg_bzwx0oxb">
               <w:r>
                 <w:rPr>
                   <w:rFonts w:ascii="Arial" w:cs="Arial" w:eastAsia="Arial" w:hAnsi="Arial"/>
@@ -18279,7 +18315,7 @@
               <w:spacing w:after="10" w:before="0"/>
               <w:ind w:left="120"/>
             </w:pPr>
-            <w:hyperlink w:history="1" r:id="rIdzyjizbia8kupe8xpvbolv">
+            <w:hyperlink w:history="1" r:id="rIdd0zoqtltrnf1d_k7_21bf">
               <w:r>
                 <w:rPr>
                   <w:rFonts w:ascii="Arial" w:cs="Arial" w:eastAsia="Arial" w:hAnsi="Arial"/>
@@ -18324,7 +18360,7 @@
             <w:pPr>
               <w:spacing w:after="20" w:before="0"/>
             </w:pPr>
-            <w:hyperlink w:history="1" r:id="rId1zduvptclxqrljcooqeky">
+            <w:hyperlink w:history="1" r:id="rIda6wy8eth9too_l9wfhesr">
               <w:r>
                 <w:rPr>
                   <w:rFonts w:ascii="Arial" w:cs="Arial" w:eastAsia="Arial" w:hAnsi="Arial"/>
@@ -18357,7 +18393,7 @@
               <w:spacing w:after="10" w:before="0"/>
               <w:ind w:left="120"/>
             </w:pPr>
-            <w:hyperlink w:history="1" r:id="rIdwkuwe495jcnloaovj3ddi">
+            <w:hyperlink w:history="1" r:id="rId-yiio233mmfwepxhwhumq">
               <w:r>
                 <w:rPr>
                   <w:rFonts w:ascii="Arial" w:cs="Arial" w:eastAsia="Arial" w:hAnsi="Arial"/>
@@ -18504,32 +18540,32 @@
         <w:tc>
           <w:tcPr>
             <w:tcW w:type="dxa" w:w="1520"/>
-            <w:shd w:fill="F2F2F2" w:color="auto" w:val="clear"/>
-            <w:tcMar>
-              <w:top w:type="dxa" w:w="60"/>
-              <w:left w:type="dxa" w:w="120"/>
-              <w:bottom w:type="dxa" w:w="60"/>
-              <w:right w:type="dxa" w:w="120"/>
-            </w:tcMar>
-            <w:vAlign w:val="top"/>
-          </w:tcPr>
-          <w:p>
-            <w:pPr>
-              <w:spacing w:after="40" w:before="0"/>
-              <w:jc w:val="left"/>
-            </w:pPr>
-            <w:r>
-              <w:rPr>
-                <w:rFonts w:ascii="Arial" w:cs="Arial" w:eastAsia="Arial" w:hAnsi="Arial"/>
-                <w:b/>
-                <w:bCs/>
-                <w:i w:val="false"/>
-                <w:iCs w:val="false"/>
-                <w:color w:val="000000"/>
-                <w:sz w:val="18"/>
-                <w:szCs w:val="18"/>
-              </w:rPr>
-              <w:t xml:space="preserve">Phase 3 — Explain</w:t>
+            <w:shd w:fill="E2EFDA" w:color="auto" w:val="clear"/>
+            <w:tcMar>
+              <w:top w:type="dxa" w:w="60"/>
+              <w:left w:type="dxa" w:w="120"/>
+              <w:bottom w:type="dxa" w:w="60"/>
+              <w:right w:type="dxa" w:w="120"/>
+            </w:tcMar>
+            <w:vAlign w:val="top"/>
+          </w:tcPr>
+          <w:p>
+            <w:pPr>
+              <w:spacing w:after="40" w:before="0"/>
+              <w:jc w:val="left"/>
+            </w:pPr>
+            <w:r>
+              <w:rPr>
+                <w:rFonts w:ascii="Arial" w:cs="Arial" w:eastAsia="Arial" w:hAnsi="Arial"/>
+                <w:b/>
+                <w:bCs/>
+                <w:i w:val="false"/>
+                <w:iCs w:val="false"/>
+                <w:color w:val="000000"/>
+                <w:sz w:val="18"/>
+                <w:szCs w:val="18"/>
+              </w:rPr>
+              <w:t xml:space="preserve">Explain Phase</w:t>
             </w:r>
           </w:p>
           <w:p>
@@ -18552,7 +18588,7 @@
             <w:pPr>
               <w:spacing w:after="20" w:before="0"/>
             </w:pPr>
-            <w:hyperlink w:history="1" r:id="rIdmedmhrxkucr2p4dm_xdkd">
+            <w:hyperlink w:history="1" r:id="rIdbnsglg61tx4pkiyt_aixu">
               <w:r>
                 <w:rPr>
                   <w:rFonts w:ascii="Arial" w:cs="Arial" w:eastAsia="Arial" w:hAnsi="Arial"/>
@@ -18585,7 +18621,7 @@
               <w:spacing w:after="10" w:before="0"/>
               <w:ind w:left="120"/>
             </w:pPr>
-            <w:hyperlink w:history="1" r:id="rIdlh-txuolg1d39s82bs7ef">
+            <w:hyperlink w:history="1" r:id="rId3bmcnd7wwc8qs7nqibh8a">
               <w:r>
                 <w:rPr>
                   <w:rFonts w:ascii="Arial" w:cs="Arial" w:eastAsia="Arial" w:hAnsi="Arial"/>
@@ -18630,7 +18666,7 @@
             <w:pPr>
               <w:spacing w:after="20" w:before="0"/>
             </w:pPr>
-            <w:hyperlink w:history="1" r:id="rIdlengvbnduxclp-vzjvmru">
+            <w:hyperlink w:history="1" r:id="rIdg1pbc42llv7tee6m8rseg">
               <w:r>
                 <w:rPr>
                   <w:rFonts w:ascii="Arial" w:cs="Arial" w:eastAsia="Arial" w:hAnsi="Arial"/>
@@ -18663,7 +18699,7 @@
               <w:spacing w:after="10" w:before="0"/>
               <w:ind w:left="120"/>
             </w:pPr>
-            <w:hyperlink w:history="1" r:id="rIdixpittlvvpnalrikne-p9">
+            <w:hyperlink w:history="1" r:id="rId0g3d5wdarv1ssnd3igm_j">
               <w:r>
                 <w:rPr>
                   <w:rFonts w:ascii="Arial" w:cs="Arial" w:eastAsia="Arial" w:hAnsi="Arial"/>
@@ -18810,32 +18846,32 @@
         <w:tc>
           <w:tcPr>
             <w:tcW w:type="dxa" w:w="1520"/>
-            <w:shd w:fill="F2F2F2" w:color="auto" w:val="clear"/>
-            <w:tcMar>
-              <w:top w:type="dxa" w:w="60"/>
-              <w:left w:type="dxa" w:w="120"/>
-              <w:bottom w:type="dxa" w:w="60"/>
-              <w:right w:type="dxa" w:w="120"/>
-            </w:tcMar>
-            <w:vAlign w:val="top"/>
-          </w:tcPr>
-          <w:p>
-            <w:pPr>
-              <w:spacing w:after="40" w:before="0"/>
-              <w:jc w:val="left"/>
-            </w:pPr>
-            <w:r>
-              <w:rPr>
-                <w:rFonts w:ascii="Arial" w:cs="Arial" w:eastAsia="Arial" w:hAnsi="Arial"/>
-                <w:b/>
-                <w:bCs/>
-                <w:i w:val="false"/>
-                <w:iCs w:val="false"/>
-                <w:color w:val="000000"/>
-                <w:sz w:val="18"/>
-                <w:szCs w:val="18"/>
-              </w:rPr>
-              <w:t xml:space="preserve">Phase 4 — Driving Question Board (DQB) Update</w:t>
+            <w:shd w:fill="FCE4D6" w:color="auto" w:val="clear"/>
+            <w:tcMar>
+              <w:top w:type="dxa" w:w="60"/>
+              <w:left w:type="dxa" w:w="120"/>
+              <w:bottom w:type="dxa" w:w="60"/>
+              <w:right w:type="dxa" w:w="120"/>
+            </w:tcMar>
+            <w:vAlign w:val="top"/>
+          </w:tcPr>
+          <w:p>
+            <w:pPr>
+              <w:spacing w:after="40" w:before="0"/>
+              <w:jc w:val="left"/>
+            </w:pPr>
+            <w:r>
+              <w:rPr>
+                <w:rFonts w:ascii="Arial" w:cs="Arial" w:eastAsia="Arial" w:hAnsi="Arial"/>
+                <w:b/>
+                <w:bCs/>
+                <w:i w:val="false"/>
+                <w:iCs w:val="false"/>
+                <w:color w:val="000000"/>
+                <w:sz w:val="18"/>
+                <w:szCs w:val="18"/>
+              </w:rPr>
+              <w:t xml:space="preserve">Driving Question Board (DQB) Creation</w:t>
             </w:r>
           </w:p>
           <w:p>
@@ -18858,7 +18894,7 @@
             <w:pPr>
               <w:spacing w:after="20" w:before="0"/>
             </w:pPr>
-            <w:hyperlink w:history="1" r:id="rIdzzdnxaqb9rl7nchwbbpro">
+            <w:hyperlink w:history="1" r:id="rIdniww6q1ahrzirbjj4fnja">
               <w:r>
                 <w:rPr>
                   <w:rFonts w:ascii="Arial" w:cs="Arial" w:eastAsia="Arial" w:hAnsi="Arial"/>
@@ -18891,7 +18927,7 @@
               <w:spacing w:after="10" w:before="0"/>
               <w:ind w:left="120"/>
             </w:pPr>
-            <w:hyperlink w:history="1" r:id="rIde8ikcdrehbuthutcyp8-k">
+            <w:hyperlink w:history="1" r:id="rIdr3aw_ep4l7plqvdyfn_3f">
               <w:r>
                 <w:rPr>
                   <w:rFonts w:ascii="Arial" w:cs="Arial" w:eastAsia="Arial" w:hAnsi="Arial"/>
@@ -18936,7 +18972,7 @@
             <w:pPr>
               <w:spacing w:after="20" w:before="0"/>
             </w:pPr>
-            <w:hyperlink w:history="1" r:id="rId1dpn-vhbt9adcdect9seg">
+            <w:hyperlink w:history="1" r:id="rIdumxcrlhc3nrjjyqkmadqt">
               <w:r>
                 <w:rPr>
                   <w:rFonts w:ascii="Arial" w:cs="Arial" w:eastAsia="Arial" w:hAnsi="Arial"/>
@@ -18969,7 +19005,7 @@
               <w:spacing w:after="10" w:before="0"/>
               <w:ind w:left="120"/>
             </w:pPr>
-            <w:hyperlink w:history="1" r:id="rIdqzo4iixfcsd46xgc49xnh">
+            <w:hyperlink w:history="1" r:id="rIdbf6dprscu37leq3oqmke5">
               <w:r>
                 <w:rPr>
                   <w:rFonts w:ascii="Arial" w:cs="Arial" w:eastAsia="Arial" w:hAnsi="Arial"/>
@@ -19116,32 +19152,32 @@
         <w:tc>
           <w:tcPr>
             <w:tcW w:type="dxa" w:w="1520"/>
-            <w:shd w:fill="F2F2F2" w:color="auto" w:val="clear"/>
-            <w:tcMar>
-              <w:top w:type="dxa" w:w="60"/>
-              <w:left w:type="dxa" w:w="120"/>
-              <w:bottom w:type="dxa" w:w="60"/>
-              <w:right w:type="dxa" w:w="120"/>
-            </w:tcMar>
-            <w:vAlign w:val="top"/>
-          </w:tcPr>
-          <w:p>
-            <w:pPr>
-              <w:spacing w:after="40" w:before="0"/>
-              <w:jc w:val="left"/>
-            </w:pPr>
-            <w:r>
-              <w:rPr>
-                <w:rFonts w:ascii="Arial" w:cs="Arial" w:eastAsia="Arial" w:hAnsi="Arial"/>
-                <w:b/>
-                <w:bCs/>
-                <w:i w:val="false"/>
-                <w:iCs w:val="false"/>
-                <w:color w:val="000000"/>
-                <w:sz w:val="18"/>
-                <w:szCs w:val="18"/>
-              </w:rPr>
-              <w:t xml:space="preserve">Phase 5 — Model Building</w:t>
+            <w:shd w:fill="D5E8F0" w:color="auto" w:val="clear"/>
+            <w:tcMar>
+              <w:top w:type="dxa" w:w="60"/>
+              <w:left w:type="dxa" w:w="120"/>
+              <w:bottom w:type="dxa" w:w="60"/>
+              <w:right w:type="dxa" w:w="120"/>
+            </w:tcMar>
+            <w:vAlign w:val="top"/>
+          </w:tcPr>
+          <w:p>
+            <w:pPr>
+              <w:spacing w:after="40" w:before="0"/>
+              <w:jc w:val="left"/>
+            </w:pPr>
+            <w:r>
+              <w:rPr>
+                <w:rFonts w:ascii="Arial" w:cs="Arial" w:eastAsia="Arial" w:hAnsi="Arial"/>
+                <w:b/>
+                <w:bCs/>
+                <w:i w:val="false"/>
+                <w:iCs w:val="false"/>
+                <w:color w:val="000000"/>
+                <w:sz w:val="18"/>
+                <w:szCs w:val="18"/>
+              </w:rPr>
+              <w:t xml:space="preserve">Model Building Phase</w:t>
             </w:r>
           </w:p>
           <w:p>
@@ -19164,7 +19200,7 @@
             <w:pPr>
               <w:spacing w:after="20" w:before="0"/>
             </w:pPr>
-            <w:hyperlink w:history="1" r:id="rId8278ihjtto43zyzlvq7sb">
+            <w:hyperlink w:history="1" r:id="rIdmrirrwrfiolzzl5wtgqy9">
               <w:r>
                 <w:rPr>
                   <w:rFonts w:ascii="Arial" w:cs="Arial" w:eastAsia="Arial" w:hAnsi="Arial"/>
@@ -19197,7 +19233,7 @@
               <w:spacing w:after="10" w:before="0"/>
               <w:ind w:left="120"/>
             </w:pPr>
-            <w:hyperlink w:history="1" r:id="rIdbqurqlisr_jtols5ssuwz">
+            <w:hyperlink w:history="1" r:id="rIdo-z32xhpn_vsqb3st2hyu">
               <w:r>
                 <w:rPr>
                   <w:rFonts w:ascii="Arial" w:cs="Arial" w:eastAsia="Arial" w:hAnsi="Arial"/>
@@ -19242,7 +19278,7 @@
             <w:pPr>
               <w:spacing w:after="20" w:before="0"/>
             </w:pPr>
-            <w:hyperlink w:history="1" r:id="rIdsv7xmvffrutz29dey8q65">
+            <w:hyperlink w:history="1" r:id="rIdd7xwnl6fbkx7ya4ca4azk">
               <w:r>
                 <w:rPr>
                   <w:rFonts w:ascii="Arial" w:cs="Arial" w:eastAsia="Arial" w:hAnsi="Arial"/>
@@ -19275,7 +19311,7 @@
               <w:spacing w:after="10" w:before="0"/>
               <w:ind w:left="120"/>
             </w:pPr>
-            <w:hyperlink w:history="1" r:id="rIde7bkyyjgan1kg-rcakhrj">
+            <w:hyperlink w:history="1" r:id="rIdj6gzs3c4gnmjkbyf3gper">
               <w:r>
                 <w:rPr>
                   <w:rFonts w:ascii="Arial" w:cs="Arial" w:eastAsia="Arial" w:hAnsi="Arial"/>
@@ -20809,32 +20845,32 @@
         <w:tc>
           <w:tcPr>
             <w:tcW w:type="dxa" w:w="1520"/>
-            <w:shd w:fill="F2F2F2" w:color="auto" w:val="clear"/>
-            <w:tcMar>
-              <w:top w:type="dxa" w:w="60"/>
-              <w:left w:type="dxa" w:w="120"/>
-              <w:bottom w:type="dxa" w:w="60"/>
-              <w:right w:type="dxa" w:w="120"/>
-            </w:tcMar>
-            <w:vAlign w:val="top"/>
-          </w:tcPr>
-          <w:p>
-            <w:pPr>
-              <w:spacing w:after="40" w:before="0"/>
-              <w:jc w:val="left"/>
-            </w:pPr>
-            <w:r>
-              <w:rPr>
-                <w:rFonts w:ascii="Arial" w:cs="Arial" w:eastAsia="Arial" w:hAnsi="Arial"/>
-                <w:b/>
-                <w:bCs/>
-                <w:i w:val="false"/>
-                <w:iCs w:val="false"/>
-                <w:color w:val="000000"/>
-                <w:sz w:val="18"/>
-                <w:szCs w:val="18"/>
-              </w:rPr>
-              <w:t xml:space="preserve">Phase 1 — Predict</w:t>
+            <w:shd w:fill="EAD1F5" w:color="auto" w:val="clear"/>
+            <w:tcMar>
+              <w:top w:type="dxa" w:w="60"/>
+              <w:left w:type="dxa" w:w="120"/>
+              <w:bottom w:type="dxa" w:w="60"/>
+              <w:right w:type="dxa" w:w="120"/>
+            </w:tcMar>
+            <w:vAlign w:val="top"/>
+          </w:tcPr>
+          <w:p>
+            <w:pPr>
+              <w:spacing w:after="40" w:before="0"/>
+              <w:jc w:val="left"/>
+            </w:pPr>
+            <w:r>
+              <w:rPr>
+                <w:rFonts w:ascii="Arial" w:cs="Arial" w:eastAsia="Arial" w:hAnsi="Arial"/>
+                <w:b/>
+                <w:bCs/>
+                <w:i w:val="false"/>
+                <w:iCs w:val="false"/>
+                <w:color w:val="000000"/>
+                <w:sz w:val="18"/>
+                <w:szCs w:val="18"/>
+              </w:rPr>
+              <w:t xml:space="preserve">Predict Phase</w:t>
             </w:r>
           </w:p>
           <w:p>
@@ -20857,7 +20893,7 @@
             <w:pPr>
               <w:spacing w:after="20" w:before="0"/>
             </w:pPr>
-            <w:hyperlink w:history="1" r:id="rIdtryv3lswsmdec7qza0sgx">
+            <w:hyperlink w:history="1" r:id="rIdnhtgzayfn43_6kxxgpvow">
               <w:r>
                 <w:rPr>
                   <w:rFonts w:ascii="Arial" w:cs="Arial" w:eastAsia="Arial" w:hAnsi="Arial"/>
@@ -20890,7 +20926,7 @@
               <w:spacing w:after="10" w:before="0"/>
               <w:ind w:left="120"/>
             </w:pPr>
-            <w:hyperlink w:history="1" r:id="rIdlugsui0c3nx-keao9ii7d">
+            <w:hyperlink w:history="1" r:id="rId9cyfextgdmxs0u687sudz">
               <w:r>
                 <w:rPr>
                   <w:rFonts w:ascii="Arial" w:cs="Arial" w:eastAsia="Arial" w:hAnsi="Arial"/>
@@ -20935,7 +20971,7 @@
             <w:pPr>
               <w:spacing w:after="20" w:before="0"/>
             </w:pPr>
-            <w:hyperlink w:history="1" r:id="rId2-yad3bzpejlpxmbicxnh">
+            <w:hyperlink w:history="1" r:id="rIdg6xbqfatrt6dxegdwk26_">
               <w:r>
                 <w:rPr>
                   <w:rFonts w:ascii="Arial" w:cs="Arial" w:eastAsia="Arial" w:hAnsi="Arial"/>
@@ -20968,7 +21004,7 @@
               <w:spacing w:after="10" w:before="0"/>
               <w:ind w:left="120"/>
             </w:pPr>
-            <w:hyperlink w:history="1" r:id="rIdruznc-zokuplsqzf29vnx">
+            <w:hyperlink w:history="1" r:id="rIdqxuhv2t7eic_yk2_un0hw">
               <w:r>
                 <w:rPr>
                   <w:rFonts w:ascii="Arial" w:cs="Arial" w:eastAsia="Arial" w:hAnsi="Arial"/>
@@ -21115,32 +21151,32 @@
         <w:tc>
           <w:tcPr>
             <w:tcW w:type="dxa" w:w="1520"/>
-            <w:shd w:fill="F2F2F2" w:color="auto" w:val="clear"/>
-            <w:tcMar>
-              <w:top w:type="dxa" w:w="60"/>
-              <w:left w:type="dxa" w:w="120"/>
-              <w:bottom w:type="dxa" w:w="60"/>
-              <w:right w:type="dxa" w:w="120"/>
-            </w:tcMar>
-            <w:vAlign w:val="top"/>
-          </w:tcPr>
-          <w:p>
-            <w:pPr>
-              <w:spacing w:after="40" w:before="0"/>
-              <w:jc w:val="left"/>
-            </w:pPr>
-            <w:r>
-              <w:rPr>
-                <w:rFonts w:ascii="Arial" w:cs="Arial" w:eastAsia="Arial" w:hAnsi="Arial"/>
-                <w:b/>
-                <w:bCs/>
-                <w:i w:val="false"/>
-                <w:iCs w:val="false"/>
-                <w:color w:val="000000"/>
-                <w:sz w:val="18"/>
-                <w:szCs w:val="18"/>
-              </w:rPr>
-              <w:t xml:space="preserve">Phase 2 — Observe (Microscopy Practical)</w:t>
+            <w:shd w:fill="D9EEF1" w:color="auto" w:val="clear"/>
+            <w:tcMar>
+              <w:top w:type="dxa" w:w="60"/>
+              <w:left w:type="dxa" w:w="120"/>
+              <w:bottom w:type="dxa" w:w="60"/>
+              <w:right w:type="dxa" w:w="120"/>
+            </w:tcMar>
+            <w:vAlign w:val="top"/>
+          </w:tcPr>
+          <w:p>
+            <w:pPr>
+              <w:spacing w:after="40" w:before="0"/>
+              <w:jc w:val="left"/>
+            </w:pPr>
+            <w:r>
+              <w:rPr>
+                <w:rFonts w:ascii="Arial" w:cs="Arial" w:eastAsia="Arial" w:hAnsi="Arial"/>
+                <w:b/>
+                <w:bCs/>
+                <w:i w:val="false"/>
+                <w:iCs w:val="false"/>
+                <w:color w:val="000000"/>
+                <w:sz w:val="18"/>
+                <w:szCs w:val="18"/>
+              </w:rPr>
+              <w:t xml:space="preserve">Observe Phase</w:t>
             </w:r>
           </w:p>
           <w:p>
@@ -21163,7 +21199,7 @@
             <w:pPr>
               <w:spacing w:after="20" w:before="0"/>
             </w:pPr>
-            <w:hyperlink w:history="1" r:id="rId2fshi0w0b3houjaxv7uc9">
+            <w:hyperlink w:history="1" r:id="rId7xbqwg2spomkwkt_c7gbl">
               <w:r>
                 <w:rPr>
                   <w:rFonts w:ascii="Arial" w:cs="Arial" w:eastAsia="Arial" w:hAnsi="Arial"/>
@@ -21196,7 +21232,7 @@
               <w:spacing w:after="10" w:before="0"/>
               <w:ind w:left="120"/>
             </w:pPr>
-            <w:hyperlink w:history="1" r:id="rIdibhlj-z_iudkjlewm2puw">
+            <w:hyperlink w:history="1" r:id="rIdpxjhkb2btzeiwfc7wmmnb">
               <w:r>
                 <w:rPr>
                   <w:rFonts w:ascii="Arial" w:cs="Arial" w:eastAsia="Arial" w:hAnsi="Arial"/>
@@ -21241,7 +21277,7 @@
             <w:pPr>
               <w:spacing w:after="20" w:before="0"/>
             </w:pPr>
-            <w:hyperlink w:history="1" r:id="rIdp8xtwdszlu8hv55ytb5fw">
+            <w:hyperlink w:history="1" r:id="rId40w9rrfcmbumfkexnunfe">
               <w:r>
                 <w:rPr>
                   <w:rFonts w:ascii="Arial" w:cs="Arial" w:eastAsia="Arial" w:hAnsi="Arial"/>
@@ -21274,7 +21310,7 @@
               <w:spacing w:after="10" w:before="0"/>
               <w:ind w:left="120"/>
             </w:pPr>
-            <w:hyperlink w:history="1" r:id="rIdz9vdvkanw9vpobep7xrfn">
+            <w:hyperlink w:history="1" r:id="rIdp_nfg5phs-ywsnqlkhgzc">
               <w:r>
                 <w:rPr>
                   <w:rFonts w:ascii="Arial" w:cs="Arial" w:eastAsia="Arial" w:hAnsi="Arial"/>
@@ -21421,32 +21457,32 @@
         <w:tc>
           <w:tcPr>
             <w:tcW w:type="dxa" w:w="1520"/>
-            <w:shd w:fill="F2F2F2" w:color="auto" w:val="clear"/>
-            <w:tcMar>
-              <w:top w:type="dxa" w:w="60"/>
-              <w:left w:type="dxa" w:w="120"/>
-              <w:bottom w:type="dxa" w:w="60"/>
-              <w:right w:type="dxa" w:w="120"/>
-            </w:tcMar>
-            <w:vAlign w:val="top"/>
-          </w:tcPr>
-          <w:p>
-            <w:pPr>
-              <w:spacing w:after="40" w:before="0"/>
-              <w:jc w:val="left"/>
-            </w:pPr>
-            <w:r>
-              <w:rPr>
-                <w:rFonts w:ascii="Arial" w:cs="Arial" w:eastAsia="Arial" w:hAnsi="Arial"/>
-                <w:b/>
-                <w:bCs/>
-                <w:i w:val="false"/>
-                <w:iCs w:val="false"/>
-                <w:color w:val="000000"/>
-                <w:sz w:val="18"/>
-                <w:szCs w:val="18"/>
-              </w:rPr>
-              <w:t xml:space="preserve">Phase 3 — Explain</w:t>
+            <w:shd w:fill="E2EFDA" w:color="auto" w:val="clear"/>
+            <w:tcMar>
+              <w:top w:type="dxa" w:w="60"/>
+              <w:left w:type="dxa" w:w="120"/>
+              <w:bottom w:type="dxa" w:w="60"/>
+              <w:right w:type="dxa" w:w="120"/>
+            </w:tcMar>
+            <w:vAlign w:val="top"/>
+          </w:tcPr>
+          <w:p>
+            <w:pPr>
+              <w:spacing w:after="40" w:before="0"/>
+              <w:jc w:val="left"/>
+            </w:pPr>
+            <w:r>
+              <w:rPr>
+                <w:rFonts w:ascii="Arial" w:cs="Arial" w:eastAsia="Arial" w:hAnsi="Arial"/>
+                <w:b/>
+                <w:bCs/>
+                <w:i w:val="false"/>
+                <w:iCs w:val="false"/>
+                <w:color w:val="000000"/>
+                <w:sz w:val="18"/>
+                <w:szCs w:val="18"/>
+              </w:rPr>
+              <w:t xml:space="preserve">Explain Phase</w:t>
             </w:r>
           </w:p>
           <w:p>
@@ -21469,7 +21505,7 @@
             <w:pPr>
               <w:spacing w:after="20" w:before="0"/>
             </w:pPr>
-            <w:hyperlink w:history="1" r:id="rId7ouxolucy9hlrmrlpatp8">
+            <w:hyperlink w:history="1" r:id="rIdija1dnpv9om5wl81mrfxq">
               <w:r>
                 <w:rPr>
                   <w:rFonts w:ascii="Arial" w:cs="Arial" w:eastAsia="Arial" w:hAnsi="Arial"/>
@@ -21502,7 +21538,7 @@
               <w:spacing w:after="10" w:before="0"/>
               <w:ind w:left="120"/>
             </w:pPr>
-            <w:hyperlink w:history="1" r:id="rIdfouve4kgc75_bclbuw0li">
+            <w:hyperlink w:history="1" r:id="rIdqhnsun2ohosp83fs6evvo">
               <w:r>
                 <w:rPr>
                   <w:rFonts w:ascii="Arial" w:cs="Arial" w:eastAsia="Arial" w:hAnsi="Arial"/>
@@ -21547,7 +21583,7 @@
             <w:pPr>
               <w:spacing w:after="20" w:before="0"/>
             </w:pPr>
-            <w:hyperlink w:history="1" r:id="rIdbuvvfgnscqhxy6ev2zjjg">
+            <w:hyperlink w:history="1" r:id="rIdboe5xk1uzhn9py5qh7gox">
               <w:r>
                 <w:rPr>
                   <w:rFonts w:ascii="Arial" w:cs="Arial" w:eastAsia="Arial" w:hAnsi="Arial"/>
@@ -21580,7 +21616,7 @@
               <w:spacing w:after="10" w:before="0"/>
               <w:ind w:left="120"/>
             </w:pPr>
-            <w:hyperlink w:history="1" r:id="rIdv4lkkhunppkont3wivn2g">
+            <w:hyperlink w:history="1" r:id="rIdyqo8m4zaszzuwkg00f_3z">
               <w:r>
                 <w:rPr>
                   <w:rFonts w:ascii="Arial" w:cs="Arial" w:eastAsia="Arial" w:hAnsi="Arial"/>
@@ -21727,32 +21763,32 @@
         <w:tc>
           <w:tcPr>
             <w:tcW w:type="dxa" w:w="1520"/>
-            <w:shd w:fill="F2F2F2" w:color="auto" w:val="clear"/>
-            <w:tcMar>
-              <w:top w:type="dxa" w:w="60"/>
-              <w:left w:type="dxa" w:w="120"/>
-              <w:bottom w:type="dxa" w:w="60"/>
-              <w:right w:type="dxa" w:w="120"/>
-            </w:tcMar>
-            <w:vAlign w:val="top"/>
-          </w:tcPr>
-          <w:p>
-            <w:pPr>
-              <w:spacing w:after="40" w:before="0"/>
-              <w:jc w:val="left"/>
-            </w:pPr>
-            <w:r>
-              <w:rPr>
-                <w:rFonts w:ascii="Arial" w:cs="Arial" w:eastAsia="Arial" w:hAnsi="Arial"/>
-                <w:b/>
-                <w:bCs/>
-                <w:i w:val="false"/>
-                <w:iCs w:val="false"/>
-                <w:color w:val="000000"/>
-                <w:sz w:val="18"/>
-                <w:szCs w:val="18"/>
-              </w:rPr>
-              <w:t xml:space="preserve">Phase 4 — Driving Question Board (DQB) Update</w:t>
+            <w:shd w:fill="FCE4D6" w:color="auto" w:val="clear"/>
+            <w:tcMar>
+              <w:top w:type="dxa" w:w="60"/>
+              <w:left w:type="dxa" w:w="120"/>
+              <w:bottom w:type="dxa" w:w="60"/>
+              <w:right w:type="dxa" w:w="120"/>
+            </w:tcMar>
+            <w:vAlign w:val="top"/>
+          </w:tcPr>
+          <w:p>
+            <w:pPr>
+              <w:spacing w:after="40" w:before="0"/>
+              <w:jc w:val="left"/>
+            </w:pPr>
+            <w:r>
+              <w:rPr>
+                <w:rFonts w:ascii="Arial" w:cs="Arial" w:eastAsia="Arial" w:hAnsi="Arial"/>
+                <w:b/>
+                <w:bCs/>
+                <w:i w:val="false"/>
+                <w:iCs w:val="false"/>
+                <w:color w:val="000000"/>
+                <w:sz w:val="18"/>
+                <w:szCs w:val="18"/>
+              </w:rPr>
+              <w:t xml:space="preserve">Driving Question Board (DQB) Creation</w:t>
             </w:r>
           </w:p>
           <w:p>
@@ -21775,7 +21811,7 @@
             <w:pPr>
               <w:spacing w:after="20" w:before="0"/>
             </w:pPr>
-            <w:hyperlink w:history="1" r:id="rIdilbvvf-qgshv6mjpwrbbd">
+            <w:hyperlink w:history="1" r:id="rIdetbzm8u_ogfbbzbnslzip">
               <w:r>
                 <w:rPr>
                   <w:rFonts w:ascii="Arial" w:cs="Arial" w:eastAsia="Arial" w:hAnsi="Arial"/>
@@ -21808,7 +21844,7 @@
               <w:spacing w:after="10" w:before="0"/>
               <w:ind w:left="120"/>
             </w:pPr>
-            <w:hyperlink w:history="1" r:id="rIdangm9_394h4z832-wam4w">
+            <w:hyperlink w:history="1" r:id="rIdvd_-jgkuao0gensirrzms">
               <w:r>
                 <w:rPr>
                   <w:rFonts w:ascii="Arial" w:cs="Arial" w:eastAsia="Arial" w:hAnsi="Arial"/>
@@ -21853,7 +21889,7 @@
             <w:pPr>
               <w:spacing w:after="20" w:before="0"/>
             </w:pPr>
-            <w:hyperlink w:history="1" r:id="rId9o_daptl6gqtfbnagioum">
+            <w:hyperlink w:history="1" r:id="rIdn2r23kgcv2-6nuet8dsla">
               <w:r>
                 <w:rPr>
                   <w:rFonts w:ascii="Arial" w:cs="Arial" w:eastAsia="Arial" w:hAnsi="Arial"/>
@@ -21886,7 +21922,7 @@
               <w:spacing w:after="10" w:before="0"/>
               <w:ind w:left="120"/>
             </w:pPr>
-            <w:hyperlink w:history="1" r:id="rIdq-mf_me-u-t0ogugop9av">
+            <w:hyperlink w:history="1" r:id="rIdd-d9emr6h_p8apxmcxv9n">
               <w:r>
                 <w:rPr>
                   <w:rFonts w:ascii="Arial" w:cs="Arial" w:eastAsia="Arial" w:hAnsi="Arial"/>
@@ -22033,32 +22069,32 @@
         <w:tc>
           <w:tcPr>
             <w:tcW w:type="dxa" w:w="1520"/>
-            <w:shd w:fill="F2F2F2" w:color="auto" w:val="clear"/>
-            <w:tcMar>
-              <w:top w:type="dxa" w:w="60"/>
-              <w:left w:type="dxa" w:w="120"/>
-              <w:bottom w:type="dxa" w:w="60"/>
-              <w:right w:type="dxa" w:w="120"/>
-            </w:tcMar>
-            <w:vAlign w:val="top"/>
-          </w:tcPr>
-          <w:p>
-            <w:pPr>
-              <w:spacing w:after="40" w:before="0"/>
-              <w:jc w:val="left"/>
-            </w:pPr>
-            <w:r>
-              <w:rPr>
-                <w:rFonts w:ascii="Arial" w:cs="Arial" w:eastAsia="Arial" w:hAnsi="Arial"/>
-                <w:b/>
-                <w:bCs/>
-                <w:i w:val="false"/>
-                <w:iCs w:val="false"/>
-                <w:color w:val="000000"/>
-                <w:sz w:val="18"/>
-                <w:szCs w:val="18"/>
-              </w:rPr>
-              <w:t xml:space="preserve">Phase 5 — Model Building</w:t>
+            <w:shd w:fill="D5E8F0" w:color="auto" w:val="clear"/>
+            <w:tcMar>
+              <w:top w:type="dxa" w:w="60"/>
+              <w:left w:type="dxa" w:w="120"/>
+              <w:bottom w:type="dxa" w:w="60"/>
+              <w:right w:type="dxa" w:w="120"/>
+            </w:tcMar>
+            <w:vAlign w:val="top"/>
+          </w:tcPr>
+          <w:p>
+            <w:pPr>
+              <w:spacing w:after="40" w:before="0"/>
+              <w:jc w:val="left"/>
+            </w:pPr>
+            <w:r>
+              <w:rPr>
+                <w:rFonts w:ascii="Arial" w:cs="Arial" w:eastAsia="Arial" w:hAnsi="Arial"/>
+                <w:b/>
+                <w:bCs/>
+                <w:i w:val="false"/>
+                <w:iCs w:val="false"/>
+                <w:color w:val="000000"/>
+                <w:sz w:val="18"/>
+                <w:szCs w:val="18"/>
+              </w:rPr>
+              <w:t xml:space="preserve">Model Building Phase</w:t>
             </w:r>
           </w:p>
           <w:p>
@@ -22081,7 +22117,7 @@
             <w:pPr>
               <w:spacing w:after="20" w:before="0"/>
             </w:pPr>
-            <w:hyperlink w:history="1" r:id="rIdawy_bxxiz_aknxleimac-">
+            <w:hyperlink w:history="1" r:id="rIdscq9872nscph5_xaazvid">
               <w:r>
                 <w:rPr>
                   <w:rFonts w:ascii="Arial" w:cs="Arial" w:eastAsia="Arial" w:hAnsi="Arial"/>
@@ -22114,7 +22150,7 @@
               <w:spacing w:after="10" w:before="0"/>
               <w:ind w:left="120"/>
             </w:pPr>
-            <w:hyperlink w:history="1" r:id="rId0o6brxwqw2skyfot5ozdz">
+            <w:hyperlink w:history="1" r:id="rIdjpwzpfhkmu_8oupwho2tg">
               <w:r>
                 <w:rPr>
                   <w:rFonts w:ascii="Arial" w:cs="Arial" w:eastAsia="Arial" w:hAnsi="Arial"/>
@@ -22159,7 +22195,7 @@
             <w:pPr>
               <w:spacing w:after="20" w:before="0"/>
             </w:pPr>
-            <w:hyperlink w:history="1" r:id="rIdg9wzdmvjl-7ewaqh7pzx-">
+            <w:hyperlink w:history="1" r:id="rIdjjgn-yotmvvhx8wcykoiw">
               <w:r>
                 <w:rPr>
                   <w:rFonts w:ascii="Arial" w:cs="Arial" w:eastAsia="Arial" w:hAnsi="Arial"/>
@@ -22192,7 +22228,7 @@
               <w:spacing w:after="10" w:before="0"/>
               <w:ind w:left="120"/>
             </w:pPr>
-            <w:hyperlink w:history="1" r:id="rIdlxkrofzlxvfs_avod4ja4">
+            <w:hyperlink w:history="1" r:id="rIdmtheyecn9tnplnak-hokz">
               <w:r>
                 <w:rPr>
                   <w:rFonts w:ascii="Arial" w:cs="Arial" w:eastAsia="Arial" w:hAnsi="Arial"/>
@@ -23745,32 +23781,32 @@
         <w:tc>
           <w:tcPr>
             <w:tcW w:type="dxa" w:w="1520"/>
-            <w:shd w:fill="F2F2F2" w:color="auto" w:val="clear"/>
-            <w:tcMar>
-              <w:top w:type="dxa" w:w="60"/>
-              <w:left w:type="dxa" w:w="120"/>
-              <w:bottom w:type="dxa" w:w="60"/>
-              <w:right w:type="dxa" w:w="120"/>
-            </w:tcMar>
-            <w:vAlign w:val="top"/>
-          </w:tcPr>
-          <w:p>
-            <w:pPr>
-              <w:spacing w:after="40" w:before="0"/>
-              <w:jc w:val="left"/>
-            </w:pPr>
-            <w:r>
-              <w:rPr>
-                <w:rFonts w:ascii="Arial" w:cs="Arial" w:eastAsia="Arial" w:hAnsi="Arial"/>
-                <w:b/>
-                <w:bCs/>
-                <w:i w:val="false"/>
-                <w:iCs w:val="false"/>
-                <w:color w:val="000000"/>
-                <w:sz w:val="18"/>
-                <w:szCs w:val="18"/>
-              </w:rPr>
-              <w:t xml:space="preserve">Phase 1 — Predict</w:t>
+            <w:shd w:fill="EAD1F5" w:color="auto" w:val="clear"/>
+            <w:tcMar>
+              <w:top w:type="dxa" w:w="60"/>
+              <w:left w:type="dxa" w:w="120"/>
+              <w:bottom w:type="dxa" w:w="60"/>
+              <w:right w:type="dxa" w:w="120"/>
+            </w:tcMar>
+            <w:vAlign w:val="top"/>
+          </w:tcPr>
+          <w:p>
+            <w:pPr>
+              <w:spacing w:after="40" w:before="0"/>
+              <w:jc w:val="left"/>
+            </w:pPr>
+            <w:r>
+              <w:rPr>
+                <w:rFonts w:ascii="Arial" w:cs="Arial" w:eastAsia="Arial" w:hAnsi="Arial"/>
+                <w:b/>
+                <w:bCs/>
+                <w:i w:val="false"/>
+                <w:iCs w:val="false"/>
+                <w:color w:val="000000"/>
+                <w:sz w:val="18"/>
+                <w:szCs w:val="18"/>
+              </w:rPr>
+              <w:t xml:space="preserve">Predict Phase</w:t>
             </w:r>
           </w:p>
           <w:p>
@@ -23793,7 +23829,7 @@
             <w:pPr>
               <w:spacing w:after="20" w:before="0"/>
             </w:pPr>
-            <w:hyperlink w:history="1" r:id="rIddv7nlsqedvxo8q3u6nqlr">
+            <w:hyperlink w:history="1" r:id="rId50ajtly80pp4ylrrrt56e">
               <w:r>
                 <w:rPr>
                   <w:rFonts w:ascii="Arial" w:cs="Arial" w:eastAsia="Arial" w:hAnsi="Arial"/>
@@ -23826,7 +23862,7 @@
               <w:spacing w:after="10" w:before="0"/>
               <w:ind w:left="120"/>
             </w:pPr>
-            <w:hyperlink w:history="1" r:id="rIdpw4aur__zwqnfkqfjmcko">
+            <w:hyperlink w:history="1" r:id="rId2noi0k16zcd4e8btferxt">
               <w:r>
                 <w:rPr>
                   <w:rFonts w:ascii="Arial" w:cs="Arial" w:eastAsia="Arial" w:hAnsi="Arial"/>
@@ -23871,7 +23907,7 @@
             <w:pPr>
               <w:spacing w:after="20" w:before="0"/>
             </w:pPr>
-            <w:hyperlink w:history="1" r:id="rIdeaqg8-3gqyjzyxxzgkofp">
+            <w:hyperlink w:history="1" r:id="rIdacoqmmixsisfxhvr1tsc6">
               <w:r>
                 <w:rPr>
                   <w:rFonts w:ascii="Arial" w:cs="Arial" w:eastAsia="Arial" w:hAnsi="Arial"/>
@@ -23904,7 +23940,7 @@
               <w:spacing w:after="10" w:before="0"/>
               <w:ind w:left="120"/>
             </w:pPr>
-            <w:hyperlink w:history="1" r:id="rIducqw46r_clesjfccmaker">
+            <w:hyperlink w:history="1" r:id="rIddsfnc9peeabxrlspxo7_c">
               <w:r>
                 <w:rPr>
                   <w:rFonts w:ascii="Arial" w:cs="Arial" w:eastAsia="Arial" w:hAnsi="Arial"/>
@@ -24051,32 +24087,32 @@
         <w:tc>
           <w:tcPr>
             <w:tcW w:type="dxa" w:w="1520"/>
-            <w:shd w:fill="F2F2F2" w:color="auto" w:val="clear"/>
-            <w:tcMar>
-              <w:top w:type="dxa" w:w="60"/>
-              <w:left w:type="dxa" w:w="120"/>
-              <w:bottom w:type="dxa" w:w="60"/>
-              <w:right w:type="dxa" w:w="120"/>
-            </w:tcMar>
-            <w:vAlign w:val="top"/>
-          </w:tcPr>
-          <w:p>
-            <w:pPr>
-              <w:spacing w:after="40" w:before="0"/>
-              <w:jc w:val="left"/>
-            </w:pPr>
-            <w:r>
-              <w:rPr>
-                <w:rFonts w:ascii="Arial" w:cs="Arial" w:eastAsia="Arial" w:hAnsi="Arial"/>
-                <w:b/>
-                <w:bCs/>
-                <w:i w:val="false"/>
-                <w:iCs w:val="false"/>
-                <w:color w:val="000000"/>
-                <w:sz w:val="18"/>
-                <w:szCs w:val="18"/>
-              </w:rPr>
-              <w:t xml:space="preserve">Phase 2 — Observe</w:t>
+            <w:shd w:fill="D9EEF1" w:color="auto" w:val="clear"/>
+            <w:tcMar>
+              <w:top w:type="dxa" w:w="60"/>
+              <w:left w:type="dxa" w:w="120"/>
+              <w:bottom w:type="dxa" w:w="60"/>
+              <w:right w:type="dxa" w:w="120"/>
+            </w:tcMar>
+            <w:vAlign w:val="top"/>
+          </w:tcPr>
+          <w:p>
+            <w:pPr>
+              <w:spacing w:after="40" w:before="0"/>
+              <w:jc w:val="left"/>
+            </w:pPr>
+            <w:r>
+              <w:rPr>
+                <w:rFonts w:ascii="Arial" w:cs="Arial" w:eastAsia="Arial" w:hAnsi="Arial"/>
+                <w:b/>
+                <w:bCs/>
+                <w:i w:val="false"/>
+                <w:iCs w:val="false"/>
+                <w:color w:val="000000"/>
+                <w:sz w:val="18"/>
+                <w:szCs w:val="18"/>
+              </w:rPr>
+              <w:t xml:space="preserve">Observe Phase</w:t>
             </w:r>
           </w:p>
           <w:p>
@@ -24099,7 +24135,7 @@
             <w:pPr>
               <w:spacing w:after="20" w:before="0"/>
             </w:pPr>
-            <w:hyperlink w:history="1" r:id="rIdyttrebki7784xt8uhgich">
+            <w:hyperlink w:history="1" r:id="rIdvvfjvunlopr0-wms7mbc8">
               <w:r>
                 <w:rPr>
                   <w:rFonts w:ascii="Arial" w:cs="Arial" w:eastAsia="Arial" w:hAnsi="Arial"/>
@@ -24132,7 +24168,7 @@
               <w:spacing w:after="10" w:before="0"/>
               <w:ind w:left="120"/>
             </w:pPr>
-            <w:hyperlink w:history="1" r:id="rIdp8drdezykac03x6bu4pu1">
+            <w:hyperlink w:history="1" r:id="rIdebloax3ieewzctgucnhk_">
               <w:r>
                 <w:rPr>
                   <w:rFonts w:ascii="Arial" w:cs="Arial" w:eastAsia="Arial" w:hAnsi="Arial"/>
@@ -24177,7 +24213,7 @@
             <w:pPr>
               <w:spacing w:after="20" w:before="0"/>
             </w:pPr>
-            <w:hyperlink w:history="1" r:id="rIdoo6awkmthrm0zjyqwrfor">
+            <w:hyperlink w:history="1" r:id="rId1ruynbu6saoa_4zctqm_6">
               <w:r>
                 <w:rPr>
                   <w:rFonts w:ascii="Arial" w:cs="Arial" w:eastAsia="Arial" w:hAnsi="Arial"/>
@@ -24210,7 +24246,7 @@
               <w:spacing w:after="10" w:before="0"/>
               <w:ind w:left="120"/>
             </w:pPr>
-            <w:hyperlink w:history="1" r:id="rIdnzrkyggpm9nqytunysfkv">
+            <w:hyperlink w:history="1" r:id="rIdsdsnltwxw4tb1vmusdo8m">
               <w:r>
                 <w:rPr>
                   <w:rFonts w:ascii="Arial" w:cs="Arial" w:eastAsia="Arial" w:hAnsi="Arial"/>
@@ -24357,32 +24393,32 @@
         <w:tc>
           <w:tcPr>
             <w:tcW w:type="dxa" w:w="1520"/>
-            <w:shd w:fill="F2F2F2" w:color="auto" w:val="clear"/>
-            <w:tcMar>
-              <w:top w:type="dxa" w:w="60"/>
-              <w:left w:type="dxa" w:w="120"/>
-              <w:bottom w:type="dxa" w:w="60"/>
-              <w:right w:type="dxa" w:w="120"/>
-            </w:tcMar>
-            <w:vAlign w:val="top"/>
-          </w:tcPr>
-          <w:p>
-            <w:pPr>
-              <w:spacing w:after="40" w:before="0"/>
-              <w:jc w:val="left"/>
-            </w:pPr>
-            <w:r>
-              <w:rPr>
-                <w:rFonts w:ascii="Arial" w:cs="Arial" w:eastAsia="Arial" w:hAnsi="Arial"/>
-                <w:b/>
-                <w:bCs/>
-                <w:i w:val="false"/>
-                <w:iCs w:val="false"/>
-                <w:color w:val="000000"/>
-                <w:sz w:val="18"/>
-                <w:szCs w:val="18"/>
-              </w:rPr>
-              <w:t xml:space="preserve">Phase 3 — Explain</w:t>
+            <w:shd w:fill="E2EFDA" w:color="auto" w:val="clear"/>
+            <w:tcMar>
+              <w:top w:type="dxa" w:w="60"/>
+              <w:left w:type="dxa" w:w="120"/>
+              <w:bottom w:type="dxa" w:w="60"/>
+              <w:right w:type="dxa" w:w="120"/>
+            </w:tcMar>
+            <w:vAlign w:val="top"/>
+          </w:tcPr>
+          <w:p>
+            <w:pPr>
+              <w:spacing w:after="40" w:before="0"/>
+              <w:jc w:val="left"/>
+            </w:pPr>
+            <w:r>
+              <w:rPr>
+                <w:rFonts w:ascii="Arial" w:cs="Arial" w:eastAsia="Arial" w:hAnsi="Arial"/>
+                <w:b/>
+                <w:bCs/>
+                <w:i w:val="false"/>
+                <w:iCs w:val="false"/>
+                <w:color w:val="000000"/>
+                <w:sz w:val="18"/>
+                <w:szCs w:val="18"/>
+              </w:rPr>
+              <w:t xml:space="preserve">Explain Phase</w:t>
             </w:r>
           </w:p>
           <w:p>
@@ -24405,7 +24441,7 @@
             <w:pPr>
               <w:spacing w:after="20" w:before="0"/>
             </w:pPr>
-            <w:hyperlink w:history="1" r:id="rId38umplpdon1o8uiapx5n3">
+            <w:hyperlink w:history="1" r:id="rId85hty9fck1mrs-p-b5mvz">
               <w:r>
                 <w:rPr>
                   <w:rFonts w:ascii="Arial" w:cs="Arial" w:eastAsia="Arial" w:hAnsi="Arial"/>
@@ -24438,7 +24474,7 @@
               <w:spacing w:after="10" w:before="0"/>
               <w:ind w:left="120"/>
             </w:pPr>
-            <w:hyperlink w:history="1" r:id="rIdvairxengmzrb8kkxp7vko">
+            <w:hyperlink w:history="1" r:id="rIdik33uz_jb0ubmsydvfw_f">
               <w:r>
                 <w:rPr>
                   <w:rFonts w:ascii="Arial" w:cs="Arial" w:eastAsia="Arial" w:hAnsi="Arial"/>
@@ -24483,7 +24519,7 @@
             <w:pPr>
               <w:spacing w:after="20" w:before="0"/>
             </w:pPr>
-            <w:hyperlink w:history="1" r:id="rId2f7hnntajfnputuskjzlp">
+            <w:hyperlink w:history="1" r:id="rIdl_8xxu7wkhr3swnm8sydd">
               <w:r>
                 <w:rPr>
                   <w:rFonts w:ascii="Arial" w:cs="Arial" w:eastAsia="Arial" w:hAnsi="Arial"/>
@@ -24516,7 +24552,7 @@
               <w:spacing w:after="10" w:before="0"/>
               <w:ind w:left="120"/>
             </w:pPr>
-            <w:hyperlink w:history="1" r:id="rId6yknrbyl5pm0unz5hws-q">
+            <w:hyperlink w:history="1" r:id="rIdhvnyrxnwdxrmdw4bjkb-_">
               <w:r>
                 <w:rPr>
                   <w:rFonts w:ascii="Arial" w:cs="Arial" w:eastAsia="Arial" w:hAnsi="Arial"/>
@@ -24663,32 +24699,32 @@
         <w:tc>
           <w:tcPr>
             <w:tcW w:type="dxa" w:w="1520"/>
-            <w:shd w:fill="F2F2F2" w:color="auto" w:val="clear"/>
-            <w:tcMar>
-              <w:top w:type="dxa" w:w="60"/>
-              <w:left w:type="dxa" w:w="120"/>
-              <w:bottom w:type="dxa" w:w="60"/>
-              <w:right w:type="dxa" w:w="120"/>
-            </w:tcMar>
-            <w:vAlign w:val="top"/>
-          </w:tcPr>
-          <w:p>
-            <w:pPr>
-              <w:spacing w:after="40" w:before="0"/>
-              <w:jc w:val="left"/>
-            </w:pPr>
-            <w:r>
-              <w:rPr>
-                <w:rFonts w:ascii="Arial" w:cs="Arial" w:eastAsia="Arial" w:hAnsi="Arial"/>
-                <w:b/>
-                <w:bCs/>
-                <w:i w:val="false"/>
-                <w:iCs w:val="false"/>
-                <w:color w:val="000000"/>
-                <w:sz w:val="18"/>
-                <w:szCs w:val="18"/>
-              </w:rPr>
-              <w:t xml:space="preserve">Phase 4 — Driving Question Board (DQB) Update</w:t>
+            <w:shd w:fill="FCE4D6" w:color="auto" w:val="clear"/>
+            <w:tcMar>
+              <w:top w:type="dxa" w:w="60"/>
+              <w:left w:type="dxa" w:w="120"/>
+              <w:bottom w:type="dxa" w:w="60"/>
+              <w:right w:type="dxa" w:w="120"/>
+            </w:tcMar>
+            <w:vAlign w:val="top"/>
+          </w:tcPr>
+          <w:p>
+            <w:pPr>
+              <w:spacing w:after="40" w:before="0"/>
+              <w:jc w:val="left"/>
+            </w:pPr>
+            <w:r>
+              <w:rPr>
+                <w:rFonts w:ascii="Arial" w:cs="Arial" w:eastAsia="Arial" w:hAnsi="Arial"/>
+                <w:b/>
+                <w:bCs/>
+                <w:i w:val="false"/>
+                <w:iCs w:val="false"/>
+                <w:color w:val="000000"/>
+                <w:sz w:val="18"/>
+                <w:szCs w:val="18"/>
+              </w:rPr>
+              <w:t xml:space="preserve">Driving Question Board (DQB) Creation</w:t>
             </w:r>
           </w:p>
           <w:p>
@@ -24711,7 +24747,7 @@
             <w:pPr>
               <w:spacing w:after="20" w:before="0"/>
             </w:pPr>
-            <w:hyperlink w:history="1" r:id="rId9p-mq7eowugnwhqtcvheq">
+            <w:hyperlink w:history="1" r:id="rIdkzaop0teakj36m6ugeznv">
               <w:r>
                 <w:rPr>
                   <w:rFonts w:ascii="Arial" w:cs="Arial" w:eastAsia="Arial" w:hAnsi="Arial"/>
@@ -24744,7 +24780,7 @@
               <w:spacing w:after="10" w:before="0"/>
               <w:ind w:left="120"/>
             </w:pPr>
-            <w:hyperlink w:history="1" r:id="rId4gqlud8au90prrwsue_do">
+            <w:hyperlink w:history="1" r:id="rIdriynuw_dxeobbdthijzcr">
               <w:r>
                 <w:rPr>
                   <w:rFonts w:ascii="Arial" w:cs="Arial" w:eastAsia="Arial" w:hAnsi="Arial"/>
@@ -24789,7 +24825,7 @@
             <w:pPr>
               <w:spacing w:after="20" w:before="0"/>
             </w:pPr>
-            <w:hyperlink w:history="1" r:id="rIdh3_3r7trv6djnutnyglub">
+            <w:hyperlink w:history="1" r:id="rIdsh5hiwddnifp_kxxvyopa">
               <w:r>
                 <w:rPr>
                   <w:rFonts w:ascii="Arial" w:cs="Arial" w:eastAsia="Arial" w:hAnsi="Arial"/>
@@ -24822,7 +24858,7 @@
               <w:spacing w:after="10" w:before="0"/>
               <w:ind w:left="120"/>
             </w:pPr>
-            <w:hyperlink w:history="1" r:id="rIdpdg6bthhlqwukdwirdnrm">
+            <w:hyperlink w:history="1" r:id="rIde4q5gkcqvhtoxjctjncex">
               <w:r>
                 <w:rPr>
                   <w:rFonts w:ascii="Arial" w:cs="Arial" w:eastAsia="Arial" w:hAnsi="Arial"/>
@@ -24969,32 +25005,32 @@
         <w:tc>
           <w:tcPr>
             <w:tcW w:type="dxa" w:w="1520"/>
-            <w:shd w:fill="F2F2F2" w:color="auto" w:val="clear"/>
-            <w:tcMar>
-              <w:top w:type="dxa" w:w="60"/>
-              <w:left w:type="dxa" w:w="120"/>
-              <w:bottom w:type="dxa" w:w="60"/>
-              <w:right w:type="dxa" w:w="120"/>
-            </w:tcMar>
-            <w:vAlign w:val="top"/>
-          </w:tcPr>
-          <w:p>
-            <w:pPr>
-              <w:spacing w:after="40" w:before="0"/>
-              <w:jc w:val="left"/>
-            </w:pPr>
-            <w:r>
-              <w:rPr>
-                <w:rFonts w:ascii="Arial" w:cs="Arial" w:eastAsia="Arial" w:hAnsi="Arial"/>
-                <w:b/>
-                <w:bCs/>
-                <w:i w:val="false"/>
-                <w:iCs w:val="false"/>
-                <w:color w:val="000000"/>
-                <w:sz w:val="18"/>
-                <w:szCs w:val="18"/>
-              </w:rPr>
-              <w:t xml:space="preserve">Phase 5 — Model Building</w:t>
+            <w:shd w:fill="D5E8F0" w:color="auto" w:val="clear"/>
+            <w:tcMar>
+              <w:top w:type="dxa" w:w="60"/>
+              <w:left w:type="dxa" w:w="120"/>
+              <w:bottom w:type="dxa" w:w="60"/>
+              <w:right w:type="dxa" w:w="120"/>
+            </w:tcMar>
+            <w:vAlign w:val="top"/>
+          </w:tcPr>
+          <w:p>
+            <w:pPr>
+              <w:spacing w:after="40" w:before="0"/>
+              <w:jc w:val="left"/>
+            </w:pPr>
+            <w:r>
+              <w:rPr>
+                <w:rFonts w:ascii="Arial" w:cs="Arial" w:eastAsia="Arial" w:hAnsi="Arial"/>
+                <w:b/>
+                <w:bCs/>
+                <w:i w:val="false"/>
+                <w:iCs w:val="false"/>
+                <w:color w:val="000000"/>
+                <w:sz w:val="18"/>
+                <w:szCs w:val="18"/>
+              </w:rPr>
+              <w:t xml:space="preserve">Model Building Phase</w:t>
             </w:r>
           </w:p>
           <w:p>
@@ -25017,7 +25053,7 @@
             <w:pPr>
               <w:spacing w:after="20" w:before="0"/>
             </w:pPr>
-            <w:hyperlink w:history="1" r:id="rIdd7fpzahileuwt4vorqmze">
+            <w:hyperlink w:history="1" r:id="rIdpdaim8ctantzebarqdcu7">
               <w:r>
                 <w:rPr>
                   <w:rFonts w:ascii="Arial" w:cs="Arial" w:eastAsia="Arial" w:hAnsi="Arial"/>
@@ -25050,7 +25086,7 @@
               <w:spacing w:after="10" w:before="0"/>
               <w:ind w:left="120"/>
             </w:pPr>
-            <w:hyperlink w:history="1" r:id="rIdufeycfmgj79htig6r4wbp">
+            <w:hyperlink w:history="1" r:id="rIdfhhc9huxigf1lgvqoud98">
               <w:r>
                 <w:rPr>
                   <w:rFonts w:ascii="Arial" w:cs="Arial" w:eastAsia="Arial" w:hAnsi="Arial"/>
@@ -25095,7 +25131,7 @@
             <w:pPr>
               <w:spacing w:after="20" w:before="0"/>
             </w:pPr>
-            <w:hyperlink w:history="1" r:id="rIdyks-yfulduj8zhuo_pd4z">
+            <w:hyperlink w:history="1" r:id="rIdlr1viphsslailbg7fzjwt">
               <w:r>
                 <w:rPr>
                   <w:rFonts w:ascii="Arial" w:cs="Arial" w:eastAsia="Arial" w:hAnsi="Arial"/>
@@ -25128,7 +25164,7 @@
               <w:spacing w:after="10" w:before="0"/>
               <w:ind w:left="120"/>
             </w:pPr>
-            <w:hyperlink w:history="1" r:id="rIdbaxarbvglhordgmtrj7pd">
+            <w:hyperlink w:history="1" r:id="rIdrhgjk_vkgo7rjoacsbshl">
               <w:r>
                 <w:rPr>
                   <w:rFonts w:ascii="Arial" w:cs="Arial" w:eastAsia="Arial" w:hAnsi="Arial"/>
@@ -26662,32 +26698,32 @@
         <w:tc>
           <w:tcPr>
             <w:tcW w:type="dxa" w:w="1520"/>
-            <w:shd w:fill="F2F2F2" w:color="auto" w:val="clear"/>
-            <w:tcMar>
-              <w:top w:type="dxa" w:w="60"/>
-              <w:left w:type="dxa" w:w="120"/>
-              <w:bottom w:type="dxa" w:w="60"/>
-              <w:right w:type="dxa" w:w="120"/>
-            </w:tcMar>
-            <w:vAlign w:val="top"/>
-          </w:tcPr>
-          <w:p>
-            <w:pPr>
-              <w:spacing w:after="40" w:before="0"/>
-              <w:jc w:val="left"/>
-            </w:pPr>
-            <w:r>
-              <w:rPr>
-                <w:rFonts w:ascii="Arial" w:cs="Arial" w:eastAsia="Arial" w:hAnsi="Arial"/>
-                <w:b/>
-                <w:bCs/>
-                <w:i w:val="false"/>
-                <w:iCs w:val="false"/>
-                <w:color w:val="000000"/>
-                <w:sz w:val="18"/>
-                <w:szCs w:val="18"/>
-              </w:rPr>
-              <w:t xml:space="preserve">Phase 1 — Predict</w:t>
+            <w:shd w:fill="EAD1F5" w:color="auto" w:val="clear"/>
+            <w:tcMar>
+              <w:top w:type="dxa" w:w="60"/>
+              <w:left w:type="dxa" w:w="120"/>
+              <w:bottom w:type="dxa" w:w="60"/>
+              <w:right w:type="dxa" w:w="120"/>
+            </w:tcMar>
+            <w:vAlign w:val="top"/>
+          </w:tcPr>
+          <w:p>
+            <w:pPr>
+              <w:spacing w:after="40" w:before="0"/>
+              <w:jc w:val="left"/>
+            </w:pPr>
+            <w:r>
+              <w:rPr>
+                <w:rFonts w:ascii="Arial" w:cs="Arial" w:eastAsia="Arial" w:hAnsi="Arial"/>
+                <w:b/>
+                <w:bCs/>
+                <w:i w:val="false"/>
+                <w:iCs w:val="false"/>
+                <w:color w:val="000000"/>
+                <w:sz w:val="18"/>
+                <w:szCs w:val="18"/>
+              </w:rPr>
+              <w:t xml:space="preserve">Predict Phase</w:t>
             </w:r>
           </w:p>
           <w:p>
@@ -26710,7 +26746,7 @@
             <w:pPr>
               <w:spacing w:after="20" w:before="0"/>
             </w:pPr>
-            <w:hyperlink w:history="1" r:id="rIdi36x5zitgk3vev-hiclie">
+            <w:hyperlink w:history="1" r:id="rId22z09_icvvuhqbgnmj_bf">
               <w:r>
                 <w:rPr>
                   <w:rFonts w:ascii="Arial" w:cs="Arial" w:eastAsia="Arial" w:hAnsi="Arial"/>
@@ -26743,7 +26779,7 @@
               <w:spacing w:after="10" w:before="0"/>
               <w:ind w:left="120"/>
             </w:pPr>
-            <w:hyperlink w:history="1" r:id="rIdfy4otvjvxovk0hts1nmgd">
+            <w:hyperlink w:history="1" r:id="rIdft3s8eqh-pcp15qmqqhgy">
               <w:r>
                 <w:rPr>
                   <w:rFonts w:ascii="Arial" w:cs="Arial" w:eastAsia="Arial" w:hAnsi="Arial"/>
@@ -26788,7 +26824,7 @@
             <w:pPr>
               <w:spacing w:after="20" w:before="0"/>
             </w:pPr>
-            <w:hyperlink w:history="1" r:id="rIdwjh9ysuszohjbufdayvnw">
+            <w:hyperlink w:history="1" r:id="rId2kb9vx59nmjtrfz8g4-aw">
               <w:r>
                 <w:rPr>
                   <w:rFonts w:ascii="Arial" w:cs="Arial" w:eastAsia="Arial" w:hAnsi="Arial"/>
@@ -26821,7 +26857,7 @@
               <w:spacing w:after="10" w:before="0"/>
               <w:ind w:left="120"/>
             </w:pPr>
-            <w:hyperlink w:history="1" r:id="rIdxl6ng8sly0vtuhdjqvwgl">
+            <w:hyperlink w:history="1" r:id="rIdd-sv6gcdp7kiazy-d5ky5">
               <w:r>
                 <w:rPr>
                   <w:rFonts w:ascii="Arial" w:cs="Arial" w:eastAsia="Arial" w:hAnsi="Arial"/>
@@ -26968,32 +27004,32 @@
         <w:tc>
           <w:tcPr>
             <w:tcW w:type="dxa" w:w="1520"/>
-            <w:shd w:fill="F2F2F2" w:color="auto" w:val="clear"/>
-            <w:tcMar>
-              <w:top w:type="dxa" w:w="60"/>
-              <w:left w:type="dxa" w:w="120"/>
-              <w:bottom w:type="dxa" w:w="60"/>
-              <w:right w:type="dxa" w:w="120"/>
-            </w:tcMar>
-            <w:vAlign w:val="top"/>
-          </w:tcPr>
-          <w:p>
-            <w:pPr>
-              <w:spacing w:after="40" w:before="0"/>
-              <w:jc w:val="left"/>
-            </w:pPr>
-            <w:r>
-              <w:rPr>
-                <w:rFonts w:ascii="Arial" w:cs="Arial" w:eastAsia="Arial" w:hAnsi="Arial"/>
-                <w:b/>
-                <w:bCs/>
-                <w:i w:val="false"/>
-                <w:iCs w:val="false"/>
-                <w:color w:val="000000"/>
-                <w:sz w:val="18"/>
-                <w:szCs w:val="18"/>
-              </w:rPr>
-              <w:t xml:space="preserve">Phase 2 — Observe</w:t>
+            <w:shd w:fill="D9EEF1" w:color="auto" w:val="clear"/>
+            <w:tcMar>
+              <w:top w:type="dxa" w:w="60"/>
+              <w:left w:type="dxa" w:w="120"/>
+              <w:bottom w:type="dxa" w:w="60"/>
+              <w:right w:type="dxa" w:w="120"/>
+            </w:tcMar>
+            <w:vAlign w:val="top"/>
+          </w:tcPr>
+          <w:p>
+            <w:pPr>
+              <w:spacing w:after="40" w:before="0"/>
+              <w:jc w:val="left"/>
+            </w:pPr>
+            <w:r>
+              <w:rPr>
+                <w:rFonts w:ascii="Arial" w:cs="Arial" w:eastAsia="Arial" w:hAnsi="Arial"/>
+                <w:b/>
+                <w:bCs/>
+                <w:i w:val="false"/>
+                <w:iCs w:val="false"/>
+                <w:color w:val="000000"/>
+                <w:sz w:val="18"/>
+                <w:szCs w:val="18"/>
+              </w:rPr>
+              <w:t xml:space="preserve">Observe Phase</w:t>
             </w:r>
           </w:p>
           <w:p>
@@ -27016,7 +27052,7 @@
             <w:pPr>
               <w:spacing w:after="20" w:before="0"/>
             </w:pPr>
-            <w:hyperlink w:history="1" r:id="rIddol13swzeu74mrxvmdand">
+            <w:hyperlink w:history="1" r:id="rIds3lbr0xbnxgm9wajqppvu">
               <w:r>
                 <w:rPr>
                   <w:rFonts w:ascii="Arial" w:cs="Arial" w:eastAsia="Arial" w:hAnsi="Arial"/>
@@ -27049,7 +27085,7 @@
               <w:spacing w:after="10" w:before="0"/>
               <w:ind w:left="120"/>
             </w:pPr>
-            <w:hyperlink w:history="1" r:id="rIdtakkwf2noriuaozxmsxmw">
+            <w:hyperlink w:history="1" r:id="rIdg1ojxk5lohdzivqrxbu_v">
               <w:r>
                 <w:rPr>
                   <w:rFonts w:ascii="Arial" w:cs="Arial" w:eastAsia="Arial" w:hAnsi="Arial"/>
@@ -27094,7 +27130,7 @@
             <w:pPr>
               <w:spacing w:after="20" w:before="0"/>
             </w:pPr>
-            <w:hyperlink w:history="1" r:id="rIdjjlaevh0mrxs_mareuwrb">
+            <w:hyperlink w:history="1" r:id="rIdphf1a6zhxhorbhmc-lmfz">
               <w:r>
                 <w:rPr>
                   <w:rFonts w:ascii="Arial" w:cs="Arial" w:eastAsia="Arial" w:hAnsi="Arial"/>
@@ -27127,7 +27163,7 @@
               <w:spacing w:after="10" w:before="0"/>
               <w:ind w:left="120"/>
             </w:pPr>
-            <w:hyperlink w:history="1" r:id="rIdag0t3okmh6mbpadqb9ehf">
+            <w:hyperlink w:history="1" r:id="rIdkqn9odgcag349johumwuv">
               <w:r>
                 <w:rPr>
                   <w:rFonts w:ascii="Arial" w:cs="Arial" w:eastAsia="Arial" w:hAnsi="Arial"/>
@@ -27274,32 +27310,32 @@
         <w:tc>
           <w:tcPr>
             <w:tcW w:type="dxa" w:w="1520"/>
-            <w:shd w:fill="F2F2F2" w:color="auto" w:val="clear"/>
-            <w:tcMar>
-              <w:top w:type="dxa" w:w="60"/>
-              <w:left w:type="dxa" w:w="120"/>
-              <w:bottom w:type="dxa" w:w="60"/>
-              <w:right w:type="dxa" w:w="120"/>
-            </w:tcMar>
-            <w:vAlign w:val="top"/>
-          </w:tcPr>
-          <w:p>
-            <w:pPr>
-              <w:spacing w:after="40" w:before="0"/>
-              <w:jc w:val="left"/>
-            </w:pPr>
-            <w:r>
-              <w:rPr>
-                <w:rFonts w:ascii="Arial" w:cs="Arial" w:eastAsia="Arial" w:hAnsi="Arial"/>
-                <w:b/>
-                <w:bCs/>
-                <w:i w:val="false"/>
-                <w:iCs w:val="false"/>
-                <w:color w:val="000000"/>
-                <w:sz w:val="18"/>
-                <w:szCs w:val="18"/>
-              </w:rPr>
-              <w:t xml:space="preserve">Phase 3 — Explain</w:t>
+            <w:shd w:fill="E2EFDA" w:color="auto" w:val="clear"/>
+            <w:tcMar>
+              <w:top w:type="dxa" w:w="60"/>
+              <w:left w:type="dxa" w:w="120"/>
+              <w:bottom w:type="dxa" w:w="60"/>
+              <w:right w:type="dxa" w:w="120"/>
+            </w:tcMar>
+            <w:vAlign w:val="top"/>
+          </w:tcPr>
+          <w:p>
+            <w:pPr>
+              <w:spacing w:after="40" w:before="0"/>
+              <w:jc w:val="left"/>
+            </w:pPr>
+            <w:r>
+              <w:rPr>
+                <w:rFonts w:ascii="Arial" w:cs="Arial" w:eastAsia="Arial" w:hAnsi="Arial"/>
+                <w:b/>
+                <w:bCs/>
+                <w:i w:val="false"/>
+                <w:iCs w:val="false"/>
+                <w:color w:val="000000"/>
+                <w:sz w:val="18"/>
+                <w:szCs w:val="18"/>
+              </w:rPr>
+              <w:t xml:space="preserve">Explain Phase</w:t>
             </w:r>
           </w:p>
           <w:p>
@@ -27322,7 +27358,7 @@
             <w:pPr>
               <w:spacing w:after="20" w:before="0"/>
             </w:pPr>
-            <w:hyperlink w:history="1" r:id="rIdybyjuhva1bwvytnyixjae">
+            <w:hyperlink w:history="1" r:id="rIdxaqf8r5meziztxyhpjos9">
               <w:r>
                 <w:rPr>
                   <w:rFonts w:ascii="Arial" w:cs="Arial" w:eastAsia="Arial" w:hAnsi="Arial"/>
@@ -27355,7 +27391,7 @@
               <w:spacing w:after="10" w:before="0"/>
               <w:ind w:left="120"/>
             </w:pPr>
-            <w:hyperlink w:history="1" r:id="rId_d8xqcewindt58rjotkrh">
+            <w:hyperlink w:history="1" r:id="rIdsuo8zn-_ta6vpvrpdsjsq">
               <w:r>
                 <w:rPr>
                   <w:rFonts w:ascii="Arial" w:cs="Arial" w:eastAsia="Arial" w:hAnsi="Arial"/>
@@ -27400,7 +27436,7 @@
             <w:pPr>
               <w:spacing w:after="20" w:before="0"/>
             </w:pPr>
-            <w:hyperlink w:history="1" r:id="rIddva6u3j25rz-ggi1v9ahf">
+            <w:hyperlink w:history="1" r:id="rIdemc7yc588xrpnbxszx8gh">
               <w:r>
                 <w:rPr>
                   <w:rFonts w:ascii="Arial" w:cs="Arial" w:eastAsia="Arial" w:hAnsi="Arial"/>
@@ -27433,7 +27469,7 @@
               <w:spacing w:after="10" w:before="0"/>
               <w:ind w:left="120"/>
             </w:pPr>
-            <w:hyperlink w:history="1" r:id="rIdkh53rvnbcaz-sd0np2k6i">
+            <w:hyperlink w:history="1" r:id="rIdpmzt-mikxkbsw0nm4ip6m">
               <w:r>
                 <w:rPr>
                   <w:rFonts w:ascii="Arial" w:cs="Arial" w:eastAsia="Arial" w:hAnsi="Arial"/>
@@ -27580,32 +27616,32 @@
         <w:tc>
           <w:tcPr>
             <w:tcW w:type="dxa" w:w="1520"/>
-            <w:shd w:fill="F2F2F2" w:color="auto" w:val="clear"/>
-            <w:tcMar>
-              <w:top w:type="dxa" w:w="60"/>
-              <w:left w:type="dxa" w:w="120"/>
-              <w:bottom w:type="dxa" w:w="60"/>
-              <w:right w:type="dxa" w:w="120"/>
-            </w:tcMar>
-            <w:vAlign w:val="top"/>
-          </w:tcPr>
-          <w:p>
-            <w:pPr>
-              <w:spacing w:after="40" w:before="0"/>
-              <w:jc w:val="left"/>
-            </w:pPr>
-            <w:r>
-              <w:rPr>
-                <w:rFonts w:ascii="Arial" w:cs="Arial" w:eastAsia="Arial" w:hAnsi="Arial"/>
-                <w:b/>
-                <w:bCs/>
-                <w:i w:val="false"/>
-                <w:iCs w:val="false"/>
-                <w:color w:val="000000"/>
-                <w:sz w:val="18"/>
-                <w:szCs w:val="18"/>
-              </w:rPr>
-              <w:t xml:space="preserve">Phase 4 — Driving Question Board (DQB) Update</w:t>
+            <w:shd w:fill="FCE4D6" w:color="auto" w:val="clear"/>
+            <w:tcMar>
+              <w:top w:type="dxa" w:w="60"/>
+              <w:left w:type="dxa" w:w="120"/>
+              <w:bottom w:type="dxa" w:w="60"/>
+              <w:right w:type="dxa" w:w="120"/>
+            </w:tcMar>
+            <w:vAlign w:val="top"/>
+          </w:tcPr>
+          <w:p>
+            <w:pPr>
+              <w:spacing w:after="40" w:before="0"/>
+              <w:jc w:val="left"/>
+            </w:pPr>
+            <w:r>
+              <w:rPr>
+                <w:rFonts w:ascii="Arial" w:cs="Arial" w:eastAsia="Arial" w:hAnsi="Arial"/>
+                <w:b/>
+                <w:bCs/>
+                <w:i w:val="false"/>
+                <w:iCs w:val="false"/>
+                <w:color w:val="000000"/>
+                <w:sz w:val="18"/>
+                <w:szCs w:val="18"/>
+              </w:rPr>
+              <w:t xml:space="preserve">Driving Question Board (DQB) Creation</w:t>
             </w:r>
           </w:p>
           <w:p>
@@ -27628,7 +27664,7 @@
             <w:pPr>
               <w:spacing w:after="20" w:before="0"/>
             </w:pPr>
-            <w:hyperlink w:history="1" r:id="rIdqxxhmwe1cxdzeye8sgsrm">
+            <w:hyperlink w:history="1" r:id="rId3ywnigi1moepxid-gglt7">
               <w:r>
                 <w:rPr>
                   <w:rFonts w:ascii="Arial" w:cs="Arial" w:eastAsia="Arial" w:hAnsi="Arial"/>
@@ -27661,7 +27697,7 @@
               <w:spacing w:after="10" w:before="0"/>
               <w:ind w:left="120"/>
             </w:pPr>
-            <w:hyperlink w:history="1" r:id="rIdkxfneb5ve4l-xz8xx9uzn">
+            <w:hyperlink w:history="1" r:id="rIdlznmmllf6drsb0g6ljlkz">
               <w:r>
                 <w:rPr>
                   <w:rFonts w:ascii="Arial" w:cs="Arial" w:eastAsia="Arial" w:hAnsi="Arial"/>
@@ -27706,7 +27742,7 @@
             <w:pPr>
               <w:spacing w:after="20" w:before="0"/>
             </w:pPr>
-            <w:hyperlink w:history="1" r:id="rId_xyvdcl5akij0gbhe8kbj">
+            <w:hyperlink w:history="1" r:id="rIdbpp8zfn_2rj0daxew0gcn">
               <w:r>
                 <w:rPr>
                   <w:rFonts w:ascii="Arial" w:cs="Arial" w:eastAsia="Arial" w:hAnsi="Arial"/>
@@ -27739,7 +27775,7 @@
               <w:spacing w:after="10" w:before="0"/>
               <w:ind w:left="120"/>
             </w:pPr>
-            <w:hyperlink w:history="1" r:id="rIdjuczzabsqj-fppdpkt4zf">
+            <w:hyperlink w:history="1" r:id="rId5odpl-zlffmw2ov9ptmht">
               <w:r>
                 <w:rPr>
                   <w:rFonts w:ascii="Arial" w:cs="Arial" w:eastAsia="Arial" w:hAnsi="Arial"/>
@@ -27886,32 +27922,32 @@
         <w:tc>
           <w:tcPr>
             <w:tcW w:type="dxa" w:w="1520"/>
-            <w:shd w:fill="F2F2F2" w:color="auto" w:val="clear"/>
-            <w:tcMar>
-              <w:top w:type="dxa" w:w="60"/>
-              <w:left w:type="dxa" w:w="120"/>
-              <w:bottom w:type="dxa" w:w="60"/>
-              <w:right w:type="dxa" w:w="120"/>
-            </w:tcMar>
-            <w:vAlign w:val="top"/>
-          </w:tcPr>
-          <w:p>
-            <w:pPr>
-              <w:spacing w:after="40" w:before="0"/>
-              <w:jc w:val="left"/>
-            </w:pPr>
-            <w:r>
-              <w:rPr>
-                <w:rFonts w:ascii="Arial" w:cs="Arial" w:eastAsia="Arial" w:hAnsi="Arial"/>
-                <w:b/>
-                <w:bCs/>
-                <w:i w:val="false"/>
-                <w:iCs w:val="false"/>
-                <w:color w:val="000000"/>
-                <w:sz w:val="18"/>
-                <w:szCs w:val="18"/>
-              </w:rPr>
-              <w:t xml:space="preserve">Phase 5 — Model Building</w:t>
+            <w:shd w:fill="D5E8F0" w:color="auto" w:val="clear"/>
+            <w:tcMar>
+              <w:top w:type="dxa" w:w="60"/>
+              <w:left w:type="dxa" w:w="120"/>
+              <w:bottom w:type="dxa" w:w="60"/>
+              <w:right w:type="dxa" w:w="120"/>
+            </w:tcMar>
+            <w:vAlign w:val="top"/>
+          </w:tcPr>
+          <w:p>
+            <w:pPr>
+              <w:spacing w:after="40" w:before="0"/>
+              <w:jc w:val="left"/>
+            </w:pPr>
+            <w:r>
+              <w:rPr>
+                <w:rFonts w:ascii="Arial" w:cs="Arial" w:eastAsia="Arial" w:hAnsi="Arial"/>
+                <w:b/>
+                <w:bCs/>
+                <w:i w:val="false"/>
+                <w:iCs w:val="false"/>
+                <w:color w:val="000000"/>
+                <w:sz w:val="18"/>
+                <w:szCs w:val="18"/>
+              </w:rPr>
+              <w:t xml:space="preserve">Model Building Phase</w:t>
             </w:r>
           </w:p>
           <w:p>
@@ -27934,7 +27970,7 @@
             <w:pPr>
               <w:spacing w:after="20" w:before="0"/>
             </w:pPr>
-            <w:hyperlink w:history="1" r:id="rIdql08q4agvshmzcdx16u6s">
+            <w:hyperlink w:history="1" r:id="rIdrdip6cozfch_utbdwf1vb">
               <w:r>
                 <w:rPr>
                   <w:rFonts w:ascii="Arial" w:cs="Arial" w:eastAsia="Arial" w:hAnsi="Arial"/>
@@ -27967,7 +28003,7 @@
               <w:spacing w:after="10" w:before="0"/>
               <w:ind w:left="120"/>
             </w:pPr>
-            <w:hyperlink w:history="1" r:id="rIdezf88vrrrorpc-uthkxha">
+            <w:hyperlink w:history="1" r:id="rIdx21qyiw_ejgbpdkd7d2zy">
               <w:r>
                 <w:rPr>
                   <w:rFonts w:ascii="Arial" w:cs="Arial" w:eastAsia="Arial" w:hAnsi="Arial"/>
@@ -28012,7 +28048,7 @@
             <w:pPr>
               <w:spacing w:after="20" w:before="0"/>
             </w:pPr>
-            <w:hyperlink w:history="1" r:id="rIdsexjdrq9bvs8e_25ehp05">
+            <w:hyperlink w:history="1" r:id="rIdu_9jzmwzmfgk8yclrieix">
               <w:r>
                 <w:rPr>
                   <w:rFonts w:ascii="Arial" w:cs="Arial" w:eastAsia="Arial" w:hAnsi="Arial"/>
@@ -28045,7 +28081,7 @@
               <w:spacing w:after="10" w:before="0"/>
               <w:ind w:left="120"/>
             </w:pPr>
-            <w:hyperlink w:history="1" r:id="rIdffx5jcxn-9-cb_vljspah">
+            <w:hyperlink w:history="1" r:id="rIdrkikpcqxese4wjhmsjtae">
               <w:r>
                 <w:rPr>
                   <w:rFonts w:ascii="Arial" w:cs="Arial" w:eastAsia="Arial" w:hAnsi="Arial"/>
@@ -29484,32 +29520,32 @@
         <w:tc>
           <w:tcPr>
             <w:tcW w:type="dxa" w:w="1520"/>
-            <w:shd w:fill="F2F2F2" w:color="auto" w:val="clear"/>
-            <w:tcMar>
-              <w:top w:type="dxa" w:w="60"/>
-              <w:left w:type="dxa" w:w="120"/>
-              <w:bottom w:type="dxa" w:w="60"/>
-              <w:right w:type="dxa" w:w="120"/>
-            </w:tcMar>
-            <w:vAlign w:val="top"/>
-          </w:tcPr>
-          <w:p>
-            <w:pPr>
-              <w:spacing w:after="40" w:before="0"/>
-              <w:jc w:val="left"/>
-            </w:pPr>
-            <w:r>
-              <w:rPr>
-                <w:rFonts w:ascii="Arial" w:cs="Arial" w:eastAsia="Arial" w:hAnsi="Arial"/>
-                <w:b/>
-                <w:bCs/>
-                <w:i w:val="false"/>
-                <w:iCs w:val="false"/>
-                <w:color w:val="000000"/>
-                <w:sz w:val="18"/>
-                <w:szCs w:val="18"/>
-              </w:rPr>
-              <w:t xml:space="preserve">Phase 1 — Predict</w:t>
+            <w:shd w:fill="EAD1F5" w:color="auto" w:val="clear"/>
+            <w:tcMar>
+              <w:top w:type="dxa" w:w="60"/>
+              <w:left w:type="dxa" w:w="120"/>
+              <w:bottom w:type="dxa" w:w="60"/>
+              <w:right w:type="dxa" w:w="120"/>
+            </w:tcMar>
+            <w:vAlign w:val="top"/>
+          </w:tcPr>
+          <w:p>
+            <w:pPr>
+              <w:spacing w:after="40" w:before="0"/>
+              <w:jc w:val="left"/>
+            </w:pPr>
+            <w:r>
+              <w:rPr>
+                <w:rFonts w:ascii="Arial" w:cs="Arial" w:eastAsia="Arial" w:hAnsi="Arial"/>
+                <w:b/>
+                <w:bCs/>
+                <w:i w:val="false"/>
+                <w:iCs w:val="false"/>
+                <w:color w:val="000000"/>
+                <w:sz w:val="18"/>
+                <w:szCs w:val="18"/>
+              </w:rPr>
+              <w:t xml:space="preserve">Predict Phase</w:t>
             </w:r>
           </w:p>
           <w:p>
@@ -29532,7 +29568,7 @@
             <w:pPr>
               <w:spacing w:after="20" w:before="0"/>
             </w:pPr>
-            <w:hyperlink w:history="1" r:id="rIdsbvd9s1d0pz_sqiz4m5p2">
+            <w:hyperlink w:history="1" r:id="rIdahzvjo2igqrhf2apooaye">
               <w:r>
                 <w:rPr>
                   <w:rFonts w:ascii="Arial" w:cs="Arial" w:eastAsia="Arial" w:hAnsi="Arial"/>
@@ -29565,7 +29601,7 @@
               <w:spacing w:after="10" w:before="0"/>
               <w:ind w:left="120"/>
             </w:pPr>
-            <w:hyperlink w:history="1" r:id="rIdjkoinbpjx5jucbewt_sr0">
+            <w:hyperlink w:history="1" r:id="rIdgdlpwkergf9h7eoqtsnug">
               <w:r>
                 <w:rPr>
                   <w:rFonts w:ascii="Arial" w:cs="Arial" w:eastAsia="Arial" w:hAnsi="Arial"/>
@@ -29610,7 +29646,7 @@
             <w:pPr>
               <w:spacing w:after="20" w:before="0"/>
             </w:pPr>
-            <w:hyperlink w:history="1" r:id="rIdid3bwhjovx-60_idbzp5p">
+            <w:hyperlink w:history="1" r:id="rIdqbknogwecn2rm222nw3w5">
               <w:r>
                 <w:rPr>
                   <w:rFonts w:ascii="Arial" w:cs="Arial" w:eastAsia="Arial" w:hAnsi="Arial"/>
@@ -29643,7 +29679,7 @@
               <w:spacing w:after="10" w:before="0"/>
               <w:ind w:left="120"/>
             </w:pPr>
-            <w:hyperlink w:history="1" r:id="rIdsy-msxpgkqaren5m2imaq">
+            <w:hyperlink w:history="1" r:id="rIdyiy77wxplut1ridko6tdu">
               <w:r>
                 <w:rPr>
                   <w:rFonts w:ascii="Arial" w:cs="Arial" w:eastAsia="Arial" w:hAnsi="Arial"/>
@@ -29790,32 +29826,32 @@
         <w:tc>
           <w:tcPr>
             <w:tcW w:type="dxa" w:w="1520"/>
-            <w:shd w:fill="F2F2F2" w:color="auto" w:val="clear"/>
-            <w:tcMar>
-              <w:top w:type="dxa" w:w="60"/>
-              <w:left w:type="dxa" w:w="120"/>
-              <w:bottom w:type="dxa" w:w="60"/>
-              <w:right w:type="dxa" w:w="120"/>
-            </w:tcMar>
-            <w:vAlign w:val="top"/>
-          </w:tcPr>
-          <w:p>
-            <w:pPr>
-              <w:spacing w:after="40" w:before="0"/>
-              <w:jc w:val="left"/>
-            </w:pPr>
-            <w:r>
-              <w:rPr>
-                <w:rFonts w:ascii="Arial" w:cs="Arial" w:eastAsia="Arial" w:hAnsi="Arial"/>
-                <w:b/>
-                <w:bCs/>
-                <w:i w:val="false"/>
-                <w:iCs w:val="false"/>
-                <w:color w:val="000000"/>
-                <w:sz w:val="18"/>
-                <w:szCs w:val="18"/>
-              </w:rPr>
-              <w:t xml:space="preserve">Phase 2 — Observe</w:t>
+            <w:shd w:fill="D9EEF1" w:color="auto" w:val="clear"/>
+            <w:tcMar>
+              <w:top w:type="dxa" w:w="60"/>
+              <w:left w:type="dxa" w:w="120"/>
+              <w:bottom w:type="dxa" w:w="60"/>
+              <w:right w:type="dxa" w:w="120"/>
+            </w:tcMar>
+            <w:vAlign w:val="top"/>
+          </w:tcPr>
+          <w:p>
+            <w:pPr>
+              <w:spacing w:after="40" w:before="0"/>
+              <w:jc w:val="left"/>
+            </w:pPr>
+            <w:r>
+              <w:rPr>
+                <w:rFonts w:ascii="Arial" w:cs="Arial" w:eastAsia="Arial" w:hAnsi="Arial"/>
+                <w:b/>
+                <w:bCs/>
+                <w:i w:val="false"/>
+                <w:iCs w:val="false"/>
+                <w:color w:val="000000"/>
+                <w:sz w:val="18"/>
+                <w:szCs w:val="18"/>
+              </w:rPr>
+              <w:t xml:space="preserve">Observe Phase</w:t>
             </w:r>
           </w:p>
           <w:p>
@@ -29838,7 +29874,7 @@
             <w:pPr>
               <w:spacing w:after="20" w:before="0"/>
             </w:pPr>
-            <w:hyperlink w:history="1" r:id="rId1mpbr8dqfrhbqvpx-autf">
+            <w:hyperlink w:history="1" r:id="rIdmm1kfn6fsqumfj6dmzxoy">
               <w:r>
                 <w:rPr>
                   <w:rFonts w:ascii="Arial" w:cs="Arial" w:eastAsia="Arial" w:hAnsi="Arial"/>
@@ -29871,7 +29907,7 @@
               <w:spacing w:after="10" w:before="0"/>
               <w:ind w:left="120"/>
             </w:pPr>
-            <w:hyperlink w:history="1" r:id="rIdxbkk1zjfv39le61ywxo8k">
+            <w:hyperlink w:history="1" r:id="rIdzhpl2diccdrbuworjjfi-">
               <w:r>
                 <w:rPr>
                   <w:rFonts w:ascii="Arial" w:cs="Arial" w:eastAsia="Arial" w:hAnsi="Arial"/>
@@ -29916,7 +29952,7 @@
             <w:pPr>
               <w:spacing w:after="20" w:before="0"/>
             </w:pPr>
-            <w:hyperlink w:history="1" r:id="rIdg8v91rmtsh0iaorywtxex">
+            <w:hyperlink w:history="1" r:id="rIdlvs5dagv7ymp14tvspwvv">
               <w:r>
                 <w:rPr>
                   <w:rFonts w:ascii="Arial" w:cs="Arial" w:eastAsia="Arial" w:hAnsi="Arial"/>
@@ -29949,7 +29985,7 @@
               <w:spacing w:after="10" w:before="0"/>
               <w:ind w:left="120"/>
             </w:pPr>
-            <w:hyperlink w:history="1" r:id="rIdpik-ckzd0giwy8z6tnnbv">
+            <w:hyperlink w:history="1" r:id="rId8mwqaa3sbk_jo97gne6uh">
               <w:r>
                 <w:rPr>
                   <w:rFonts w:ascii="Arial" w:cs="Arial" w:eastAsia="Arial" w:hAnsi="Arial"/>
@@ -30096,32 +30132,32 @@
         <w:tc>
           <w:tcPr>
             <w:tcW w:type="dxa" w:w="1520"/>
-            <w:shd w:fill="F2F2F2" w:color="auto" w:val="clear"/>
-            <w:tcMar>
-              <w:top w:type="dxa" w:w="60"/>
-              <w:left w:type="dxa" w:w="120"/>
-              <w:bottom w:type="dxa" w:w="60"/>
-              <w:right w:type="dxa" w:w="120"/>
-            </w:tcMar>
-            <w:vAlign w:val="top"/>
-          </w:tcPr>
-          <w:p>
-            <w:pPr>
-              <w:spacing w:after="40" w:before="0"/>
-              <w:jc w:val="left"/>
-            </w:pPr>
-            <w:r>
-              <w:rPr>
-                <w:rFonts w:ascii="Arial" w:cs="Arial" w:eastAsia="Arial" w:hAnsi="Arial"/>
-                <w:b/>
-                <w:bCs/>
-                <w:i w:val="false"/>
-                <w:iCs w:val="false"/>
-                <w:color w:val="000000"/>
-                <w:sz w:val="18"/>
-                <w:szCs w:val="18"/>
-              </w:rPr>
-              <w:t xml:space="preserve">Phase 3 — Explain</w:t>
+            <w:shd w:fill="E2EFDA" w:color="auto" w:val="clear"/>
+            <w:tcMar>
+              <w:top w:type="dxa" w:w="60"/>
+              <w:left w:type="dxa" w:w="120"/>
+              <w:bottom w:type="dxa" w:w="60"/>
+              <w:right w:type="dxa" w:w="120"/>
+            </w:tcMar>
+            <w:vAlign w:val="top"/>
+          </w:tcPr>
+          <w:p>
+            <w:pPr>
+              <w:spacing w:after="40" w:before="0"/>
+              <w:jc w:val="left"/>
+            </w:pPr>
+            <w:r>
+              <w:rPr>
+                <w:rFonts w:ascii="Arial" w:cs="Arial" w:eastAsia="Arial" w:hAnsi="Arial"/>
+                <w:b/>
+                <w:bCs/>
+                <w:i w:val="false"/>
+                <w:iCs w:val="false"/>
+                <w:color w:val="000000"/>
+                <w:sz w:val="18"/>
+                <w:szCs w:val="18"/>
+              </w:rPr>
+              <w:t xml:space="preserve">Explain Phase</w:t>
             </w:r>
           </w:p>
           <w:p>
@@ -30144,7 +30180,7 @@
             <w:pPr>
               <w:spacing w:after="20" w:before="0"/>
             </w:pPr>
-            <w:hyperlink w:history="1" r:id="rIdl_qhtpe78nrgzcg6whdh9">
+            <w:hyperlink w:history="1" r:id="rId7l4wrgzo94v3sjp2p3sre">
               <w:r>
                 <w:rPr>
                   <w:rFonts w:ascii="Arial" w:cs="Arial" w:eastAsia="Arial" w:hAnsi="Arial"/>
@@ -30177,7 +30213,7 @@
               <w:spacing w:after="10" w:before="0"/>
               <w:ind w:left="120"/>
             </w:pPr>
-            <w:hyperlink w:history="1" r:id="rIdhbtkgnlyls2fxasnnm23b">
+            <w:hyperlink w:history="1" r:id="rIdplrhhkqi9qbxtc9hwkmum">
               <w:r>
                 <w:rPr>
                   <w:rFonts w:ascii="Arial" w:cs="Arial" w:eastAsia="Arial" w:hAnsi="Arial"/>
@@ -30222,7 +30258,7 @@
             <w:pPr>
               <w:spacing w:after="20" w:before="0"/>
             </w:pPr>
-            <w:hyperlink w:history="1" r:id="rIdnvhtb5yudkitjh1gclqtg">
+            <w:hyperlink w:history="1" r:id="rIdcxob6lpmtr00titikspc5">
               <w:r>
                 <w:rPr>
                   <w:rFonts w:ascii="Arial" w:cs="Arial" w:eastAsia="Arial" w:hAnsi="Arial"/>
@@ -30255,7 +30291,7 @@
               <w:spacing w:after="10" w:before="0"/>
               <w:ind w:left="120"/>
             </w:pPr>
-            <w:hyperlink w:history="1" r:id="rId6zuach8j_avyma4s_1iyx">
+            <w:hyperlink w:history="1" r:id="rIdvng_xhocvezbdqlome-af">
               <w:r>
                 <w:rPr>
                   <w:rFonts w:ascii="Arial" w:cs="Arial" w:eastAsia="Arial" w:hAnsi="Arial"/>
@@ -30402,32 +30438,32 @@
         <w:tc>
           <w:tcPr>
             <w:tcW w:type="dxa" w:w="1520"/>
-            <w:shd w:fill="F2F2F2" w:color="auto" w:val="clear"/>
-            <w:tcMar>
-              <w:top w:type="dxa" w:w="60"/>
-              <w:left w:type="dxa" w:w="120"/>
-              <w:bottom w:type="dxa" w:w="60"/>
-              <w:right w:type="dxa" w:w="120"/>
-            </w:tcMar>
-            <w:vAlign w:val="top"/>
-          </w:tcPr>
-          <w:p>
-            <w:pPr>
-              <w:spacing w:after="40" w:before="0"/>
-              <w:jc w:val="left"/>
-            </w:pPr>
-            <w:r>
-              <w:rPr>
-                <w:rFonts w:ascii="Arial" w:cs="Arial" w:eastAsia="Arial" w:hAnsi="Arial"/>
-                <w:b/>
-                <w:bCs/>
-                <w:i w:val="false"/>
-                <w:iCs w:val="false"/>
-                <w:color w:val="000000"/>
-                <w:sz w:val="18"/>
-                <w:szCs w:val="18"/>
-              </w:rPr>
-              <w:t xml:space="preserve">Phase 4 — Driving Question Board (DQB) Update</w:t>
+            <w:shd w:fill="FCE4D6" w:color="auto" w:val="clear"/>
+            <w:tcMar>
+              <w:top w:type="dxa" w:w="60"/>
+              <w:left w:type="dxa" w:w="120"/>
+              <w:bottom w:type="dxa" w:w="60"/>
+              <w:right w:type="dxa" w:w="120"/>
+            </w:tcMar>
+            <w:vAlign w:val="top"/>
+          </w:tcPr>
+          <w:p>
+            <w:pPr>
+              <w:spacing w:after="40" w:before="0"/>
+              <w:jc w:val="left"/>
+            </w:pPr>
+            <w:r>
+              <w:rPr>
+                <w:rFonts w:ascii="Arial" w:cs="Arial" w:eastAsia="Arial" w:hAnsi="Arial"/>
+                <w:b/>
+                <w:bCs/>
+                <w:i w:val="false"/>
+                <w:iCs w:val="false"/>
+                <w:color w:val="000000"/>
+                <w:sz w:val="18"/>
+                <w:szCs w:val="18"/>
+              </w:rPr>
+              <w:t xml:space="preserve">Driving Question Board (DQB) Creation</w:t>
             </w:r>
           </w:p>
           <w:p>
@@ -30450,7 +30486,7 @@
             <w:pPr>
               <w:spacing w:after="20" w:before="0"/>
             </w:pPr>
-            <w:hyperlink w:history="1" r:id="rIdgstgqau4cxxq4faepszjk">
+            <w:hyperlink w:history="1" r:id="rIdqggjdl4akwuyqavi7ken-">
               <w:r>
                 <w:rPr>
                   <w:rFonts w:ascii="Arial" w:cs="Arial" w:eastAsia="Arial" w:hAnsi="Arial"/>
@@ -30483,7 +30519,7 @@
               <w:spacing w:after="10" w:before="0"/>
               <w:ind w:left="120"/>
             </w:pPr>
-            <w:hyperlink w:history="1" r:id="rId3bflafzrtcjkvjzhvdq85">
+            <w:hyperlink w:history="1" r:id="rIdoykq82uk3xhbjcp04ujlo">
               <w:r>
                 <w:rPr>
                   <w:rFonts w:ascii="Arial" w:cs="Arial" w:eastAsia="Arial" w:hAnsi="Arial"/>
@@ -30528,7 +30564,7 @@
             <w:pPr>
               <w:spacing w:after="20" w:before="0"/>
             </w:pPr>
-            <w:hyperlink w:history="1" r:id="rId08dzcmv49bbgybsinvjpr">
+            <w:hyperlink w:history="1" r:id="rIdjjyh0v3bobhvprmqram8n">
               <w:r>
                 <w:rPr>
                   <w:rFonts w:ascii="Arial" w:cs="Arial" w:eastAsia="Arial" w:hAnsi="Arial"/>
@@ -30561,7 +30597,7 @@
               <w:spacing w:after="10" w:before="0"/>
               <w:ind w:left="120"/>
             </w:pPr>
-            <w:hyperlink w:history="1" r:id="rIdbakbl66xbrtbinbntsxat">
+            <w:hyperlink w:history="1" r:id="rIdgtg7sna3lqnk3zpcbuvyx">
               <w:r>
                 <w:rPr>
                   <w:rFonts w:ascii="Arial" w:cs="Arial" w:eastAsia="Arial" w:hAnsi="Arial"/>
@@ -30708,32 +30744,32 @@
         <w:tc>
           <w:tcPr>
             <w:tcW w:type="dxa" w:w="1520"/>
-            <w:shd w:fill="F2F2F2" w:color="auto" w:val="clear"/>
-            <w:tcMar>
-              <w:top w:type="dxa" w:w="60"/>
-              <w:left w:type="dxa" w:w="120"/>
-              <w:bottom w:type="dxa" w:w="60"/>
-              <w:right w:type="dxa" w:w="120"/>
-            </w:tcMar>
-            <w:vAlign w:val="top"/>
-          </w:tcPr>
-          <w:p>
-            <w:pPr>
-              <w:spacing w:after="40" w:before="0"/>
-              <w:jc w:val="left"/>
-            </w:pPr>
-            <w:r>
-              <w:rPr>
-                <w:rFonts w:ascii="Arial" w:cs="Arial" w:eastAsia="Arial" w:hAnsi="Arial"/>
-                <w:b/>
-                <w:bCs/>
-                <w:i w:val="false"/>
-                <w:iCs w:val="false"/>
-                <w:color w:val="000000"/>
-                <w:sz w:val="18"/>
-                <w:szCs w:val="18"/>
-              </w:rPr>
-              <w:t xml:space="preserve">Phase 5 — Model Building (Version 4)</w:t>
+            <w:shd w:fill="D5E8F0" w:color="auto" w:val="clear"/>
+            <w:tcMar>
+              <w:top w:type="dxa" w:w="60"/>
+              <w:left w:type="dxa" w:w="120"/>
+              <w:bottom w:type="dxa" w:w="60"/>
+              <w:right w:type="dxa" w:w="120"/>
+            </w:tcMar>
+            <w:vAlign w:val="top"/>
+          </w:tcPr>
+          <w:p>
+            <w:pPr>
+              <w:spacing w:after="40" w:before="0"/>
+              <w:jc w:val="left"/>
+            </w:pPr>
+            <w:r>
+              <w:rPr>
+                <w:rFonts w:ascii="Arial" w:cs="Arial" w:eastAsia="Arial" w:hAnsi="Arial"/>
+                <w:b/>
+                <w:bCs/>
+                <w:i w:val="false"/>
+                <w:iCs w:val="false"/>
+                <w:color w:val="000000"/>
+                <w:sz w:val="18"/>
+                <w:szCs w:val="18"/>
+              </w:rPr>
+              <w:t xml:space="preserve">Model Building Phase</w:t>
             </w:r>
           </w:p>
           <w:p>
@@ -30756,7 +30792,7 @@
             <w:pPr>
               <w:spacing w:after="20" w:before="0"/>
             </w:pPr>
-            <w:hyperlink w:history="1" r:id="rIdkl7xnfx9fkxyjsfnnv5mo">
+            <w:hyperlink w:history="1" r:id="rIdp9x1bo9xvugutlotfpp7-">
               <w:r>
                 <w:rPr>
                   <w:rFonts w:ascii="Arial" w:cs="Arial" w:eastAsia="Arial" w:hAnsi="Arial"/>
@@ -30789,7 +30825,7 @@
               <w:spacing w:after="10" w:before="0"/>
               <w:ind w:left="120"/>
             </w:pPr>
-            <w:hyperlink w:history="1" r:id="rIdlvhx03tpzv9my_gwjqsae">
+            <w:hyperlink w:history="1" r:id="rIdcjegarxgmijyf9xikg3_6">
               <w:r>
                 <w:rPr>
                   <w:rFonts w:ascii="Arial" w:cs="Arial" w:eastAsia="Arial" w:hAnsi="Arial"/>
@@ -30834,7 +30870,7 @@
             <w:pPr>
               <w:spacing w:after="20" w:before="0"/>
             </w:pPr>
-            <w:hyperlink w:history="1" r:id="rIdoz7jhiv78dgfikgwebp3r">
+            <w:hyperlink w:history="1" r:id="rIdc24wztdrxzk-omc1qplfv">
               <w:r>
                 <w:rPr>
                   <w:rFonts w:ascii="Arial" w:cs="Arial" w:eastAsia="Arial" w:hAnsi="Arial"/>
@@ -30867,7 +30903,7 @@
               <w:spacing w:after="10" w:before="0"/>
               <w:ind w:left="120"/>
             </w:pPr>
-            <w:hyperlink w:history="1" r:id="rId33wfgi8ge5fr9glfgy6dg">
+            <w:hyperlink w:history="1" r:id="rIdg3qoyxsud733vid4mqobx">
               <w:r>
                 <w:rPr>
                   <w:rFonts w:ascii="Arial" w:cs="Arial" w:eastAsia="Arial" w:hAnsi="Arial"/>
@@ -32057,7 +32093,25 @@
             </w:tcMar>
             <w:vAlign w:val="top"/>
           </w:tcPr>
-          <w:p/>
+          <w:p>
+            <w:pPr>
+              <w:spacing w:after="40" w:before="0"/>
+              <w:jc w:val="left"/>
+            </w:pPr>
+            <w:r>
+              <w:rPr>
+                <w:rFonts w:ascii="Arial" w:cs="Arial" w:eastAsia="Arial" w:hAnsi="Arial"/>
+                <w:b w:val="false"/>
+                <w:bCs w:val="false"/>
+                <w:i w:val="false"/>
+                <w:iCs w:val="false"/>
+                <w:color w:val="000000"/>
+                <w:sz w:val="18"/>
+                <w:szCs w:val="18"/>
+              </w:rPr>
+              <w:t xml:space="preserve">No hazardous materials are used in this lesson. Learners handle poster paper, markers, and scissors where used for card-sorting. Ensure adequate space between groups to allow movement without collision. No specific PPE required.</w:t>
+            </w:r>
+          </w:p>
         </w:tc>
       </w:tr>
     </w:tbl>
@@ -32431,7 +32485,7 @@
             <w:pPr>
               <w:spacing w:after="20" w:before="0"/>
             </w:pPr>
-            <w:hyperlink w:history="1" r:id="rId7ls07wtvtabzy2f0w3fib">
+            <w:hyperlink w:history="1" r:id="rIdahnn0remaj6afqbo44eu9">
               <w:r>
                 <w:rPr>
                   <w:rFonts w:ascii="Arial" w:cs="Arial" w:eastAsia="Arial" w:hAnsi="Arial"/>
@@ -32464,7 +32518,7 @@
               <w:spacing w:after="10" w:before="0"/>
               <w:ind w:left="120"/>
             </w:pPr>
-            <w:hyperlink w:history="1" r:id="rIdvmtfp0zbocxqc_5j_ov2p">
+            <w:hyperlink w:history="1" r:id="rIdpwo5wu48wrszfun1dtonp">
               <w:r>
                 <w:rPr>
                   <w:rFonts w:ascii="Arial" w:cs="Arial" w:eastAsia="Arial" w:hAnsi="Arial"/>
@@ -32509,7 +32563,7 @@
             <w:pPr>
               <w:spacing w:after="20" w:before="0"/>
             </w:pPr>
-            <w:hyperlink w:history="1" r:id="rIdopfqibv3sgwojowsir7ha">
+            <w:hyperlink w:history="1" r:id="rIdc-mobgj1mpde44bnztbpu">
               <w:r>
                 <w:rPr>
                   <w:rFonts w:ascii="Arial" w:cs="Arial" w:eastAsia="Arial" w:hAnsi="Arial"/>
@@ -32542,7 +32596,7 @@
               <w:spacing w:after="10" w:before="0"/>
               <w:ind w:left="120"/>
             </w:pPr>
-            <w:hyperlink w:history="1" r:id="rIdfght8zgcltkhbxhhwdkog">
+            <w:hyperlink w:history="1" r:id="rIdscdgvqypgqwp7dg2iihp5">
               <w:r>
                 <w:rPr>
                   <w:rFonts w:ascii="Arial" w:cs="Arial" w:eastAsia="Arial" w:hAnsi="Arial"/>
@@ -32737,7 +32791,7 @@
             <w:pPr>
               <w:spacing w:after="20" w:before="0"/>
             </w:pPr>
-            <w:hyperlink w:history="1" r:id="rIdvjvpulkutyxsfv6qn0v3l">
+            <w:hyperlink w:history="1" r:id="rIdy5usns5roraq2-klm8rqd">
               <w:r>
                 <w:rPr>
                   <w:rFonts w:ascii="Arial" w:cs="Arial" w:eastAsia="Arial" w:hAnsi="Arial"/>
@@ -32770,7 +32824,7 @@
               <w:spacing w:after="10" w:before="0"/>
               <w:ind w:left="120"/>
             </w:pPr>
-            <w:hyperlink w:history="1" r:id="rIdmkhv3jemm1pdhz0r6nhqg">
+            <w:hyperlink w:history="1" r:id="rIdz-nsby-_gytxvwhb7qxeb">
               <w:r>
                 <w:rPr>
                   <w:rFonts w:ascii="Arial" w:cs="Arial" w:eastAsia="Arial" w:hAnsi="Arial"/>
@@ -32815,7 +32869,7 @@
             <w:pPr>
               <w:spacing w:after="20" w:before="0"/>
             </w:pPr>
-            <w:hyperlink w:history="1" r:id="rIdvyawquy-srjopp8zpgwjp">
+            <w:hyperlink w:history="1" r:id="rIdvo0ymvueskeurnig25jjp">
               <w:r>
                 <w:rPr>
                   <w:rFonts w:ascii="Arial" w:cs="Arial" w:eastAsia="Arial" w:hAnsi="Arial"/>
@@ -32848,7 +32902,7 @@
               <w:spacing w:after="10" w:before="0"/>
               <w:ind w:left="120"/>
             </w:pPr>
-            <w:hyperlink w:history="1" r:id="rIdmft6j8e97k5kdbu21vgqw">
+            <w:hyperlink w:history="1" r:id="rId9nmn4nitznfy1h-b_k3wc">
               <w:r>
                 <w:rPr>
                   <w:rFonts w:ascii="Arial" w:cs="Arial" w:eastAsia="Arial" w:hAnsi="Arial"/>
@@ -33043,7 +33097,7 @@
             <w:pPr>
               <w:spacing w:after="20" w:before="0"/>
             </w:pPr>
-            <w:hyperlink w:history="1" r:id="rIdngba6csvypmlsezrpa9wf">
+            <w:hyperlink w:history="1" r:id="rIdt7peaartfva5aa74ssyfz">
               <w:r>
                 <w:rPr>
                   <w:rFonts w:ascii="Arial" w:cs="Arial" w:eastAsia="Arial" w:hAnsi="Arial"/>
@@ -33076,7 +33130,7 @@
               <w:spacing w:after="10" w:before="0"/>
               <w:ind w:left="120"/>
             </w:pPr>
-            <w:hyperlink w:history="1" r:id="rIdh9sv_uphkqua6hiqapujm">
+            <w:hyperlink w:history="1" r:id="rIdiwac_8hsj3yvge9zcaopt">
               <w:r>
                 <w:rPr>
                   <w:rFonts w:ascii="Arial" w:cs="Arial" w:eastAsia="Arial" w:hAnsi="Arial"/>
@@ -33121,7 +33175,7 @@
             <w:pPr>
               <w:spacing w:after="20" w:before="0"/>
             </w:pPr>
-            <w:hyperlink w:history="1" r:id="rIduqp9pju1za5xpzbgpaxy2">
+            <w:hyperlink w:history="1" r:id="rIdc9v2szbbamwxhz9i8se-t">
               <w:r>
                 <w:rPr>
                   <w:rFonts w:ascii="Arial" w:cs="Arial" w:eastAsia="Arial" w:hAnsi="Arial"/>
@@ -33154,7 +33208,7 @@
               <w:spacing w:after="10" w:before="0"/>
               <w:ind w:left="120"/>
             </w:pPr>
-            <w:hyperlink w:history="1" r:id="rIdfpk3jenwcj0e_klivmmr1">
+            <w:hyperlink w:history="1" r:id="rIdo8jshutewpfd-p2cmsmko">
               <w:r>
                 <w:rPr>
                   <w:rFonts w:ascii="Arial" w:cs="Arial" w:eastAsia="Arial" w:hAnsi="Arial"/>
@@ -33349,7 +33403,7 @@
             <w:pPr>
               <w:spacing w:after="20" w:before="0"/>
             </w:pPr>
-            <w:hyperlink w:history="1" r:id="rIddvaojr2ppsne_2mtaklgl">
+            <w:hyperlink w:history="1" r:id="rIdtb7mxb8pzqhnzsxpdkbwu">
               <w:r>
                 <w:rPr>
                   <w:rFonts w:ascii="Arial" w:cs="Arial" w:eastAsia="Arial" w:hAnsi="Arial"/>
@@ -33382,7 +33436,7 @@
               <w:spacing w:after="10" w:before="0"/>
               <w:ind w:left="120"/>
             </w:pPr>
-            <w:hyperlink w:history="1" r:id="rIdfderr8ywehowaxjlvifmz">
+            <w:hyperlink w:history="1" r:id="rId8d2ogawaczvw-yblbr-fi">
               <w:r>
                 <w:rPr>
                   <w:rFonts w:ascii="Arial" w:cs="Arial" w:eastAsia="Arial" w:hAnsi="Arial"/>
@@ -33427,7 +33481,7 @@
             <w:pPr>
               <w:spacing w:after="20" w:before="0"/>
             </w:pPr>
-            <w:hyperlink w:history="1" r:id="rIdqnaru6ssypa8mrgziweeb">
+            <w:hyperlink w:history="1" r:id="rIdvvtcrw6twncc4xxikw2zo">
               <w:r>
                 <w:rPr>
                   <w:rFonts w:ascii="Arial" w:cs="Arial" w:eastAsia="Arial" w:hAnsi="Arial"/>
@@ -33460,7 +33514,7 @@
               <w:spacing w:after="10" w:before="0"/>
               <w:ind w:left="120"/>
             </w:pPr>
-            <w:hyperlink w:history="1" r:id="rIdukb98r2-c2eaxyw_gtji1">
+            <w:hyperlink w:history="1" r:id="rId3q_wdfremdubjstsr8n-p">
               <w:r>
                 <w:rPr>
                   <w:rFonts w:ascii="Arial" w:cs="Arial" w:eastAsia="Arial" w:hAnsi="Arial"/>
@@ -33655,7 +33709,7 @@
             <w:pPr>
               <w:spacing w:after="20" w:before="0"/>
             </w:pPr>
-            <w:hyperlink w:history="1" r:id="rIdpkblzesngmwnogjcwt0-a">
+            <w:hyperlink w:history="1" r:id="rIdbvft3iwjnnb6zcsw4gnyl">
               <w:r>
                 <w:rPr>
                   <w:rFonts w:ascii="Arial" w:cs="Arial" w:eastAsia="Arial" w:hAnsi="Arial"/>
@@ -33688,7 +33742,7 @@
               <w:spacing w:after="10" w:before="0"/>
               <w:ind w:left="120"/>
             </w:pPr>
-            <w:hyperlink w:history="1" r:id="rId6we305-duje4lxqvp4lne">
+            <w:hyperlink w:history="1" r:id="rIda6qi02ldnmpljsjxx2k97">
               <w:r>
                 <w:rPr>
                   <w:rFonts w:ascii="Arial" w:cs="Arial" w:eastAsia="Arial" w:hAnsi="Arial"/>
@@ -33733,7 +33787,7 @@
             <w:pPr>
               <w:spacing w:after="20" w:before="0"/>
             </w:pPr>
-            <w:hyperlink w:history="1" r:id="rId4xcnxtatz-dfttqamyqas">
+            <w:hyperlink w:history="1" r:id="rIdtlijeiaaaclrxp4i4ytop">
               <w:r>
                 <w:rPr>
                   <w:rFonts w:ascii="Arial" w:cs="Arial" w:eastAsia="Arial" w:hAnsi="Arial"/>
@@ -33766,7 +33820,7 @@
               <w:spacing w:after="10" w:before="0"/>
               <w:ind w:left="120"/>
             </w:pPr>
-            <w:hyperlink w:history="1" r:id="rIdfswajo7cq2hrf7eggx-pp">
+            <w:hyperlink w:history="1" r:id="rIdxbiokq5b9yy_xdqliynoi">
               <w:r>
                 <w:rPr>
                   <w:rFonts w:ascii="Arial" w:cs="Arial" w:eastAsia="Arial" w:hAnsi="Arial"/>
@@ -35205,32 +35259,32 @@
         <w:tc>
           <w:tcPr>
             <w:tcW w:type="dxa" w:w="1520"/>
-            <w:shd w:fill="F2F2F2" w:color="auto" w:val="clear"/>
-            <w:tcMar>
-              <w:top w:type="dxa" w:w="60"/>
-              <w:left w:type="dxa" w:w="120"/>
-              <w:bottom w:type="dxa" w:w="60"/>
-              <w:right w:type="dxa" w:w="120"/>
-            </w:tcMar>
-            <w:vAlign w:val="top"/>
-          </w:tcPr>
-          <w:p>
-            <w:pPr>
-              <w:spacing w:after="40" w:before="0"/>
-              <w:jc w:val="left"/>
-            </w:pPr>
-            <w:r>
-              <w:rPr>
-                <w:rFonts w:ascii="Arial" w:cs="Arial" w:eastAsia="Arial" w:hAnsi="Arial"/>
-                <w:b/>
-                <w:bCs/>
-                <w:i w:val="false"/>
-                <w:iCs w:val="false"/>
-                <w:color w:val="000000"/>
-                <w:sz w:val="18"/>
-                <w:szCs w:val="18"/>
-              </w:rPr>
-              <w:t xml:space="preserve">Phase 1 — Predict: What Did We Think Then?</w:t>
+            <w:shd w:fill="EAD1F5" w:color="auto" w:val="clear"/>
+            <w:tcMar>
+              <w:top w:type="dxa" w:w="60"/>
+              <w:left w:type="dxa" w:w="120"/>
+              <w:bottom w:type="dxa" w:w="60"/>
+              <w:right w:type="dxa" w:w="120"/>
+            </w:tcMar>
+            <w:vAlign w:val="top"/>
+          </w:tcPr>
+          <w:p>
+            <w:pPr>
+              <w:spacing w:after="40" w:before="0"/>
+              <w:jc w:val="left"/>
+            </w:pPr>
+            <w:r>
+              <w:rPr>
+                <w:rFonts w:ascii="Arial" w:cs="Arial" w:eastAsia="Arial" w:hAnsi="Arial"/>
+                <w:b/>
+                <w:bCs/>
+                <w:i w:val="false"/>
+                <w:iCs w:val="false"/>
+                <w:color w:val="000000"/>
+                <w:sz w:val="18"/>
+                <w:szCs w:val="18"/>
+              </w:rPr>
+              <w:t xml:space="preserve">Predict Phase</w:t>
             </w:r>
           </w:p>
           <w:p>
@@ -35253,7 +35307,7 @@
             <w:pPr>
               <w:spacing w:after="20" w:before="0"/>
             </w:pPr>
-            <w:hyperlink w:history="1" r:id="rId1golcdbkpmlf8josipjaa">
+            <w:hyperlink w:history="1" r:id="rIdjivbkctguod6z5zyqpr3v">
               <w:r>
                 <w:rPr>
                   <w:rFonts w:ascii="Arial" w:cs="Arial" w:eastAsia="Arial" w:hAnsi="Arial"/>
@@ -35286,7 +35340,7 @@
               <w:spacing w:after="10" w:before="0"/>
               <w:ind w:left="120"/>
             </w:pPr>
-            <w:hyperlink w:history="1" r:id="rIdl_qozoxck6sphra-obwgn">
+            <w:hyperlink w:history="1" r:id="rIdfp4ykkfazh1oisruv4kej">
               <w:r>
                 <w:rPr>
                   <w:rFonts w:ascii="Arial" w:cs="Arial" w:eastAsia="Arial" w:hAnsi="Arial"/>
@@ -35331,7 +35385,7 @@
             <w:pPr>
               <w:spacing w:after="20" w:before="0"/>
             </w:pPr>
-            <w:hyperlink w:history="1" r:id="rIdubajmgyql36e1xo7p7s2j">
+            <w:hyperlink w:history="1" r:id="rIdhwxdosohwmn2sidccgrou">
               <w:r>
                 <w:rPr>
                   <w:rFonts w:ascii="Arial" w:cs="Arial" w:eastAsia="Arial" w:hAnsi="Arial"/>
@@ -35364,7 +35418,7 @@
               <w:spacing w:after="10" w:before="0"/>
               <w:ind w:left="120"/>
             </w:pPr>
-            <w:hyperlink w:history="1" r:id="rIdnvs6e2pha1muzqfbjbq25">
+            <w:hyperlink w:history="1" r:id="rIdhiobggqyosljhja8136hk">
               <w:r>
                 <w:rPr>
                   <w:rFonts w:ascii="Arial" w:cs="Arial" w:eastAsia="Arial" w:hAnsi="Arial"/>
@@ -35663,32 +35717,32 @@
         <w:tc>
           <w:tcPr>
             <w:tcW w:type="dxa" w:w="1520"/>
-            <w:shd w:fill="F2F2F2" w:color="auto" w:val="clear"/>
-            <w:tcMar>
-              <w:top w:type="dxa" w:w="60"/>
-              <w:left w:type="dxa" w:w="120"/>
-              <w:bottom w:type="dxa" w:w="60"/>
-              <w:right w:type="dxa" w:w="120"/>
-            </w:tcMar>
-            <w:vAlign w:val="top"/>
-          </w:tcPr>
-          <w:p>
-            <w:pPr>
-              <w:spacing w:after="40" w:before="0"/>
-              <w:jc w:val="left"/>
-            </w:pPr>
-            <w:r>
-              <w:rPr>
-                <w:rFonts w:ascii="Arial" w:cs="Arial" w:eastAsia="Arial" w:hAnsi="Arial"/>
-                <w:b/>
-                <w:bCs/>
-                <w:i w:val="false"/>
-                <w:iCs w:val="false"/>
-                <w:color w:val="000000"/>
-                <w:sz w:val="18"/>
-                <w:szCs w:val="18"/>
-              </w:rPr>
-              <w:t xml:space="preserve">Phase 2 — Observe (Evidence Synthesis): The Cell-by-Cell Explanation Round</w:t>
+            <w:shd w:fill="D9EEF1" w:color="auto" w:val="clear"/>
+            <w:tcMar>
+              <w:top w:type="dxa" w:w="60"/>
+              <w:left w:type="dxa" w:w="120"/>
+              <w:bottom w:type="dxa" w:w="60"/>
+              <w:right w:type="dxa" w:w="120"/>
+            </w:tcMar>
+            <w:vAlign w:val="top"/>
+          </w:tcPr>
+          <w:p>
+            <w:pPr>
+              <w:spacing w:after="40" w:before="0"/>
+              <w:jc w:val="left"/>
+            </w:pPr>
+            <w:r>
+              <w:rPr>
+                <w:rFonts w:ascii="Arial" w:cs="Arial" w:eastAsia="Arial" w:hAnsi="Arial"/>
+                <w:b/>
+                <w:bCs/>
+                <w:i w:val="false"/>
+                <w:iCs w:val="false"/>
+                <w:color w:val="000000"/>
+                <w:sz w:val="18"/>
+                <w:szCs w:val="18"/>
+              </w:rPr>
+              <w:t xml:space="preserve">Observe Phase</w:t>
             </w:r>
           </w:p>
           <w:p>
@@ -35711,7 +35765,7 @@
             <w:pPr>
               <w:spacing w:after="20" w:before="0"/>
             </w:pPr>
-            <w:hyperlink w:history="1" r:id="rId1gzz5myjjtmln0hq_zddt">
+            <w:hyperlink w:history="1" r:id="rIdulmtm7iycdyicimwhyuzc">
               <w:r>
                 <w:rPr>
                   <w:rFonts w:ascii="Arial" w:cs="Arial" w:eastAsia="Arial" w:hAnsi="Arial"/>
@@ -35744,7 +35798,7 @@
               <w:spacing w:after="10" w:before="0"/>
               <w:ind w:left="120"/>
             </w:pPr>
-            <w:hyperlink w:history="1" r:id="rIdkba_ewmvbs6hsdewyjgqo">
+            <w:hyperlink w:history="1" r:id="rIdsz0zowlagn2k4afgjvozu">
               <w:r>
                 <w:rPr>
                   <w:rFonts w:ascii="Arial" w:cs="Arial" w:eastAsia="Arial" w:hAnsi="Arial"/>
@@ -35789,7 +35843,7 @@
             <w:pPr>
               <w:spacing w:after="20" w:before="0"/>
             </w:pPr>
-            <w:hyperlink w:history="1" r:id="rIdxaii_v_zmjbmpbwbxeioe">
+            <w:hyperlink w:history="1" r:id="rIdbf98ndmsqczud733hioab">
               <w:r>
                 <w:rPr>
                   <w:rFonts w:ascii="Arial" w:cs="Arial" w:eastAsia="Arial" w:hAnsi="Arial"/>
@@ -35822,7 +35876,7 @@
               <w:spacing w:after="10" w:before="0"/>
               <w:ind w:left="120"/>
             </w:pPr>
-            <w:hyperlink w:history="1" r:id="rIdfko-yutudwiyijr1vjvv4">
+            <w:hyperlink w:history="1" r:id="rIdxef5one4rrtsm_bgfnjaz">
               <w:r>
                 <w:rPr>
                   <w:rFonts w:ascii="Arial" w:cs="Arial" w:eastAsia="Arial" w:hAnsi="Arial"/>
@@ -36273,32 +36327,32 @@
         <w:tc>
           <w:tcPr>
             <w:tcW w:type="dxa" w:w="1520"/>
-            <w:shd w:fill="F2F2F2" w:color="auto" w:val="clear"/>
-            <w:tcMar>
-              <w:top w:type="dxa" w:w="60"/>
-              <w:left w:type="dxa" w:w="120"/>
-              <w:bottom w:type="dxa" w:w="60"/>
-              <w:right w:type="dxa" w:w="120"/>
-            </w:tcMar>
-            <w:vAlign w:val="top"/>
-          </w:tcPr>
-          <w:p>
-            <w:pPr>
-              <w:spacing w:after="40" w:before="0"/>
-              <w:jc w:val="left"/>
-            </w:pPr>
-            <w:r>
-              <w:rPr>
-                <w:rFonts w:ascii="Arial" w:cs="Arial" w:eastAsia="Arial" w:hAnsi="Arial"/>
-                <w:b/>
-                <w:bCs/>
-                <w:i w:val="false"/>
-                <w:iCs w:val="false"/>
-                <w:color w:val="000000"/>
-                <w:sz w:val="18"/>
-                <w:szCs w:val="18"/>
-              </w:rPr>
-              <w:t xml:space="preserve">Phase 3 — Explain: Model Comparison and Final Explanation Writing</w:t>
+            <w:shd w:fill="E2EFDA" w:color="auto" w:val="clear"/>
+            <w:tcMar>
+              <w:top w:type="dxa" w:w="60"/>
+              <w:left w:type="dxa" w:w="120"/>
+              <w:bottom w:type="dxa" w:w="60"/>
+              <w:right w:type="dxa" w:w="120"/>
+            </w:tcMar>
+            <w:vAlign w:val="top"/>
+          </w:tcPr>
+          <w:p>
+            <w:pPr>
+              <w:spacing w:after="40" w:before="0"/>
+              <w:jc w:val="left"/>
+            </w:pPr>
+            <w:r>
+              <w:rPr>
+                <w:rFonts w:ascii="Arial" w:cs="Arial" w:eastAsia="Arial" w:hAnsi="Arial"/>
+                <w:b/>
+                <w:bCs/>
+                <w:i w:val="false"/>
+                <w:iCs w:val="false"/>
+                <w:color w:val="000000"/>
+                <w:sz w:val="18"/>
+                <w:szCs w:val="18"/>
+              </w:rPr>
+              <w:t xml:space="preserve">Explain Phase</w:t>
             </w:r>
           </w:p>
           <w:p>
@@ -36321,7 +36375,7 @@
             <w:pPr>
               <w:spacing w:after="20" w:before="0"/>
             </w:pPr>
-            <w:hyperlink w:history="1" r:id="rIdae5hr6q38eq5aw8ftmmp9">
+            <w:hyperlink w:history="1" r:id="rId1ao_qnsl1d0fkp3bfwtiv">
               <w:r>
                 <w:rPr>
                   <w:rFonts w:ascii="Arial" w:cs="Arial" w:eastAsia="Arial" w:hAnsi="Arial"/>
@@ -36354,7 +36408,7 @@
               <w:spacing w:after="10" w:before="0"/>
               <w:ind w:left="120"/>
             </w:pPr>
-            <w:hyperlink w:history="1" r:id="rIde0vsismjksbnhxc7qd2bc">
+            <w:hyperlink w:history="1" r:id="rIdvytln25vwo9x1v5kssi89">
               <w:r>
                 <w:rPr>
                   <w:rFonts w:ascii="Arial" w:cs="Arial" w:eastAsia="Arial" w:hAnsi="Arial"/>
@@ -36399,7 +36453,7 @@
             <w:pPr>
               <w:spacing w:after="20" w:before="0"/>
             </w:pPr>
-            <w:hyperlink w:history="1" r:id="rIdbx5ruf-md34d4rricqgwh">
+            <w:hyperlink w:history="1" r:id="rIdqxl0ndfmfoh8e4x0dcl_g">
               <w:r>
                 <w:rPr>
                   <w:rFonts w:ascii="Arial" w:cs="Arial" w:eastAsia="Arial" w:hAnsi="Arial"/>
@@ -36432,7 +36486,7 @@
               <w:spacing w:after="10" w:before="0"/>
               <w:ind w:left="120"/>
             </w:pPr>
-            <w:hyperlink w:history="1" r:id="rIdca5yc3o70fi4c4ak0fpdu">
+            <w:hyperlink w:history="1" r:id="rIdivnxhsiejyonlebfqfxhs">
               <w:r>
                 <w:rPr>
                   <w:rFonts w:ascii="Arial" w:cs="Arial" w:eastAsia="Arial" w:hAnsi="Arial"/>
@@ -36788,32 +36842,32 @@
         <w:tc>
           <w:tcPr>
             <w:tcW w:type="dxa" w:w="1520"/>
-            <w:shd w:fill="F2F2F2" w:color="auto" w:val="clear"/>
-            <w:tcMar>
-              <w:top w:type="dxa" w:w="60"/>
-              <w:left w:type="dxa" w:w="120"/>
-              <w:bottom w:type="dxa" w:w="60"/>
-              <w:right w:type="dxa" w:w="120"/>
-            </w:tcMar>
-            <w:vAlign w:val="top"/>
-          </w:tcPr>
-          <w:p>
-            <w:pPr>
-              <w:spacing w:after="40" w:before="0"/>
-              <w:jc w:val="left"/>
-            </w:pPr>
-            <w:r>
-              <w:rPr>
-                <w:rFonts w:ascii="Arial" w:cs="Arial" w:eastAsia="Arial" w:hAnsi="Arial"/>
-                <w:b/>
-                <w:bCs/>
-                <w:i w:val="false"/>
-                <w:iCs w:val="false"/>
-                <w:color w:val="000000"/>
-                <w:sz w:val="18"/>
-                <w:szCs w:val="18"/>
-              </w:rPr>
-              <w:t xml:space="preserve">Phase 4 — Driving Question Board (DQB) Closure</w:t>
+            <w:shd w:fill="FCE4D6" w:color="auto" w:val="clear"/>
+            <w:tcMar>
+              <w:top w:type="dxa" w:w="60"/>
+              <w:left w:type="dxa" w:w="120"/>
+              <w:bottom w:type="dxa" w:w="60"/>
+              <w:right w:type="dxa" w:w="120"/>
+            </w:tcMar>
+            <w:vAlign w:val="top"/>
+          </w:tcPr>
+          <w:p>
+            <w:pPr>
+              <w:spacing w:after="40" w:before="0"/>
+              <w:jc w:val="left"/>
+            </w:pPr>
+            <w:r>
+              <w:rPr>
+                <w:rFonts w:ascii="Arial" w:cs="Arial" w:eastAsia="Arial" w:hAnsi="Arial"/>
+                <w:b/>
+                <w:bCs/>
+                <w:i w:val="false"/>
+                <w:iCs w:val="false"/>
+                <w:color w:val="000000"/>
+                <w:sz w:val="18"/>
+                <w:szCs w:val="18"/>
+              </w:rPr>
+              <w:t xml:space="preserve">Driving Question Board (DQB) Creation</w:t>
             </w:r>
           </w:p>
           <w:p>
@@ -36836,7 +36890,7 @@
             <w:pPr>
               <w:spacing w:after="20" w:before="0"/>
             </w:pPr>
-            <w:hyperlink w:history="1" r:id="rId2t-bdasvdniu2fp0z8xtg">
+            <w:hyperlink w:history="1" r:id="rIdl61tydc0q5eu6p37s8jez">
               <w:r>
                 <w:rPr>
                   <w:rFonts w:ascii="Arial" w:cs="Arial" w:eastAsia="Arial" w:hAnsi="Arial"/>
@@ -36869,7 +36923,7 @@
               <w:spacing w:after="10" w:before="0"/>
               <w:ind w:left="120"/>
             </w:pPr>
-            <w:hyperlink w:history="1" r:id="rIdfj-udrgnttsrrehjf_wvo">
+            <w:hyperlink w:history="1" r:id="rIddbdadwuvx9yomau2_29qw">
               <w:r>
                 <w:rPr>
                   <w:rFonts w:ascii="Arial" w:cs="Arial" w:eastAsia="Arial" w:hAnsi="Arial"/>
@@ -36914,7 +36968,7 @@
             <w:pPr>
               <w:spacing w:after="20" w:before="0"/>
             </w:pPr>
-            <w:hyperlink w:history="1" r:id="rIddqyjdz1hd3xawkxfpao41">
+            <w:hyperlink w:history="1" r:id="rIdrg_9bbugzxfwbpm75-1zs">
               <w:r>
                 <w:rPr>
                   <w:rFonts w:ascii="Arial" w:cs="Arial" w:eastAsia="Arial" w:hAnsi="Arial"/>
@@ -36947,7 +37001,7 @@
               <w:spacing w:after="10" w:before="0"/>
               <w:ind w:left="120"/>
             </w:pPr>
-            <w:hyperlink w:history="1" r:id="rId2eyoz4s54nhumzwsemror">
+            <w:hyperlink w:history="1" r:id="rIdj8ychptehqgsgjx2gu0op">
               <w:r>
                 <w:rPr>
                   <w:rFonts w:ascii="Arial" w:cs="Arial" w:eastAsia="Arial" w:hAnsi="Arial"/>
@@ -37341,32 +37395,32 @@
         <w:tc>
           <w:tcPr>
             <w:tcW w:type="dxa" w:w="1520"/>
-            <w:shd w:fill="F2F2F2" w:color="auto" w:val="clear"/>
-            <w:tcMar>
-              <w:top w:type="dxa" w:w="60"/>
-              <w:left w:type="dxa" w:w="120"/>
-              <w:bottom w:type="dxa" w:w="60"/>
-              <w:right w:type="dxa" w:w="120"/>
-            </w:tcMar>
-            <w:vAlign w:val="top"/>
-          </w:tcPr>
-          <w:p>
-            <w:pPr>
-              <w:spacing w:after="40" w:before="0"/>
-              <w:jc w:val="left"/>
-            </w:pPr>
-            <w:r>
-              <w:rPr>
-                <w:rFonts w:ascii="Arial" w:cs="Arial" w:eastAsia="Arial" w:hAnsi="Arial"/>
-                <w:b/>
-                <w:bCs/>
-                <w:i w:val="false"/>
-                <w:iCs w:val="false"/>
-                <w:color w:val="000000"/>
-                <w:sz w:val="18"/>
-                <w:szCs w:val="18"/>
-              </w:rPr>
-              <w:t xml:space="preserve">Phase 5 — Model Building: Exit Reflection and Sub-Strand Assessment</w:t>
+            <w:shd w:fill="D5E8F0" w:color="auto" w:val="clear"/>
+            <w:tcMar>
+              <w:top w:type="dxa" w:w="60"/>
+              <w:left w:type="dxa" w:w="120"/>
+              <w:bottom w:type="dxa" w:w="60"/>
+              <w:right w:type="dxa" w:w="120"/>
+            </w:tcMar>
+            <w:vAlign w:val="top"/>
+          </w:tcPr>
+          <w:p>
+            <w:pPr>
+              <w:spacing w:after="40" w:before="0"/>
+              <w:jc w:val="left"/>
+            </w:pPr>
+            <w:r>
+              <w:rPr>
+                <w:rFonts w:ascii="Arial" w:cs="Arial" w:eastAsia="Arial" w:hAnsi="Arial"/>
+                <w:b/>
+                <w:bCs/>
+                <w:i w:val="false"/>
+                <w:iCs w:val="false"/>
+                <w:color w:val="000000"/>
+                <w:sz w:val="18"/>
+                <w:szCs w:val="18"/>
+              </w:rPr>
+              <w:t xml:space="preserve">Model Building Phase</w:t>
             </w:r>
           </w:p>
           <w:p>
@@ -37389,7 +37443,7 @@
             <w:pPr>
               <w:spacing w:after="20" w:before="0"/>
             </w:pPr>
-            <w:hyperlink w:history="1" r:id="rIdpz4axcuwurrs93u4s-spr">
+            <w:hyperlink w:history="1" r:id="rIdop1vpwjvjrmjty31vszpi">
               <w:r>
                 <w:rPr>
                   <w:rFonts w:ascii="Arial" w:cs="Arial" w:eastAsia="Arial" w:hAnsi="Arial"/>
@@ -37422,7 +37476,7 @@
               <w:spacing w:after="10" w:before="0"/>
               <w:ind w:left="120"/>
             </w:pPr>
-            <w:hyperlink w:history="1" r:id="rIdedwl4acyxuylto_tjtu9q">
+            <w:hyperlink w:history="1" r:id="rIdiv_wsnjuskfmgwcmwill7">
               <w:r>
                 <w:rPr>
                   <w:rFonts w:ascii="Arial" w:cs="Arial" w:eastAsia="Arial" w:hAnsi="Arial"/>
@@ -37467,7 +37521,7 @@
             <w:pPr>
               <w:spacing w:after="20" w:before="0"/>
             </w:pPr>
-            <w:hyperlink w:history="1" r:id="rIdpoqhqxva9etoq3hqx6eoz">
+            <w:hyperlink w:history="1" r:id="rIdsszc7fsexc0ngvy9b8lfb">
               <w:r>
                 <w:rPr>
                   <w:rFonts w:ascii="Arial" w:cs="Arial" w:eastAsia="Arial" w:hAnsi="Arial"/>
@@ -37500,7 +37554,7 @@
               <w:spacing w:after="10" w:before="0"/>
               <w:ind w:left="120"/>
             </w:pPr>
-            <w:hyperlink w:history="1" r:id="rIdcikb-9owd58qwf6qgdgep">
+            <w:hyperlink w:history="1" r:id="rIddagcdcsuewmqipcf_onlh">
               <w:r>
                 <w:rPr>
                   <w:rFonts w:ascii="Arial" w:cs="Arial" w:eastAsia="Arial" w:hAnsi="Arial"/>

</xml_diff>

<commit_message>
Address partner re-review: schemaVersion in JSON exports + two missing summaryTablePrompt.explained
- generators/lib/build_docs.js: JSON exporter now serializes schemaVersion
  as the first top-level key (was being dropped during .js to .json export
  because the run() destructure and JSON.stringify object literal omitted it)
- phys_3_4_data.js: add summaryTablePrompt.explained for Lesson 8
  (capacitor energy storage / Ol Kalou lightning)
- phys_4_2_data.js: add summaryTablePrompt.explained for Lesson 7
  (telescopes / MeerKAT)
- Regenerate all 42 JSON exports + 126 docx with corrected data

Resolves remaining items from partner's re-review of commit 3b75018.
</commit_message>
<xml_diff>
--- a/data/outputs/v2/Biology/SS1.1_Cell_Structure/Biology_Cell_Structure_CBE_LessonSequence.docx
+++ b/data/outputs/v2/Biology/SS1.1_Cell_Structure/Biology_Cell_Structure_CBE_LessonSequence.docx
@@ -3477,7 +3477,7 @@
             <w:pPr>
               <w:spacing w:after="20" w:before="0"/>
             </w:pPr>
-            <w:hyperlink w:history="1" r:id="rIddp8imfnep_txdbo2_5jbt">
+            <w:hyperlink w:history="1" r:id="rIdq8mrs6xh6e0afbclqjbgz">
               <w:r>
                 <w:rPr>
                   <w:rFonts w:ascii="Arial" w:cs="Arial" w:eastAsia="Arial" w:hAnsi="Arial"/>
@@ -3510,7 +3510,7 @@
               <w:spacing w:after="10" w:before="0"/>
               <w:ind w:left="120"/>
             </w:pPr>
-            <w:hyperlink w:history="1" r:id="rIdmcvksnhdy1e59cywn_ehl">
+            <w:hyperlink w:history="1" r:id="rIdbxf16tt-ovgvbrjrex0kj">
               <w:r>
                 <w:rPr>
                   <w:rFonts w:ascii="Arial" w:cs="Arial" w:eastAsia="Arial" w:hAnsi="Arial"/>
@@ -3555,7 +3555,7 @@
             <w:pPr>
               <w:spacing w:after="20" w:before="0"/>
             </w:pPr>
-            <w:hyperlink w:history="1" r:id="rIdw1pb-bw-appsshqfhlhod">
+            <w:hyperlink w:history="1" r:id="rIdwh_4kk_w-rsrb2ah8eao_">
               <w:r>
                 <w:rPr>
                   <w:rFonts w:ascii="Arial" w:cs="Arial" w:eastAsia="Arial" w:hAnsi="Arial"/>
@@ -3588,7 +3588,7 @@
               <w:spacing w:after="10" w:before="0"/>
               <w:ind w:left="120"/>
             </w:pPr>
-            <w:hyperlink w:history="1" r:id="rIdgvqb8mcgrwyo3a_c0bv2t">
+            <w:hyperlink w:history="1" r:id="rIdqf9e7f_w9ud7_doqawww_">
               <w:r>
                 <w:rPr>
                   <w:rFonts w:ascii="Arial" w:cs="Arial" w:eastAsia="Arial" w:hAnsi="Arial"/>
@@ -3783,7 +3783,7 @@
             <w:pPr>
               <w:spacing w:after="20" w:before="0"/>
             </w:pPr>
-            <w:hyperlink w:history="1" r:id="rId94gji-53xbczwnzszi_ct">
+            <w:hyperlink w:history="1" r:id="rId1ghurbuorhuki8oeovmcf">
               <w:r>
                 <w:rPr>
                   <w:rFonts w:ascii="Arial" w:cs="Arial" w:eastAsia="Arial" w:hAnsi="Arial"/>
@@ -3816,7 +3816,7 @@
               <w:spacing w:after="10" w:before="0"/>
               <w:ind w:left="120"/>
             </w:pPr>
-            <w:hyperlink w:history="1" r:id="rIdjo29bsnmcmzmpno6ynspx">
+            <w:hyperlink w:history="1" r:id="rId2gzce6nhzkttttavuxq7-">
               <w:r>
                 <w:rPr>
                   <w:rFonts w:ascii="Arial" w:cs="Arial" w:eastAsia="Arial" w:hAnsi="Arial"/>
@@ -3861,7 +3861,7 @@
             <w:pPr>
               <w:spacing w:after="20" w:before="0"/>
             </w:pPr>
-            <w:hyperlink w:history="1" r:id="rIdbop9uc1zvnwujj4tyw7qg">
+            <w:hyperlink w:history="1" r:id="rIdoqsnsqm2uqg2atseismjs">
               <w:r>
                 <w:rPr>
                   <w:rFonts w:ascii="Arial" w:cs="Arial" w:eastAsia="Arial" w:hAnsi="Arial"/>
@@ -3894,7 +3894,7 @@
               <w:spacing w:after="10" w:before="0"/>
               <w:ind w:left="120"/>
             </w:pPr>
-            <w:hyperlink w:history="1" r:id="rIdyxd5f6t1fs_1wagymuvd9">
+            <w:hyperlink w:history="1" r:id="rIdpnli8gdtvd9tm9zvu8lm8">
               <w:r>
                 <w:rPr>
                   <w:rFonts w:ascii="Arial" w:cs="Arial" w:eastAsia="Arial" w:hAnsi="Arial"/>
@@ -4089,7 +4089,7 @@
             <w:pPr>
               <w:spacing w:after="20" w:before="0"/>
             </w:pPr>
-            <w:hyperlink w:history="1" r:id="rIdbigzxvfxep-occoo4fzv0">
+            <w:hyperlink w:history="1" r:id="rIdknoz2lznbyxzbukusqxdu">
               <w:r>
                 <w:rPr>
                   <w:rFonts w:ascii="Arial" w:cs="Arial" w:eastAsia="Arial" w:hAnsi="Arial"/>
@@ -4122,7 +4122,7 @@
               <w:spacing w:after="10" w:before="0"/>
               <w:ind w:left="120"/>
             </w:pPr>
-            <w:hyperlink w:history="1" r:id="rIdm_jxqq6h4grl5ynmhv94q">
+            <w:hyperlink w:history="1" r:id="rIdlrye7h5ti3rkjwn6ta0gv">
               <w:r>
                 <w:rPr>
                   <w:rFonts w:ascii="Arial" w:cs="Arial" w:eastAsia="Arial" w:hAnsi="Arial"/>
@@ -4167,7 +4167,7 @@
             <w:pPr>
               <w:spacing w:after="20" w:before="0"/>
             </w:pPr>
-            <w:hyperlink w:history="1" r:id="rIdsx5v33qbophlj4zoiuvyd">
+            <w:hyperlink w:history="1" r:id="rIdyfbwm4qjcigl_oe4l_gse">
               <w:r>
                 <w:rPr>
                   <w:rFonts w:ascii="Arial" w:cs="Arial" w:eastAsia="Arial" w:hAnsi="Arial"/>
@@ -4200,7 +4200,7 @@
               <w:spacing w:after="10" w:before="0"/>
               <w:ind w:left="120"/>
             </w:pPr>
-            <w:hyperlink w:history="1" r:id="rIdnr1orudewrbgctggd4hrm">
+            <w:hyperlink w:history="1" r:id="rId5ormkco7ojohtc8u7_e1z">
               <w:r>
                 <w:rPr>
                   <w:rFonts w:ascii="Arial" w:cs="Arial" w:eastAsia="Arial" w:hAnsi="Arial"/>
@@ -4395,7 +4395,7 @@
             <w:pPr>
               <w:spacing w:after="20" w:before="0"/>
             </w:pPr>
-            <w:hyperlink w:history="1" r:id="rIdy_bhil0ei30nvthh7zohj">
+            <w:hyperlink w:history="1" r:id="rIddmzochnkuntru67d1lapw">
               <w:r>
                 <w:rPr>
                   <w:rFonts w:ascii="Arial" w:cs="Arial" w:eastAsia="Arial" w:hAnsi="Arial"/>
@@ -4428,7 +4428,7 @@
               <w:spacing w:after="10" w:before="0"/>
               <w:ind w:left="120"/>
             </w:pPr>
-            <w:hyperlink w:history="1" r:id="rIdusghysfrylitvwctj0a2q">
+            <w:hyperlink w:history="1" r:id="rIdg078lo6xo73lt1qsdf1lm">
               <w:r>
                 <w:rPr>
                   <w:rFonts w:ascii="Arial" w:cs="Arial" w:eastAsia="Arial" w:hAnsi="Arial"/>
@@ -4473,7 +4473,7 @@
             <w:pPr>
               <w:spacing w:after="20" w:before="0"/>
             </w:pPr>
-            <w:hyperlink w:history="1" r:id="rIdl05v7zl4lzepk5fn-6g41">
+            <w:hyperlink w:history="1" r:id="rIds6vn6dqlvtmawv4xxgj4m">
               <w:r>
                 <w:rPr>
                   <w:rFonts w:ascii="Arial" w:cs="Arial" w:eastAsia="Arial" w:hAnsi="Arial"/>
@@ -4506,7 +4506,7 @@
               <w:spacing w:after="10" w:before="0"/>
               <w:ind w:left="120"/>
             </w:pPr>
-            <w:hyperlink w:history="1" r:id="rIdxih_ug-yl3yxyssmzviq2">
+            <w:hyperlink w:history="1" r:id="rIdeaneuefqzi_drit03dznw">
               <w:r>
                 <w:rPr>
                   <w:rFonts w:ascii="Arial" w:cs="Arial" w:eastAsia="Arial" w:hAnsi="Arial"/>
@@ -4701,7 +4701,7 @@
             <w:pPr>
               <w:spacing w:after="20" w:before="0"/>
             </w:pPr>
-            <w:hyperlink w:history="1" r:id="rId2grdwrrdejf5hw0sm-rh2">
+            <w:hyperlink w:history="1" r:id="rIdtmmbyrwm_coaygo2m-g4e">
               <w:r>
                 <w:rPr>
                   <w:rFonts w:ascii="Arial" w:cs="Arial" w:eastAsia="Arial" w:hAnsi="Arial"/>
@@ -4734,7 +4734,7 @@
               <w:spacing w:after="10" w:before="0"/>
               <w:ind w:left="120"/>
             </w:pPr>
-            <w:hyperlink w:history="1" r:id="rIdbsb7l06b_clnvg-o2l3ta">
+            <w:hyperlink w:history="1" r:id="rId9lri_lxjc8xv34r6fk1n4">
               <w:r>
                 <w:rPr>
                   <w:rFonts w:ascii="Arial" w:cs="Arial" w:eastAsia="Arial" w:hAnsi="Arial"/>
@@ -4779,7 +4779,7 @@
             <w:pPr>
               <w:spacing w:after="20" w:before="0"/>
             </w:pPr>
-            <w:hyperlink w:history="1" r:id="rId3gmdlhfjiygwnuevsweli">
+            <w:hyperlink w:history="1" r:id="rIdnbibazqpxaivzf3voqf_j">
               <w:r>
                 <w:rPr>
                   <w:rFonts w:ascii="Arial" w:cs="Arial" w:eastAsia="Arial" w:hAnsi="Arial"/>
@@ -4812,7 +4812,7 @@
               <w:spacing w:after="10" w:before="0"/>
               <w:ind w:left="120"/>
             </w:pPr>
-            <w:hyperlink w:history="1" r:id="rId8vhwi1_n_mggxng01ouzb">
+            <w:hyperlink w:history="1" r:id="rIdavvmlf6emvjolxtvdypod">
               <w:r>
                 <w:rPr>
                   <w:rFonts w:ascii="Arial" w:cs="Arial" w:eastAsia="Arial" w:hAnsi="Arial"/>
@@ -6299,7 +6299,7 @@
             <w:pPr>
               <w:spacing w:after="20" w:before="0"/>
             </w:pPr>
-            <w:hyperlink w:history="1" r:id="rIdaw8wt423yk6ey3ozsqfyr">
+            <w:hyperlink w:history="1" r:id="rId6zwnjzjiedofmk4wlatbs">
               <w:r>
                 <w:rPr>
                   <w:rFonts w:ascii="Arial" w:cs="Arial" w:eastAsia="Arial" w:hAnsi="Arial"/>
@@ -6332,7 +6332,7 @@
               <w:spacing w:after="10" w:before="0"/>
               <w:ind w:left="120"/>
             </w:pPr>
-            <w:hyperlink w:history="1" r:id="rIdieclf7525uqnigjwvem3t">
+            <w:hyperlink w:history="1" r:id="rIdn1lpbpwxlxnagecfpoej2">
               <w:r>
                 <w:rPr>
                   <w:rFonts w:ascii="Arial" w:cs="Arial" w:eastAsia="Arial" w:hAnsi="Arial"/>
@@ -6377,7 +6377,7 @@
             <w:pPr>
               <w:spacing w:after="20" w:before="0"/>
             </w:pPr>
-            <w:hyperlink w:history="1" r:id="rIdb8e20djznt5bz8uwcozoc">
+            <w:hyperlink w:history="1" r:id="rIdzazgaulignmrclettjq_z">
               <w:r>
                 <w:rPr>
                   <w:rFonts w:ascii="Arial" w:cs="Arial" w:eastAsia="Arial" w:hAnsi="Arial"/>
@@ -6410,7 +6410,7 @@
               <w:spacing w:after="10" w:before="0"/>
               <w:ind w:left="120"/>
             </w:pPr>
-            <w:hyperlink w:history="1" r:id="rIdpfvyjyvagz_osbgdjheek">
+            <w:hyperlink w:history="1" r:id="rIdnazjwaiuhjmfnyhjtottq">
               <w:r>
                 <w:rPr>
                   <w:rFonts w:ascii="Arial" w:cs="Arial" w:eastAsia="Arial" w:hAnsi="Arial"/>
@@ -6605,7 +6605,7 @@
             <w:pPr>
               <w:spacing w:after="20" w:before="0"/>
             </w:pPr>
-            <w:hyperlink w:history="1" r:id="rId_ebevwxxfzs4vnhgls4gc">
+            <w:hyperlink w:history="1" r:id="rIdpx4xn0qgaajcem4eowbp7">
               <w:r>
                 <w:rPr>
                   <w:rFonts w:ascii="Arial" w:cs="Arial" w:eastAsia="Arial" w:hAnsi="Arial"/>
@@ -6638,7 +6638,7 @@
               <w:spacing w:after="10" w:before="0"/>
               <w:ind w:left="120"/>
             </w:pPr>
-            <w:hyperlink w:history="1" r:id="rId_ebkneteddeov4yzmhrxs">
+            <w:hyperlink w:history="1" r:id="rId-geuyi9w_lk8kyeiaqkjo">
               <w:r>
                 <w:rPr>
                   <w:rFonts w:ascii="Arial" w:cs="Arial" w:eastAsia="Arial" w:hAnsi="Arial"/>
@@ -6683,7 +6683,7 @@
             <w:pPr>
               <w:spacing w:after="20" w:before="0"/>
             </w:pPr>
-            <w:hyperlink w:history="1" r:id="rIdmdhcv7upf47gf4u6ezycb">
+            <w:hyperlink w:history="1" r:id="rId-i0bocifrepmmaldpxic7">
               <w:r>
                 <w:rPr>
                   <w:rFonts w:ascii="Arial" w:cs="Arial" w:eastAsia="Arial" w:hAnsi="Arial"/>
@@ -6716,7 +6716,7 @@
               <w:spacing w:after="10" w:before="0"/>
               <w:ind w:left="120"/>
             </w:pPr>
-            <w:hyperlink w:history="1" r:id="rIdsiylrzip308-4kqlh0p8u">
+            <w:hyperlink w:history="1" r:id="rIdn0afv0us_4bwi88m9dhzh">
               <w:r>
                 <w:rPr>
                   <w:rFonts w:ascii="Arial" w:cs="Arial" w:eastAsia="Arial" w:hAnsi="Arial"/>
@@ -6911,7 +6911,7 @@
             <w:pPr>
               <w:spacing w:after="20" w:before="0"/>
             </w:pPr>
-            <w:hyperlink w:history="1" r:id="rIdanu6uldn2sopaf354dgnh">
+            <w:hyperlink w:history="1" r:id="rIduuoy4wtk771vlku9d0jpa">
               <w:r>
                 <w:rPr>
                   <w:rFonts w:ascii="Arial" w:cs="Arial" w:eastAsia="Arial" w:hAnsi="Arial"/>
@@ -6944,7 +6944,7 @@
               <w:spacing w:after="10" w:before="0"/>
               <w:ind w:left="120"/>
             </w:pPr>
-            <w:hyperlink w:history="1" r:id="rId95njhgjlmfucr-qzkbs97">
+            <w:hyperlink w:history="1" r:id="rId1v-dnjvih9d0whkrmhpr4">
               <w:r>
                 <w:rPr>
                   <w:rFonts w:ascii="Arial" w:cs="Arial" w:eastAsia="Arial" w:hAnsi="Arial"/>
@@ -6989,7 +6989,7 @@
             <w:pPr>
               <w:spacing w:after="20" w:before="0"/>
             </w:pPr>
-            <w:hyperlink w:history="1" r:id="rId2_tampgjgvwir5vjjqzl-">
+            <w:hyperlink w:history="1" r:id="rId0s0tjlx15fefbv3agfnbw">
               <w:r>
                 <w:rPr>
                   <w:rFonts w:ascii="Arial" w:cs="Arial" w:eastAsia="Arial" w:hAnsi="Arial"/>
@@ -7022,7 +7022,7 @@
               <w:spacing w:after="10" w:before="0"/>
               <w:ind w:left="120"/>
             </w:pPr>
-            <w:hyperlink w:history="1" r:id="rId8_xy121yiyal0suao0778">
+            <w:hyperlink w:history="1" r:id="rIdbrkgycieq1yhedfdnqiy_">
               <w:r>
                 <w:rPr>
                   <w:rFonts w:ascii="Arial" w:cs="Arial" w:eastAsia="Arial" w:hAnsi="Arial"/>
@@ -7217,7 +7217,7 @@
             <w:pPr>
               <w:spacing w:after="20" w:before="0"/>
             </w:pPr>
-            <w:hyperlink w:history="1" r:id="rIdi1pfojkphs8rzig5pahav">
+            <w:hyperlink w:history="1" r:id="rIdfuyqnzdmzz8bmtrxjpqmz">
               <w:r>
                 <w:rPr>
                   <w:rFonts w:ascii="Arial" w:cs="Arial" w:eastAsia="Arial" w:hAnsi="Arial"/>
@@ -7250,7 +7250,7 @@
               <w:spacing w:after="10" w:before="0"/>
               <w:ind w:left="120"/>
             </w:pPr>
-            <w:hyperlink w:history="1" r:id="rIdfu71eqo29-jcnxzcn9mjx">
+            <w:hyperlink w:history="1" r:id="rIdov7xuwglaqe1w7zb5juqg">
               <w:r>
                 <w:rPr>
                   <w:rFonts w:ascii="Arial" w:cs="Arial" w:eastAsia="Arial" w:hAnsi="Arial"/>
@@ -7295,7 +7295,7 @@
             <w:pPr>
               <w:spacing w:after="20" w:before="0"/>
             </w:pPr>
-            <w:hyperlink w:history="1" r:id="rIderv1d-wxcc8_bbpbueeui">
+            <w:hyperlink w:history="1" r:id="rIdfexy_ku8buua2d10yq_yz">
               <w:r>
                 <w:rPr>
                   <w:rFonts w:ascii="Arial" w:cs="Arial" w:eastAsia="Arial" w:hAnsi="Arial"/>
@@ -7328,7 +7328,7 @@
               <w:spacing w:after="10" w:before="0"/>
               <w:ind w:left="120"/>
             </w:pPr>
-            <w:hyperlink w:history="1" r:id="rIdawnzk7-rytodx3j9uxb8r">
+            <w:hyperlink w:history="1" r:id="rIdlzlumieoecjwuvzh4l9tw">
               <w:r>
                 <w:rPr>
                   <w:rFonts w:ascii="Arial" w:cs="Arial" w:eastAsia="Arial" w:hAnsi="Arial"/>
@@ -7523,7 +7523,7 @@
             <w:pPr>
               <w:spacing w:after="20" w:before="0"/>
             </w:pPr>
-            <w:hyperlink w:history="1" r:id="rIdtlbocusdycuhe4nbkuoxg">
+            <w:hyperlink w:history="1" r:id="rIdzfxr2qbpablo2uc4enjew">
               <w:r>
                 <w:rPr>
                   <w:rFonts w:ascii="Arial" w:cs="Arial" w:eastAsia="Arial" w:hAnsi="Arial"/>
@@ -7556,7 +7556,7 @@
               <w:spacing w:after="10" w:before="0"/>
               <w:ind w:left="120"/>
             </w:pPr>
-            <w:hyperlink w:history="1" r:id="rIdyjpj7ejjqwbywvxfiycq_">
+            <w:hyperlink w:history="1" r:id="rIdbtay8r3jfgxsxhncgghwx">
               <w:r>
                 <w:rPr>
                   <w:rFonts w:ascii="Arial" w:cs="Arial" w:eastAsia="Arial" w:hAnsi="Arial"/>
@@ -7601,7 +7601,7 @@
             <w:pPr>
               <w:spacing w:after="20" w:before="0"/>
             </w:pPr>
-            <w:hyperlink w:history="1" r:id="rIdxztrievl4jkx4hlppqyh1">
+            <w:hyperlink w:history="1" r:id="rIdsrwricori6g28idkamco9">
               <w:r>
                 <w:rPr>
                   <w:rFonts w:ascii="Arial" w:cs="Arial" w:eastAsia="Arial" w:hAnsi="Arial"/>
@@ -7634,7 +7634,7 @@
               <w:spacing w:after="10" w:before="0"/>
               <w:ind w:left="120"/>
             </w:pPr>
-            <w:hyperlink w:history="1" r:id="rIdtcrl6affp9x_qbax46t3h">
+            <w:hyperlink w:history="1" r:id="rIdnnemlj1seazvhwjufznii">
               <w:r>
                 <w:rPr>
                   <w:rFonts w:ascii="Arial" w:cs="Arial" w:eastAsia="Arial" w:hAnsi="Arial"/>
@@ -9121,7 +9121,7 @@
             <w:pPr>
               <w:spacing w:after="20" w:before="0"/>
             </w:pPr>
-            <w:hyperlink w:history="1" r:id="rIdcj51-y6g_ymom8y9s5jtu">
+            <w:hyperlink w:history="1" r:id="rIdpdjnlgykny_tecckaalaw">
               <w:r>
                 <w:rPr>
                   <w:rFonts w:ascii="Arial" w:cs="Arial" w:eastAsia="Arial" w:hAnsi="Arial"/>
@@ -9154,7 +9154,7 @@
               <w:spacing w:after="10" w:before="0"/>
               <w:ind w:left="120"/>
             </w:pPr>
-            <w:hyperlink w:history="1" r:id="rIdpqq3d_wzwhnpgfp3mz0za">
+            <w:hyperlink w:history="1" r:id="rIdonwiqhcoj3cgjendaydrb">
               <w:r>
                 <w:rPr>
                   <w:rFonts w:ascii="Arial" w:cs="Arial" w:eastAsia="Arial" w:hAnsi="Arial"/>
@@ -9199,7 +9199,7 @@
             <w:pPr>
               <w:spacing w:after="20" w:before="0"/>
             </w:pPr>
-            <w:hyperlink w:history="1" r:id="rIdegefib4b-72dl2jrxeapv">
+            <w:hyperlink w:history="1" r:id="rIdd7v-waa41sshnigv5vbxr">
               <w:r>
                 <w:rPr>
                   <w:rFonts w:ascii="Arial" w:cs="Arial" w:eastAsia="Arial" w:hAnsi="Arial"/>
@@ -9232,7 +9232,7 @@
               <w:spacing w:after="10" w:before="0"/>
               <w:ind w:left="120"/>
             </w:pPr>
-            <w:hyperlink w:history="1" r:id="rIdjfhptqw_1qul-4fwhkmfb">
+            <w:hyperlink w:history="1" r:id="rIdaqmiq47okc-lq09u7ooqy">
               <w:r>
                 <w:rPr>
                   <w:rFonts w:ascii="Arial" w:cs="Arial" w:eastAsia="Arial" w:hAnsi="Arial"/>
@@ -9427,7 +9427,7 @@
             <w:pPr>
               <w:spacing w:after="20" w:before="0"/>
             </w:pPr>
-            <w:hyperlink w:history="1" r:id="rIdqzldpgop1dejnlldb91u_">
+            <w:hyperlink w:history="1" r:id="rIdmwqlxnpqgegctza6ruyvt">
               <w:r>
                 <w:rPr>
                   <w:rFonts w:ascii="Arial" w:cs="Arial" w:eastAsia="Arial" w:hAnsi="Arial"/>
@@ -9460,7 +9460,7 @@
               <w:spacing w:after="10" w:before="0"/>
               <w:ind w:left="120"/>
             </w:pPr>
-            <w:hyperlink w:history="1" r:id="rIdvjna7su7c7-7ljmp5bddr">
+            <w:hyperlink w:history="1" r:id="rId6u-izdfxtneckknact5qs">
               <w:r>
                 <w:rPr>
                   <w:rFonts w:ascii="Arial" w:cs="Arial" w:eastAsia="Arial" w:hAnsi="Arial"/>
@@ -9505,7 +9505,7 @@
             <w:pPr>
               <w:spacing w:after="20" w:before="0"/>
             </w:pPr>
-            <w:hyperlink w:history="1" r:id="rIdppjzhnuq3-p6cbyznir8g">
+            <w:hyperlink w:history="1" r:id="rIdp1joywo9rul9czovhuug-">
               <w:r>
                 <w:rPr>
                   <w:rFonts w:ascii="Arial" w:cs="Arial" w:eastAsia="Arial" w:hAnsi="Arial"/>
@@ -9538,7 +9538,7 @@
               <w:spacing w:after="10" w:before="0"/>
               <w:ind w:left="120"/>
             </w:pPr>
-            <w:hyperlink w:history="1" r:id="rIdi8_9-kjvxbfhhuxoeprpm">
+            <w:hyperlink w:history="1" r:id="rId3z7ijezkuvae3gkvqaelh">
               <w:r>
                 <w:rPr>
                   <w:rFonts w:ascii="Arial" w:cs="Arial" w:eastAsia="Arial" w:hAnsi="Arial"/>
@@ -9733,7 +9733,7 @@
             <w:pPr>
               <w:spacing w:after="20" w:before="0"/>
             </w:pPr>
-            <w:hyperlink w:history="1" r:id="rIdtvyz-cbuku8qdi1ly3wke">
+            <w:hyperlink w:history="1" r:id="rIds9lvocayye8773sj5d5yp">
               <w:r>
                 <w:rPr>
                   <w:rFonts w:ascii="Arial" w:cs="Arial" w:eastAsia="Arial" w:hAnsi="Arial"/>
@@ -9766,7 +9766,7 @@
               <w:spacing w:after="10" w:before="0"/>
               <w:ind w:left="120"/>
             </w:pPr>
-            <w:hyperlink w:history="1" r:id="rId4e2d_v9v5ur6gaaxqtvth">
+            <w:hyperlink w:history="1" r:id="rIdzfum0lo84uu2vhla2hcrk">
               <w:r>
                 <w:rPr>
                   <w:rFonts w:ascii="Arial" w:cs="Arial" w:eastAsia="Arial" w:hAnsi="Arial"/>
@@ -9811,7 +9811,7 @@
             <w:pPr>
               <w:spacing w:after="20" w:before="0"/>
             </w:pPr>
-            <w:hyperlink w:history="1" r:id="rIdcv28rxcbaqtsrnxzhivob">
+            <w:hyperlink w:history="1" r:id="rIdobikem-wmxfaso0hicc_0">
               <w:r>
                 <w:rPr>
                   <w:rFonts w:ascii="Arial" w:cs="Arial" w:eastAsia="Arial" w:hAnsi="Arial"/>
@@ -9844,7 +9844,7 @@
               <w:spacing w:after="10" w:before="0"/>
               <w:ind w:left="120"/>
             </w:pPr>
-            <w:hyperlink w:history="1" r:id="rIdptuy_zcuhtfsdsnrs-qlm">
+            <w:hyperlink w:history="1" r:id="rIdpayikomq4nnrrd11k1tgg">
               <w:r>
                 <w:rPr>
                   <w:rFonts w:ascii="Arial" w:cs="Arial" w:eastAsia="Arial" w:hAnsi="Arial"/>
@@ -10039,7 +10039,7 @@
             <w:pPr>
               <w:spacing w:after="20" w:before="0"/>
             </w:pPr>
-            <w:hyperlink w:history="1" r:id="rIdhsw9mddbowlxkzny_ou8v">
+            <w:hyperlink w:history="1" r:id="rIdv64mok-oehfordaebnoif">
               <w:r>
                 <w:rPr>
                   <w:rFonts w:ascii="Arial" w:cs="Arial" w:eastAsia="Arial" w:hAnsi="Arial"/>
@@ -10072,7 +10072,7 @@
               <w:spacing w:after="10" w:before="0"/>
               <w:ind w:left="120"/>
             </w:pPr>
-            <w:hyperlink w:history="1" r:id="rIdwsfeuk9vfhf1d94w6wfgq">
+            <w:hyperlink w:history="1" r:id="rIdcn8c-jq4ycfu4wt87qnsz">
               <w:r>
                 <w:rPr>
                   <w:rFonts w:ascii="Arial" w:cs="Arial" w:eastAsia="Arial" w:hAnsi="Arial"/>
@@ -10117,7 +10117,7 @@
             <w:pPr>
               <w:spacing w:after="20" w:before="0"/>
             </w:pPr>
-            <w:hyperlink w:history="1" r:id="rId2bem13tej9_dpnbbrnvxw">
+            <w:hyperlink w:history="1" r:id="rIdjnky8mjz_jwgwmurjlko6">
               <w:r>
                 <w:rPr>
                   <w:rFonts w:ascii="Arial" w:cs="Arial" w:eastAsia="Arial" w:hAnsi="Arial"/>
@@ -10150,7 +10150,7 @@
               <w:spacing w:after="10" w:before="0"/>
               <w:ind w:left="120"/>
             </w:pPr>
-            <w:hyperlink w:history="1" r:id="rIdywbslcfcoaztwavdhvkob">
+            <w:hyperlink w:history="1" r:id="rIdc6cv-uiljlzudzdqzbpvt">
               <w:r>
                 <w:rPr>
                   <w:rFonts w:ascii="Arial" w:cs="Arial" w:eastAsia="Arial" w:hAnsi="Arial"/>
@@ -10345,7 +10345,7 @@
             <w:pPr>
               <w:spacing w:after="20" w:before="0"/>
             </w:pPr>
-            <w:hyperlink w:history="1" r:id="rIdfdeotyxj6vbz0rm8idm8_">
+            <w:hyperlink w:history="1" r:id="rId9jclgha_vzjnxnmdnnbnc">
               <w:r>
                 <w:rPr>
                   <w:rFonts w:ascii="Arial" w:cs="Arial" w:eastAsia="Arial" w:hAnsi="Arial"/>
@@ -10378,7 +10378,7 @@
               <w:spacing w:after="10" w:before="0"/>
               <w:ind w:left="120"/>
             </w:pPr>
-            <w:hyperlink w:history="1" r:id="rId7y9dfoqdn_lrppcfliw6h">
+            <w:hyperlink w:history="1" r:id="rIdauurue5csfhandde-pfwc">
               <w:r>
                 <w:rPr>
                   <w:rFonts w:ascii="Arial" w:cs="Arial" w:eastAsia="Arial" w:hAnsi="Arial"/>
@@ -10423,7 +10423,7 @@
             <w:pPr>
               <w:spacing w:after="20" w:before="0"/>
             </w:pPr>
-            <w:hyperlink w:history="1" r:id="rIdmiubsaca_swc2rjgn3ai8">
+            <w:hyperlink w:history="1" r:id="rIdp5syl8hee0a1iy3gj3yf1">
               <w:r>
                 <w:rPr>
                   <w:rFonts w:ascii="Arial" w:cs="Arial" w:eastAsia="Arial" w:hAnsi="Arial"/>
@@ -10456,7 +10456,7 @@
               <w:spacing w:after="10" w:before="0"/>
               <w:ind w:left="120"/>
             </w:pPr>
-            <w:hyperlink w:history="1" r:id="rIdutx8rxhhpbyd-tuqz0gjl">
+            <w:hyperlink w:history="1" r:id="rId8lgc8hbkoafnddfddd1_y">
               <w:r>
                 <w:rPr>
                   <w:rFonts w:ascii="Arial" w:cs="Arial" w:eastAsia="Arial" w:hAnsi="Arial"/>
@@ -11943,7 +11943,7 @@
             <w:pPr>
               <w:spacing w:after="20" w:before="0"/>
             </w:pPr>
-            <w:hyperlink w:history="1" r:id="rIdqejmfz_74qzdmtql_vw91">
+            <w:hyperlink w:history="1" r:id="rIdwbbjzuc-qk097fjcxwdov">
               <w:r>
                 <w:rPr>
                   <w:rFonts w:ascii="Arial" w:cs="Arial" w:eastAsia="Arial" w:hAnsi="Arial"/>
@@ -11976,7 +11976,7 @@
               <w:spacing w:after="10" w:before="0"/>
               <w:ind w:left="120"/>
             </w:pPr>
-            <w:hyperlink w:history="1" r:id="rIdqo72qeugph1y9hsycg1zb">
+            <w:hyperlink w:history="1" r:id="rIdayekdumttayz1bwx5sqpt">
               <w:r>
                 <w:rPr>
                   <w:rFonts w:ascii="Arial" w:cs="Arial" w:eastAsia="Arial" w:hAnsi="Arial"/>
@@ -12021,7 +12021,7 @@
             <w:pPr>
               <w:spacing w:after="20" w:before="0"/>
             </w:pPr>
-            <w:hyperlink w:history="1" r:id="rIdbms9yw_qck8xkxesw3kvo">
+            <w:hyperlink w:history="1" r:id="rIdv2ib__a1sqe7egogenz-z">
               <w:r>
                 <w:rPr>
                   <w:rFonts w:ascii="Arial" w:cs="Arial" w:eastAsia="Arial" w:hAnsi="Arial"/>
@@ -12054,7 +12054,7 @@
               <w:spacing w:after="10" w:before="0"/>
               <w:ind w:left="120"/>
             </w:pPr>
-            <w:hyperlink w:history="1" r:id="rIdn36rkcb0-l2pqlop3xniy">
+            <w:hyperlink w:history="1" r:id="rIdzgzhnitu0x72cpogkkdid">
               <w:r>
                 <w:rPr>
                   <w:rFonts w:ascii="Arial" w:cs="Arial" w:eastAsia="Arial" w:hAnsi="Arial"/>
@@ -12249,7 +12249,7 @@
             <w:pPr>
               <w:spacing w:after="20" w:before="0"/>
             </w:pPr>
-            <w:hyperlink w:history="1" r:id="rIdchhfipyrdkeuw8_fegwbq">
+            <w:hyperlink w:history="1" r:id="rId8olz4qbhi5dsmdrnmvjyu">
               <w:r>
                 <w:rPr>
                   <w:rFonts w:ascii="Arial" w:cs="Arial" w:eastAsia="Arial" w:hAnsi="Arial"/>
@@ -12282,7 +12282,7 @@
               <w:spacing w:after="10" w:before="0"/>
               <w:ind w:left="120"/>
             </w:pPr>
-            <w:hyperlink w:history="1" r:id="rId8m9mjxcajl1jtns5yhorq">
+            <w:hyperlink w:history="1" r:id="rIdeswapfgletssdrogg4fel">
               <w:r>
                 <w:rPr>
                   <w:rFonts w:ascii="Arial" w:cs="Arial" w:eastAsia="Arial" w:hAnsi="Arial"/>
@@ -12327,7 +12327,7 @@
             <w:pPr>
               <w:spacing w:after="20" w:before="0"/>
             </w:pPr>
-            <w:hyperlink w:history="1" r:id="rIdd7iitpaxp3shbc1vqva-l">
+            <w:hyperlink w:history="1" r:id="rIdbnp3ve9b4-v4b0e1z5ien">
               <w:r>
                 <w:rPr>
                   <w:rFonts w:ascii="Arial" w:cs="Arial" w:eastAsia="Arial" w:hAnsi="Arial"/>
@@ -12360,7 +12360,7 @@
               <w:spacing w:after="10" w:before="0"/>
               <w:ind w:left="120"/>
             </w:pPr>
-            <w:hyperlink w:history="1" r:id="rIdswdn1b95kotxkxz-krp93">
+            <w:hyperlink w:history="1" r:id="rIddn0pv80fxy52qfzif1mf5">
               <w:r>
                 <w:rPr>
                   <w:rFonts w:ascii="Arial" w:cs="Arial" w:eastAsia="Arial" w:hAnsi="Arial"/>
@@ -12555,7 +12555,7 @@
             <w:pPr>
               <w:spacing w:after="20" w:before="0"/>
             </w:pPr>
-            <w:hyperlink w:history="1" r:id="rIdjdzppknj82qvd9xmawfxi">
+            <w:hyperlink w:history="1" r:id="rIdnfak_vk7dzti2qrujoifr">
               <w:r>
                 <w:rPr>
                   <w:rFonts w:ascii="Arial" w:cs="Arial" w:eastAsia="Arial" w:hAnsi="Arial"/>
@@ -12588,7 +12588,7 @@
               <w:spacing w:after="10" w:before="0"/>
               <w:ind w:left="120"/>
             </w:pPr>
-            <w:hyperlink w:history="1" r:id="rIdcljwosq_1sosfdapjz0gx">
+            <w:hyperlink w:history="1" r:id="rId2okmqrsrotgu5ylmiid9d">
               <w:r>
                 <w:rPr>
                   <w:rFonts w:ascii="Arial" w:cs="Arial" w:eastAsia="Arial" w:hAnsi="Arial"/>
@@ -12633,7 +12633,7 @@
             <w:pPr>
               <w:spacing w:after="20" w:before="0"/>
             </w:pPr>
-            <w:hyperlink w:history="1" r:id="rIdmyhwtskdoonym0w4ee0-0">
+            <w:hyperlink w:history="1" r:id="rIdrvakusm0pglbgzuyli-oz">
               <w:r>
                 <w:rPr>
                   <w:rFonts w:ascii="Arial" w:cs="Arial" w:eastAsia="Arial" w:hAnsi="Arial"/>
@@ -12666,7 +12666,7 @@
               <w:spacing w:after="10" w:before="0"/>
               <w:ind w:left="120"/>
             </w:pPr>
-            <w:hyperlink w:history="1" r:id="rIdkmb1apo4bqe1kstotk-qy">
+            <w:hyperlink w:history="1" r:id="rIdx9y2yi18ceh6bfqxrlvtc">
               <w:r>
                 <w:rPr>
                   <w:rFonts w:ascii="Arial" w:cs="Arial" w:eastAsia="Arial" w:hAnsi="Arial"/>
@@ -13250,7 +13250,7 @@
             <w:pPr>
               <w:spacing w:after="20" w:before="0"/>
             </w:pPr>
-            <w:hyperlink w:history="1" r:id="rId8c0fnnlkqf9ucl7_ezoeg">
+            <w:hyperlink w:history="1" r:id="rIdtyuvkacy-qalc-h_ga5ic">
               <w:r>
                 <w:rPr>
                   <w:rFonts w:ascii="Arial" w:cs="Arial" w:eastAsia="Arial" w:hAnsi="Arial"/>
@@ -13283,7 +13283,7 @@
               <w:spacing w:after="10" w:before="0"/>
               <w:ind w:left="120"/>
             </w:pPr>
-            <w:hyperlink w:history="1" r:id="rIdmefgzrxcoptx9ispt1kh4">
+            <w:hyperlink w:history="1" r:id="rId9gjtxjm--rx1_rbo3avci">
               <w:r>
                 <w:rPr>
                   <w:rFonts w:ascii="Arial" w:cs="Arial" w:eastAsia="Arial" w:hAnsi="Arial"/>
@@ -13328,7 +13328,7 @@
             <w:pPr>
               <w:spacing w:after="20" w:before="0"/>
             </w:pPr>
-            <w:hyperlink w:history="1" r:id="rIdqgwi850qhehagzfsh6apy">
+            <w:hyperlink w:history="1" r:id="rIdrg8vtn9-ongouonezael7">
               <w:r>
                 <w:rPr>
                   <w:rFonts w:ascii="Arial" w:cs="Arial" w:eastAsia="Arial" w:hAnsi="Arial"/>
@@ -13361,7 +13361,7 @@
               <w:spacing w:after="10" w:before="0"/>
               <w:ind w:left="120"/>
             </w:pPr>
-            <w:hyperlink w:history="1" r:id="rIdrx_nk9rlwfgze1ljzlpby">
+            <w:hyperlink w:history="1" r:id="rIdm_d_8ouzhyjcfjeb_uwx6">
               <w:r>
                 <w:rPr>
                   <w:rFonts w:ascii="Arial" w:cs="Arial" w:eastAsia="Arial" w:hAnsi="Arial"/>
@@ -13556,7 +13556,7 @@
             <w:pPr>
               <w:spacing w:after="20" w:before="0"/>
             </w:pPr>
-            <w:hyperlink w:history="1" r:id="rIdhfrhsm7lik3au5cqm31uf">
+            <w:hyperlink w:history="1" r:id="rIdkvafm2rxz0y_dxm4r8k9z">
               <w:r>
                 <w:rPr>
                   <w:rFonts w:ascii="Arial" w:cs="Arial" w:eastAsia="Arial" w:hAnsi="Arial"/>
@@ -13589,7 +13589,7 @@
               <w:spacing w:after="10" w:before="0"/>
               <w:ind w:left="120"/>
             </w:pPr>
-            <w:hyperlink w:history="1" r:id="rIdcuhfnbtnhzybym9nslkrt">
+            <w:hyperlink w:history="1" r:id="rIdm2qanoos9b2vz8yhqfigd">
               <w:r>
                 <w:rPr>
                   <w:rFonts w:ascii="Arial" w:cs="Arial" w:eastAsia="Arial" w:hAnsi="Arial"/>
@@ -13634,7 +13634,7 @@
             <w:pPr>
               <w:spacing w:after="20" w:before="0"/>
             </w:pPr>
-            <w:hyperlink w:history="1" r:id="rId8ydd0e614swvb1okztaoq">
+            <w:hyperlink w:history="1" r:id="rIdtxj4drefi3pqxn0zuke0i">
               <w:r>
                 <w:rPr>
                   <w:rFonts w:ascii="Arial" w:cs="Arial" w:eastAsia="Arial" w:hAnsi="Arial"/>
@@ -13667,7 +13667,7 @@
               <w:spacing w:after="10" w:before="0"/>
               <w:ind w:left="120"/>
             </w:pPr>
-            <w:hyperlink w:history="1" r:id="rIdzhezbw-i7f8vrr04sfm3m">
+            <w:hyperlink w:history="1" r:id="rIdww5fklaogtc_wvnyr86wk">
               <w:r>
                 <w:rPr>
                   <w:rFonts w:ascii="Arial" w:cs="Arial" w:eastAsia="Arial" w:hAnsi="Arial"/>
@@ -15154,7 +15154,7 @@
             <w:pPr>
               <w:spacing w:after="20" w:before="0"/>
             </w:pPr>
-            <w:hyperlink w:history="1" r:id="rId3qjnixrur_cw4ijljtw0n">
+            <w:hyperlink w:history="1" r:id="rIdc6buysvvtmiserimkvmlu">
               <w:r>
                 <w:rPr>
                   <w:rFonts w:ascii="Arial" w:cs="Arial" w:eastAsia="Arial" w:hAnsi="Arial"/>
@@ -15187,7 +15187,7 @@
               <w:spacing w:after="10" w:before="0"/>
               <w:ind w:left="120"/>
             </w:pPr>
-            <w:hyperlink w:history="1" r:id="rId5t0kweanmaezg-gn--wp6">
+            <w:hyperlink w:history="1" r:id="rIdlo4wh0ujea3cqs-4tjwmv">
               <w:r>
                 <w:rPr>
                   <w:rFonts w:ascii="Arial" w:cs="Arial" w:eastAsia="Arial" w:hAnsi="Arial"/>
@@ -15232,7 +15232,7 @@
             <w:pPr>
               <w:spacing w:after="20" w:before="0"/>
             </w:pPr>
-            <w:hyperlink w:history="1" r:id="rIdul2eciu0y8zer9nqldbax">
+            <w:hyperlink w:history="1" r:id="rIdpxmvcp2ay-app8lmgpxl6">
               <w:r>
                 <w:rPr>
                   <w:rFonts w:ascii="Arial" w:cs="Arial" w:eastAsia="Arial" w:hAnsi="Arial"/>
@@ -15265,7 +15265,7 @@
               <w:spacing w:after="10" w:before="0"/>
               <w:ind w:left="120"/>
             </w:pPr>
-            <w:hyperlink w:history="1" r:id="rIdxjso_jb9vvbwg5cvvrdhd">
+            <w:hyperlink w:history="1" r:id="rIded4itt65kqmru5loufdid">
               <w:r>
                 <w:rPr>
                   <w:rFonts w:ascii="Arial" w:cs="Arial" w:eastAsia="Arial" w:hAnsi="Arial"/>
@@ -15460,7 +15460,7 @@
             <w:pPr>
               <w:spacing w:after="20" w:before="0"/>
             </w:pPr>
-            <w:hyperlink w:history="1" r:id="rIdgaa0svtuqp2znzrpn8-zl">
+            <w:hyperlink w:history="1" r:id="rIdb7sm0pdxwyrhkmslqk82b">
               <w:r>
                 <w:rPr>
                   <w:rFonts w:ascii="Arial" w:cs="Arial" w:eastAsia="Arial" w:hAnsi="Arial"/>
@@ -15493,7 +15493,7 @@
               <w:spacing w:after="10" w:before="0"/>
               <w:ind w:left="120"/>
             </w:pPr>
-            <w:hyperlink w:history="1" r:id="rIdabwkb8zsutuci9uyte_nz">
+            <w:hyperlink w:history="1" r:id="rIdnsc5fjnuyq108cgzs0sjj">
               <w:r>
                 <w:rPr>
                   <w:rFonts w:ascii="Arial" w:cs="Arial" w:eastAsia="Arial" w:hAnsi="Arial"/>
@@ -15538,7 +15538,7 @@
             <w:pPr>
               <w:spacing w:after="20" w:before="0"/>
             </w:pPr>
-            <w:hyperlink w:history="1" r:id="rIdagx2x-elei8kpmfnfrlif">
+            <w:hyperlink w:history="1" r:id="rIdpfvczydopctiukdhrud-d">
               <w:r>
                 <w:rPr>
                   <w:rFonts w:ascii="Arial" w:cs="Arial" w:eastAsia="Arial" w:hAnsi="Arial"/>
@@ -15571,7 +15571,7 @@
               <w:spacing w:after="10" w:before="0"/>
               <w:ind w:left="120"/>
             </w:pPr>
-            <w:hyperlink w:history="1" r:id="rId19l4b4zfc_jp6fyvyx1dn">
+            <w:hyperlink w:history="1" r:id="rIdnqmpelxt99q2eon4jgrq8">
               <w:r>
                 <w:rPr>
                   <w:rFonts w:ascii="Arial" w:cs="Arial" w:eastAsia="Arial" w:hAnsi="Arial"/>
@@ -15766,7 +15766,7 @@
             <w:pPr>
               <w:spacing w:after="20" w:before="0"/>
             </w:pPr>
-            <w:hyperlink w:history="1" r:id="rIdfayys_urcsot5flaefema">
+            <w:hyperlink w:history="1" r:id="rIdnxjgkginmg62-dlefokey">
               <w:r>
                 <w:rPr>
                   <w:rFonts w:ascii="Arial" w:cs="Arial" w:eastAsia="Arial" w:hAnsi="Arial"/>
@@ -15799,7 +15799,7 @@
               <w:spacing w:after="10" w:before="0"/>
               <w:ind w:left="120"/>
             </w:pPr>
-            <w:hyperlink w:history="1" r:id="rIdh4u_udgkbtc3h8dqzsuyl">
+            <w:hyperlink w:history="1" r:id="rIddp50wzr56dji4di4dreum">
               <w:r>
                 <w:rPr>
                   <w:rFonts w:ascii="Arial" w:cs="Arial" w:eastAsia="Arial" w:hAnsi="Arial"/>
@@ -15844,7 +15844,7 @@
             <w:pPr>
               <w:spacing w:after="20" w:before="0"/>
             </w:pPr>
-            <w:hyperlink w:history="1" r:id="rIdknzjffg5ne4uh8d4npm6r">
+            <w:hyperlink w:history="1" r:id="rIdnkpldqysapc2nocnzqhru">
               <w:r>
                 <w:rPr>
                   <w:rFonts w:ascii="Arial" w:cs="Arial" w:eastAsia="Arial" w:hAnsi="Arial"/>
@@ -15877,7 +15877,7 @@
               <w:spacing w:after="10" w:before="0"/>
               <w:ind w:left="120"/>
             </w:pPr>
-            <w:hyperlink w:history="1" r:id="rIdi32kijg-bi91inbxznopo">
+            <w:hyperlink w:history="1" r:id="rIdf3dmrqda3eskvlvag8bqd">
               <w:r>
                 <w:rPr>
                   <w:rFonts w:ascii="Arial" w:cs="Arial" w:eastAsia="Arial" w:hAnsi="Arial"/>
@@ -16072,7 +16072,7 @@
             <w:pPr>
               <w:spacing w:after="20" w:before="0"/>
             </w:pPr>
-            <w:hyperlink w:history="1" r:id="rIdw_rzmjnpm5xxjp4bcu1ib">
+            <w:hyperlink w:history="1" r:id="rIdfgyyspmzauz8atqtlmphp">
               <w:r>
                 <w:rPr>
                   <w:rFonts w:ascii="Arial" w:cs="Arial" w:eastAsia="Arial" w:hAnsi="Arial"/>
@@ -16105,7 +16105,7 @@
               <w:spacing w:after="10" w:before="0"/>
               <w:ind w:left="120"/>
             </w:pPr>
-            <w:hyperlink w:history="1" r:id="rId96pbftvzok1dfy7as5szj">
+            <w:hyperlink w:history="1" r:id="rIdmwmruypz4oydq5oys1p_x">
               <w:r>
                 <w:rPr>
                   <w:rFonts w:ascii="Arial" w:cs="Arial" w:eastAsia="Arial" w:hAnsi="Arial"/>
@@ -16150,7 +16150,7 @@
             <w:pPr>
               <w:spacing w:after="20" w:before="0"/>
             </w:pPr>
-            <w:hyperlink w:history="1" r:id="rIdc9crvjxeo9wn29npwcdah">
+            <w:hyperlink w:history="1" r:id="rIdymw7emrgrap4cqm6v2qcl">
               <w:r>
                 <w:rPr>
                   <w:rFonts w:ascii="Arial" w:cs="Arial" w:eastAsia="Arial" w:hAnsi="Arial"/>
@@ -16183,7 +16183,7 @@
               <w:spacing w:after="10" w:before="0"/>
               <w:ind w:left="120"/>
             </w:pPr>
-            <w:hyperlink w:history="1" r:id="rIdxnashcsttv0kiwuer4wif">
+            <w:hyperlink w:history="1" r:id="rIdc9lkmckdza3kdciud--qk">
               <w:r>
                 <w:rPr>
                   <w:rFonts w:ascii="Arial" w:cs="Arial" w:eastAsia="Arial" w:hAnsi="Arial"/>
@@ -16378,7 +16378,7 @@
             <w:pPr>
               <w:spacing w:after="20" w:before="0"/>
             </w:pPr>
-            <w:hyperlink w:history="1" r:id="rIdw4qfnitouf0uqld1yvtju">
+            <w:hyperlink w:history="1" r:id="rIdijgesuztjunqnv7kjt-vo">
               <w:r>
                 <w:rPr>
                   <w:rFonts w:ascii="Arial" w:cs="Arial" w:eastAsia="Arial" w:hAnsi="Arial"/>
@@ -16411,7 +16411,7 @@
               <w:spacing w:after="10" w:before="0"/>
               <w:ind w:left="120"/>
             </w:pPr>
-            <w:hyperlink w:history="1" r:id="rId_wbcg_g08gyb64pzyhzue">
+            <w:hyperlink w:history="1" r:id="rIdbevj1rq1goeuxlsplj1sh">
               <w:r>
                 <w:rPr>
                   <w:rFonts w:ascii="Arial" w:cs="Arial" w:eastAsia="Arial" w:hAnsi="Arial"/>
@@ -16456,7 +16456,7 @@
             <w:pPr>
               <w:spacing w:after="20" w:before="0"/>
             </w:pPr>
-            <w:hyperlink w:history="1" r:id="rIdhayg2_sbaddj7ydn72sg4">
+            <w:hyperlink w:history="1" r:id="rIdtjkt0kqov9sk6pyyazhnv">
               <w:r>
                 <w:rPr>
                   <w:rFonts w:ascii="Arial" w:cs="Arial" w:eastAsia="Arial" w:hAnsi="Arial"/>
@@ -16489,7 +16489,7 @@
               <w:spacing w:after="10" w:before="0"/>
               <w:ind w:left="120"/>
             </w:pPr>
-            <w:hyperlink w:history="1" r:id="rIdhw5ijzbwojlvphvgfbmyg">
+            <w:hyperlink w:history="1" r:id="rIdfh5ug_swxivpfjyyzcpbq">
               <w:r>
                 <w:rPr>
                   <w:rFonts w:ascii="Arial" w:cs="Arial" w:eastAsia="Arial" w:hAnsi="Arial"/>
@@ -17976,7 +17976,7 @@
             <w:pPr>
               <w:spacing w:after="20" w:before="0"/>
             </w:pPr>
-            <w:hyperlink w:history="1" r:id="rIdoamy6wgpoksqh9-n6g7lz">
+            <w:hyperlink w:history="1" r:id="rIdquhxns6irjw1fuumpplre">
               <w:r>
                 <w:rPr>
                   <w:rFonts w:ascii="Arial" w:cs="Arial" w:eastAsia="Arial" w:hAnsi="Arial"/>
@@ -18009,7 +18009,7 @@
               <w:spacing w:after="10" w:before="0"/>
               <w:ind w:left="120"/>
             </w:pPr>
-            <w:hyperlink w:history="1" r:id="rIdtmzaf60udg_mkwvwxoc60">
+            <w:hyperlink w:history="1" r:id="rId13bmv2tdz92azexffzmdf">
               <w:r>
                 <w:rPr>
                   <w:rFonts w:ascii="Arial" w:cs="Arial" w:eastAsia="Arial" w:hAnsi="Arial"/>
@@ -18054,7 +18054,7 @@
             <w:pPr>
               <w:spacing w:after="20" w:before="0"/>
             </w:pPr>
-            <w:hyperlink w:history="1" r:id="rIdvyfsphw9zho9caemwnz4n">
+            <w:hyperlink w:history="1" r:id="rIdcpv2otjci0ew38y_uhyvn">
               <w:r>
                 <w:rPr>
                   <w:rFonts w:ascii="Arial" w:cs="Arial" w:eastAsia="Arial" w:hAnsi="Arial"/>
@@ -18087,7 +18087,7 @@
               <w:spacing w:after="10" w:before="0"/>
               <w:ind w:left="120"/>
             </w:pPr>
-            <w:hyperlink w:history="1" r:id="rIdd31jmliwuzzd9_fxgtimv">
+            <w:hyperlink w:history="1" r:id="rIdymquv945w5xj2uhi_slyc">
               <w:r>
                 <w:rPr>
                   <w:rFonts w:ascii="Arial" w:cs="Arial" w:eastAsia="Arial" w:hAnsi="Arial"/>
@@ -18282,7 +18282,7 @@
             <w:pPr>
               <w:spacing w:after="20" w:before="0"/>
             </w:pPr>
-            <w:hyperlink w:history="1" r:id="rIda8n5okbft9hg_bzwx0oxb">
+            <w:hyperlink w:history="1" r:id="rIdh-kuqz8fgf3llbhjvhakb">
               <w:r>
                 <w:rPr>
                   <w:rFonts w:ascii="Arial" w:cs="Arial" w:eastAsia="Arial" w:hAnsi="Arial"/>
@@ -18315,7 +18315,7 @@
               <w:spacing w:after="10" w:before="0"/>
               <w:ind w:left="120"/>
             </w:pPr>
-            <w:hyperlink w:history="1" r:id="rIdd0zoqtltrnf1d_k7_21bf">
+            <w:hyperlink w:history="1" r:id="rId4dgyurn_rabjnxapsvvf1">
               <w:r>
                 <w:rPr>
                   <w:rFonts w:ascii="Arial" w:cs="Arial" w:eastAsia="Arial" w:hAnsi="Arial"/>
@@ -18360,7 +18360,7 @@
             <w:pPr>
               <w:spacing w:after="20" w:before="0"/>
             </w:pPr>
-            <w:hyperlink w:history="1" r:id="rIda6wy8eth9too_l9wfhesr">
+            <w:hyperlink w:history="1" r:id="rIdyqjxrnvkqckuznyykccik">
               <w:r>
                 <w:rPr>
                   <w:rFonts w:ascii="Arial" w:cs="Arial" w:eastAsia="Arial" w:hAnsi="Arial"/>
@@ -18393,7 +18393,7 @@
               <w:spacing w:after="10" w:before="0"/>
               <w:ind w:left="120"/>
             </w:pPr>
-            <w:hyperlink w:history="1" r:id="rId-yiio233mmfwepxhwhumq">
+            <w:hyperlink w:history="1" r:id="rIdwo3a75xx36vyhpnttyk3z">
               <w:r>
                 <w:rPr>
                   <w:rFonts w:ascii="Arial" w:cs="Arial" w:eastAsia="Arial" w:hAnsi="Arial"/>
@@ -18588,7 +18588,7 @@
             <w:pPr>
               <w:spacing w:after="20" w:before="0"/>
             </w:pPr>
-            <w:hyperlink w:history="1" r:id="rIdbnsglg61tx4pkiyt_aixu">
+            <w:hyperlink w:history="1" r:id="rIdwrftewf6quo4q8hmuc_jh">
               <w:r>
                 <w:rPr>
                   <w:rFonts w:ascii="Arial" w:cs="Arial" w:eastAsia="Arial" w:hAnsi="Arial"/>
@@ -18621,7 +18621,7 @@
               <w:spacing w:after="10" w:before="0"/>
               <w:ind w:left="120"/>
             </w:pPr>
-            <w:hyperlink w:history="1" r:id="rId3bmcnd7wwc8qs7nqibh8a">
+            <w:hyperlink w:history="1" r:id="rIdxcqj_cxieqbric5cawg23">
               <w:r>
                 <w:rPr>
                   <w:rFonts w:ascii="Arial" w:cs="Arial" w:eastAsia="Arial" w:hAnsi="Arial"/>
@@ -18666,7 +18666,7 @@
             <w:pPr>
               <w:spacing w:after="20" w:before="0"/>
             </w:pPr>
-            <w:hyperlink w:history="1" r:id="rIdg1pbc42llv7tee6m8rseg">
+            <w:hyperlink w:history="1" r:id="rIdva2zhjdv3xm2k03edh7b9">
               <w:r>
                 <w:rPr>
                   <w:rFonts w:ascii="Arial" w:cs="Arial" w:eastAsia="Arial" w:hAnsi="Arial"/>
@@ -18699,7 +18699,7 @@
               <w:spacing w:after="10" w:before="0"/>
               <w:ind w:left="120"/>
             </w:pPr>
-            <w:hyperlink w:history="1" r:id="rId0g3d5wdarv1ssnd3igm_j">
+            <w:hyperlink w:history="1" r:id="rIdtpttsb8bqek74nqt6oki5">
               <w:r>
                 <w:rPr>
                   <w:rFonts w:ascii="Arial" w:cs="Arial" w:eastAsia="Arial" w:hAnsi="Arial"/>
@@ -18894,7 +18894,7 @@
             <w:pPr>
               <w:spacing w:after="20" w:before="0"/>
             </w:pPr>
-            <w:hyperlink w:history="1" r:id="rIdniww6q1ahrzirbjj4fnja">
+            <w:hyperlink w:history="1" r:id="rIdecan4xetgypisrcmmbdvd">
               <w:r>
                 <w:rPr>
                   <w:rFonts w:ascii="Arial" w:cs="Arial" w:eastAsia="Arial" w:hAnsi="Arial"/>
@@ -18927,7 +18927,7 @@
               <w:spacing w:after="10" w:before="0"/>
               <w:ind w:left="120"/>
             </w:pPr>
-            <w:hyperlink w:history="1" r:id="rIdr3aw_ep4l7plqvdyfn_3f">
+            <w:hyperlink w:history="1" r:id="rIdoj4zgwc59rql4zf9ynwu2">
               <w:r>
                 <w:rPr>
                   <w:rFonts w:ascii="Arial" w:cs="Arial" w:eastAsia="Arial" w:hAnsi="Arial"/>
@@ -18972,7 +18972,7 @@
             <w:pPr>
               <w:spacing w:after="20" w:before="0"/>
             </w:pPr>
-            <w:hyperlink w:history="1" r:id="rIdumxcrlhc3nrjjyqkmadqt">
+            <w:hyperlink w:history="1" r:id="rIdkf3xrsg7ziso9ooljl-pk">
               <w:r>
                 <w:rPr>
                   <w:rFonts w:ascii="Arial" w:cs="Arial" w:eastAsia="Arial" w:hAnsi="Arial"/>
@@ -19005,7 +19005,7 @@
               <w:spacing w:after="10" w:before="0"/>
               <w:ind w:left="120"/>
             </w:pPr>
-            <w:hyperlink w:history="1" r:id="rIdbf6dprscu37leq3oqmke5">
+            <w:hyperlink w:history="1" r:id="rIdtveihlokec0u95bkbw5nd">
               <w:r>
                 <w:rPr>
                   <w:rFonts w:ascii="Arial" w:cs="Arial" w:eastAsia="Arial" w:hAnsi="Arial"/>
@@ -19200,7 +19200,7 @@
             <w:pPr>
               <w:spacing w:after="20" w:before="0"/>
             </w:pPr>
-            <w:hyperlink w:history="1" r:id="rIdmrirrwrfiolzzl5wtgqy9">
+            <w:hyperlink w:history="1" r:id="rIdnpu2zssd-byagcck9cino">
               <w:r>
                 <w:rPr>
                   <w:rFonts w:ascii="Arial" w:cs="Arial" w:eastAsia="Arial" w:hAnsi="Arial"/>
@@ -19233,7 +19233,7 @@
               <w:spacing w:after="10" w:before="0"/>
               <w:ind w:left="120"/>
             </w:pPr>
-            <w:hyperlink w:history="1" r:id="rIdo-z32xhpn_vsqb3st2hyu">
+            <w:hyperlink w:history="1" r:id="rIdeoa8he5dmum-q3zrfycl4">
               <w:r>
                 <w:rPr>
                   <w:rFonts w:ascii="Arial" w:cs="Arial" w:eastAsia="Arial" w:hAnsi="Arial"/>
@@ -19278,7 +19278,7 @@
             <w:pPr>
               <w:spacing w:after="20" w:before="0"/>
             </w:pPr>
-            <w:hyperlink w:history="1" r:id="rIdd7xwnl6fbkx7ya4ca4azk">
+            <w:hyperlink w:history="1" r:id="rIdxmnnkjmosdmnyn_io6vs3">
               <w:r>
                 <w:rPr>
                   <w:rFonts w:ascii="Arial" w:cs="Arial" w:eastAsia="Arial" w:hAnsi="Arial"/>
@@ -19311,7 +19311,7 @@
               <w:spacing w:after="10" w:before="0"/>
               <w:ind w:left="120"/>
             </w:pPr>
-            <w:hyperlink w:history="1" r:id="rIdj6gzs3c4gnmjkbyf3gper">
+            <w:hyperlink w:history="1" r:id="rId6bapsxjkqiprimx_qusaq">
               <w:r>
                 <w:rPr>
                   <w:rFonts w:ascii="Arial" w:cs="Arial" w:eastAsia="Arial" w:hAnsi="Arial"/>
@@ -20893,7 +20893,7 @@
             <w:pPr>
               <w:spacing w:after="20" w:before="0"/>
             </w:pPr>
-            <w:hyperlink w:history="1" r:id="rIdnhtgzayfn43_6kxxgpvow">
+            <w:hyperlink w:history="1" r:id="rIde51lklyiqy0ifmlj2cwpi">
               <w:r>
                 <w:rPr>
                   <w:rFonts w:ascii="Arial" w:cs="Arial" w:eastAsia="Arial" w:hAnsi="Arial"/>
@@ -20926,7 +20926,7 @@
               <w:spacing w:after="10" w:before="0"/>
               <w:ind w:left="120"/>
             </w:pPr>
-            <w:hyperlink w:history="1" r:id="rId9cyfextgdmxs0u687sudz">
+            <w:hyperlink w:history="1" r:id="rIdtbe9cchkp2mddjbqaws3z">
               <w:r>
                 <w:rPr>
                   <w:rFonts w:ascii="Arial" w:cs="Arial" w:eastAsia="Arial" w:hAnsi="Arial"/>
@@ -20971,7 +20971,7 @@
             <w:pPr>
               <w:spacing w:after="20" w:before="0"/>
             </w:pPr>
-            <w:hyperlink w:history="1" r:id="rIdg6xbqfatrt6dxegdwk26_">
+            <w:hyperlink w:history="1" r:id="rIdfxxjjlvqtxzjmrancck_m">
               <w:r>
                 <w:rPr>
                   <w:rFonts w:ascii="Arial" w:cs="Arial" w:eastAsia="Arial" w:hAnsi="Arial"/>
@@ -21004,7 +21004,7 @@
               <w:spacing w:after="10" w:before="0"/>
               <w:ind w:left="120"/>
             </w:pPr>
-            <w:hyperlink w:history="1" r:id="rIdqxuhv2t7eic_yk2_un0hw">
+            <w:hyperlink w:history="1" r:id="rIdjf2f2ly3vh6fgf-cmrwif">
               <w:r>
                 <w:rPr>
                   <w:rFonts w:ascii="Arial" w:cs="Arial" w:eastAsia="Arial" w:hAnsi="Arial"/>
@@ -21199,7 +21199,7 @@
             <w:pPr>
               <w:spacing w:after="20" w:before="0"/>
             </w:pPr>
-            <w:hyperlink w:history="1" r:id="rId7xbqwg2spomkwkt_c7gbl">
+            <w:hyperlink w:history="1" r:id="rIdxaqc6l0nyg9pvtplqs4wj">
               <w:r>
                 <w:rPr>
                   <w:rFonts w:ascii="Arial" w:cs="Arial" w:eastAsia="Arial" w:hAnsi="Arial"/>
@@ -21232,7 +21232,7 @@
               <w:spacing w:after="10" w:before="0"/>
               <w:ind w:left="120"/>
             </w:pPr>
-            <w:hyperlink w:history="1" r:id="rIdpxjhkb2btzeiwfc7wmmnb">
+            <w:hyperlink w:history="1" r:id="rIdjtfgzr9_tdoqcxkxjnms7">
               <w:r>
                 <w:rPr>
                   <w:rFonts w:ascii="Arial" w:cs="Arial" w:eastAsia="Arial" w:hAnsi="Arial"/>
@@ -21277,7 +21277,7 @@
             <w:pPr>
               <w:spacing w:after="20" w:before="0"/>
             </w:pPr>
-            <w:hyperlink w:history="1" r:id="rId40w9rrfcmbumfkexnunfe">
+            <w:hyperlink w:history="1" r:id="rIdwrnn2qhp4e5e1uyybmryr">
               <w:r>
                 <w:rPr>
                   <w:rFonts w:ascii="Arial" w:cs="Arial" w:eastAsia="Arial" w:hAnsi="Arial"/>
@@ -21310,7 +21310,7 @@
               <w:spacing w:after="10" w:before="0"/>
               <w:ind w:left="120"/>
             </w:pPr>
-            <w:hyperlink w:history="1" r:id="rIdp_nfg5phs-ywsnqlkhgzc">
+            <w:hyperlink w:history="1" r:id="rIdkqqmbvbmu8n6-ympxfnns">
               <w:r>
                 <w:rPr>
                   <w:rFonts w:ascii="Arial" w:cs="Arial" w:eastAsia="Arial" w:hAnsi="Arial"/>
@@ -21505,7 +21505,7 @@
             <w:pPr>
               <w:spacing w:after="20" w:before="0"/>
             </w:pPr>
-            <w:hyperlink w:history="1" r:id="rIdija1dnpv9om5wl81mrfxq">
+            <w:hyperlink w:history="1" r:id="rIdnlapw9xfdiuzbcgdzurpz">
               <w:r>
                 <w:rPr>
                   <w:rFonts w:ascii="Arial" w:cs="Arial" w:eastAsia="Arial" w:hAnsi="Arial"/>
@@ -21538,7 +21538,7 @@
               <w:spacing w:after="10" w:before="0"/>
               <w:ind w:left="120"/>
             </w:pPr>
-            <w:hyperlink w:history="1" r:id="rIdqhnsun2ohosp83fs6evvo">
+            <w:hyperlink w:history="1" r:id="rId3vhzilnz4fhqmksjgrzx3">
               <w:r>
                 <w:rPr>
                   <w:rFonts w:ascii="Arial" w:cs="Arial" w:eastAsia="Arial" w:hAnsi="Arial"/>
@@ -21583,7 +21583,7 @@
             <w:pPr>
               <w:spacing w:after="20" w:before="0"/>
             </w:pPr>
-            <w:hyperlink w:history="1" r:id="rIdboe5xk1uzhn9py5qh7gox">
+            <w:hyperlink w:history="1" r:id="rIdrplzsamilqqftukbdxabz">
               <w:r>
                 <w:rPr>
                   <w:rFonts w:ascii="Arial" w:cs="Arial" w:eastAsia="Arial" w:hAnsi="Arial"/>
@@ -21616,7 +21616,7 @@
               <w:spacing w:after="10" w:before="0"/>
               <w:ind w:left="120"/>
             </w:pPr>
-            <w:hyperlink w:history="1" r:id="rIdyqo8m4zaszzuwkg00f_3z">
+            <w:hyperlink w:history="1" r:id="rIdna3g-0xywf-re9p6v4edq">
               <w:r>
                 <w:rPr>
                   <w:rFonts w:ascii="Arial" w:cs="Arial" w:eastAsia="Arial" w:hAnsi="Arial"/>
@@ -21811,7 +21811,7 @@
             <w:pPr>
               <w:spacing w:after="20" w:before="0"/>
             </w:pPr>
-            <w:hyperlink w:history="1" r:id="rIdetbzm8u_ogfbbzbnslzip">
+            <w:hyperlink w:history="1" r:id="rIdg2vqigrskhbyimpoddej5">
               <w:r>
                 <w:rPr>
                   <w:rFonts w:ascii="Arial" w:cs="Arial" w:eastAsia="Arial" w:hAnsi="Arial"/>
@@ -21844,7 +21844,7 @@
               <w:spacing w:after="10" w:before="0"/>
               <w:ind w:left="120"/>
             </w:pPr>
-            <w:hyperlink w:history="1" r:id="rIdvd_-jgkuao0gensirrzms">
+            <w:hyperlink w:history="1" r:id="rIdzvqnsqwqqkaiee01iomiy">
               <w:r>
                 <w:rPr>
                   <w:rFonts w:ascii="Arial" w:cs="Arial" w:eastAsia="Arial" w:hAnsi="Arial"/>
@@ -21889,7 +21889,7 @@
             <w:pPr>
               <w:spacing w:after="20" w:before="0"/>
             </w:pPr>
-            <w:hyperlink w:history="1" r:id="rIdn2r23kgcv2-6nuet8dsla">
+            <w:hyperlink w:history="1" r:id="rId_jnjckeylvcqs2ugkqvhh">
               <w:r>
                 <w:rPr>
                   <w:rFonts w:ascii="Arial" w:cs="Arial" w:eastAsia="Arial" w:hAnsi="Arial"/>
@@ -21922,7 +21922,7 @@
               <w:spacing w:after="10" w:before="0"/>
               <w:ind w:left="120"/>
             </w:pPr>
-            <w:hyperlink w:history="1" r:id="rIdd-d9emr6h_p8apxmcxv9n">
+            <w:hyperlink w:history="1" r:id="rIduuqua2xrsirqgkoqvx2lc">
               <w:r>
                 <w:rPr>
                   <w:rFonts w:ascii="Arial" w:cs="Arial" w:eastAsia="Arial" w:hAnsi="Arial"/>
@@ -22117,7 +22117,7 @@
             <w:pPr>
               <w:spacing w:after="20" w:before="0"/>
             </w:pPr>
-            <w:hyperlink w:history="1" r:id="rIdscq9872nscph5_xaazvid">
+            <w:hyperlink w:history="1" r:id="rId7pnway06sphzo08vz6ekr">
               <w:r>
                 <w:rPr>
                   <w:rFonts w:ascii="Arial" w:cs="Arial" w:eastAsia="Arial" w:hAnsi="Arial"/>
@@ -22150,7 +22150,7 @@
               <w:spacing w:after="10" w:before="0"/>
               <w:ind w:left="120"/>
             </w:pPr>
-            <w:hyperlink w:history="1" r:id="rIdjpwzpfhkmu_8oupwho2tg">
+            <w:hyperlink w:history="1" r:id="rId7nc1jejdt3s1o3nc9-6yx">
               <w:r>
                 <w:rPr>
                   <w:rFonts w:ascii="Arial" w:cs="Arial" w:eastAsia="Arial" w:hAnsi="Arial"/>
@@ -22195,7 +22195,7 @@
             <w:pPr>
               <w:spacing w:after="20" w:before="0"/>
             </w:pPr>
-            <w:hyperlink w:history="1" r:id="rIdjjgn-yotmvvhx8wcykoiw">
+            <w:hyperlink w:history="1" r:id="rIdo899hz2rdn5ry2a8htzuh">
               <w:r>
                 <w:rPr>
                   <w:rFonts w:ascii="Arial" w:cs="Arial" w:eastAsia="Arial" w:hAnsi="Arial"/>
@@ -22228,7 +22228,7 @@
               <w:spacing w:after="10" w:before="0"/>
               <w:ind w:left="120"/>
             </w:pPr>
-            <w:hyperlink w:history="1" r:id="rIdmtheyecn9tnplnak-hokz">
+            <w:hyperlink w:history="1" r:id="rIdpr-0kpfqj2g0nruowulfe">
               <w:r>
                 <w:rPr>
                   <w:rFonts w:ascii="Arial" w:cs="Arial" w:eastAsia="Arial" w:hAnsi="Arial"/>
@@ -23829,7 +23829,7 @@
             <w:pPr>
               <w:spacing w:after="20" w:before="0"/>
             </w:pPr>
-            <w:hyperlink w:history="1" r:id="rId50ajtly80pp4ylrrrt56e">
+            <w:hyperlink w:history="1" r:id="rId-7ovio3zl-jrkj5eaenpb">
               <w:r>
                 <w:rPr>
                   <w:rFonts w:ascii="Arial" w:cs="Arial" w:eastAsia="Arial" w:hAnsi="Arial"/>
@@ -23862,7 +23862,7 @@
               <w:spacing w:after="10" w:before="0"/>
               <w:ind w:left="120"/>
             </w:pPr>
-            <w:hyperlink w:history="1" r:id="rId2noi0k16zcd4e8btferxt">
+            <w:hyperlink w:history="1" r:id="rIdsrh606beoreftu_v35obg">
               <w:r>
                 <w:rPr>
                   <w:rFonts w:ascii="Arial" w:cs="Arial" w:eastAsia="Arial" w:hAnsi="Arial"/>
@@ -23907,7 +23907,7 @@
             <w:pPr>
               <w:spacing w:after="20" w:before="0"/>
             </w:pPr>
-            <w:hyperlink w:history="1" r:id="rIdacoqmmixsisfxhvr1tsc6">
+            <w:hyperlink w:history="1" r:id="rIdfe51emb5-yk1u0v-lkn0j">
               <w:r>
                 <w:rPr>
                   <w:rFonts w:ascii="Arial" w:cs="Arial" w:eastAsia="Arial" w:hAnsi="Arial"/>
@@ -23940,7 +23940,7 @@
               <w:spacing w:after="10" w:before="0"/>
               <w:ind w:left="120"/>
             </w:pPr>
-            <w:hyperlink w:history="1" r:id="rIddsfnc9peeabxrlspxo7_c">
+            <w:hyperlink w:history="1" r:id="rIdepyzfvm1xktqc9kip99nt">
               <w:r>
                 <w:rPr>
                   <w:rFonts w:ascii="Arial" w:cs="Arial" w:eastAsia="Arial" w:hAnsi="Arial"/>
@@ -24135,7 +24135,7 @@
             <w:pPr>
               <w:spacing w:after="20" w:before="0"/>
             </w:pPr>
-            <w:hyperlink w:history="1" r:id="rIdvvfjvunlopr0-wms7mbc8">
+            <w:hyperlink w:history="1" r:id="rIdnvfzrjfyxoaskbnka9zzo">
               <w:r>
                 <w:rPr>
                   <w:rFonts w:ascii="Arial" w:cs="Arial" w:eastAsia="Arial" w:hAnsi="Arial"/>
@@ -24168,7 +24168,7 @@
               <w:spacing w:after="10" w:before="0"/>
               <w:ind w:left="120"/>
             </w:pPr>
-            <w:hyperlink w:history="1" r:id="rIdebloax3ieewzctgucnhk_">
+            <w:hyperlink w:history="1" r:id="rIdzvcvgprv3wbcoyfcuby_v">
               <w:r>
                 <w:rPr>
                   <w:rFonts w:ascii="Arial" w:cs="Arial" w:eastAsia="Arial" w:hAnsi="Arial"/>
@@ -24213,7 +24213,7 @@
             <w:pPr>
               <w:spacing w:after="20" w:before="0"/>
             </w:pPr>
-            <w:hyperlink w:history="1" r:id="rId1ruynbu6saoa_4zctqm_6">
+            <w:hyperlink w:history="1" r:id="rIdpxdtdaxel8g_a90o8ub7a">
               <w:r>
                 <w:rPr>
                   <w:rFonts w:ascii="Arial" w:cs="Arial" w:eastAsia="Arial" w:hAnsi="Arial"/>
@@ -24246,7 +24246,7 @@
               <w:spacing w:after="10" w:before="0"/>
               <w:ind w:left="120"/>
             </w:pPr>
-            <w:hyperlink w:history="1" r:id="rIdsdsnltwxw4tb1vmusdo8m">
+            <w:hyperlink w:history="1" r:id="rIdsfi7adhvceca-6psvucyp">
               <w:r>
                 <w:rPr>
                   <w:rFonts w:ascii="Arial" w:cs="Arial" w:eastAsia="Arial" w:hAnsi="Arial"/>
@@ -24441,7 +24441,7 @@
             <w:pPr>
               <w:spacing w:after="20" w:before="0"/>
             </w:pPr>
-            <w:hyperlink w:history="1" r:id="rId85hty9fck1mrs-p-b5mvz">
+            <w:hyperlink w:history="1" r:id="rIdeelylzvgqnlhardqhiriv">
               <w:r>
                 <w:rPr>
                   <w:rFonts w:ascii="Arial" w:cs="Arial" w:eastAsia="Arial" w:hAnsi="Arial"/>
@@ -24474,7 +24474,7 @@
               <w:spacing w:after="10" w:before="0"/>
               <w:ind w:left="120"/>
             </w:pPr>
-            <w:hyperlink w:history="1" r:id="rIdik33uz_jb0ubmsydvfw_f">
+            <w:hyperlink w:history="1" r:id="rId9zcozpj7a4sbazjsveh8t">
               <w:r>
                 <w:rPr>
                   <w:rFonts w:ascii="Arial" w:cs="Arial" w:eastAsia="Arial" w:hAnsi="Arial"/>
@@ -24519,7 +24519,7 @@
             <w:pPr>
               <w:spacing w:after="20" w:before="0"/>
             </w:pPr>
-            <w:hyperlink w:history="1" r:id="rIdl_8xxu7wkhr3swnm8sydd">
+            <w:hyperlink w:history="1" r:id="rId7rmnasnl7eldvilny7u9c">
               <w:r>
                 <w:rPr>
                   <w:rFonts w:ascii="Arial" w:cs="Arial" w:eastAsia="Arial" w:hAnsi="Arial"/>
@@ -24552,7 +24552,7 @@
               <w:spacing w:after="10" w:before="0"/>
               <w:ind w:left="120"/>
             </w:pPr>
-            <w:hyperlink w:history="1" r:id="rIdhvnyrxnwdxrmdw4bjkb-_">
+            <w:hyperlink w:history="1" r:id="rIdwupb-spnwz7om-hhjwfsx">
               <w:r>
                 <w:rPr>
                   <w:rFonts w:ascii="Arial" w:cs="Arial" w:eastAsia="Arial" w:hAnsi="Arial"/>
@@ -24747,7 +24747,7 @@
             <w:pPr>
               <w:spacing w:after="20" w:before="0"/>
             </w:pPr>
-            <w:hyperlink w:history="1" r:id="rIdkzaop0teakj36m6ugeznv">
+            <w:hyperlink w:history="1" r:id="rId7f-dc-zn0iyzcyk6cr6p5">
               <w:r>
                 <w:rPr>
                   <w:rFonts w:ascii="Arial" w:cs="Arial" w:eastAsia="Arial" w:hAnsi="Arial"/>
@@ -24780,7 +24780,7 @@
               <w:spacing w:after="10" w:before="0"/>
               <w:ind w:left="120"/>
             </w:pPr>
-            <w:hyperlink w:history="1" r:id="rIdriynuw_dxeobbdthijzcr">
+            <w:hyperlink w:history="1" r:id="rId7zwd03tozason7vzkqtrx">
               <w:r>
                 <w:rPr>
                   <w:rFonts w:ascii="Arial" w:cs="Arial" w:eastAsia="Arial" w:hAnsi="Arial"/>
@@ -24825,7 +24825,7 @@
             <w:pPr>
               <w:spacing w:after="20" w:before="0"/>
             </w:pPr>
-            <w:hyperlink w:history="1" r:id="rIdsh5hiwddnifp_kxxvyopa">
+            <w:hyperlink w:history="1" r:id="rIdquqcf1vu4pkrgkvfw0uzd">
               <w:r>
                 <w:rPr>
                   <w:rFonts w:ascii="Arial" w:cs="Arial" w:eastAsia="Arial" w:hAnsi="Arial"/>
@@ -24858,7 +24858,7 @@
               <w:spacing w:after="10" w:before="0"/>
               <w:ind w:left="120"/>
             </w:pPr>
-            <w:hyperlink w:history="1" r:id="rIde4q5gkcqvhtoxjctjncex">
+            <w:hyperlink w:history="1" r:id="rIdmoxl4erbecmzie5q7dl3g">
               <w:r>
                 <w:rPr>
                   <w:rFonts w:ascii="Arial" w:cs="Arial" w:eastAsia="Arial" w:hAnsi="Arial"/>
@@ -25053,7 +25053,7 @@
             <w:pPr>
               <w:spacing w:after="20" w:before="0"/>
             </w:pPr>
-            <w:hyperlink w:history="1" r:id="rIdpdaim8ctantzebarqdcu7">
+            <w:hyperlink w:history="1" r:id="rIdwlgk0atavi49isnp2n3gu">
               <w:r>
                 <w:rPr>
                   <w:rFonts w:ascii="Arial" w:cs="Arial" w:eastAsia="Arial" w:hAnsi="Arial"/>
@@ -25086,7 +25086,7 @@
               <w:spacing w:after="10" w:before="0"/>
               <w:ind w:left="120"/>
             </w:pPr>
-            <w:hyperlink w:history="1" r:id="rIdfhhc9huxigf1lgvqoud98">
+            <w:hyperlink w:history="1" r:id="rId5bzez66t6sepwcf44bxlb">
               <w:r>
                 <w:rPr>
                   <w:rFonts w:ascii="Arial" w:cs="Arial" w:eastAsia="Arial" w:hAnsi="Arial"/>
@@ -25131,7 +25131,7 @@
             <w:pPr>
               <w:spacing w:after="20" w:before="0"/>
             </w:pPr>
-            <w:hyperlink w:history="1" r:id="rIdlr1viphsslailbg7fzjwt">
+            <w:hyperlink w:history="1" r:id="rIdqtlzjsdibagdjybby7wtt">
               <w:r>
                 <w:rPr>
                   <w:rFonts w:ascii="Arial" w:cs="Arial" w:eastAsia="Arial" w:hAnsi="Arial"/>
@@ -25164,7 +25164,7 @@
               <w:spacing w:after="10" w:before="0"/>
               <w:ind w:left="120"/>
             </w:pPr>
-            <w:hyperlink w:history="1" r:id="rIdrhgjk_vkgo7rjoacsbshl">
+            <w:hyperlink w:history="1" r:id="rIdb-8jxe1zaoh1rsbdmkixk">
               <w:r>
                 <w:rPr>
                   <w:rFonts w:ascii="Arial" w:cs="Arial" w:eastAsia="Arial" w:hAnsi="Arial"/>
@@ -26746,7 +26746,7 @@
             <w:pPr>
               <w:spacing w:after="20" w:before="0"/>
             </w:pPr>
-            <w:hyperlink w:history="1" r:id="rId22z09_icvvuhqbgnmj_bf">
+            <w:hyperlink w:history="1" r:id="rIdcdlhxyhkrjujp148lzkb9">
               <w:r>
                 <w:rPr>
                   <w:rFonts w:ascii="Arial" w:cs="Arial" w:eastAsia="Arial" w:hAnsi="Arial"/>
@@ -26779,7 +26779,7 @@
               <w:spacing w:after="10" w:before="0"/>
               <w:ind w:left="120"/>
             </w:pPr>
-            <w:hyperlink w:history="1" r:id="rIdft3s8eqh-pcp15qmqqhgy">
+            <w:hyperlink w:history="1" r:id="rIdevdqab5olcvlqwqapo4zf">
               <w:r>
                 <w:rPr>
                   <w:rFonts w:ascii="Arial" w:cs="Arial" w:eastAsia="Arial" w:hAnsi="Arial"/>
@@ -26824,7 +26824,7 @@
             <w:pPr>
               <w:spacing w:after="20" w:before="0"/>
             </w:pPr>
-            <w:hyperlink w:history="1" r:id="rId2kb9vx59nmjtrfz8g4-aw">
+            <w:hyperlink w:history="1" r:id="rId1agsfdlgptinyvwlgg24j">
               <w:r>
                 <w:rPr>
                   <w:rFonts w:ascii="Arial" w:cs="Arial" w:eastAsia="Arial" w:hAnsi="Arial"/>
@@ -26857,7 +26857,7 @@
               <w:spacing w:after="10" w:before="0"/>
               <w:ind w:left="120"/>
             </w:pPr>
-            <w:hyperlink w:history="1" r:id="rIdd-sv6gcdp7kiazy-d5ky5">
+            <w:hyperlink w:history="1" r:id="rIdcdtrd4abodw39ekayb9d6">
               <w:r>
                 <w:rPr>
                   <w:rFonts w:ascii="Arial" w:cs="Arial" w:eastAsia="Arial" w:hAnsi="Arial"/>
@@ -27052,7 +27052,7 @@
             <w:pPr>
               <w:spacing w:after="20" w:before="0"/>
             </w:pPr>
-            <w:hyperlink w:history="1" r:id="rIds3lbr0xbnxgm9wajqppvu">
+            <w:hyperlink w:history="1" r:id="rIdd70gsvutcbyhgogothfew">
               <w:r>
                 <w:rPr>
                   <w:rFonts w:ascii="Arial" w:cs="Arial" w:eastAsia="Arial" w:hAnsi="Arial"/>
@@ -27085,7 +27085,7 @@
               <w:spacing w:after="10" w:before="0"/>
               <w:ind w:left="120"/>
             </w:pPr>
-            <w:hyperlink w:history="1" r:id="rIdg1ojxk5lohdzivqrxbu_v">
+            <w:hyperlink w:history="1" r:id="rId3-mqaxlk0kaougyzzhgsd">
               <w:r>
                 <w:rPr>
                   <w:rFonts w:ascii="Arial" w:cs="Arial" w:eastAsia="Arial" w:hAnsi="Arial"/>
@@ -27130,7 +27130,7 @@
             <w:pPr>
               <w:spacing w:after="20" w:before="0"/>
             </w:pPr>
-            <w:hyperlink w:history="1" r:id="rIdphf1a6zhxhorbhmc-lmfz">
+            <w:hyperlink w:history="1" r:id="rIdmu6b68yy4hy6k867i8bzc">
               <w:r>
                 <w:rPr>
                   <w:rFonts w:ascii="Arial" w:cs="Arial" w:eastAsia="Arial" w:hAnsi="Arial"/>
@@ -27163,7 +27163,7 @@
               <w:spacing w:after="10" w:before="0"/>
               <w:ind w:left="120"/>
             </w:pPr>
-            <w:hyperlink w:history="1" r:id="rIdkqn9odgcag349johumwuv">
+            <w:hyperlink w:history="1" r:id="rIdraottvjumk8rgri9lr24p">
               <w:r>
                 <w:rPr>
                   <w:rFonts w:ascii="Arial" w:cs="Arial" w:eastAsia="Arial" w:hAnsi="Arial"/>
@@ -27358,7 +27358,7 @@
             <w:pPr>
               <w:spacing w:after="20" w:before="0"/>
             </w:pPr>
-            <w:hyperlink w:history="1" r:id="rIdxaqf8r5meziztxyhpjos9">
+            <w:hyperlink w:history="1" r:id="rIdbij8pp1bxydraieylwbuv">
               <w:r>
                 <w:rPr>
                   <w:rFonts w:ascii="Arial" w:cs="Arial" w:eastAsia="Arial" w:hAnsi="Arial"/>
@@ -27391,7 +27391,7 @@
               <w:spacing w:after="10" w:before="0"/>
               <w:ind w:left="120"/>
             </w:pPr>
-            <w:hyperlink w:history="1" r:id="rIdsuo8zn-_ta6vpvrpdsjsq">
+            <w:hyperlink w:history="1" r:id="rIdzr7jvz-kllznqkmyfo0rp">
               <w:r>
                 <w:rPr>
                   <w:rFonts w:ascii="Arial" w:cs="Arial" w:eastAsia="Arial" w:hAnsi="Arial"/>
@@ -27436,7 +27436,7 @@
             <w:pPr>
               <w:spacing w:after="20" w:before="0"/>
             </w:pPr>
-            <w:hyperlink w:history="1" r:id="rIdemc7yc588xrpnbxszx8gh">
+            <w:hyperlink w:history="1" r:id="rIdvmqrkd6_gyzrag1w2vi46">
               <w:r>
                 <w:rPr>
                   <w:rFonts w:ascii="Arial" w:cs="Arial" w:eastAsia="Arial" w:hAnsi="Arial"/>
@@ -27469,7 +27469,7 @@
               <w:spacing w:after="10" w:before="0"/>
               <w:ind w:left="120"/>
             </w:pPr>
-            <w:hyperlink w:history="1" r:id="rIdpmzt-mikxkbsw0nm4ip6m">
+            <w:hyperlink w:history="1" r:id="rIdsyorlnaqyaq-o5e9auv4j">
               <w:r>
                 <w:rPr>
                   <w:rFonts w:ascii="Arial" w:cs="Arial" w:eastAsia="Arial" w:hAnsi="Arial"/>
@@ -27664,7 +27664,7 @@
             <w:pPr>
               <w:spacing w:after="20" w:before="0"/>
             </w:pPr>
-            <w:hyperlink w:history="1" r:id="rId3ywnigi1moepxid-gglt7">
+            <w:hyperlink w:history="1" r:id="rIdz2wqkzihpkzcgmsrpv-eg">
               <w:r>
                 <w:rPr>
                   <w:rFonts w:ascii="Arial" w:cs="Arial" w:eastAsia="Arial" w:hAnsi="Arial"/>
@@ -27697,7 +27697,7 @@
               <w:spacing w:after="10" w:before="0"/>
               <w:ind w:left="120"/>
             </w:pPr>
-            <w:hyperlink w:history="1" r:id="rIdlznmmllf6drsb0g6ljlkz">
+            <w:hyperlink w:history="1" r:id="rIdh6h92li9svvqzzq-v4vta">
               <w:r>
                 <w:rPr>
                   <w:rFonts w:ascii="Arial" w:cs="Arial" w:eastAsia="Arial" w:hAnsi="Arial"/>
@@ -27742,7 +27742,7 @@
             <w:pPr>
               <w:spacing w:after="20" w:before="0"/>
             </w:pPr>
-            <w:hyperlink w:history="1" r:id="rIdbpp8zfn_2rj0daxew0gcn">
+            <w:hyperlink w:history="1" r:id="rIdwr5eh9-wenfengjzjvly_">
               <w:r>
                 <w:rPr>
                   <w:rFonts w:ascii="Arial" w:cs="Arial" w:eastAsia="Arial" w:hAnsi="Arial"/>
@@ -27775,7 +27775,7 @@
               <w:spacing w:after="10" w:before="0"/>
               <w:ind w:left="120"/>
             </w:pPr>
-            <w:hyperlink w:history="1" r:id="rId5odpl-zlffmw2ov9ptmht">
+            <w:hyperlink w:history="1" r:id="rId1bcziv7bxl94-vauzuwx4">
               <w:r>
                 <w:rPr>
                   <w:rFonts w:ascii="Arial" w:cs="Arial" w:eastAsia="Arial" w:hAnsi="Arial"/>
@@ -27970,7 +27970,7 @@
             <w:pPr>
               <w:spacing w:after="20" w:before="0"/>
             </w:pPr>
-            <w:hyperlink w:history="1" r:id="rIdrdip6cozfch_utbdwf1vb">
+            <w:hyperlink w:history="1" r:id="rIdvtuhji6db1iaj1uszquvr">
               <w:r>
                 <w:rPr>
                   <w:rFonts w:ascii="Arial" w:cs="Arial" w:eastAsia="Arial" w:hAnsi="Arial"/>
@@ -28003,7 +28003,7 @@
               <w:spacing w:after="10" w:before="0"/>
               <w:ind w:left="120"/>
             </w:pPr>
-            <w:hyperlink w:history="1" r:id="rIdx21qyiw_ejgbpdkd7d2zy">
+            <w:hyperlink w:history="1" r:id="rIds1fiwltfbybz4kmqcozq5">
               <w:r>
                 <w:rPr>
                   <w:rFonts w:ascii="Arial" w:cs="Arial" w:eastAsia="Arial" w:hAnsi="Arial"/>
@@ -28048,7 +28048,7 @@
             <w:pPr>
               <w:spacing w:after="20" w:before="0"/>
             </w:pPr>
-            <w:hyperlink w:history="1" r:id="rIdu_9jzmwzmfgk8yclrieix">
+            <w:hyperlink w:history="1" r:id="rIdieagrqwi7w9wxnzrfi4oj">
               <w:r>
                 <w:rPr>
                   <w:rFonts w:ascii="Arial" w:cs="Arial" w:eastAsia="Arial" w:hAnsi="Arial"/>
@@ -28081,7 +28081,7 @@
               <w:spacing w:after="10" w:before="0"/>
               <w:ind w:left="120"/>
             </w:pPr>
-            <w:hyperlink w:history="1" r:id="rIdrkikpcqxese4wjhmsjtae">
+            <w:hyperlink w:history="1" r:id="rIdry_ehgpimap_snwwo5tqi">
               <w:r>
                 <w:rPr>
                   <w:rFonts w:ascii="Arial" w:cs="Arial" w:eastAsia="Arial" w:hAnsi="Arial"/>
@@ -29568,7 +29568,7 @@
             <w:pPr>
               <w:spacing w:after="20" w:before="0"/>
             </w:pPr>
-            <w:hyperlink w:history="1" r:id="rIdahzvjo2igqrhf2apooaye">
+            <w:hyperlink w:history="1" r:id="rId4hbzehskx1ubhj6jdbx5d">
               <w:r>
                 <w:rPr>
                   <w:rFonts w:ascii="Arial" w:cs="Arial" w:eastAsia="Arial" w:hAnsi="Arial"/>
@@ -29601,7 +29601,7 @@
               <w:spacing w:after="10" w:before="0"/>
               <w:ind w:left="120"/>
             </w:pPr>
-            <w:hyperlink w:history="1" r:id="rIdgdlpwkergf9h7eoqtsnug">
+            <w:hyperlink w:history="1" r:id="rIdripmkt4cvxdmyhvfids7k">
               <w:r>
                 <w:rPr>
                   <w:rFonts w:ascii="Arial" w:cs="Arial" w:eastAsia="Arial" w:hAnsi="Arial"/>
@@ -29646,7 +29646,7 @@
             <w:pPr>
               <w:spacing w:after="20" w:before="0"/>
             </w:pPr>
-            <w:hyperlink w:history="1" r:id="rIdqbknogwecn2rm222nw3w5">
+            <w:hyperlink w:history="1" r:id="rIdsvsdf6ftnr6wa1q7g0ff5">
               <w:r>
                 <w:rPr>
                   <w:rFonts w:ascii="Arial" w:cs="Arial" w:eastAsia="Arial" w:hAnsi="Arial"/>
@@ -29679,7 +29679,7 @@
               <w:spacing w:after="10" w:before="0"/>
               <w:ind w:left="120"/>
             </w:pPr>
-            <w:hyperlink w:history="1" r:id="rIdyiy77wxplut1ridko6tdu">
+            <w:hyperlink w:history="1" r:id="rIds7owqrvpwg8d3iwfmu87h">
               <w:r>
                 <w:rPr>
                   <w:rFonts w:ascii="Arial" w:cs="Arial" w:eastAsia="Arial" w:hAnsi="Arial"/>
@@ -29874,7 +29874,7 @@
             <w:pPr>
               <w:spacing w:after="20" w:before="0"/>
             </w:pPr>
-            <w:hyperlink w:history="1" r:id="rIdmm1kfn6fsqumfj6dmzxoy">
+            <w:hyperlink w:history="1" r:id="rIdpkyzzhzsk-c8vav4qxeky">
               <w:r>
                 <w:rPr>
                   <w:rFonts w:ascii="Arial" w:cs="Arial" w:eastAsia="Arial" w:hAnsi="Arial"/>
@@ -29907,7 +29907,7 @@
               <w:spacing w:after="10" w:before="0"/>
               <w:ind w:left="120"/>
             </w:pPr>
-            <w:hyperlink w:history="1" r:id="rIdzhpl2diccdrbuworjjfi-">
+            <w:hyperlink w:history="1" r:id="rIdt4gcnedrd_axscqttf4gd">
               <w:r>
                 <w:rPr>
                   <w:rFonts w:ascii="Arial" w:cs="Arial" w:eastAsia="Arial" w:hAnsi="Arial"/>
@@ -29952,7 +29952,7 @@
             <w:pPr>
               <w:spacing w:after="20" w:before="0"/>
             </w:pPr>
-            <w:hyperlink w:history="1" r:id="rIdlvs5dagv7ymp14tvspwvv">
+            <w:hyperlink w:history="1" r:id="rId_hrbm08dz6hqgvuybagmw">
               <w:r>
                 <w:rPr>
                   <w:rFonts w:ascii="Arial" w:cs="Arial" w:eastAsia="Arial" w:hAnsi="Arial"/>
@@ -29985,7 +29985,7 @@
               <w:spacing w:after="10" w:before="0"/>
               <w:ind w:left="120"/>
             </w:pPr>
-            <w:hyperlink w:history="1" r:id="rId8mwqaa3sbk_jo97gne6uh">
+            <w:hyperlink w:history="1" r:id="rIdyoxruiac7loeosij2arxz">
               <w:r>
                 <w:rPr>
                   <w:rFonts w:ascii="Arial" w:cs="Arial" w:eastAsia="Arial" w:hAnsi="Arial"/>
@@ -30180,7 +30180,7 @@
             <w:pPr>
               <w:spacing w:after="20" w:before="0"/>
             </w:pPr>
-            <w:hyperlink w:history="1" r:id="rId7l4wrgzo94v3sjp2p3sre">
+            <w:hyperlink w:history="1" r:id="rIdvwcth2plabsptcvba-omm">
               <w:r>
                 <w:rPr>
                   <w:rFonts w:ascii="Arial" w:cs="Arial" w:eastAsia="Arial" w:hAnsi="Arial"/>
@@ -30213,7 +30213,7 @@
               <w:spacing w:after="10" w:before="0"/>
               <w:ind w:left="120"/>
             </w:pPr>
-            <w:hyperlink w:history="1" r:id="rIdplrhhkqi9qbxtc9hwkmum">
+            <w:hyperlink w:history="1" r:id="rIdrrnh9nkly7ctaivlzkinw">
               <w:r>
                 <w:rPr>
                   <w:rFonts w:ascii="Arial" w:cs="Arial" w:eastAsia="Arial" w:hAnsi="Arial"/>
@@ -30258,7 +30258,7 @@
             <w:pPr>
               <w:spacing w:after="20" w:before="0"/>
             </w:pPr>
-            <w:hyperlink w:history="1" r:id="rIdcxob6lpmtr00titikspc5">
+            <w:hyperlink w:history="1" r:id="rIdw1r8ml3kojjmy1azz03wx">
               <w:r>
                 <w:rPr>
                   <w:rFonts w:ascii="Arial" w:cs="Arial" w:eastAsia="Arial" w:hAnsi="Arial"/>
@@ -30291,7 +30291,7 @@
               <w:spacing w:after="10" w:before="0"/>
               <w:ind w:left="120"/>
             </w:pPr>
-            <w:hyperlink w:history="1" r:id="rIdvng_xhocvezbdqlome-af">
+            <w:hyperlink w:history="1" r:id="rIdd_6fzylrycbsnnpytszgp">
               <w:r>
                 <w:rPr>
                   <w:rFonts w:ascii="Arial" w:cs="Arial" w:eastAsia="Arial" w:hAnsi="Arial"/>
@@ -30486,7 +30486,7 @@
             <w:pPr>
               <w:spacing w:after="20" w:before="0"/>
             </w:pPr>
-            <w:hyperlink w:history="1" r:id="rIdqggjdl4akwuyqavi7ken-">
+            <w:hyperlink w:history="1" r:id="rIdf6iiwnlm35etmjju3zfjz">
               <w:r>
                 <w:rPr>
                   <w:rFonts w:ascii="Arial" w:cs="Arial" w:eastAsia="Arial" w:hAnsi="Arial"/>
@@ -30519,7 +30519,7 @@
               <w:spacing w:after="10" w:before="0"/>
               <w:ind w:left="120"/>
             </w:pPr>
-            <w:hyperlink w:history="1" r:id="rIdoykq82uk3xhbjcp04ujlo">
+            <w:hyperlink w:history="1" r:id="rIdgzyggw1g1kptxw6lbz09j">
               <w:r>
                 <w:rPr>
                   <w:rFonts w:ascii="Arial" w:cs="Arial" w:eastAsia="Arial" w:hAnsi="Arial"/>
@@ -30564,7 +30564,7 @@
             <w:pPr>
               <w:spacing w:after="20" w:before="0"/>
             </w:pPr>
-            <w:hyperlink w:history="1" r:id="rIdjjyh0v3bobhvprmqram8n">
+            <w:hyperlink w:history="1" r:id="rId2ll2r7hnql89ammzbcdzi">
               <w:r>
                 <w:rPr>
                   <w:rFonts w:ascii="Arial" w:cs="Arial" w:eastAsia="Arial" w:hAnsi="Arial"/>
@@ -30597,7 +30597,7 @@
               <w:spacing w:after="10" w:before="0"/>
               <w:ind w:left="120"/>
             </w:pPr>
-            <w:hyperlink w:history="1" r:id="rIdgtg7sna3lqnk3zpcbuvyx">
+            <w:hyperlink w:history="1" r:id="rIdomjgps2vgq8jwoawfxnmn">
               <w:r>
                 <w:rPr>
                   <w:rFonts w:ascii="Arial" w:cs="Arial" w:eastAsia="Arial" w:hAnsi="Arial"/>
@@ -30792,7 +30792,7 @@
             <w:pPr>
               <w:spacing w:after="20" w:before="0"/>
             </w:pPr>
-            <w:hyperlink w:history="1" r:id="rIdp9x1bo9xvugutlotfpp7-">
+            <w:hyperlink w:history="1" r:id="rIdd_-bkswbmfrr_7kftiyo6">
               <w:r>
                 <w:rPr>
                   <w:rFonts w:ascii="Arial" w:cs="Arial" w:eastAsia="Arial" w:hAnsi="Arial"/>
@@ -30825,7 +30825,7 @@
               <w:spacing w:after="10" w:before="0"/>
               <w:ind w:left="120"/>
             </w:pPr>
-            <w:hyperlink w:history="1" r:id="rIdcjegarxgmijyf9xikg3_6">
+            <w:hyperlink w:history="1" r:id="rIdq12jbp5ymsddq7-mvwwch">
               <w:r>
                 <w:rPr>
                   <w:rFonts w:ascii="Arial" w:cs="Arial" w:eastAsia="Arial" w:hAnsi="Arial"/>
@@ -30870,7 +30870,7 @@
             <w:pPr>
               <w:spacing w:after="20" w:before="0"/>
             </w:pPr>
-            <w:hyperlink w:history="1" r:id="rIdc24wztdrxzk-omc1qplfv">
+            <w:hyperlink w:history="1" r:id="rIdb5xzuayxghete2yirwk9e">
               <w:r>
                 <w:rPr>
                   <w:rFonts w:ascii="Arial" w:cs="Arial" w:eastAsia="Arial" w:hAnsi="Arial"/>
@@ -30903,7 +30903,7 @@
               <w:spacing w:after="10" w:before="0"/>
               <w:ind w:left="120"/>
             </w:pPr>
-            <w:hyperlink w:history="1" r:id="rIdg3qoyxsud733vid4mqobx">
+            <w:hyperlink w:history="1" r:id="rIdjjy5sulvt4hoe5kknsu4u">
               <w:r>
                 <w:rPr>
                   <w:rFonts w:ascii="Arial" w:cs="Arial" w:eastAsia="Arial" w:hAnsi="Arial"/>
@@ -32485,7 +32485,7 @@
             <w:pPr>
               <w:spacing w:after="20" w:before="0"/>
             </w:pPr>
-            <w:hyperlink w:history="1" r:id="rIdahnn0remaj6afqbo44eu9">
+            <w:hyperlink w:history="1" r:id="rId9biggutlvkzytqizjy8hb">
               <w:r>
                 <w:rPr>
                   <w:rFonts w:ascii="Arial" w:cs="Arial" w:eastAsia="Arial" w:hAnsi="Arial"/>
@@ -32518,7 +32518,7 @@
               <w:spacing w:after="10" w:before="0"/>
               <w:ind w:left="120"/>
             </w:pPr>
-            <w:hyperlink w:history="1" r:id="rIdpwo5wu48wrszfun1dtonp">
+            <w:hyperlink w:history="1" r:id="rIdwwidlrr7oqur1p-cwht2x">
               <w:r>
                 <w:rPr>
                   <w:rFonts w:ascii="Arial" w:cs="Arial" w:eastAsia="Arial" w:hAnsi="Arial"/>
@@ -32563,7 +32563,7 @@
             <w:pPr>
               <w:spacing w:after="20" w:before="0"/>
             </w:pPr>
-            <w:hyperlink w:history="1" r:id="rIdc-mobgj1mpde44bnztbpu">
+            <w:hyperlink w:history="1" r:id="rIdbnsgbxyszjydhu-vi4tu3">
               <w:r>
                 <w:rPr>
                   <w:rFonts w:ascii="Arial" w:cs="Arial" w:eastAsia="Arial" w:hAnsi="Arial"/>
@@ -32596,7 +32596,7 @@
               <w:spacing w:after="10" w:before="0"/>
               <w:ind w:left="120"/>
             </w:pPr>
-            <w:hyperlink w:history="1" r:id="rIdscdgvqypgqwp7dg2iihp5">
+            <w:hyperlink w:history="1" r:id="rIdvwdxzxnacikg-n583hlgt">
               <w:r>
                 <w:rPr>
                   <w:rFonts w:ascii="Arial" w:cs="Arial" w:eastAsia="Arial" w:hAnsi="Arial"/>
@@ -32791,7 +32791,7 @@
             <w:pPr>
               <w:spacing w:after="20" w:before="0"/>
             </w:pPr>
-            <w:hyperlink w:history="1" r:id="rIdy5usns5roraq2-klm8rqd">
+            <w:hyperlink w:history="1" r:id="rIdihgsclqtvisonutxygwdc">
               <w:r>
                 <w:rPr>
                   <w:rFonts w:ascii="Arial" w:cs="Arial" w:eastAsia="Arial" w:hAnsi="Arial"/>
@@ -32824,7 +32824,7 @@
               <w:spacing w:after="10" w:before="0"/>
               <w:ind w:left="120"/>
             </w:pPr>
-            <w:hyperlink w:history="1" r:id="rIdz-nsby-_gytxvwhb7qxeb">
+            <w:hyperlink w:history="1" r:id="rIdg5cktgrw_oujqe31lqrmw">
               <w:r>
                 <w:rPr>
                   <w:rFonts w:ascii="Arial" w:cs="Arial" w:eastAsia="Arial" w:hAnsi="Arial"/>
@@ -32869,7 +32869,7 @@
             <w:pPr>
               <w:spacing w:after="20" w:before="0"/>
             </w:pPr>
-            <w:hyperlink w:history="1" r:id="rIdvo0ymvueskeurnig25jjp">
+            <w:hyperlink w:history="1" r:id="rId7ogsku9qntrg877busnpa">
               <w:r>
                 <w:rPr>
                   <w:rFonts w:ascii="Arial" w:cs="Arial" w:eastAsia="Arial" w:hAnsi="Arial"/>
@@ -32902,7 +32902,7 @@
               <w:spacing w:after="10" w:before="0"/>
               <w:ind w:left="120"/>
             </w:pPr>
-            <w:hyperlink w:history="1" r:id="rId9nmn4nitznfy1h-b_k3wc">
+            <w:hyperlink w:history="1" r:id="rIdtyiqyzgtdprjbjwqeewoo">
               <w:r>
                 <w:rPr>
                   <w:rFonts w:ascii="Arial" w:cs="Arial" w:eastAsia="Arial" w:hAnsi="Arial"/>
@@ -33097,7 +33097,7 @@
             <w:pPr>
               <w:spacing w:after="20" w:before="0"/>
             </w:pPr>
-            <w:hyperlink w:history="1" r:id="rIdt7peaartfva5aa74ssyfz">
+            <w:hyperlink w:history="1" r:id="rId2kpskxqgcmgkz00yrbafd">
               <w:r>
                 <w:rPr>
                   <w:rFonts w:ascii="Arial" w:cs="Arial" w:eastAsia="Arial" w:hAnsi="Arial"/>
@@ -33130,7 +33130,7 @@
               <w:spacing w:after="10" w:before="0"/>
               <w:ind w:left="120"/>
             </w:pPr>
-            <w:hyperlink w:history="1" r:id="rIdiwac_8hsj3yvge9zcaopt">
+            <w:hyperlink w:history="1" r:id="rId8dx2sbbddrugoc7ftvyi2">
               <w:r>
                 <w:rPr>
                   <w:rFonts w:ascii="Arial" w:cs="Arial" w:eastAsia="Arial" w:hAnsi="Arial"/>
@@ -33175,7 +33175,7 @@
             <w:pPr>
               <w:spacing w:after="20" w:before="0"/>
             </w:pPr>
-            <w:hyperlink w:history="1" r:id="rIdc9v2szbbamwxhz9i8se-t">
+            <w:hyperlink w:history="1" r:id="rIdvmpf2gkp0yhgoliuyfpmy">
               <w:r>
                 <w:rPr>
                   <w:rFonts w:ascii="Arial" w:cs="Arial" w:eastAsia="Arial" w:hAnsi="Arial"/>
@@ -33208,7 +33208,7 @@
               <w:spacing w:after="10" w:before="0"/>
               <w:ind w:left="120"/>
             </w:pPr>
-            <w:hyperlink w:history="1" r:id="rIdo8jshutewpfd-p2cmsmko">
+            <w:hyperlink w:history="1" r:id="rIdsqi_dl20td-vnuinevw0d">
               <w:r>
                 <w:rPr>
                   <w:rFonts w:ascii="Arial" w:cs="Arial" w:eastAsia="Arial" w:hAnsi="Arial"/>
@@ -33403,7 +33403,7 @@
             <w:pPr>
               <w:spacing w:after="20" w:before="0"/>
             </w:pPr>
-            <w:hyperlink w:history="1" r:id="rIdtb7mxb8pzqhnzsxpdkbwu">
+            <w:hyperlink w:history="1" r:id="rIdapvnutp-bevorybs1auj3">
               <w:r>
                 <w:rPr>
                   <w:rFonts w:ascii="Arial" w:cs="Arial" w:eastAsia="Arial" w:hAnsi="Arial"/>
@@ -33436,7 +33436,7 @@
               <w:spacing w:after="10" w:before="0"/>
               <w:ind w:left="120"/>
             </w:pPr>
-            <w:hyperlink w:history="1" r:id="rId8d2ogawaczvw-yblbr-fi">
+            <w:hyperlink w:history="1" r:id="rIdvn4vpsd4zr956uamwzoz-">
               <w:r>
                 <w:rPr>
                   <w:rFonts w:ascii="Arial" w:cs="Arial" w:eastAsia="Arial" w:hAnsi="Arial"/>
@@ -33481,7 +33481,7 @@
             <w:pPr>
               <w:spacing w:after="20" w:before="0"/>
             </w:pPr>
-            <w:hyperlink w:history="1" r:id="rIdvvtcrw6twncc4xxikw2zo">
+            <w:hyperlink w:history="1" r:id="rIdj-fkkbueobxeveajuqjgy">
               <w:r>
                 <w:rPr>
                   <w:rFonts w:ascii="Arial" w:cs="Arial" w:eastAsia="Arial" w:hAnsi="Arial"/>
@@ -33514,7 +33514,7 @@
               <w:spacing w:after="10" w:before="0"/>
               <w:ind w:left="120"/>
             </w:pPr>
-            <w:hyperlink w:history="1" r:id="rId3q_wdfremdubjstsr8n-p">
+            <w:hyperlink w:history="1" r:id="rIdj71xpjb0ovqzcglyykpg0">
               <w:r>
                 <w:rPr>
                   <w:rFonts w:ascii="Arial" w:cs="Arial" w:eastAsia="Arial" w:hAnsi="Arial"/>
@@ -33709,7 +33709,7 @@
             <w:pPr>
               <w:spacing w:after="20" w:before="0"/>
             </w:pPr>
-            <w:hyperlink w:history="1" r:id="rIdbvft3iwjnnb6zcsw4gnyl">
+            <w:hyperlink w:history="1" r:id="rId9pc-4fdhdjgnbszqvucuh">
               <w:r>
                 <w:rPr>
                   <w:rFonts w:ascii="Arial" w:cs="Arial" w:eastAsia="Arial" w:hAnsi="Arial"/>
@@ -33742,7 +33742,7 @@
               <w:spacing w:after="10" w:before="0"/>
               <w:ind w:left="120"/>
             </w:pPr>
-            <w:hyperlink w:history="1" r:id="rIda6qi02ldnmpljsjxx2k97">
+            <w:hyperlink w:history="1" r:id="rIdvf5nmmlvtw2w61lt7ef13">
               <w:r>
                 <w:rPr>
                   <w:rFonts w:ascii="Arial" w:cs="Arial" w:eastAsia="Arial" w:hAnsi="Arial"/>
@@ -33787,7 +33787,7 @@
             <w:pPr>
               <w:spacing w:after="20" w:before="0"/>
             </w:pPr>
-            <w:hyperlink w:history="1" r:id="rIdtlijeiaaaclrxp4i4ytop">
+            <w:hyperlink w:history="1" r:id="rIdboldmbfeufweka980fpje">
               <w:r>
                 <w:rPr>
                   <w:rFonts w:ascii="Arial" w:cs="Arial" w:eastAsia="Arial" w:hAnsi="Arial"/>
@@ -33820,7 +33820,7 @@
               <w:spacing w:after="10" w:before="0"/>
               <w:ind w:left="120"/>
             </w:pPr>
-            <w:hyperlink w:history="1" r:id="rIdxbiokq5b9yy_xdqliynoi">
+            <w:hyperlink w:history="1" r:id="rIdurfwzxcrv1gioe-spabr8">
               <w:r>
                 <w:rPr>
                   <w:rFonts w:ascii="Arial" w:cs="Arial" w:eastAsia="Arial" w:hAnsi="Arial"/>
@@ -35307,7 +35307,7 @@
             <w:pPr>
               <w:spacing w:after="20" w:before="0"/>
             </w:pPr>
-            <w:hyperlink w:history="1" r:id="rIdjivbkctguod6z5zyqpr3v">
+            <w:hyperlink w:history="1" r:id="rIdlrcq4lwuloh2mqzoux002">
               <w:r>
                 <w:rPr>
                   <w:rFonts w:ascii="Arial" w:cs="Arial" w:eastAsia="Arial" w:hAnsi="Arial"/>
@@ -35340,7 +35340,7 @@
               <w:spacing w:after="10" w:before="0"/>
               <w:ind w:left="120"/>
             </w:pPr>
-            <w:hyperlink w:history="1" r:id="rIdfp4ykkfazh1oisruv4kej">
+            <w:hyperlink w:history="1" r:id="rIdugtqyhfnpv_bulv5ox6tx">
               <w:r>
                 <w:rPr>
                   <w:rFonts w:ascii="Arial" w:cs="Arial" w:eastAsia="Arial" w:hAnsi="Arial"/>
@@ -35385,7 +35385,7 @@
             <w:pPr>
               <w:spacing w:after="20" w:before="0"/>
             </w:pPr>
-            <w:hyperlink w:history="1" r:id="rIdhwxdosohwmn2sidccgrou">
+            <w:hyperlink w:history="1" r:id="rIdeg54rfexrbwvtxivvqgp7">
               <w:r>
                 <w:rPr>
                   <w:rFonts w:ascii="Arial" w:cs="Arial" w:eastAsia="Arial" w:hAnsi="Arial"/>
@@ -35418,7 +35418,7 @@
               <w:spacing w:after="10" w:before="0"/>
               <w:ind w:left="120"/>
             </w:pPr>
-            <w:hyperlink w:history="1" r:id="rIdhiobggqyosljhja8136hk">
+            <w:hyperlink w:history="1" r:id="rIdtqli4asyzvxc2wx2ycgza">
               <w:r>
                 <w:rPr>
                   <w:rFonts w:ascii="Arial" w:cs="Arial" w:eastAsia="Arial" w:hAnsi="Arial"/>
@@ -35765,7 +35765,7 @@
             <w:pPr>
               <w:spacing w:after="20" w:before="0"/>
             </w:pPr>
-            <w:hyperlink w:history="1" r:id="rIdulmtm7iycdyicimwhyuzc">
+            <w:hyperlink w:history="1" r:id="rId9cd-d8qlxouo9mgkfnroj">
               <w:r>
                 <w:rPr>
                   <w:rFonts w:ascii="Arial" w:cs="Arial" w:eastAsia="Arial" w:hAnsi="Arial"/>
@@ -35798,7 +35798,7 @@
               <w:spacing w:after="10" w:before="0"/>
               <w:ind w:left="120"/>
             </w:pPr>
-            <w:hyperlink w:history="1" r:id="rIdsz0zowlagn2k4afgjvozu">
+            <w:hyperlink w:history="1" r:id="rIdcepyma0x-3-vi8hbesusl">
               <w:r>
                 <w:rPr>
                   <w:rFonts w:ascii="Arial" w:cs="Arial" w:eastAsia="Arial" w:hAnsi="Arial"/>
@@ -35843,7 +35843,7 @@
             <w:pPr>
               <w:spacing w:after="20" w:before="0"/>
             </w:pPr>
-            <w:hyperlink w:history="1" r:id="rIdbf98ndmsqczud733hioab">
+            <w:hyperlink w:history="1" r:id="rIdib87ku8urhfwmumbnmgyn">
               <w:r>
                 <w:rPr>
                   <w:rFonts w:ascii="Arial" w:cs="Arial" w:eastAsia="Arial" w:hAnsi="Arial"/>
@@ -35876,7 +35876,7 @@
               <w:spacing w:after="10" w:before="0"/>
               <w:ind w:left="120"/>
             </w:pPr>
-            <w:hyperlink w:history="1" r:id="rIdxef5one4rrtsm_bgfnjaz">
+            <w:hyperlink w:history="1" r:id="rIdrqdjqm82rn3vveq3-017c">
               <w:r>
                 <w:rPr>
                   <w:rFonts w:ascii="Arial" w:cs="Arial" w:eastAsia="Arial" w:hAnsi="Arial"/>
@@ -36375,7 +36375,7 @@
             <w:pPr>
               <w:spacing w:after="20" w:before="0"/>
             </w:pPr>
-            <w:hyperlink w:history="1" r:id="rId1ao_qnsl1d0fkp3bfwtiv">
+            <w:hyperlink w:history="1" r:id="rIdui3az0-t1bklcg9lb8qi4">
               <w:r>
                 <w:rPr>
                   <w:rFonts w:ascii="Arial" w:cs="Arial" w:eastAsia="Arial" w:hAnsi="Arial"/>
@@ -36408,7 +36408,7 @@
               <w:spacing w:after="10" w:before="0"/>
               <w:ind w:left="120"/>
             </w:pPr>
-            <w:hyperlink w:history="1" r:id="rIdvytln25vwo9x1v5kssi89">
+            <w:hyperlink w:history="1" r:id="rIdyros6lkk966vzdw8dz8h1">
               <w:r>
                 <w:rPr>
                   <w:rFonts w:ascii="Arial" w:cs="Arial" w:eastAsia="Arial" w:hAnsi="Arial"/>
@@ -36453,7 +36453,7 @@
             <w:pPr>
               <w:spacing w:after="20" w:before="0"/>
             </w:pPr>
-            <w:hyperlink w:history="1" r:id="rIdqxl0ndfmfoh8e4x0dcl_g">
+            <w:hyperlink w:history="1" r:id="rIddfqv1is1tzx-fsfsxp94s">
               <w:r>
                 <w:rPr>
                   <w:rFonts w:ascii="Arial" w:cs="Arial" w:eastAsia="Arial" w:hAnsi="Arial"/>
@@ -36486,7 +36486,7 @@
               <w:spacing w:after="10" w:before="0"/>
               <w:ind w:left="120"/>
             </w:pPr>
-            <w:hyperlink w:history="1" r:id="rIdivnxhsiejyonlebfqfxhs">
+            <w:hyperlink w:history="1" r:id="rIdjsdtpndhcyca0flpvwdux">
               <w:r>
                 <w:rPr>
                   <w:rFonts w:ascii="Arial" w:cs="Arial" w:eastAsia="Arial" w:hAnsi="Arial"/>
@@ -36890,7 +36890,7 @@
             <w:pPr>
               <w:spacing w:after="20" w:before="0"/>
             </w:pPr>
-            <w:hyperlink w:history="1" r:id="rIdl61tydc0q5eu6p37s8jez">
+            <w:hyperlink w:history="1" r:id="rIdoliimxzo_vb9pihnmkqrv">
               <w:r>
                 <w:rPr>
                   <w:rFonts w:ascii="Arial" w:cs="Arial" w:eastAsia="Arial" w:hAnsi="Arial"/>
@@ -36923,7 +36923,7 @@
               <w:spacing w:after="10" w:before="0"/>
               <w:ind w:left="120"/>
             </w:pPr>
-            <w:hyperlink w:history="1" r:id="rIddbdadwuvx9yomau2_29qw">
+            <w:hyperlink w:history="1" r:id="rIdra_tqfgbrpuhhzaods_zu">
               <w:r>
                 <w:rPr>
                   <w:rFonts w:ascii="Arial" w:cs="Arial" w:eastAsia="Arial" w:hAnsi="Arial"/>
@@ -36968,7 +36968,7 @@
             <w:pPr>
               <w:spacing w:after="20" w:before="0"/>
             </w:pPr>
-            <w:hyperlink w:history="1" r:id="rIdrg_9bbugzxfwbpm75-1zs">
+            <w:hyperlink w:history="1" r:id="rId9wfvs2bun2fjnnezr2j7d">
               <w:r>
                 <w:rPr>
                   <w:rFonts w:ascii="Arial" w:cs="Arial" w:eastAsia="Arial" w:hAnsi="Arial"/>
@@ -37001,7 +37001,7 @@
               <w:spacing w:after="10" w:before="0"/>
               <w:ind w:left="120"/>
             </w:pPr>
-            <w:hyperlink w:history="1" r:id="rIdj8ychptehqgsgjx2gu0op">
+            <w:hyperlink w:history="1" r:id="rId2tf7wybetybkmo8npfc7q">
               <w:r>
                 <w:rPr>
                   <w:rFonts w:ascii="Arial" w:cs="Arial" w:eastAsia="Arial" w:hAnsi="Arial"/>
@@ -37443,7 +37443,7 @@
             <w:pPr>
               <w:spacing w:after="20" w:before="0"/>
             </w:pPr>
-            <w:hyperlink w:history="1" r:id="rIdop1vpwjvjrmjty31vszpi">
+            <w:hyperlink w:history="1" r:id="rIdakhiq7ehgchwkclmmfesr">
               <w:r>
                 <w:rPr>
                   <w:rFonts w:ascii="Arial" w:cs="Arial" w:eastAsia="Arial" w:hAnsi="Arial"/>
@@ -37476,7 +37476,7 @@
               <w:spacing w:after="10" w:before="0"/>
               <w:ind w:left="120"/>
             </w:pPr>
-            <w:hyperlink w:history="1" r:id="rIdiv_wsnjuskfmgwcmwill7">
+            <w:hyperlink w:history="1" r:id="rIdy7sqc8pba9juj2wh1mflu">
               <w:r>
                 <w:rPr>
                   <w:rFonts w:ascii="Arial" w:cs="Arial" w:eastAsia="Arial" w:hAnsi="Arial"/>
@@ -37521,7 +37521,7 @@
             <w:pPr>
               <w:spacing w:after="20" w:before="0"/>
             </w:pPr>
-            <w:hyperlink w:history="1" r:id="rIdsszc7fsexc0ngvy9b8lfb">
+            <w:hyperlink w:history="1" r:id="rId_h1ksgjnmcwbhpzpoeweu">
               <w:r>
                 <w:rPr>
                   <w:rFonts w:ascii="Arial" w:cs="Arial" w:eastAsia="Arial" w:hAnsi="Arial"/>
@@ -37554,7 +37554,7 @@
               <w:spacing w:after="10" w:before="0"/>
               <w:ind w:left="120"/>
             </w:pPr>
-            <w:hyperlink w:history="1" r:id="rIddagcdcsuewmqipcf_onlh">
+            <w:hyperlink w:history="1" r:id="rId6v7m_ixtvzjir_yfqxlky">
               <w:r>
                 <w:rPr>
                   <w:rFonts w:ascii="Arial" w:cs="Arial" w:eastAsia="Arial" w:hAnsi="Arial"/>

</xml_diff>

<commit_message>
Add generate_teacher_index.js to repo; regenerate all 42 sub-strands with ares.local + resourceLinks
</commit_message>
<xml_diff>
--- a/data/outputs/v2/Biology/SS1.1_Cell_Structure/Biology_Cell_Structure_CBE_LessonSequence.docx
+++ b/data/outputs/v2/Biology/SS1.1_Cell_Structure/Biology_Cell_Structure_CBE_LessonSequence.docx
@@ -3477,7 +3477,7 @@
             <w:pPr>
               <w:spacing w:after="20" w:before="0"/>
             </w:pPr>
-            <w:hyperlink w:history="1" r:id="rIdq8mrs6xh6e0afbclqjbgz">
+            <w:hyperlink w:history="1" r:id="rId6ho2twhgzsu41x7-jpgom">
               <w:r>
                 <w:rPr>
                   <w:rFonts w:ascii="Arial" w:cs="Arial" w:eastAsia="Arial" w:hAnsi="Arial"/>
@@ -3510,7 +3510,7 @@
               <w:spacing w:after="10" w:before="0"/>
               <w:ind w:left="120"/>
             </w:pPr>
-            <w:hyperlink w:history="1" r:id="rIdbxf16tt-ovgvbrjrex0kj">
+            <w:hyperlink w:history="1" r:id="rIdc2iz6bwdrfzysaf5ryyqo">
               <w:r>
                 <w:rPr>
                   <w:rFonts w:ascii="Arial" w:cs="Arial" w:eastAsia="Arial" w:hAnsi="Arial"/>
@@ -3555,7 +3555,7 @@
             <w:pPr>
               <w:spacing w:after="20" w:before="0"/>
             </w:pPr>
-            <w:hyperlink w:history="1" r:id="rIdwh_4kk_w-rsrb2ah8eao_">
+            <w:hyperlink w:history="1" r:id="rIdmozecyacwujp11_d_zrfj">
               <w:r>
                 <w:rPr>
                   <w:rFonts w:ascii="Arial" w:cs="Arial" w:eastAsia="Arial" w:hAnsi="Arial"/>
@@ -3588,7 +3588,7 @@
               <w:spacing w:after="10" w:before="0"/>
               <w:ind w:left="120"/>
             </w:pPr>
-            <w:hyperlink w:history="1" r:id="rIdqf9e7f_w9ud7_doqawww_">
+            <w:hyperlink w:history="1" r:id="rId9aheit-5tcgfdihvf-fgv">
               <w:r>
                 <w:rPr>
                   <w:rFonts w:ascii="Arial" w:cs="Arial" w:eastAsia="Arial" w:hAnsi="Arial"/>
@@ -3783,7 +3783,7 @@
             <w:pPr>
               <w:spacing w:after="20" w:before="0"/>
             </w:pPr>
-            <w:hyperlink w:history="1" r:id="rId1ghurbuorhuki8oeovmcf">
+            <w:hyperlink w:history="1" r:id="rId94f9-6m-lfqm-ypxwexbk">
               <w:r>
                 <w:rPr>
                   <w:rFonts w:ascii="Arial" w:cs="Arial" w:eastAsia="Arial" w:hAnsi="Arial"/>
@@ -3816,7 +3816,7 @@
               <w:spacing w:after="10" w:before="0"/>
               <w:ind w:left="120"/>
             </w:pPr>
-            <w:hyperlink w:history="1" r:id="rId2gzce6nhzkttttavuxq7-">
+            <w:hyperlink w:history="1" r:id="rIdmdnwbeeunw0b2rh5nug9b">
               <w:r>
                 <w:rPr>
                   <w:rFonts w:ascii="Arial" w:cs="Arial" w:eastAsia="Arial" w:hAnsi="Arial"/>
@@ -3861,7 +3861,7 @@
             <w:pPr>
               <w:spacing w:after="20" w:before="0"/>
             </w:pPr>
-            <w:hyperlink w:history="1" r:id="rIdoqsnsqm2uqg2atseismjs">
+            <w:hyperlink w:history="1" r:id="rId7mwgalwegui717uqv0ygj">
               <w:r>
                 <w:rPr>
                   <w:rFonts w:ascii="Arial" w:cs="Arial" w:eastAsia="Arial" w:hAnsi="Arial"/>
@@ -3894,7 +3894,7 @@
               <w:spacing w:after="10" w:before="0"/>
               <w:ind w:left="120"/>
             </w:pPr>
-            <w:hyperlink w:history="1" r:id="rIdpnli8gdtvd9tm9zvu8lm8">
+            <w:hyperlink w:history="1" r:id="rIdrevrmgfpfnyvuxftqtpcv">
               <w:r>
                 <w:rPr>
                   <w:rFonts w:ascii="Arial" w:cs="Arial" w:eastAsia="Arial" w:hAnsi="Arial"/>
@@ -4089,7 +4089,7 @@
             <w:pPr>
               <w:spacing w:after="20" w:before="0"/>
             </w:pPr>
-            <w:hyperlink w:history="1" r:id="rIdknoz2lznbyxzbukusqxdu">
+            <w:hyperlink w:history="1" r:id="rIdfrjq1924d6cgpwjlb6amp">
               <w:r>
                 <w:rPr>
                   <w:rFonts w:ascii="Arial" w:cs="Arial" w:eastAsia="Arial" w:hAnsi="Arial"/>
@@ -4122,7 +4122,7 @@
               <w:spacing w:after="10" w:before="0"/>
               <w:ind w:left="120"/>
             </w:pPr>
-            <w:hyperlink w:history="1" r:id="rIdlrye7h5ti3rkjwn6ta0gv">
+            <w:hyperlink w:history="1" r:id="rId7r1l_mm6xcseiuwawkc5p">
               <w:r>
                 <w:rPr>
                   <w:rFonts w:ascii="Arial" w:cs="Arial" w:eastAsia="Arial" w:hAnsi="Arial"/>
@@ -4167,7 +4167,7 @@
             <w:pPr>
               <w:spacing w:after="20" w:before="0"/>
             </w:pPr>
-            <w:hyperlink w:history="1" r:id="rIdyfbwm4qjcigl_oe4l_gse">
+            <w:hyperlink w:history="1" r:id="rIdsitosta5qcxgnwlxrxsj6">
               <w:r>
                 <w:rPr>
                   <w:rFonts w:ascii="Arial" w:cs="Arial" w:eastAsia="Arial" w:hAnsi="Arial"/>
@@ -4200,7 +4200,7 @@
               <w:spacing w:after="10" w:before="0"/>
               <w:ind w:left="120"/>
             </w:pPr>
-            <w:hyperlink w:history="1" r:id="rId5ormkco7ojohtc8u7_e1z">
+            <w:hyperlink w:history="1" r:id="rIdf6ie8jzkhjmpurxvc6dyy">
               <w:r>
                 <w:rPr>
                   <w:rFonts w:ascii="Arial" w:cs="Arial" w:eastAsia="Arial" w:hAnsi="Arial"/>
@@ -4395,7 +4395,7 @@
             <w:pPr>
               <w:spacing w:after="20" w:before="0"/>
             </w:pPr>
-            <w:hyperlink w:history="1" r:id="rIddmzochnkuntru67d1lapw">
+            <w:hyperlink w:history="1" r:id="rIdxw23pcbcrmaxrpydzurlp">
               <w:r>
                 <w:rPr>
                   <w:rFonts w:ascii="Arial" w:cs="Arial" w:eastAsia="Arial" w:hAnsi="Arial"/>
@@ -4428,7 +4428,7 @@
               <w:spacing w:after="10" w:before="0"/>
               <w:ind w:left="120"/>
             </w:pPr>
-            <w:hyperlink w:history="1" r:id="rIdg078lo6xo73lt1qsdf1lm">
+            <w:hyperlink w:history="1" r:id="rIdk4xzryfk3d9t4gytjdm1v">
               <w:r>
                 <w:rPr>
                   <w:rFonts w:ascii="Arial" w:cs="Arial" w:eastAsia="Arial" w:hAnsi="Arial"/>
@@ -4473,7 +4473,7 @@
             <w:pPr>
               <w:spacing w:after="20" w:before="0"/>
             </w:pPr>
-            <w:hyperlink w:history="1" r:id="rIds6vn6dqlvtmawv4xxgj4m">
+            <w:hyperlink w:history="1" r:id="rId6g7mgztcgpys_b4uw-ypv">
               <w:r>
                 <w:rPr>
                   <w:rFonts w:ascii="Arial" w:cs="Arial" w:eastAsia="Arial" w:hAnsi="Arial"/>
@@ -4506,7 +4506,7 @@
               <w:spacing w:after="10" w:before="0"/>
               <w:ind w:left="120"/>
             </w:pPr>
-            <w:hyperlink w:history="1" r:id="rIdeaneuefqzi_drit03dznw">
+            <w:hyperlink w:history="1" r:id="rIdwa-bcgrnpctkkac8t2mbu">
               <w:r>
                 <w:rPr>
                   <w:rFonts w:ascii="Arial" w:cs="Arial" w:eastAsia="Arial" w:hAnsi="Arial"/>
@@ -4701,7 +4701,7 @@
             <w:pPr>
               <w:spacing w:after="20" w:before="0"/>
             </w:pPr>
-            <w:hyperlink w:history="1" r:id="rIdtmmbyrwm_coaygo2m-g4e">
+            <w:hyperlink w:history="1" r:id="rIddxz5d0hk9gs0rz91jksrt">
               <w:r>
                 <w:rPr>
                   <w:rFonts w:ascii="Arial" w:cs="Arial" w:eastAsia="Arial" w:hAnsi="Arial"/>
@@ -4734,7 +4734,7 @@
               <w:spacing w:after="10" w:before="0"/>
               <w:ind w:left="120"/>
             </w:pPr>
-            <w:hyperlink w:history="1" r:id="rId9lri_lxjc8xv34r6fk1n4">
+            <w:hyperlink w:history="1" r:id="rId2nynv5fbpytvkaetzblht">
               <w:r>
                 <w:rPr>
                   <w:rFonts w:ascii="Arial" w:cs="Arial" w:eastAsia="Arial" w:hAnsi="Arial"/>
@@ -4779,7 +4779,7 @@
             <w:pPr>
               <w:spacing w:after="20" w:before="0"/>
             </w:pPr>
-            <w:hyperlink w:history="1" r:id="rIdnbibazqpxaivzf3voqf_j">
+            <w:hyperlink w:history="1" r:id="rIdl9vztcmpyfzxjlg7nbf3n">
               <w:r>
                 <w:rPr>
                   <w:rFonts w:ascii="Arial" w:cs="Arial" w:eastAsia="Arial" w:hAnsi="Arial"/>
@@ -4812,7 +4812,7 @@
               <w:spacing w:after="10" w:before="0"/>
               <w:ind w:left="120"/>
             </w:pPr>
-            <w:hyperlink w:history="1" r:id="rIdavvmlf6emvjolxtvdypod">
+            <w:hyperlink w:history="1" r:id="rIddl_lf1p2jrmt11lr0xto3">
               <w:r>
                 <w:rPr>
                   <w:rFonts w:ascii="Arial" w:cs="Arial" w:eastAsia="Arial" w:hAnsi="Arial"/>
@@ -6299,7 +6299,7 @@
             <w:pPr>
               <w:spacing w:after="20" w:before="0"/>
             </w:pPr>
-            <w:hyperlink w:history="1" r:id="rId6zwnjzjiedofmk4wlatbs">
+            <w:hyperlink w:history="1" r:id="rIdr1lxctoc6ya85ad8-wsua">
               <w:r>
                 <w:rPr>
                   <w:rFonts w:ascii="Arial" w:cs="Arial" w:eastAsia="Arial" w:hAnsi="Arial"/>
@@ -6332,7 +6332,7 @@
               <w:spacing w:after="10" w:before="0"/>
               <w:ind w:left="120"/>
             </w:pPr>
-            <w:hyperlink w:history="1" r:id="rIdn1lpbpwxlxnagecfpoej2">
+            <w:hyperlink w:history="1" r:id="rIdcpetf13ugscobhxjypyor">
               <w:r>
                 <w:rPr>
                   <w:rFonts w:ascii="Arial" w:cs="Arial" w:eastAsia="Arial" w:hAnsi="Arial"/>
@@ -6377,7 +6377,7 @@
             <w:pPr>
               <w:spacing w:after="20" w:before="0"/>
             </w:pPr>
-            <w:hyperlink w:history="1" r:id="rIdzazgaulignmrclettjq_z">
+            <w:hyperlink w:history="1" r:id="rId4eezrw_nfzxxorayrzjrt">
               <w:r>
                 <w:rPr>
                   <w:rFonts w:ascii="Arial" w:cs="Arial" w:eastAsia="Arial" w:hAnsi="Arial"/>
@@ -6410,7 +6410,7 @@
               <w:spacing w:after="10" w:before="0"/>
               <w:ind w:left="120"/>
             </w:pPr>
-            <w:hyperlink w:history="1" r:id="rIdnazjwaiuhjmfnyhjtottq">
+            <w:hyperlink w:history="1" r:id="rIdf3gvrbvamigfi64t0pjw_">
               <w:r>
                 <w:rPr>
                   <w:rFonts w:ascii="Arial" w:cs="Arial" w:eastAsia="Arial" w:hAnsi="Arial"/>
@@ -6605,7 +6605,7 @@
             <w:pPr>
               <w:spacing w:after="20" w:before="0"/>
             </w:pPr>
-            <w:hyperlink w:history="1" r:id="rIdpx4xn0qgaajcem4eowbp7">
+            <w:hyperlink w:history="1" r:id="rIdlxn7t5970q4quwiodpeoo">
               <w:r>
                 <w:rPr>
                   <w:rFonts w:ascii="Arial" w:cs="Arial" w:eastAsia="Arial" w:hAnsi="Arial"/>
@@ -6638,7 +6638,7 @@
               <w:spacing w:after="10" w:before="0"/>
               <w:ind w:left="120"/>
             </w:pPr>
-            <w:hyperlink w:history="1" r:id="rId-geuyi9w_lk8kyeiaqkjo">
+            <w:hyperlink w:history="1" r:id="rId5yohu_qkge1enci0ul33u">
               <w:r>
                 <w:rPr>
                   <w:rFonts w:ascii="Arial" w:cs="Arial" w:eastAsia="Arial" w:hAnsi="Arial"/>
@@ -6683,7 +6683,7 @@
             <w:pPr>
               <w:spacing w:after="20" w:before="0"/>
             </w:pPr>
-            <w:hyperlink w:history="1" r:id="rId-i0bocifrepmmaldpxic7">
+            <w:hyperlink w:history="1" r:id="rIdxcon-n8sqnp6mh95ymtbm">
               <w:r>
                 <w:rPr>
                   <w:rFonts w:ascii="Arial" w:cs="Arial" w:eastAsia="Arial" w:hAnsi="Arial"/>
@@ -6716,7 +6716,7 @@
               <w:spacing w:after="10" w:before="0"/>
               <w:ind w:left="120"/>
             </w:pPr>
-            <w:hyperlink w:history="1" r:id="rIdn0afv0us_4bwi88m9dhzh">
+            <w:hyperlink w:history="1" r:id="rIdh7n4qzk8jsaru1xke-ua3">
               <w:r>
                 <w:rPr>
                   <w:rFonts w:ascii="Arial" w:cs="Arial" w:eastAsia="Arial" w:hAnsi="Arial"/>
@@ -6911,7 +6911,7 @@
             <w:pPr>
               <w:spacing w:after="20" w:before="0"/>
             </w:pPr>
-            <w:hyperlink w:history="1" r:id="rIduuoy4wtk771vlku9d0jpa">
+            <w:hyperlink w:history="1" r:id="rIdvg9mykhjnrrrtqpn-nkgb">
               <w:r>
                 <w:rPr>
                   <w:rFonts w:ascii="Arial" w:cs="Arial" w:eastAsia="Arial" w:hAnsi="Arial"/>
@@ -6944,7 +6944,7 @@
               <w:spacing w:after="10" w:before="0"/>
               <w:ind w:left="120"/>
             </w:pPr>
-            <w:hyperlink w:history="1" r:id="rId1v-dnjvih9d0whkrmhpr4">
+            <w:hyperlink w:history="1" r:id="rIdxbfn98fir2ppvwi7v7vis">
               <w:r>
                 <w:rPr>
                   <w:rFonts w:ascii="Arial" w:cs="Arial" w:eastAsia="Arial" w:hAnsi="Arial"/>
@@ -6989,7 +6989,7 @@
             <w:pPr>
               <w:spacing w:after="20" w:before="0"/>
             </w:pPr>
-            <w:hyperlink w:history="1" r:id="rId0s0tjlx15fefbv3agfnbw">
+            <w:hyperlink w:history="1" r:id="rId4n9vw3hga8swc7q8pnnxh">
               <w:r>
                 <w:rPr>
                   <w:rFonts w:ascii="Arial" w:cs="Arial" w:eastAsia="Arial" w:hAnsi="Arial"/>
@@ -7022,7 +7022,7 @@
               <w:spacing w:after="10" w:before="0"/>
               <w:ind w:left="120"/>
             </w:pPr>
-            <w:hyperlink w:history="1" r:id="rIdbrkgycieq1yhedfdnqiy_">
+            <w:hyperlink w:history="1" r:id="rIdkbodo4xvyrbxd5frsq1kj">
               <w:r>
                 <w:rPr>
                   <w:rFonts w:ascii="Arial" w:cs="Arial" w:eastAsia="Arial" w:hAnsi="Arial"/>
@@ -7217,7 +7217,7 @@
             <w:pPr>
               <w:spacing w:after="20" w:before="0"/>
             </w:pPr>
-            <w:hyperlink w:history="1" r:id="rIdfuyqnzdmzz8bmtrxjpqmz">
+            <w:hyperlink w:history="1" r:id="rIdp-l6mh46dwbdtn4nxtnwl">
               <w:r>
                 <w:rPr>
                   <w:rFonts w:ascii="Arial" w:cs="Arial" w:eastAsia="Arial" w:hAnsi="Arial"/>
@@ -7250,7 +7250,7 @@
               <w:spacing w:after="10" w:before="0"/>
               <w:ind w:left="120"/>
             </w:pPr>
-            <w:hyperlink w:history="1" r:id="rIdov7xuwglaqe1w7zb5juqg">
+            <w:hyperlink w:history="1" r:id="rIdcw-45iivgyehgneg19o2u">
               <w:r>
                 <w:rPr>
                   <w:rFonts w:ascii="Arial" w:cs="Arial" w:eastAsia="Arial" w:hAnsi="Arial"/>
@@ -7295,7 +7295,7 @@
             <w:pPr>
               <w:spacing w:after="20" w:before="0"/>
             </w:pPr>
-            <w:hyperlink w:history="1" r:id="rIdfexy_ku8buua2d10yq_yz">
+            <w:hyperlink w:history="1" r:id="rIdubykkqggqtm_bu0u8hkp1">
               <w:r>
                 <w:rPr>
                   <w:rFonts w:ascii="Arial" w:cs="Arial" w:eastAsia="Arial" w:hAnsi="Arial"/>
@@ -7328,7 +7328,7 @@
               <w:spacing w:after="10" w:before="0"/>
               <w:ind w:left="120"/>
             </w:pPr>
-            <w:hyperlink w:history="1" r:id="rIdlzlumieoecjwuvzh4l9tw">
+            <w:hyperlink w:history="1" r:id="rId5hn6u4gfqgq0qux74u6on">
               <w:r>
                 <w:rPr>
                   <w:rFonts w:ascii="Arial" w:cs="Arial" w:eastAsia="Arial" w:hAnsi="Arial"/>
@@ -7523,7 +7523,7 @@
             <w:pPr>
               <w:spacing w:after="20" w:before="0"/>
             </w:pPr>
-            <w:hyperlink w:history="1" r:id="rIdzfxr2qbpablo2uc4enjew">
+            <w:hyperlink w:history="1" r:id="rIdfblwkj0qq-3l2n1mgudq7">
               <w:r>
                 <w:rPr>
                   <w:rFonts w:ascii="Arial" w:cs="Arial" w:eastAsia="Arial" w:hAnsi="Arial"/>
@@ -7556,7 +7556,7 @@
               <w:spacing w:after="10" w:before="0"/>
               <w:ind w:left="120"/>
             </w:pPr>
-            <w:hyperlink w:history="1" r:id="rIdbtay8r3jfgxsxhncgghwx">
+            <w:hyperlink w:history="1" r:id="rId4jssumxshcr4d1gw-watu">
               <w:r>
                 <w:rPr>
                   <w:rFonts w:ascii="Arial" w:cs="Arial" w:eastAsia="Arial" w:hAnsi="Arial"/>
@@ -7601,7 +7601,7 @@
             <w:pPr>
               <w:spacing w:after="20" w:before="0"/>
             </w:pPr>
-            <w:hyperlink w:history="1" r:id="rIdsrwricori6g28idkamco9">
+            <w:hyperlink w:history="1" r:id="rIdd29o7kegm3l-xfamfwwsu">
               <w:r>
                 <w:rPr>
                   <w:rFonts w:ascii="Arial" w:cs="Arial" w:eastAsia="Arial" w:hAnsi="Arial"/>
@@ -7634,7 +7634,7 @@
               <w:spacing w:after="10" w:before="0"/>
               <w:ind w:left="120"/>
             </w:pPr>
-            <w:hyperlink w:history="1" r:id="rIdnnemlj1seazvhwjufznii">
+            <w:hyperlink w:history="1" r:id="rIdq7vkdbchb4vxwwgicuhvu">
               <w:r>
                 <w:rPr>
                   <w:rFonts w:ascii="Arial" w:cs="Arial" w:eastAsia="Arial" w:hAnsi="Arial"/>
@@ -9121,7 +9121,7 @@
             <w:pPr>
               <w:spacing w:after="20" w:before="0"/>
             </w:pPr>
-            <w:hyperlink w:history="1" r:id="rIdpdjnlgykny_tecckaalaw">
+            <w:hyperlink w:history="1" r:id="rId1wkemm7gzoebl0njnhw-m">
               <w:r>
                 <w:rPr>
                   <w:rFonts w:ascii="Arial" w:cs="Arial" w:eastAsia="Arial" w:hAnsi="Arial"/>
@@ -9154,7 +9154,7 @@
               <w:spacing w:after="10" w:before="0"/>
               <w:ind w:left="120"/>
             </w:pPr>
-            <w:hyperlink w:history="1" r:id="rIdonwiqhcoj3cgjendaydrb">
+            <w:hyperlink w:history="1" r:id="rIdmesrekgdpqsz-sxwisy2n">
               <w:r>
                 <w:rPr>
                   <w:rFonts w:ascii="Arial" w:cs="Arial" w:eastAsia="Arial" w:hAnsi="Arial"/>
@@ -9199,7 +9199,7 @@
             <w:pPr>
               <w:spacing w:after="20" w:before="0"/>
             </w:pPr>
-            <w:hyperlink w:history="1" r:id="rIdd7v-waa41sshnigv5vbxr">
+            <w:hyperlink w:history="1" r:id="rIdqc7gmmhkwmjqtrhels6xb">
               <w:r>
                 <w:rPr>
                   <w:rFonts w:ascii="Arial" w:cs="Arial" w:eastAsia="Arial" w:hAnsi="Arial"/>
@@ -9232,7 +9232,7 @@
               <w:spacing w:after="10" w:before="0"/>
               <w:ind w:left="120"/>
             </w:pPr>
-            <w:hyperlink w:history="1" r:id="rIdaqmiq47okc-lq09u7ooqy">
+            <w:hyperlink w:history="1" r:id="rIdlgh0htoq9eqxzrenw47r3">
               <w:r>
                 <w:rPr>
                   <w:rFonts w:ascii="Arial" w:cs="Arial" w:eastAsia="Arial" w:hAnsi="Arial"/>
@@ -9427,7 +9427,7 @@
             <w:pPr>
               <w:spacing w:after="20" w:before="0"/>
             </w:pPr>
-            <w:hyperlink w:history="1" r:id="rIdmwqlxnpqgegctza6ruyvt">
+            <w:hyperlink w:history="1" r:id="rIdlu3bpr05gtyfusekqszhb">
               <w:r>
                 <w:rPr>
                   <w:rFonts w:ascii="Arial" w:cs="Arial" w:eastAsia="Arial" w:hAnsi="Arial"/>
@@ -9460,7 +9460,7 @@
               <w:spacing w:after="10" w:before="0"/>
               <w:ind w:left="120"/>
             </w:pPr>
-            <w:hyperlink w:history="1" r:id="rId6u-izdfxtneckknact5qs">
+            <w:hyperlink w:history="1" r:id="rIdjwvlfa_h8rvwyve6or04n">
               <w:r>
                 <w:rPr>
                   <w:rFonts w:ascii="Arial" w:cs="Arial" w:eastAsia="Arial" w:hAnsi="Arial"/>
@@ -9505,7 +9505,7 @@
             <w:pPr>
               <w:spacing w:after="20" w:before="0"/>
             </w:pPr>
-            <w:hyperlink w:history="1" r:id="rIdp1joywo9rul9czovhuug-">
+            <w:hyperlink w:history="1" r:id="rIdp1_3ujs-wm-ihqqfhif1f">
               <w:r>
                 <w:rPr>
                   <w:rFonts w:ascii="Arial" w:cs="Arial" w:eastAsia="Arial" w:hAnsi="Arial"/>
@@ -9538,7 +9538,7 @@
               <w:spacing w:after="10" w:before="0"/>
               <w:ind w:left="120"/>
             </w:pPr>
-            <w:hyperlink w:history="1" r:id="rId3z7ijezkuvae3gkvqaelh">
+            <w:hyperlink w:history="1" r:id="rId5yrwgu2nxjdwc2dviph3v">
               <w:r>
                 <w:rPr>
                   <w:rFonts w:ascii="Arial" w:cs="Arial" w:eastAsia="Arial" w:hAnsi="Arial"/>
@@ -9733,7 +9733,7 @@
             <w:pPr>
               <w:spacing w:after="20" w:before="0"/>
             </w:pPr>
-            <w:hyperlink w:history="1" r:id="rIds9lvocayye8773sj5d5yp">
+            <w:hyperlink w:history="1" r:id="rIdelc7en3fgdvkz6hwnfg1i">
               <w:r>
                 <w:rPr>
                   <w:rFonts w:ascii="Arial" w:cs="Arial" w:eastAsia="Arial" w:hAnsi="Arial"/>
@@ -9766,7 +9766,7 @@
               <w:spacing w:after="10" w:before="0"/>
               <w:ind w:left="120"/>
             </w:pPr>
-            <w:hyperlink w:history="1" r:id="rIdzfum0lo84uu2vhla2hcrk">
+            <w:hyperlink w:history="1" r:id="rIdiczlp3fb2yxdxhwlhimuv">
               <w:r>
                 <w:rPr>
                   <w:rFonts w:ascii="Arial" w:cs="Arial" w:eastAsia="Arial" w:hAnsi="Arial"/>
@@ -9811,7 +9811,7 @@
             <w:pPr>
               <w:spacing w:after="20" w:before="0"/>
             </w:pPr>
-            <w:hyperlink w:history="1" r:id="rIdobikem-wmxfaso0hicc_0">
+            <w:hyperlink w:history="1" r:id="rIdavrodccp6sshlg5jd-oii">
               <w:r>
                 <w:rPr>
                   <w:rFonts w:ascii="Arial" w:cs="Arial" w:eastAsia="Arial" w:hAnsi="Arial"/>
@@ -9844,7 +9844,7 @@
               <w:spacing w:after="10" w:before="0"/>
               <w:ind w:left="120"/>
             </w:pPr>
-            <w:hyperlink w:history="1" r:id="rIdpayikomq4nnrrd11k1tgg">
+            <w:hyperlink w:history="1" r:id="rIdzeo9j9g-ux48azb71wk8n">
               <w:r>
                 <w:rPr>
                   <w:rFonts w:ascii="Arial" w:cs="Arial" w:eastAsia="Arial" w:hAnsi="Arial"/>
@@ -10039,7 +10039,7 @@
             <w:pPr>
               <w:spacing w:after="20" w:before="0"/>
             </w:pPr>
-            <w:hyperlink w:history="1" r:id="rIdv64mok-oehfordaebnoif">
+            <w:hyperlink w:history="1" r:id="rIdfhqebq_jxlmx-zzfr5rr9">
               <w:r>
                 <w:rPr>
                   <w:rFonts w:ascii="Arial" w:cs="Arial" w:eastAsia="Arial" w:hAnsi="Arial"/>
@@ -10072,7 +10072,7 @@
               <w:spacing w:after="10" w:before="0"/>
               <w:ind w:left="120"/>
             </w:pPr>
-            <w:hyperlink w:history="1" r:id="rIdcn8c-jq4ycfu4wt87qnsz">
+            <w:hyperlink w:history="1" r:id="rId2vg5xso-nihrprd-vj1jb">
               <w:r>
                 <w:rPr>
                   <w:rFonts w:ascii="Arial" w:cs="Arial" w:eastAsia="Arial" w:hAnsi="Arial"/>
@@ -10117,7 +10117,7 @@
             <w:pPr>
               <w:spacing w:after="20" w:before="0"/>
             </w:pPr>
-            <w:hyperlink w:history="1" r:id="rIdjnky8mjz_jwgwmurjlko6">
+            <w:hyperlink w:history="1" r:id="rIdi25trvqp3bh4nzay8uk9l">
               <w:r>
                 <w:rPr>
                   <w:rFonts w:ascii="Arial" w:cs="Arial" w:eastAsia="Arial" w:hAnsi="Arial"/>
@@ -10150,7 +10150,7 @@
               <w:spacing w:after="10" w:before="0"/>
               <w:ind w:left="120"/>
             </w:pPr>
-            <w:hyperlink w:history="1" r:id="rIdc6cv-uiljlzudzdqzbpvt">
+            <w:hyperlink w:history="1" r:id="rIdultjvnfhdh_kzgazbfgge">
               <w:r>
                 <w:rPr>
                   <w:rFonts w:ascii="Arial" w:cs="Arial" w:eastAsia="Arial" w:hAnsi="Arial"/>
@@ -10345,7 +10345,7 @@
             <w:pPr>
               <w:spacing w:after="20" w:before="0"/>
             </w:pPr>
-            <w:hyperlink w:history="1" r:id="rId9jclgha_vzjnxnmdnnbnc">
+            <w:hyperlink w:history="1" r:id="rIdvguysouyppexaoqh48v7g">
               <w:r>
                 <w:rPr>
                   <w:rFonts w:ascii="Arial" w:cs="Arial" w:eastAsia="Arial" w:hAnsi="Arial"/>
@@ -10378,7 +10378,7 @@
               <w:spacing w:after="10" w:before="0"/>
               <w:ind w:left="120"/>
             </w:pPr>
-            <w:hyperlink w:history="1" r:id="rIdauurue5csfhandde-pfwc">
+            <w:hyperlink w:history="1" r:id="rIdegdn4e76ulj9hrbj7_9md">
               <w:r>
                 <w:rPr>
                   <w:rFonts w:ascii="Arial" w:cs="Arial" w:eastAsia="Arial" w:hAnsi="Arial"/>
@@ -10423,7 +10423,7 @@
             <w:pPr>
               <w:spacing w:after="20" w:before="0"/>
             </w:pPr>
-            <w:hyperlink w:history="1" r:id="rIdp5syl8hee0a1iy3gj3yf1">
+            <w:hyperlink w:history="1" r:id="rIdd6a4-ae7n49ic_sfdxfgr">
               <w:r>
                 <w:rPr>
                   <w:rFonts w:ascii="Arial" w:cs="Arial" w:eastAsia="Arial" w:hAnsi="Arial"/>
@@ -10456,7 +10456,7 @@
               <w:spacing w:after="10" w:before="0"/>
               <w:ind w:left="120"/>
             </w:pPr>
-            <w:hyperlink w:history="1" r:id="rId8lgc8hbkoafnddfddd1_y">
+            <w:hyperlink w:history="1" r:id="rIdytrmi3tgu76iyx8rox3ew">
               <w:r>
                 <w:rPr>
                   <w:rFonts w:ascii="Arial" w:cs="Arial" w:eastAsia="Arial" w:hAnsi="Arial"/>
@@ -11943,7 +11943,7 @@
             <w:pPr>
               <w:spacing w:after="20" w:before="0"/>
             </w:pPr>
-            <w:hyperlink w:history="1" r:id="rIdwbbjzuc-qk097fjcxwdov">
+            <w:hyperlink w:history="1" r:id="rIdincmctjwrqzt-2ykqezmp">
               <w:r>
                 <w:rPr>
                   <w:rFonts w:ascii="Arial" w:cs="Arial" w:eastAsia="Arial" w:hAnsi="Arial"/>
@@ -11976,7 +11976,7 @@
               <w:spacing w:after="10" w:before="0"/>
               <w:ind w:left="120"/>
             </w:pPr>
-            <w:hyperlink w:history="1" r:id="rIdayekdumttayz1bwx5sqpt">
+            <w:hyperlink w:history="1" r:id="rIdb0teerpdd4b1tvnjqibe-">
               <w:r>
                 <w:rPr>
                   <w:rFonts w:ascii="Arial" w:cs="Arial" w:eastAsia="Arial" w:hAnsi="Arial"/>
@@ -12021,7 +12021,7 @@
             <w:pPr>
               <w:spacing w:after="20" w:before="0"/>
             </w:pPr>
-            <w:hyperlink w:history="1" r:id="rIdv2ib__a1sqe7egogenz-z">
+            <w:hyperlink w:history="1" r:id="rIdwzfr8vnrbhx6djy1qjj7s">
               <w:r>
                 <w:rPr>
                   <w:rFonts w:ascii="Arial" w:cs="Arial" w:eastAsia="Arial" w:hAnsi="Arial"/>
@@ -12054,7 +12054,7 @@
               <w:spacing w:after="10" w:before="0"/>
               <w:ind w:left="120"/>
             </w:pPr>
-            <w:hyperlink w:history="1" r:id="rIdzgzhnitu0x72cpogkkdid">
+            <w:hyperlink w:history="1" r:id="rIdmbxp_cgp0edme3ybtsvli">
               <w:r>
                 <w:rPr>
                   <w:rFonts w:ascii="Arial" w:cs="Arial" w:eastAsia="Arial" w:hAnsi="Arial"/>
@@ -12249,7 +12249,7 @@
             <w:pPr>
               <w:spacing w:after="20" w:before="0"/>
             </w:pPr>
-            <w:hyperlink w:history="1" r:id="rId8olz4qbhi5dsmdrnmvjyu">
+            <w:hyperlink w:history="1" r:id="rIdbqmokisxwlvzhe39idrsz">
               <w:r>
                 <w:rPr>
                   <w:rFonts w:ascii="Arial" w:cs="Arial" w:eastAsia="Arial" w:hAnsi="Arial"/>
@@ -12282,7 +12282,7 @@
               <w:spacing w:after="10" w:before="0"/>
               <w:ind w:left="120"/>
             </w:pPr>
-            <w:hyperlink w:history="1" r:id="rIdeswapfgletssdrogg4fel">
+            <w:hyperlink w:history="1" r:id="rIdbgcl4fkwnqumj7-o5by0r">
               <w:r>
                 <w:rPr>
                   <w:rFonts w:ascii="Arial" w:cs="Arial" w:eastAsia="Arial" w:hAnsi="Arial"/>
@@ -12327,7 +12327,7 @@
             <w:pPr>
               <w:spacing w:after="20" w:before="0"/>
             </w:pPr>
-            <w:hyperlink w:history="1" r:id="rIdbnp3ve9b4-v4b0e1z5ien">
+            <w:hyperlink w:history="1" r:id="rId2s5miazr9qhwbh4qigthz">
               <w:r>
                 <w:rPr>
                   <w:rFonts w:ascii="Arial" w:cs="Arial" w:eastAsia="Arial" w:hAnsi="Arial"/>
@@ -12360,7 +12360,7 @@
               <w:spacing w:after="10" w:before="0"/>
               <w:ind w:left="120"/>
             </w:pPr>
-            <w:hyperlink w:history="1" r:id="rIddn0pv80fxy52qfzif1mf5">
+            <w:hyperlink w:history="1" r:id="rIdhbuc5lj14eht4jixvaxht">
               <w:r>
                 <w:rPr>
                   <w:rFonts w:ascii="Arial" w:cs="Arial" w:eastAsia="Arial" w:hAnsi="Arial"/>
@@ -12555,7 +12555,7 @@
             <w:pPr>
               <w:spacing w:after="20" w:before="0"/>
             </w:pPr>
-            <w:hyperlink w:history="1" r:id="rIdnfak_vk7dzti2qrujoifr">
+            <w:hyperlink w:history="1" r:id="rIdjro6lchqf20i9qtqhlpfy">
               <w:r>
                 <w:rPr>
                   <w:rFonts w:ascii="Arial" w:cs="Arial" w:eastAsia="Arial" w:hAnsi="Arial"/>
@@ -12588,7 +12588,7 @@
               <w:spacing w:after="10" w:before="0"/>
               <w:ind w:left="120"/>
             </w:pPr>
-            <w:hyperlink w:history="1" r:id="rId2okmqrsrotgu5ylmiid9d">
+            <w:hyperlink w:history="1" r:id="rIdkqynifnv1jqcfvfvoqor0">
               <w:r>
                 <w:rPr>
                   <w:rFonts w:ascii="Arial" w:cs="Arial" w:eastAsia="Arial" w:hAnsi="Arial"/>
@@ -12633,7 +12633,7 @@
             <w:pPr>
               <w:spacing w:after="20" w:before="0"/>
             </w:pPr>
-            <w:hyperlink w:history="1" r:id="rIdrvakusm0pglbgzuyli-oz">
+            <w:hyperlink w:history="1" r:id="rIdv1ggiufcqwq-b7jkjc7ly">
               <w:r>
                 <w:rPr>
                   <w:rFonts w:ascii="Arial" w:cs="Arial" w:eastAsia="Arial" w:hAnsi="Arial"/>
@@ -12666,7 +12666,7 @@
               <w:spacing w:after="10" w:before="0"/>
               <w:ind w:left="120"/>
             </w:pPr>
-            <w:hyperlink w:history="1" r:id="rIdx9y2yi18ceh6bfqxrlvtc">
+            <w:hyperlink w:history="1" r:id="rId_cnkzou7dazjzlxuxzoac">
               <w:r>
                 <w:rPr>
                   <w:rFonts w:ascii="Arial" w:cs="Arial" w:eastAsia="Arial" w:hAnsi="Arial"/>
@@ -13250,7 +13250,7 @@
             <w:pPr>
               <w:spacing w:after="20" w:before="0"/>
             </w:pPr>
-            <w:hyperlink w:history="1" r:id="rIdtyuvkacy-qalc-h_ga5ic">
+            <w:hyperlink w:history="1" r:id="rId7bnscirdfnxgaaxc30fuh">
               <w:r>
                 <w:rPr>
                   <w:rFonts w:ascii="Arial" w:cs="Arial" w:eastAsia="Arial" w:hAnsi="Arial"/>
@@ -13283,7 +13283,7 @@
               <w:spacing w:after="10" w:before="0"/>
               <w:ind w:left="120"/>
             </w:pPr>
-            <w:hyperlink w:history="1" r:id="rId9gjtxjm--rx1_rbo3avci">
+            <w:hyperlink w:history="1" r:id="rId-ydesuk-dxayizpvdnisd">
               <w:r>
                 <w:rPr>
                   <w:rFonts w:ascii="Arial" w:cs="Arial" w:eastAsia="Arial" w:hAnsi="Arial"/>
@@ -13328,7 +13328,7 @@
             <w:pPr>
               <w:spacing w:after="20" w:before="0"/>
             </w:pPr>
-            <w:hyperlink w:history="1" r:id="rIdrg8vtn9-ongouonezael7">
+            <w:hyperlink w:history="1" r:id="rIdh1_xcejp9i46rscnaqgjb">
               <w:r>
                 <w:rPr>
                   <w:rFonts w:ascii="Arial" w:cs="Arial" w:eastAsia="Arial" w:hAnsi="Arial"/>
@@ -13361,7 +13361,7 @@
               <w:spacing w:after="10" w:before="0"/>
               <w:ind w:left="120"/>
             </w:pPr>
-            <w:hyperlink w:history="1" r:id="rIdm_d_8ouzhyjcfjeb_uwx6">
+            <w:hyperlink w:history="1" r:id="rIdijfodg3jsdomcxoxdqpt6">
               <w:r>
                 <w:rPr>
                   <w:rFonts w:ascii="Arial" w:cs="Arial" w:eastAsia="Arial" w:hAnsi="Arial"/>
@@ -13556,7 +13556,7 @@
             <w:pPr>
               <w:spacing w:after="20" w:before="0"/>
             </w:pPr>
-            <w:hyperlink w:history="1" r:id="rIdkvafm2rxz0y_dxm4r8k9z">
+            <w:hyperlink w:history="1" r:id="rIdvoy0w5dvbdnou6yi1wmp3">
               <w:r>
                 <w:rPr>
                   <w:rFonts w:ascii="Arial" w:cs="Arial" w:eastAsia="Arial" w:hAnsi="Arial"/>
@@ -13589,7 +13589,7 @@
               <w:spacing w:after="10" w:before="0"/>
               <w:ind w:left="120"/>
             </w:pPr>
-            <w:hyperlink w:history="1" r:id="rIdm2qanoos9b2vz8yhqfigd">
+            <w:hyperlink w:history="1" r:id="rIdkvp_db9opc6nlg1timisa">
               <w:r>
                 <w:rPr>
                   <w:rFonts w:ascii="Arial" w:cs="Arial" w:eastAsia="Arial" w:hAnsi="Arial"/>
@@ -13634,7 +13634,7 @@
             <w:pPr>
               <w:spacing w:after="20" w:before="0"/>
             </w:pPr>
-            <w:hyperlink w:history="1" r:id="rIdtxj4drefi3pqxn0zuke0i">
+            <w:hyperlink w:history="1" r:id="rId_fsgsn_nurmeifmrwxovi">
               <w:r>
                 <w:rPr>
                   <w:rFonts w:ascii="Arial" w:cs="Arial" w:eastAsia="Arial" w:hAnsi="Arial"/>
@@ -13667,7 +13667,7 @@
               <w:spacing w:after="10" w:before="0"/>
               <w:ind w:left="120"/>
             </w:pPr>
-            <w:hyperlink w:history="1" r:id="rIdww5fklaogtc_wvnyr86wk">
+            <w:hyperlink w:history="1" r:id="rIdwefkid-fbd23kn2ytxr2n">
               <w:r>
                 <w:rPr>
                   <w:rFonts w:ascii="Arial" w:cs="Arial" w:eastAsia="Arial" w:hAnsi="Arial"/>
@@ -15154,7 +15154,7 @@
             <w:pPr>
               <w:spacing w:after="20" w:before="0"/>
             </w:pPr>
-            <w:hyperlink w:history="1" r:id="rIdc6buysvvtmiserimkvmlu">
+            <w:hyperlink w:history="1" r:id="rIdapauk65hhl52anguosuut">
               <w:r>
                 <w:rPr>
                   <w:rFonts w:ascii="Arial" w:cs="Arial" w:eastAsia="Arial" w:hAnsi="Arial"/>
@@ -15187,7 +15187,7 @@
               <w:spacing w:after="10" w:before="0"/>
               <w:ind w:left="120"/>
             </w:pPr>
-            <w:hyperlink w:history="1" r:id="rIdlo4wh0ujea3cqs-4tjwmv">
+            <w:hyperlink w:history="1" r:id="rIdgd0atom5qxqf-lu5sk0sp">
               <w:r>
                 <w:rPr>
                   <w:rFonts w:ascii="Arial" w:cs="Arial" w:eastAsia="Arial" w:hAnsi="Arial"/>
@@ -15232,7 +15232,7 @@
             <w:pPr>
               <w:spacing w:after="20" w:before="0"/>
             </w:pPr>
-            <w:hyperlink w:history="1" r:id="rIdpxmvcp2ay-app8lmgpxl6">
+            <w:hyperlink w:history="1" r:id="rIdm_l5bmtoualqetoakelci">
               <w:r>
                 <w:rPr>
                   <w:rFonts w:ascii="Arial" w:cs="Arial" w:eastAsia="Arial" w:hAnsi="Arial"/>
@@ -15265,7 +15265,7 @@
               <w:spacing w:after="10" w:before="0"/>
               <w:ind w:left="120"/>
             </w:pPr>
-            <w:hyperlink w:history="1" r:id="rIded4itt65kqmru5loufdid">
+            <w:hyperlink w:history="1" r:id="rIdb9svznxmurkljgfkhtce_">
               <w:r>
                 <w:rPr>
                   <w:rFonts w:ascii="Arial" w:cs="Arial" w:eastAsia="Arial" w:hAnsi="Arial"/>
@@ -15460,7 +15460,7 @@
             <w:pPr>
               <w:spacing w:after="20" w:before="0"/>
             </w:pPr>
-            <w:hyperlink w:history="1" r:id="rIdb7sm0pdxwyrhkmslqk82b">
+            <w:hyperlink w:history="1" r:id="rIdnls02tba9zsndptjnd5yw">
               <w:r>
                 <w:rPr>
                   <w:rFonts w:ascii="Arial" w:cs="Arial" w:eastAsia="Arial" w:hAnsi="Arial"/>
@@ -15493,7 +15493,7 @@
               <w:spacing w:after="10" w:before="0"/>
               <w:ind w:left="120"/>
             </w:pPr>
-            <w:hyperlink w:history="1" r:id="rIdnsc5fjnuyq108cgzs0sjj">
+            <w:hyperlink w:history="1" r:id="rIdlrz5zzcwqv31tcve3lskq">
               <w:r>
                 <w:rPr>
                   <w:rFonts w:ascii="Arial" w:cs="Arial" w:eastAsia="Arial" w:hAnsi="Arial"/>
@@ -15538,7 +15538,7 @@
             <w:pPr>
               <w:spacing w:after="20" w:before="0"/>
             </w:pPr>
-            <w:hyperlink w:history="1" r:id="rIdpfvczydopctiukdhrud-d">
+            <w:hyperlink w:history="1" r:id="rIdmjwwd7veuxxqndy9qbvph">
               <w:r>
                 <w:rPr>
                   <w:rFonts w:ascii="Arial" w:cs="Arial" w:eastAsia="Arial" w:hAnsi="Arial"/>
@@ -15571,7 +15571,7 @@
               <w:spacing w:after="10" w:before="0"/>
               <w:ind w:left="120"/>
             </w:pPr>
-            <w:hyperlink w:history="1" r:id="rIdnqmpelxt99q2eon4jgrq8">
+            <w:hyperlink w:history="1" r:id="rIdxp7cb3l-gamgc8l7cuxjd">
               <w:r>
                 <w:rPr>
                   <w:rFonts w:ascii="Arial" w:cs="Arial" w:eastAsia="Arial" w:hAnsi="Arial"/>
@@ -15766,7 +15766,7 @@
             <w:pPr>
               <w:spacing w:after="20" w:before="0"/>
             </w:pPr>
-            <w:hyperlink w:history="1" r:id="rIdnxjgkginmg62-dlefokey">
+            <w:hyperlink w:history="1" r:id="rIdfbacow84p5mlmzl0cyd6j">
               <w:r>
                 <w:rPr>
                   <w:rFonts w:ascii="Arial" w:cs="Arial" w:eastAsia="Arial" w:hAnsi="Arial"/>
@@ -15799,7 +15799,7 @@
               <w:spacing w:after="10" w:before="0"/>
               <w:ind w:left="120"/>
             </w:pPr>
-            <w:hyperlink w:history="1" r:id="rIddp50wzr56dji4di4dreum">
+            <w:hyperlink w:history="1" r:id="rIdomzzsezwcbwsfxdxi3ast">
               <w:r>
                 <w:rPr>
                   <w:rFonts w:ascii="Arial" w:cs="Arial" w:eastAsia="Arial" w:hAnsi="Arial"/>
@@ -15844,7 +15844,7 @@
             <w:pPr>
               <w:spacing w:after="20" w:before="0"/>
             </w:pPr>
-            <w:hyperlink w:history="1" r:id="rIdnkpldqysapc2nocnzqhru">
+            <w:hyperlink w:history="1" r:id="rIddac11-uxilmvmtpwrqgpe">
               <w:r>
                 <w:rPr>
                   <w:rFonts w:ascii="Arial" w:cs="Arial" w:eastAsia="Arial" w:hAnsi="Arial"/>
@@ -15877,7 +15877,7 @@
               <w:spacing w:after="10" w:before="0"/>
               <w:ind w:left="120"/>
             </w:pPr>
-            <w:hyperlink w:history="1" r:id="rIdf3dmrqda3eskvlvag8bqd">
+            <w:hyperlink w:history="1" r:id="rIdoumb919x82t4sdgopwnv2">
               <w:r>
                 <w:rPr>
                   <w:rFonts w:ascii="Arial" w:cs="Arial" w:eastAsia="Arial" w:hAnsi="Arial"/>
@@ -16072,7 +16072,7 @@
             <w:pPr>
               <w:spacing w:after="20" w:before="0"/>
             </w:pPr>
-            <w:hyperlink w:history="1" r:id="rIdfgyyspmzauz8atqtlmphp">
+            <w:hyperlink w:history="1" r:id="rIdvyaynuls0srhx2xnjeyce">
               <w:r>
                 <w:rPr>
                   <w:rFonts w:ascii="Arial" w:cs="Arial" w:eastAsia="Arial" w:hAnsi="Arial"/>
@@ -16105,7 +16105,7 @@
               <w:spacing w:after="10" w:before="0"/>
               <w:ind w:left="120"/>
             </w:pPr>
-            <w:hyperlink w:history="1" r:id="rIdmwmruypz4oydq5oys1p_x">
+            <w:hyperlink w:history="1" r:id="rIdhj5qpwtujkqyjxdxbg-xr">
               <w:r>
                 <w:rPr>
                   <w:rFonts w:ascii="Arial" w:cs="Arial" w:eastAsia="Arial" w:hAnsi="Arial"/>
@@ -16150,7 +16150,7 @@
             <w:pPr>
               <w:spacing w:after="20" w:before="0"/>
             </w:pPr>
-            <w:hyperlink w:history="1" r:id="rIdymw7emrgrap4cqm6v2qcl">
+            <w:hyperlink w:history="1" r:id="rIdc4r_v6vmxcu5wp99jevcr">
               <w:r>
                 <w:rPr>
                   <w:rFonts w:ascii="Arial" w:cs="Arial" w:eastAsia="Arial" w:hAnsi="Arial"/>
@@ -16183,7 +16183,7 @@
               <w:spacing w:after="10" w:before="0"/>
               <w:ind w:left="120"/>
             </w:pPr>
-            <w:hyperlink w:history="1" r:id="rIdc9lkmckdza3kdciud--qk">
+            <w:hyperlink w:history="1" r:id="rIdffazyxaohjowj4kevwx2j">
               <w:r>
                 <w:rPr>
                   <w:rFonts w:ascii="Arial" w:cs="Arial" w:eastAsia="Arial" w:hAnsi="Arial"/>
@@ -16378,7 +16378,7 @@
             <w:pPr>
               <w:spacing w:after="20" w:before="0"/>
             </w:pPr>
-            <w:hyperlink w:history="1" r:id="rIdijgesuztjunqnv7kjt-vo">
+            <w:hyperlink w:history="1" r:id="rIduagq0mrpopuwt-dyi12ja">
               <w:r>
                 <w:rPr>
                   <w:rFonts w:ascii="Arial" w:cs="Arial" w:eastAsia="Arial" w:hAnsi="Arial"/>
@@ -16411,7 +16411,7 @@
               <w:spacing w:after="10" w:before="0"/>
               <w:ind w:left="120"/>
             </w:pPr>
-            <w:hyperlink w:history="1" r:id="rIdbevj1rq1goeuxlsplj1sh">
+            <w:hyperlink w:history="1" r:id="rIdqxteczy6cshzferzooeb5">
               <w:r>
                 <w:rPr>
                   <w:rFonts w:ascii="Arial" w:cs="Arial" w:eastAsia="Arial" w:hAnsi="Arial"/>
@@ -16456,7 +16456,7 @@
             <w:pPr>
               <w:spacing w:after="20" w:before="0"/>
             </w:pPr>
-            <w:hyperlink w:history="1" r:id="rIdtjkt0kqov9sk6pyyazhnv">
+            <w:hyperlink w:history="1" r:id="rIdtegk97qs6okohawfiwqu2">
               <w:r>
                 <w:rPr>
                   <w:rFonts w:ascii="Arial" w:cs="Arial" w:eastAsia="Arial" w:hAnsi="Arial"/>
@@ -16489,7 +16489,7 @@
               <w:spacing w:after="10" w:before="0"/>
               <w:ind w:left="120"/>
             </w:pPr>
-            <w:hyperlink w:history="1" r:id="rIdfh5ug_swxivpfjyyzcpbq">
+            <w:hyperlink w:history="1" r:id="rIdue5-b52gpzusv7prj3mbd">
               <w:r>
                 <w:rPr>
                   <w:rFonts w:ascii="Arial" w:cs="Arial" w:eastAsia="Arial" w:hAnsi="Arial"/>
@@ -17976,7 +17976,7 @@
             <w:pPr>
               <w:spacing w:after="20" w:before="0"/>
             </w:pPr>
-            <w:hyperlink w:history="1" r:id="rIdquhxns6irjw1fuumpplre">
+            <w:hyperlink w:history="1" r:id="rIdm0nes7ns7-6wnm6qlsvps">
               <w:r>
                 <w:rPr>
                   <w:rFonts w:ascii="Arial" w:cs="Arial" w:eastAsia="Arial" w:hAnsi="Arial"/>
@@ -18009,7 +18009,7 @@
               <w:spacing w:after="10" w:before="0"/>
               <w:ind w:left="120"/>
             </w:pPr>
-            <w:hyperlink w:history="1" r:id="rId13bmv2tdz92azexffzmdf">
+            <w:hyperlink w:history="1" r:id="rIddasnqgq-yfpzxlh-oupkb">
               <w:r>
                 <w:rPr>
                   <w:rFonts w:ascii="Arial" w:cs="Arial" w:eastAsia="Arial" w:hAnsi="Arial"/>
@@ -18054,7 +18054,7 @@
             <w:pPr>
               <w:spacing w:after="20" w:before="0"/>
             </w:pPr>
-            <w:hyperlink w:history="1" r:id="rIdcpv2otjci0ew38y_uhyvn">
+            <w:hyperlink w:history="1" r:id="rIdbidod7dddde36aaejdavv">
               <w:r>
                 <w:rPr>
                   <w:rFonts w:ascii="Arial" w:cs="Arial" w:eastAsia="Arial" w:hAnsi="Arial"/>
@@ -18087,7 +18087,7 @@
               <w:spacing w:after="10" w:before="0"/>
               <w:ind w:left="120"/>
             </w:pPr>
-            <w:hyperlink w:history="1" r:id="rIdymquv945w5xj2uhi_slyc">
+            <w:hyperlink w:history="1" r:id="rIdq-jnmv_wnfiredy63jl8d">
               <w:r>
                 <w:rPr>
                   <w:rFonts w:ascii="Arial" w:cs="Arial" w:eastAsia="Arial" w:hAnsi="Arial"/>
@@ -18282,7 +18282,7 @@
             <w:pPr>
               <w:spacing w:after="20" w:before="0"/>
             </w:pPr>
-            <w:hyperlink w:history="1" r:id="rIdh-kuqz8fgf3llbhjvhakb">
+            <w:hyperlink w:history="1" r:id="rId7kzrefcf_nuabo81fgwwg">
               <w:r>
                 <w:rPr>
                   <w:rFonts w:ascii="Arial" w:cs="Arial" w:eastAsia="Arial" w:hAnsi="Arial"/>
@@ -18315,7 +18315,7 @@
               <w:spacing w:after="10" w:before="0"/>
               <w:ind w:left="120"/>
             </w:pPr>
-            <w:hyperlink w:history="1" r:id="rId4dgyurn_rabjnxapsvvf1">
+            <w:hyperlink w:history="1" r:id="rIdxtjn6j1ue1kkqpnhjeq4h">
               <w:r>
                 <w:rPr>
                   <w:rFonts w:ascii="Arial" w:cs="Arial" w:eastAsia="Arial" w:hAnsi="Arial"/>
@@ -18360,7 +18360,7 @@
             <w:pPr>
               <w:spacing w:after="20" w:before="0"/>
             </w:pPr>
-            <w:hyperlink w:history="1" r:id="rIdyqjxrnvkqckuznyykccik">
+            <w:hyperlink w:history="1" r:id="rIdoyw4symtx7filobi3kepk">
               <w:r>
                 <w:rPr>
                   <w:rFonts w:ascii="Arial" w:cs="Arial" w:eastAsia="Arial" w:hAnsi="Arial"/>
@@ -18393,7 +18393,7 @@
               <w:spacing w:after="10" w:before="0"/>
               <w:ind w:left="120"/>
             </w:pPr>
-            <w:hyperlink w:history="1" r:id="rIdwo3a75xx36vyhpnttyk3z">
+            <w:hyperlink w:history="1" r:id="rIdmxklyyxlczgt5htbmf7ze">
               <w:r>
                 <w:rPr>
                   <w:rFonts w:ascii="Arial" w:cs="Arial" w:eastAsia="Arial" w:hAnsi="Arial"/>
@@ -18588,7 +18588,7 @@
             <w:pPr>
               <w:spacing w:after="20" w:before="0"/>
             </w:pPr>
-            <w:hyperlink w:history="1" r:id="rIdwrftewf6quo4q8hmuc_jh">
+            <w:hyperlink w:history="1" r:id="rIdp7bhhmkqcwtobd32ju43o">
               <w:r>
                 <w:rPr>
                   <w:rFonts w:ascii="Arial" w:cs="Arial" w:eastAsia="Arial" w:hAnsi="Arial"/>
@@ -18621,7 +18621,7 @@
               <w:spacing w:after="10" w:before="0"/>
               <w:ind w:left="120"/>
             </w:pPr>
-            <w:hyperlink w:history="1" r:id="rIdxcqj_cxieqbric5cawg23">
+            <w:hyperlink w:history="1" r:id="rIdmn0mrkhq8yb8i1ao0dshm">
               <w:r>
                 <w:rPr>
                   <w:rFonts w:ascii="Arial" w:cs="Arial" w:eastAsia="Arial" w:hAnsi="Arial"/>
@@ -18666,7 +18666,7 @@
             <w:pPr>
               <w:spacing w:after="20" w:before="0"/>
             </w:pPr>
-            <w:hyperlink w:history="1" r:id="rIdva2zhjdv3xm2k03edh7b9">
+            <w:hyperlink w:history="1" r:id="rIdptlnm-ca6lt8pmyy4zbc_">
               <w:r>
                 <w:rPr>
                   <w:rFonts w:ascii="Arial" w:cs="Arial" w:eastAsia="Arial" w:hAnsi="Arial"/>
@@ -18699,7 +18699,7 @@
               <w:spacing w:after="10" w:before="0"/>
               <w:ind w:left="120"/>
             </w:pPr>
-            <w:hyperlink w:history="1" r:id="rIdtpttsb8bqek74nqt6oki5">
+            <w:hyperlink w:history="1" r:id="rIde9i1i0km-3iidi_hiww2v">
               <w:r>
                 <w:rPr>
                   <w:rFonts w:ascii="Arial" w:cs="Arial" w:eastAsia="Arial" w:hAnsi="Arial"/>
@@ -18894,7 +18894,7 @@
             <w:pPr>
               <w:spacing w:after="20" w:before="0"/>
             </w:pPr>
-            <w:hyperlink w:history="1" r:id="rIdecan4xetgypisrcmmbdvd">
+            <w:hyperlink w:history="1" r:id="rIdpetswuprruchqb9fouxou">
               <w:r>
                 <w:rPr>
                   <w:rFonts w:ascii="Arial" w:cs="Arial" w:eastAsia="Arial" w:hAnsi="Arial"/>
@@ -18927,7 +18927,7 @@
               <w:spacing w:after="10" w:before="0"/>
               <w:ind w:left="120"/>
             </w:pPr>
-            <w:hyperlink w:history="1" r:id="rIdoj4zgwc59rql4zf9ynwu2">
+            <w:hyperlink w:history="1" r:id="rIdpvi5xcdf-vcoib-aqupqo">
               <w:r>
                 <w:rPr>
                   <w:rFonts w:ascii="Arial" w:cs="Arial" w:eastAsia="Arial" w:hAnsi="Arial"/>
@@ -18972,7 +18972,7 @@
             <w:pPr>
               <w:spacing w:after="20" w:before="0"/>
             </w:pPr>
-            <w:hyperlink w:history="1" r:id="rIdkf3xrsg7ziso9ooljl-pk">
+            <w:hyperlink w:history="1" r:id="rId0s3zeyprd-rcodfg7lnjr">
               <w:r>
                 <w:rPr>
                   <w:rFonts w:ascii="Arial" w:cs="Arial" w:eastAsia="Arial" w:hAnsi="Arial"/>
@@ -19005,7 +19005,7 @@
               <w:spacing w:after="10" w:before="0"/>
               <w:ind w:left="120"/>
             </w:pPr>
-            <w:hyperlink w:history="1" r:id="rIdtveihlokec0u95bkbw5nd">
+            <w:hyperlink w:history="1" r:id="rIdyycstoerc1sxleqxcfvay">
               <w:r>
                 <w:rPr>
                   <w:rFonts w:ascii="Arial" w:cs="Arial" w:eastAsia="Arial" w:hAnsi="Arial"/>
@@ -19200,7 +19200,7 @@
             <w:pPr>
               <w:spacing w:after="20" w:before="0"/>
             </w:pPr>
-            <w:hyperlink w:history="1" r:id="rIdnpu2zssd-byagcck9cino">
+            <w:hyperlink w:history="1" r:id="rIdhojfa_bksf8g8fixtirkt">
               <w:r>
                 <w:rPr>
                   <w:rFonts w:ascii="Arial" w:cs="Arial" w:eastAsia="Arial" w:hAnsi="Arial"/>
@@ -19233,7 +19233,7 @@
               <w:spacing w:after="10" w:before="0"/>
               <w:ind w:left="120"/>
             </w:pPr>
-            <w:hyperlink w:history="1" r:id="rIdeoa8he5dmum-q3zrfycl4">
+            <w:hyperlink w:history="1" r:id="rIdkbnfgzgqpmagou2uggw0u">
               <w:r>
                 <w:rPr>
                   <w:rFonts w:ascii="Arial" w:cs="Arial" w:eastAsia="Arial" w:hAnsi="Arial"/>
@@ -19278,7 +19278,7 @@
             <w:pPr>
               <w:spacing w:after="20" w:before="0"/>
             </w:pPr>
-            <w:hyperlink w:history="1" r:id="rIdxmnnkjmosdmnyn_io6vs3">
+            <w:hyperlink w:history="1" r:id="rIdfcm8pkahonfnmkd4umqwq">
               <w:r>
                 <w:rPr>
                   <w:rFonts w:ascii="Arial" w:cs="Arial" w:eastAsia="Arial" w:hAnsi="Arial"/>
@@ -19311,7 +19311,7 @@
               <w:spacing w:after="10" w:before="0"/>
               <w:ind w:left="120"/>
             </w:pPr>
-            <w:hyperlink w:history="1" r:id="rId6bapsxjkqiprimx_qusaq">
+            <w:hyperlink w:history="1" r:id="rIdlqpsrii5mmiplli4dwivb">
               <w:r>
                 <w:rPr>
                   <w:rFonts w:ascii="Arial" w:cs="Arial" w:eastAsia="Arial" w:hAnsi="Arial"/>
@@ -20893,7 +20893,7 @@
             <w:pPr>
               <w:spacing w:after="20" w:before="0"/>
             </w:pPr>
-            <w:hyperlink w:history="1" r:id="rIde51lklyiqy0ifmlj2cwpi">
+            <w:hyperlink w:history="1" r:id="rIdjhsxkci7fsugzxayozl7z">
               <w:r>
                 <w:rPr>
                   <w:rFonts w:ascii="Arial" w:cs="Arial" w:eastAsia="Arial" w:hAnsi="Arial"/>
@@ -20926,7 +20926,7 @@
               <w:spacing w:after="10" w:before="0"/>
               <w:ind w:left="120"/>
             </w:pPr>
-            <w:hyperlink w:history="1" r:id="rIdtbe9cchkp2mddjbqaws3z">
+            <w:hyperlink w:history="1" r:id="rId2loh9foelykrl211bkrpm">
               <w:r>
                 <w:rPr>
                   <w:rFonts w:ascii="Arial" w:cs="Arial" w:eastAsia="Arial" w:hAnsi="Arial"/>
@@ -20971,7 +20971,7 @@
             <w:pPr>
               <w:spacing w:after="20" w:before="0"/>
             </w:pPr>
-            <w:hyperlink w:history="1" r:id="rIdfxxjjlvqtxzjmrancck_m">
+            <w:hyperlink w:history="1" r:id="rId3l-ml-jve42pedukv-gkj">
               <w:r>
                 <w:rPr>
                   <w:rFonts w:ascii="Arial" w:cs="Arial" w:eastAsia="Arial" w:hAnsi="Arial"/>
@@ -21004,7 +21004,7 @@
               <w:spacing w:after="10" w:before="0"/>
               <w:ind w:left="120"/>
             </w:pPr>
-            <w:hyperlink w:history="1" r:id="rIdjf2f2ly3vh6fgf-cmrwif">
+            <w:hyperlink w:history="1" r:id="rIdggdfyickgljo5g4j1fa-v">
               <w:r>
                 <w:rPr>
                   <w:rFonts w:ascii="Arial" w:cs="Arial" w:eastAsia="Arial" w:hAnsi="Arial"/>
@@ -21199,7 +21199,7 @@
             <w:pPr>
               <w:spacing w:after="20" w:before="0"/>
             </w:pPr>
-            <w:hyperlink w:history="1" r:id="rIdxaqc6l0nyg9pvtplqs4wj">
+            <w:hyperlink w:history="1" r:id="rIdgbe-vwl1rpdbpnkdy_iip">
               <w:r>
                 <w:rPr>
                   <w:rFonts w:ascii="Arial" w:cs="Arial" w:eastAsia="Arial" w:hAnsi="Arial"/>
@@ -21232,7 +21232,7 @@
               <w:spacing w:after="10" w:before="0"/>
               <w:ind w:left="120"/>
             </w:pPr>
-            <w:hyperlink w:history="1" r:id="rIdjtfgzr9_tdoqcxkxjnms7">
+            <w:hyperlink w:history="1" r:id="rIdnlxiypvf5vr2lf7ao0sl3">
               <w:r>
                 <w:rPr>
                   <w:rFonts w:ascii="Arial" w:cs="Arial" w:eastAsia="Arial" w:hAnsi="Arial"/>
@@ -21277,7 +21277,7 @@
             <w:pPr>
               <w:spacing w:after="20" w:before="0"/>
             </w:pPr>
-            <w:hyperlink w:history="1" r:id="rIdwrnn2qhp4e5e1uyybmryr">
+            <w:hyperlink w:history="1" r:id="rId5wqf1jg5na-frybjjfxgd">
               <w:r>
                 <w:rPr>
                   <w:rFonts w:ascii="Arial" w:cs="Arial" w:eastAsia="Arial" w:hAnsi="Arial"/>
@@ -21310,7 +21310,7 @@
               <w:spacing w:after="10" w:before="0"/>
               <w:ind w:left="120"/>
             </w:pPr>
-            <w:hyperlink w:history="1" r:id="rIdkqqmbvbmu8n6-ympxfnns">
+            <w:hyperlink w:history="1" r:id="rId46sraphgcqzxthkuywn9x">
               <w:r>
                 <w:rPr>
                   <w:rFonts w:ascii="Arial" w:cs="Arial" w:eastAsia="Arial" w:hAnsi="Arial"/>
@@ -21505,7 +21505,7 @@
             <w:pPr>
               <w:spacing w:after="20" w:before="0"/>
             </w:pPr>
-            <w:hyperlink w:history="1" r:id="rIdnlapw9xfdiuzbcgdzurpz">
+            <w:hyperlink w:history="1" r:id="rIdiwm0fzkgk6fhnt3zcbxxq">
               <w:r>
                 <w:rPr>
                   <w:rFonts w:ascii="Arial" w:cs="Arial" w:eastAsia="Arial" w:hAnsi="Arial"/>
@@ -21538,7 +21538,7 @@
               <w:spacing w:after="10" w:before="0"/>
               <w:ind w:left="120"/>
             </w:pPr>
-            <w:hyperlink w:history="1" r:id="rId3vhzilnz4fhqmksjgrzx3">
+            <w:hyperlink w:history="1" r:id="rIdjyuqxbixstetrq9pvfsd2">
               <w:r>
                 <w:rPr>
                   <w:rFonts w:ascii="Arial" w:cs="Arial" w:eastAsia="Arial" w:hAnsi="Arial"/>
@@ -21583,7 +21583,7 @@
             <w:pPr>
               <w:spacing w:after="20" w:before="0"/>
             </w:pPr>
-            <w:hyperlink w:history="1" r:id="rIdrplzsamilqqftukbdxabz">
+            <w:hyperlink w:history="1" r:id="rId3ivxep7v7owabdhxolgl5">
               <w:r>
                 <w:rPr>
                   <w:rFonts w:ascii="Arial" w:cs="Arial" w:eastAsia="Arial" w:hAnsi="Arial"/>
@@ -21616,7 +21616,7 @@
               <w:spacing w:after="10" w:before="0"/>
               <w:ind w:left="120"/>
             </w:pPr>
-            <w:hyperlink w:history="1" r:id="rIdna3g-0xywf-re9p6v4edq">
+            <w:hyperlink w:history="1" r:id="rIdsxysq5-qotxz1k14z2qxp">
               <w:r>
                 <w:rPr>
                   <w:rFonts w:ascii="Arial" w:cs="Arial" w:eastAsia="Arial" w:hAnsi="Arial"/>
@@ -21811,7 +21811,7 @@
             <w:pPr>
               <w:spacing w:after="20" w:before="0"/>
             </w:pPr>
-            <w:hyperlink w:history="1" r:id="rIdg2vqigrskhbyimpoddej5">
+            <w:hyperlink w:history="1" r:id="rId8p_7wjklwgal0ab7v697x">
               <w:r>
                 <w:rPr>
                   <w:rFonts w:ascii="Arial" w:cs="Arial" w:eastAsia="Arial" w:hAnsi="Arial"/>
@@ -21844,7 +21844,7 @@
               <w:spacing w:after="10" w:before="0"/>
               <w:ind w:left="120"/>
             </w:pPr>
-            <w:hyperlink w:history="1" r:id="rIdzvqnsqwqqkaiee01iomiy">
+            <w:hyperlink w:history="1" r:id="rIdr2845zc6c2j-bxrrmqy30">
               <w:r>
                 <w:rPr>
                   <w:rFonts w:ascii="Arial" w:cs="Arial" w:eastAsia="Arial" w:hAnsi="Arial"/>
@@ -21889,7 +21889,7 @@
             <w:pPr>
               <w:spacing w:after="20" w:before="0"/>
             </w:pPr>
-            <w:hyperlink w:history="1" r:id="rId_jnjckeylvcqs2ugkqvhh">
+            <w:hyperlink w:history="1" r:id="rIdjxwywo-fmxywonhfb3ufo">
               <w:r>
                 <w:rPr>
                   <w:rFonts w:ascii="Arial" w:cs="Arial" w:eastAsia="Arial" w:hAnsi="Arial"/>
@@ -21922,7 +21922,7 @@
               <w:spacing w:after="10" w:before="0"/>
               <w:ind w:left="120"/>
             </w:pPr>
-            <w:hyperlink w:history="1" r:id="rIduuqua2xrsirqgkoqvx2lc">
+            <w:hyperlink w:history="1" r:id="rIdno3dgva7ok0b0k9yhthsm">
               <w:r>
                 <w:rPr>
                   <w:rFonts w:ascii="Arial" w:cs="Arial" w:eastAsia="Arial" w:hAnsi="Arial"/>
@@ -22117,7 +22117,7 @@
             <w:pPr>
               <w:spacing w:after="20" w:before="0"/>
             </w:pPr>
-            <w:hyperlink w:history="1" r:id="rId7pnway06sphzo08vz6ekr">
+            <w:hyperlink w:history="1" r:id="rIdnyiqwjgumgo_788fkwqsy">
               <w:r>
                 <w:rPr>
                   <w:rFonts w:ascii="Arial" w:cs="Arial" w:eastAsia="Arial" w:hAnsi="Arial"/>
@@ -22150,7 +22150,7 @@
               <w:spacing w:after="10" w:before="0"/>
               <w:ind w:left="120"/>
             </w:pPr>
-            <w:hyperlink w:history="1" r:id="rId7nc1jejdt3s1o3nc9-6yx">
+            <w:hyperlink w:history="1" r:id="rIdcdcuwiovztlso9saiktjs">
               <w:r>
                 <w:rPr>
                   <w:rFonts w:ascii="Arial" w:cs="Arial" w:eastAsia="Arial" w:hAnsi="Arial"/>
@@ -22195,7 +22195,7 @@
             <w:pPr>
               <w:spacing w:after="20" w:before="0"/>
             </w:pPr>
-            <w:hyperlink w:history="1" r:id="rIdo899hz2rdn5ry2a8htzuh">
+            <w:hyperlink w:history="1" r:id="rIdpymm0c5qhporf3f0i-tao">
               <w:r>
                 <w:rPr>
                   <w:rFonts w:ascii="Arial" w:cs="Arial" w:eastAsia="Arial" w:hAnsi="Arial"/>
@@ -22228,7 +22228,7 @@
               <w:spacing w:after="10" w:before="0"/>
               <w:ind w:left="120"/>
             </w:pPr>
-            <w:hyperlink w:history="1" r:id="rIdpr-0kpfqj2g0nruowulfe">
+            <w:hyperlink w:history="1" r:id="rIdwfp3wed0izfzzpzdgruhj">
               <w:r>
                 <w:rPr>
                   <w:rFonts w:ascii="Arial" w:cs="Arial" w:eastAsia="Arial" w:hAnsi="Arial"/>
@@ -23829,7 +23829,7 @@
             <w:pPr>
               <w:spacing w:after="20" w:before="0"/>
             </w:pPr>
-            <w:hyperlink w:history="1" r:id="rId-7ovio3zl-jrkj5eaenpb">
+            <w:hyperlink w:history="1" r:id="rIdrdcvuegy2z9_3i8q41w1e">
               <w:r>
                 <w:rPr>
                   <w:rFonts w:ascii="Arial" w:cs="Arial" w:eastAsia="Arial" w:hAnsi="Arial"/>
@@ -23862,7 +23862,7 @@
               <w:spacing w:after="10" w:before="0"/>
               <w:ind w:left="120"/>
             </w:pPr>
-            <w:hyperlink w:history="1" r:id="rIdsrh606beoreftu_v35obg">
+            <w:hyperlink w:history="1" r:id="rId4bu_q95sqbrwnuiktqjcl">
               <w:r>
                 <w:rPr>
                   <w:rFonts w:ascii="Arial" w:cs="Arial" w:eastAsia="Arial" w:hAnsi="Arial"/>
@@ -23907,7 +23907,7 @@
             <w:pPr>
               <w:spacing w:after="20" w:before="0"/>
             </w:pPr>
-            <w:hyperlink w:history="1" r:id="rIdfe51emb5-yk1u0v-lkn0j">
+            <w:hyperlink w:history="1" r:id="rIdbywfqztdyohovh-r1xmis">
               <w:r>
                 <w:rPr>
                   <w:rFonts w:ascii="Arial" w:cs="Arial" w:eastAsia="Arial" w:hAnsi="Arial"/>
@@ -23940,7 +23940,7 @@
               <w:spacing w:after="10" w:before="0"/>
               <w:ind w:left="120"/>
             </w:pPr>
-            <w:hyperlink w:history="1" r:id="rIdepyzfvm1xktqc9kip99nt">
+            <w:hyperlink w:history="1" r:id="rIdym6cmwkmtzpo_aeh7eyga">
               <w:r>
                 <w:rPr>
                   <w:rFonts w:ascii="Arial" w:cs="Arial" w:eastAsia="Arial" w:hAnsi="Arial"/>
@@ -24135,7 +24135,7 @@
             <w:pPr>
               <w:spacing w:after="20" w:before="0"/>
             </w:pPr>
-            <w:hyperlink w:history="1" r:id="rIdnvfzrjfyxoaskbnka9zzo">
+            <w:hyperlink w:history="1" r:id="rId9h-fnp1sfurbbgdsvv2c5">
               <w:r>
                 <w:rPr>
                   <w:rFonts w:ascii="Arial" w:cs="Arial" w:eastAsia="Arial" w:hAnsi="Arial"/>
@@ -24168,7 +24168,7 @@
               <w:spacing w:after="10" w:before="0"/>
               <w:ind w:left="120"/>
             </w:pPr>
-            <w:hyperlink w:history="1" r:id="rIdzvcvgprv3wbcoyfcuby_v">
+            <w:hyperlink w:history="1" r:id="rIdr6l4vhrfkj85i07d8j2h7">
               <w:r>
                 <w:rPr>
                   <w:rFonts w:ascii="Arial" w:cs="Arial" w:eastAsia="Arial" w:hAnsi="Arial"/>
@@ -24213,7 +24213,7 @@
             <w:pPr>
               <w:spacing w:after="20" w:before="0"/>
             </w:pPr>
-            <w:hyperlink w:history="1" r:id="rIdpxdtdaxel8g_a90o8ub7a">
+            <w:hyperlink w:history="1" r:id="rIdhe2_xg4kqfvxcmu94node">
               <w:r>
                 <w:rPr>
                   <w:rFonts w:ascii="Arial" w:cs="Arial" w:eastAsia="Arial" w:hAnsi="Arial"/>
@@ -24246,7 +24246,7 @@
               <w:spacing w:after="10" w:before="0"/>
               <w:ind w:left="120"/>
             </w:pPr>
-            <w:hyperlink w:history="1" r:id="rIdsfi7adhvceca-6psvucyp">
+            <w:hyperlink w:history="1" r:id="rIdr4uk2kyirj52dk9d1ynfx">
               <w:r>
                 <w:rPr>
                   <w:rFonts w:ascii="Arial" w:cs="Arial" w:eastAsia="Arial" w:hAnsi="Arial"/>
@@ -24441,7 +24441,7 @@
             <w:pPr>
               <w:spacing w:after="20" w:before="0"/>
             </w:pPr>
-            <w:hyperlink w:history="1" r:id="rIdeelylzvgqnlhardqhiriv">
+            <w:hyperlink w:history="1" r:id="rIdsixkgsantwogrxi7mzahm">
               <w:r>
                 <w:rPr>
                   <w:rFonts w:ascii="Arial" w:cs="Arial" w:eastAsia="Arial" w:hAnsi="Arial"/>
@@ -24474,7 +24474,7 @@
               <w:spacing w:after="10" w:before="0"/>
               <w:ind w:left="120"/>
             </w:pPr>
-            <w:hyperlink w:history="1" r:id="rId9zcozpj7a4sbazjsveh8t">
+            <w:hyperlink w:history="1" r:id="rIdg_rr1-5tozqahjeb6kzmo">
               <w:r>
                 <w:rPr>
                   <w:rFonts w:ascii="Arial" w:cs="Arial" w:eastAsia="Arial" w:hAnsi="Arial"/>
@@ -24519,7 +24519,7 @@
             <w:pPr>
               <w:spacing w:after="20" w:before="0"/>
             </w:pPr>
-            <w:hyperlink w:history="1" r:id="rId7rmnasnl7eldvilny7u9c">
+            <w:hyperlink w:history="1" r:id="rId6xmnthzzhj9xv74rodhyi">
               <w:r>
                 <w:rPr>
                   <w:rFonts w:ascii="Arial" w:cs="Arial" w:eastAsia="Arial" w:hAnsi="Arial"/>
@@ -24552,7 +24552,7 @@
               <w:spacing w:after="10" w:before="0"/>
               <w:ind w:left="120"/>
             </w:pPr>
-            <w:hyperlink w:history="1" r:id="rIdwupb-spnwz7om-hhjwfsx">
+            <w:hyperlink w:history="1" r:id="rIdty4ktvx3qmxpsjt5bit1s">
               <w:r>
                 <w:rPr>
                   <w:rFonts w:ascii="Arial" w:cs="Arial" w:eastAsia="Arial" w:hAnsi="Arial"/>
@@ -24747,7 +24747,7 @@
             <w:pPr>
               <w:spacing w:after="20" w:before="0"/>
             </w:pPr>
-            <w:hyperlink w:history="1" r:id="rId7f-dc-zn0iyzcyk6cr6p5">
+            <w:hyperlink w:history="1" r:id="rIdz2ydewzo7j0nv91wjnbsx">
               <w:r>
                 <w:rPr>
                   <w:rFonts w:ascii="Arial" w:cs="Arial" w:eastAsia="Arial" w:hAnsi="Arial"/>
@@ -24780,7 +24780,7 @@
               <w:spacing w:after="10" w:before="0"/>
               <w:ind w:left="120"/>
             </w:pPr>
-            <w:hyperlink w:history="1" r:id="rId7zwd03tozason7vzkqtrx">
+            <w:hyperlink w:history="1" r:id="rIdtq7julhrjv-5mhbehrt4o">
               <w:r>
                 <w:rPr>
                   <w:rFonts w:ascii="Arial" w:cs="Arial" w:eastAsia="Arial" w:hAnsi="Arial"/>
@@ -24825,7 +24825,7 @@
             <w:pPr>
               <w:spacing w:after="20" w:before="0"/>
             </w:pPr>
-            <w:hyperlink w:history="1" r:id="rIdquqcf1vu4pkrgkvfw0uzd">
+            <w:hyperlink w:history="1" r:id="rId_zovlclylm1uttbfy4z7u">
               <w:r>
                 <w:rPr>
                   <w:rFonts w:ascii="Arial" w:cs="Arial" w:eastAsia="Arial" w:hAnsi="Arial"/>
@@ -24858,7 +24858,7 @@
               <w:spacing w:after="10" w:before="0"/>
               <w:ind w:left="120"/>
             </w:pPr>
-            <w:hyperlink w:history="1" r:id="rIdmoxl4erbecmzie5q7dl3g">
+            <w:hyperlink w:history="1" r:id="rIdu4bfaib9fndk6d3_feggz">
               <w:r>
                 <w:rPr>
                   <w:rFonts w:ascii="Arial" w:cs="Arial" w:eastAsia="Arial" w:hAnsi="Arial"/>
@@ -25053,7 +25053,7 @@
             <w:pPr>
               <w:spacing w:after="20" w:before="0"/>
             </w:pPr>
-            <w:hyperlink w:history="1" r:id="rIdwlgk0atavi49isnp2n3gu">
+            <w:hyperlink w:history="1" r:id="rIdfelcjt_8dfl7ei1u5iexc">
               <w:r>
                 <w:rPr>
                   <w:rFonts w:ascii="Arial" w:cs="Arial" w:eastAsia="Arial" w:hAnsi="Arial"/>
@@ -25086,7 +25086,7 @@
               <w:spacing w:after="10" w:before="0"/>
               <w:ind w:left="120"/>
             </w:pPr>
-            <w:hyperlink w:history="1" r:id="rId5bzez66t6sepwcf44bxlb">
+            <w:hyperlink w:history="1" r:id="rIdv4gqglhwyzkns2mvfmdp2">
               <w:r>
                 <w:rPr>
                   <w:rFonts w:ascii="Arial" w:cs="Arial" w:eastAsia="Arial" w:hAnsi="Arial"/>
@@ -25131,7 +25131,7 @@
             <w:pPr>
               <w:spacing w:after="20" w:before="0"/>
             </w:pPr>
-            <w:hyperlink w:history="1" r:id="rIdqtlzjsdibagdjybby7wtt">
+            <w:hyperlink w:history="1" r:id="rIdtqy21qsuyt7l25lxxzcnk">
               <w:r>
                 <w:rPr>
                   <w:rFonts w:ascii="Arial" w:cs="Arial" w:eastAsia="Arial" w:hAnsi="Arial"/>
@@ -25164,7 +25164,7 @@
               <w:spacing w:after="10" w:before="0"/>
               <w:ind w:left="120"/>
             </w:pPr>
-            <w:hyperlink w:history="1" r:id="rIdb-8jxe1zaoh1rsbdmkixk">
+            <w:hyperlink w:history="1" r:id="rId7qigouljqdttf_jfsabxa">
               <w:r>
                 <w:rPr>
                   <w:rFonts w:ascii="Arial" w:cs="Arial" w:eastAsia="Arial" w:hAnsi="Arial"/>
@@ -26746,7 +26746,7 @@
             <w:pPr>
               <w:spacing w:after="20" w:before="0"/>
             </w:pPr>
-            <w:hyperlink w:history="1" r:id="rIdcdlhxyhkrjujp148lzkb9">
+            <w:hyperlink w:history="1" r:id="rIdtygvrrczwhzfikiytptw_">
               <w:r>
                 <w:rPr>
                   <w:rFonts w:ascii="Arial" w:cs="Arial" w:eastAsia="Arial" w:hAnsi="Arial"/>
@@ -26779,7 +26779,7 @@
               <w:spacing w:after="10" w:before="0"/>
               <w:ind w:left="120"/>
             </w:pPr>
-            <w:hyperlink w:history="1" r:id="rIdevdqab5olcvlqwqapo4zf">
+            <w:hyperlink w:history="1" r:id="rIdfpxzrgn1tdfntzhn-8agj">
               <w:r>
                 <w:rPr>
                   <w:rFonts w:ascii="Arial" w:cs="Arial" w:eastAsia="Arial" w:hAnsi="Arial"/>
@@ -26824,7 +26824,7 @@
             <w:pPr>
               <w:spacing w:after="20" w:before="0"/>
             </w:pPr>
-            <w:hyperlink w:history="1" r:id="rId1agsfdlgptinyvwlgg24j">
+            <w:hyperlink w:history="1" r:id="rIddtv_afko-rf0ydtywtapv">
               <w:r>
                 <w:rPr>
                   <w:rFonts w:ascii="Arial" w:cs="Arial" w:eastAsia="Arial" w:hAnsi="Arial"/>
@@ -26857,7 +26857,7 @@
               <w:spacing w:after="10" w:before="0"/>
               <w:ind w:left="120"/>
             </w:pPr>
-            <w:hyperlink w:history="1" r:id="rIdcdtrd4abodw39ekayb9d6">
+            <w:hyperlink w:history="1" r:id="rIdcr6swtmhfgrwfav68q-wb">
               <w:r>
                 <w:rPr>
                   <w:rFonts w:ascii="Arial" w:cs="Arial" w:eastAsia="Arial" w:hAnsi="Arial"/>
@@ -27052,7 +27052,7 @@
             <w:pPr>
               <w:spacing w:after="20" w:before="0"/>
             </w:pPr>
-            <w:hyperlink w:history="1" r:id="rIdd70gsvutcbyhgogothfew">
+            <w:hyperlink w:history="1" r:id="rIdj8cnvlithwy2bsbyvcbdx">
               <w:r>
                 <w:rPr>
                   <w:rFonts w:ascii="Arial" w:cs="Arial" w:eastAsia="Arial" w:hAnsi="Arial"/>
@@ -27085,7 +27085,7 @@
               <w:spacing w:after="10" w:before="0"/>
               <w:ind w:left="120"/>
             </w:pPr>
-            <w:hyperlink w:history="1" r:id="rId3-mqaxlk0kaougyzzhgsd">
+            <w:hyperlink w:history="1" r:id="rIdlbcfdystyk3kj_pnqaqct">
               <w:r>
                 <w:rPr>
                   <w:rFonts w:ascii="Arial" w:cs="Arial" w:eastAsia="Arial" w:hAnsi="Arial"/>
@@ -27130,7 +27130,7 @@
             <w:pPr>
               <w:spacing w:after="20" w:before="0"/>
             </w:pPr>
-            <w:hyperlink w:history="1" r:id="rIdmu6b68yy4hy6k867i8bzc">
+            <w:hyperlink w:history="1" r:id="rIdieumuzeqy6jlc-03fbmbj">
               <w:r>
                 <w:rPr>
                   <w:rFonts w:ascii="Arial" w:cs="Arial" w:eastAsia="Arial" w:hAnsi="Arial"/>
@@ -27163,7 +27163,7 @@
               <w:spacing w:after="10" w:before="0"/>
               <w:ind w:left="120"/>
             </w:pPr>
-            <w:hyperlink w:history="1" r:id="rIdraottvjumk8rgri9lr24p">
+            <w:hyperlink w:history="1" r:id="rId5ysqopbe9ne1ug5xy07js">
               <w:r>
                 <w:rPr>
                   <w:rFonts w:ascii="Arial" w:cs="Arial" w:eastAsia="Arial" w:hAnsi="Arial"/>
@@ -27358,7 +27358,7 @@
             <w:pPr>
               <w:spacing w:after="20" w:before="0"/>
             </w:pPr>
-            <w:hyperlink w:history="1" r:id="rIdbij8pp1bxydraieylwbuv">
+            <w:hyperlink w:history="1" r:id="rIdk4oolm48m4brtovpqoiuu">
               <w:r>
                 <w:rPr>
                   <w:rFonts w:ascii="Arial" w:cs="Arial" w:eastAsia="Arial" w:hAnsi="Arial"/>
@@ -27391,7 +27391,7 @@
               <w:spacing w:after="10" w:before="0"/>
               <w:ind w:left="120"/>
             </w:pPr>
-            <w:hyperlink w:history="1" r:id="rIdzr7jvz-kllznqkmyfo0rp">
+            <w:hyperlink w:history="1" r:id="rIdqdwxuthva20ic9qatkqpb">
               <w:r>
                 <w:rPr>
                   <w:rFonts w:ascii="Arial" w:cs="Arial" w:eastAsia="Arial" w:hAnsi="Arial"/>
@@ -27436,7 +27436,7 @@
             <w:pPr>
               <w:spacing w:after="20" w:before="0"/>
             </w:pPr>
-            <w:hyperlink w:history="1" r:id="rIdvmqrkd6_gyzrag1w2vi46">
+            <w:hyperlink w:history="1" r:id="rIdkz2_heij6qmz-ozozqtor">
               <w:r>
                 <w:rPr>
                   <w:rFonts w:ascii="Arial" w:cs="Arial" w:eastAsia="Arial" w:hAnsi="Arial"/>
@@ -27469,7 +27469,7 @@
               <w:spacing w:after="10" w:before="0"/>
               <w:ind w:left="120"/>
             </w:pPr>
-            <w:hyperlink w:history="1" r:id="rIdsyorlnaqyaq-o5e9auv4j">
+            <w:hyperlink w:history="1" r:id="rIdqobl_4la5sghsptyjkhth">
               <w:r>
                 <w:rPr>
                   <w:rFonts w:ascii="Arial" w:cs="Arial" w:eastAsia="Arial" w:hAnsi="Arial"/>
@@ -27664,7 +27664,7 @@
             <w:pPr>
               <w:spacing w:after="20" w:before="0"/>
             </w:pPr>
-            <w:hyperlink w:history="1" r:id="rIdz2wqkzihpkzcgmsrpv-eg">
+            <w:hyperlink w:history="1" r:id="rId_lk5npqnij_f2aqpbphye">
               <w:r>
                 <w:rPr>
                   <w:rFonts w:ascii="Arial" w:cs="Arial" w:eastAsia="Arial" w:hAnsi="Arial"/>
@@ -27697,7 +27697,7 @@
               <w:spacing w:after="10" w:before="0"/>
               <w:ind w:left="120"/>
             </w:pPr>
-            <w:hyperlink w:history="1" r:id="rIdh6h92li9svvqzzq-v4vta">
+            <w:hyperlink w:history="1" r:id="rIdbbhxt4ogidfq3won_-li8">
               <w:r>
                 <w:rPr>
                   <w:rFonts w:ascii="Arial" w:cs="Arial" w:eastAsia="Arial" w:hAnsi="Arial"/>
@@ -27742,7 +27742,7 @@
             <w:pPr>
               <w:spacing w:after="20" w:before="0"/>
             </w:pPr>
-            <w:hyperlink w:history="1" r:id="rIdwr5eh9-wenfengjzjvly_">
+            <w:hyperlink w:history="1" r:id="rIdiwaw6mpdxacjhlmulnnae">
               <w:r>
                 <w:rPr>
                   <w:rFonts w:ascii="Arial" w:cs="Arial" w:eastAsia="Arial" w:hAnsi="Arial"/>
@@ -27775,7 +27775,7 @@
               <w:spacing w:after="10" w:before="0"/>
               <w:ind w:left="120"/>
             </w:pPr>
-            <w:hyperlink w:history="1" r:id="rId1bcziv7bxl94-vauzuwx4">
+            <w:hyperlink w:history="1" r:id="rIdjyt9ng2u0w7yz7tsfqn6k">
               <w:r>
                 <w:rPr>
                   <w:rFonts w:ascii="Arial" w:cs="Arial" w:eastAsia="Arial" w:hAnsi="Arial"/>
@@ -27970,7 +27970,7 @@
             <w:pPr>
               <w:spacing w:after="20" w:before="0"/>
             </w:pPr>
-            <w:hyperlink w:history="1" r:id="rIdvtuhji6db1iaj1uszquvr">
+            <w:hyperlink w:history="1" r:id="rIdtrfi1dihyqmticogsiz9h">
               <w:r>
                 <w:rPr>
                   <w:rFonts w:ascii="Arial" w:cs="Arial" w:eastAsia="Arial" w:hAnsi="Arial"/>
@@ -28003,7 +28003,7 @@
               <w:spacing w:after="10" w:before="0"/>
               <w:ind w:left="120"/>
             </w:pPr>
-            <w:hyperlink w:history="1" r:id="rIds1fiwltfbybz4kmqcozq5">
+            <w:hyperlink w:history="1" r:id="rId8spi9rpa6gcsm8qhahhhp">
               <w:r>
                 <w:rPr>
                   <w:rFonts w:ascii="Arial" w:cs="Arial" w:eastAsia="Arial" w:hAnsi="Arial"/>
@@ -28048,7 +28048,7 @@
             <w:pPr>
               <w:spacing w:after="20" w:before="0"/>
             </w:pPr>
-            <w:hyperlink w:history="1" r:id="rIdieagrqwi7w9wxnzrfi4oj">
+            <w:hyperlink w:history="1" r:id="rIdaovcdjai6sphsbqevffpf">
               <w:r>
                 <w:rPr>
                   <w:rFonts w:ascii="Arial" w:cs="Arial" w:eastAsia="Arial" w:hAnsi="Arial"/>
@@ -28081,7 +28081,7 @@
               <w:spacing w:after="10" w:before="0"/>
               <w:ind w:left="120"/>
             </w:pPr>
-            <w:hyperlink w:history="1" r:id="rIdry_ehgpimap_snwwo5tqi">
+            <w:hyperlink w:history="1" r:id="rIdxhjo3su5hghj1-zpe1tqq">
               <w:r>
                 <w:rPr>
                   <w:rFonts w:ascii="Arial" w:cs="Arial" w:eastAsia="Arial" w:hAnsi="Arial"/>
@@ -29568,7 +29568,7 @@
             <w:pPr>
               <w:spacing w:after="20" w:before="0"/>
             </w:pPr>
-            <w:hyperlink w:history="1" r:id="rId4hbzehskx1ubhj6jdbx5d">
+            <w:hyperlink w:history="1" r:id="rIdam1g9ne5jsaqvvx4hvjeb">
               <w:r>
                 <w:rPr>
                   <w:rFonts w:ascii="Arial" w:cs="Arial" w:eastAsia="Arial" w:hAnsi="Arial"/>
@@ -29601,7 +29601,7 @@
               <w:spacing w:after="10" w:before="0"/>
               <w:ind w:left="120"/>
             </w:pPr>
-            <w:hyperlink w:history="1" r:id="rIdripmkt4cvxdmyhvfids7k">
+            <w:hyperlink w:history="1" r:id="rIdinbqh-rusxo8ssh9vbpcd">
               <w:r>
                 <w:rPr>
                   <w:rFonts w:ascii="Arial" w:cs="Arial" w:eastAsia="Arial" w:hAnsi="Arial"/>
@@ -29646,7 +29646,7 @@
             <w:pPr>
               <w:spacing w:after="20" w:before="0"/>
             </w:pPr>
-            <w:hyperlink w:history="1" r:id="rIdsvsdf6ftnr6wa1q7g0ff5">
+            <w:hyperlink w:history="1" r:id="rIdjnstyhaybmw62zlvg3xqz">
               <w:r>
                 <w:rPr>
                   <w:rFonts w:ascii="Arial" w:cs="Arial" w:eastAsia="Arial" w:hAnsi="Arial"/>
@@ -29679,7 +29679,7 @@
               <w:spacing w:after="10" w:before="0"/>
               <w:ind w:left="120"/>
             </w:pPr>
-            <w:hyperlink w:history="1" r:id="rIds7owqrvpwg8d3iwfmu87h">
+            <w:hyperlink w:history="1" r:id="rIduhywlbfuonw6dawf3pjiy">
               <w:r>
                 <w:rPr>
                   <w:rFonts w:ascii="Arial" w:cs="Arial" w:eastAsia="Arial" w:hAnsi="Arial"/>
@@ -29874,7 +29874,7 @@
             <w:pPr>
               <w:spacing w:after="20" w:before="0"/>
             </w:pPr>
-            <w:hyperlink w:history="1" r:id="rIdpkyzzhzsk-c8vav4qxeky">
+            <w:hyperlink w:history="1" r:id="rIdwoocqlktankgse_wmpog9">
               <w:r>
                 <w:rPr>
                   <w:rFonts w:ascii="Arial" w:cs="Arial" w:eastAsia="Arial" w:hAnsi="Arial"/>
@@ -29907,7 +29907,7 @@
               <w:spacing w:after="10" w:before="0"/>
               <w:ind w:left="120"/>
             </w:pPr>
-            <w:hyperlink w:history="1" r:id="rIdt4gcnedrd_axscqttf4gd">
+            <w:hyperlink w:history="1" r:id="rId7sy-yw0cbh9-ctaxhevic">
               <w:r>
                 <w:rPr>
                   <w:rFonts w:ascii="Arial" w:cs="Arial" w:eastAsia="Arial" w:hAnsi="Arial"/>
@@ -29952,7 +29952,7 @@
             <w:pPr>
               <w:spacing w:after="20" w:before="0"/>
             </w:pPr>
-            <w:hyperlink w:history="1" r:id="rId_hrbm08dz6hqgvuybagmw">
+            <w:hyperlink w:history="1" r:id="rIdef_f-nsksvpbea61aqc1u">
               <w:r>
                 <w:rPr>
                   <w:rFonts w:ascii="Arial" w:cs="Arial" w:eastAsia="Arial" w:hAnsi="Arial"/>
@@ -29985,7 +29985,7 @@
               <w:spacing w:after="10" w:before="0"/>
               <w:ind w:left="120"/>
             </w:pPr>
-            <w:hyperlink w:history="1" r:id="rIdyoxruiac7loeosij2arxz">
+            <w:hyperlink w:history="1" r:id="rIdnd7-wgf7pt4utjbbe8jid">
               <w:r>
                 <w:rPr>
                   <w:rFonts w:ascii="Arial" w:cs="Arial" w:eastAsia="Arial" w:hAnsi="Arial"/>
@@ -30180,7 +30180,7 @@
             <w:pPr>
               <w:spacing w:after="20" w:before="0"/>
             </w:pPr>
-            <w:hyperlink w:history="1" r:id="rIdvwcth2plabsptcvba-omm">
+            <w:hyperlink w:history="1" r:id="rIdjotiwxcx-dlsa_rdg1pc8">
               <w:r>
                 <w:rPr>
                   <w:rFonts w:ascii="Arial" w:cs="Arial" w:eastAsia="Arial" w:hAnsi="Arial"/>
@@ -30213,7 +30213,7 @@
               <w:spacing w:after="10" w:before="0"/>
               <w:ind w:left="120"/>
             </w:pPr>
-            <w:hyperlink w:history="1" r:id="rIdrrnh9nkly7ctaivlzkinw">
+            <w:hyperlink w:history="1" r:id="rId9t2galgqmwdcmw8orns52">
               <w:r>
                 <w:rPr>
                   <w:rFonts w:ascii="Arial" w:cs="Arial" w:eastAsia="Arial" w:hAnsi="Arial"/>
@@ -30258,7 +30258,7 @@
             <w:pPr>
               <w:spacing w:after="20" w:before="0"/>
             </w:pPr>
-            <w:hyperlink w:history="1" r:id="rIdw1r8ml3kojjmy1azz03wx">
+            <w:hyperlink w:history="1" r:id="rIdphq3uhd3pyrkmkf-uj7sf">
               <w:r>
                 <w:rPr>
                   <w:rFonts w:ascii="Arial" w:cs="Arial" w:eastAsia="Arial" w:hAnsi="Arial"/>
@@ -30291,7 +30291,7 @@
               <w:spacing w:after="10" w:before="0"/>
               <w:ind w:left="120"/>
             </w:pPr>
-            <w:hyperlink w:history="1" r:id="rIdd_6fzylrycbsnnpytszgp">
+            <w:hyperlink w:history="1" r:id="rIdircuxcmladmntaywjcdy0">
               <w:r>
                 <w:rPr>
                   <w:rFonts w:ascii="Arial" w:cs="Arial" w:eastAsia="Arial" w:hAnsi="Arial"/>
@@ -30486,7 +30486,7 @@
             <w:pPr>
               <w:spacing w:after="20" w:before="0"/>
             </w:pPr>
-            <w:hyperlink w:history="1" r:id="rIdf6iiwnlm35etmjju3zfjz">
+            <w:hyperlink w:history="1" r:id="rId6hqf93tcuq9sq1xzr74bi">
               <w:r>
                 <w:rPr>
                   <w:rFonts w:ascii="Arial" w:cs="Arial" w:eastAsia="Arial" w:hAnsi="Arial"/>
@@ -30519,7 +30519,7 @@
               <w:spacing w:after="10" w:before="0"/>
               <w:ind w:left="120"/>
             </w:pPr>
-            <w:hyperlink w:history="1" r:id="rIdgzyggw1g1kptxw6lbz09j">
+            <w:hyperlink w:history="1" r:id="rIdx8uvae-7v_k6imdinl2w9">
               <w:r>
                 <w:rPr>
                   <w:rFonts w:ascii="Arial" w:cs="Arial" w:eastAsia="Arial" w:hAnsi="Arial"/>
@@ -30564,7 +30564,7 @@
             <w:pPr>
               <w:spacing w:after="20" w:before="0"/>
             </w:pPr>
-            <w:hyperlink w:history="1" r:id="rId2ll2r7hnql89ammzbcdzi">
+            <w:hyperlink w:history="1" r:id="rIdshzdrmcytaomvkgr8wkfg">
               <w:r>
                 <w:rPr>
                   <w:rFonts w:ascii="Arial" w:cs="Arial" w:eastAsia="Arial" w:hAnsi="Arial"/>
@@ -30597,7 +30597,7 @@
               <w:spacing w:after="10" w:before="0"/>
               <w:ind w:left="120"/>
             </w:pPr>
-            <w:hyperlink w:history="1" r:id="rIdomjgps2vgq8jwoawfxnmn">
+            <w:hyperlink w:history="1" r:id="rId2ri3mgw7ol1nfqlir_krf">
               <w:r>
                 <w:rPr>
                   <w:rFonts w:ascii="Arial" w:cs="Arial" w:eastAsia="Arial" w:hAnsi="Arial"/>
@@ -30792,7 +30792,7 @@
             <w:pPr>
               <w:spacing w:after="20" w:before="0"/>
             </w:pPr>
-            <w:hyperlink w:history="1" r:id="rIdd_-bkswbmfrr_7kftiyo6">
+            <w:hyperlink w:history="1" r:id="rIdnxjnqi9f0fep84xkosxsb">
               <w:r>
                 <w:rPr>
                   <w:rFonts w:ascii="Arial" w:cs="Arial" w:eastAsia="Arial" w:hAnsi="Arial"/>
@@ -30825,7 +30825,7 @@
               <w:spacing w:after="10" w:before="0"/>
               <w:ind w:left="120"/>
             </w:pPr>
-            <w:hyperlink w:history="1" r:id="rIdq12jbp5ymsddq7-mvwwch">
+            <w:hyperlink w:history="1" r:id="rIdc4idou09qvik-jdfx43qm">
               <w:r>
                 <w:rPr>
                   <w:rFonts w:ascii="Arial" w:cs="Arial" w:eastAsia="Arial" w:hAnsi="Arial"/>
@@ -30870,7 +30870,7 @@
             <w:pPr>
               <w:spacing w:after="20" w:before="0"/>
             </w:pPr>
-            <w:hyperlink w:history="1" r:id="rIdb5xzuayxghete2yirwk9e">
+            <w:hyperlink w:history="1" r:id="rIdmwpsrd9cex0tjuuj5wjcd">
               <w:r>
                 <w:rPr>
                   <w:rFonts w:ascii="Arial" w:cs="Arial" w:eastAsia="Arial" w:hAnsi="Arial"/>
@@ -30903,7 +30903,7 @@
               <w:spacing w:after="10" w:before="0"/>
               <w:ind w:left="120"/>
             </w:pPr>
-            <w:hyperlink w:history="1" r:id="rIdjjy5sulvt4hoe5kknsu4u">
+            <w:hyperlink w:history="1" r:id="rIdrhu0mgaqzdb_vjdp6rxqd">
               <w:r>
                 <w:rPr>
                   <w:rFonts w:ascii="Arial" w:cs="Arial" w:eastAsia="Arial" w:hAnsi="Arial"/>
@@ -32485,7 +32485,7 @@
             <w:pPr>
               <w:spacing w:after="20" w:before="0"/>
             </w:pPr>
-            <w:hyperlink w:history="1" r:id="rId9biggutlvkzytqizjy8hb">
+            <w:hyperlink w:history="1" r:id="rIda-fphggswkf-q0veonc_-">
               <w:r>
                 <w:rPr>
                   <w:rFonts w:ascii="Arial" w:cs="Arial" w:eastAsia="Arial" w:hAnsi="Arial"/>
@@ -32518,7 +32518,7 @@
               <w:spacing w:after="10" w:before="0"/>
               <w:ind w:left="120"/>
             </w:pPr>
-            <w:hyperlink w:history="1" r:id="rIdwwidlrr7oqur1p-cwht2x">
+            <w:hyperlink w:history="1" r:id="rIdnhbgqowlh16pqgdyncycj">
               <w:r>
                 <w:rPr>
                   <w:rFonts w:ascii="Arial" w:cs="Arial" w:eastAsia="Arial" w:hAnsi="Arial"/>
@@ -32563,7 +32563,7 @@
             <w:pPr>
               <w:spacing w:after="20" w:before="0"/>
             </w:pPr>
-            <w:hyperlink w:history="1" r:id="rIdbnsgbxyszjydhu-vi4tu3">
+            <w:hyperlink w:history="1" r:id="rIdyunhlxlroxttlllrrf16o">
               <w:r>
                 <w:rPr>
                   <w:rFonts w:ascii="Arial" w:cs="Arial" w:eastAsia="Arial" w:hAnsi="Arial"/>
@@ -32596,7 +32596,7 @@
               <w:spacing w:after="10" w:before="0"/>
               <w:ind w:left="120"/>
             </w:pPr>
-            <w:hyperlink w:history="1" r:id="rIdvwdxzxnacikg-n583hlgt">
+            <w:hyperlink w:history="1" r:id="rIdge4mwjnpqokmgbtpa8_ts">
               <w:r>
                 <w:rPr>
                   <w:rFonts w:ascii="Arial" w:cs="Arial" w:eastAsia="Arial" w:hAnsi="Arial"/>
@@ -32791,7 +32791,7 @@
             <w:pPr>
               <w:spacing w:after="20" w:before="0"/>
             </w:pPr>
-            <w:hyperlink w:history="1" r:id="rIdihgsclqtvisonutxygwdc">
+            <w:hyperlink w:history="1" r:id="rIdsnyh9bejrr-n63rt8hixf">
               <w:r>
                 <w:rPr>
                   <w:rFonts w:ascii="Arial" w:cs="Arial" w:eastAsia="Arial" w:hAnsi="Arial"/>
@@ -32824,7 +32824,7 @@
               <w:spacing w:after="10" w:before="0"/>
               <w:ind w:left="120"/>
             </w:pPr>
-            <w:hyperlink w:history="1" r:id="rIdg5cktgrw_oujqe31lqrmw">
+            <w:hyperlink w:history="1" r:id="rIdodikf3gtdmldmwurcdbgq">
               <w:r>
                 <w:rPr>
                   <w:rFonts w:ascii="Arial" w:cs="Arial" w:eastAsia="Arial" w:hAnsi="Arial"/>
@@ -32869,7 +32869,7 @@
             <w:pPr>
               <w:spacing w:after="20" w:before="0"/>
             </w:pPr>
-            <w:hyperlink w:history="1" r:id="rId7ogsku9qntrg877busnpa">
+            <w:hyperlink w:history="1" r:id="rIddsskqthhodn7-0c84au-n">
               <w:r>
                 <w:rPr>
                   <w:rFonts w:ascii="Arial" w:cs="Arial" w:eastAsia="Arial" w:hAnsi="Arial"/>
@@ -32902,7 +32902,7 @@
               <w:spacing w:after="10" w:before="0"/>
               <w:ind w:left="120"/>
             </w:pPr>
-            <w:hyperlink w:history="1" r:id="rIdtyiqyzgtdprjbjwqeewoo">
+            <w:hyperlink w:history="1" r:id="rIdmtp39-r2af118u7m4uz2s">
               <w:r>
                 <w:rPr>
                   <w:rFonts w:ascii="Arial" w:cs="Arial" w:eastAsia="Arial" w:hAnsi="Arial"/>
@@ -33097,7 +33097,7 @@
             <w:pPr>
               <w:spacing w:after="20" w:before="0"/>
             </w:pPr>
-            <w:hyperlink w:history="1" r:id="rId2kpskxqgcmgkz00yrbafd">
+            <w:hyperlink w:history="1" r:id="rIdqjsed4ogjeez61xpenusi">
               <w:r>
                 <w:rPr>
                   <w:rFonts w:ascii="Arial" w:cs="Arial" w:eastAsia="Arial" w:hAnsi="Arial"/>
@@ -33130,7 +33130,7 @@
               <w:spacing w:after="10" w:before="0"/>
               <w:ind w:left="120"/>
             </w:pPr>
-            <w:hyperlink w:history="1" r:id="rId8dx2sbbddrugoc7ftvyi2">
+            <w:hyperlink w:history="1" r:id="rIdh7yumkqxejb3hjcxd2cci">
               <w:r>
                 <w:rPr>
                   <w:rFonts w:ascii="Arial" w:cs="Arial" w:eastAsia="Arial" w:hAnsi="Arial"/>
@@ -33175,7 +33175,7 @@
             <w:pPr>
               <w:spacing w:after="20" w:before="0"/>
             </w:pPr>
-            <w:hyperlink w:history="1" r:id="rIdvmpf2gkp0yhgoliuyfpmy">
+            <w:hyperlink w:history="1" r:id="rIdstf3ehp8cwkrw6ghwwyec">
               <w:r>
                 <w:rPr>
                   <w:rFonts w:ascii="Arial" w:cs="Arial" w:eastAsia="Arial" w:hAnsi="Arial"/>
@@ -33208,7 +33208,7 @@
               <w:spacing w:after="10" w:before="0"/>
               <w:ind w:left="120"/>
             </w:pPr>
-            <w:hyperlink w:history="1" r:id="rIdsqi_dl20td-vnuinevw0d">
+            <w:hyperlink w:history="1" r:id="rIdukcn_2spbkuaufbszzyze">
               <w:r>
                 <w:rPr>
                   <w:rFonts w:ascii="Arial" w:cs="Arial" w:eastAsia="Arial" w:hAnsi="Arial"/>
@@ -33403,7 +33403,7 @@
             <w:pPr>
               <w:spacing w:after="20" w:before="0"/>
             </w:pPr>
-            <w:hyperlink w:history="1" r:id="rIdapvnutp-bevorybs1auj3">
+            <w:hyperlink w:history="1" r:id="rIdhabor6fcmt-dqznnp9ble">
               <w:r>
                 <w:rPr>
                   <w:rFonts w:ascii="Arial" w:cs="Arial" w:eastAsia="Arial" w:hAnsi="Arial"/>
@@ -33436,7 +33436,7 @@
               <w:spacing w:after="10" w:before="0"/>
               <w:ind w:left="120"/>
             </w:pPr>
-            <w:hyperlink w:history="1" r:id="rIdvn4vpsd4zr956uamwzoz-">
+            <w:hyperlink w:history="1" r:id="rIdjtlqzvadciyc8k_wjtelr">
               <w:r>
                 <w:rPr>
                   <w:rFonts w:ascii="Arial" w:cs="Arial" w:eastAsia="Arial" w:hAnsi="Arial"/>
@@ -33481,7 +33481,7 @@
             <w:pPr>
               <w:spacing w:after="20" w:before="0"/>
             </w:pPr>
-            <w:hyperlink w:history="1" r:id="rIdj-fkkbueobxeveajuqjgy">
+            <w:hyperlink w:history="1" r:id="rId_jd74_eiyesvlnuncadrm">
               <w:r>
                 <w:rPr>
                   <w:rFonts w:ascii="Arial" w:cs="Arial" w:eastAsia="Arial" w:hAnsi="Arial"/>
@@ -33514,7 +33514,7 @@
               <w:spacing w:after="10" w:before="0"/>
               <w:ind w:left="120"/>
             </w:pPr>
-            <w:hyperlink w:history="1" r:id="rIdj71xpjb0ovqzcglyykpg0">
+            <w:hyperlink w:history="1" r:id="rIdqr9enc2odjqrfoyv4nuht">
               <w:r>
                 <w:rPr>
                   <w:rFonts w:ascii="Arial" w:cs="Arial" w:eastAsia="Arial" w:hAnsi="Arial"/>
@@ -33709,7 +33709,7 @@
             <w:pPr>
               <w:spacing w:after="20" w:before="0"/>
             </w:pPr>
-            <w:hyperlink w:history="1" r:id="rId9pc-4fdhdjgnbszqvucuh">
+            <w:hyperlink w:history="1" r:id="rIdwxbropvxapnqblwth1tsl">
               <w:r>
                 <w:rPr>
                   <w:rFonts w:ascii="Arial" w:cs="Arial" w:eastAsia="Arial" w:hAnsi="Arial"/>
@@ -33742,7 +33742,7 @@
               <w:spacing w:after="10" w:before="0"/>
               <w:ind w:left="120"/>
             </w:pPr>
-            <w:hyperlink w:history="1" r:id="rIdvf5nmmlvtw2w61lt7ef13">
+            <w:hyperlink w:history="1" r:id="rIdvgjqukfjdf5nw8suqqywf">
               <w:r>
                 <w:rPr>
                   <w:rFonts w:ascii="Arial" w:cs="Arial" w:eastAsia="Arial" w:hAnsi="Arial"/>
@@ -33787,7 +33787,7 @@
             <w:pPr>
               <w:spacing w:after="20" w:before="0"/>
             </w:pPr>
-            <w:hyperlink w:history="1" r:id="rIdboldmbfeufweka980fpje">
+            <w:hyperlink w:history="1" r:id="rIdtjrpo-1a9sqz9uaqwstxf">
               <w:r>
                 <w:rPr>
                   <w:rFonts w:ascii="Arial" w:cs="Arial" w:eastAsia="Arial" w:hAnsi="Arial"/>
@@ -33820,7 +33820,7 @@
               <w:spacing w:after="10" w:before="0"/>
               <w:ind w:left="120"/>
             </w:pPr>
-            <w:hyperlink w:history="1" r:id="rIdurfwzxcrv1gioe-spabr8">
+            <w:hyperlink w:history="1" r:id="rIdlmxnbcemrpwrb9xf9bjqb">
               <w:r>
                 <w:rPr>
                   <w:rFonts w:ascii="Arial" w:cs="Arial" w:eastAsia="Arial" w:hAnsi="Arial"/>
@@ -35307,7 +35307,7 @@
             <w:pPr>
               <w:spacing w:after="20" w:before="0"/>
             </w:pPr>
-            <w:hyperlink w:history="1" r:id="rIdlrcq4lwuloh2mqzoux002">
+            <w:hyperlink w:history="1" r:id="rIdy2shiy4iiwmg7ohp3exvt">
               <w:r>
                 <w:rPr>
                   <w:rFonts w:ascii="Arial" w:cs="Arial" w:eastAsia="Arial" w:hAnsi="Arial"/>
@@ -35340,7 +35340,7 @@
               <w:spacing w:after="10" w:before="0"/>
               <w:ind w:left="120"/>
             </w:pPr>
-            <w:hyperlink w:history="1" r:id="rIdugtqyhfnpv_bulv5ox6tx">
+            <w:hyperlink w:history="1" r:id="rIducaq9vw7f6hdd-wid_m3v">
               <w:r>
                 <w:rPr>
                   <w:rFonts w:ascii="Arial" w:cs="Arial" w:eastAsia="Arial" w:hAnsi="Arial"/>
@@ -35385,7 +35385,7 @@
             <w:pPr>
               <w:spacing w:after="20" w:before="0"/>
             </w:pPr>
-            <w:hyperlink w:history="1" r:id="rIdeg54rfexrbwvtxivvqgp7">
+            <w:hyperlink w:history="1" r:id="rIdvoiux7qfkui1udbaympjo">
               <w:r>
                 <w:rPr>
                   <w:rFonts w:ascii="Arial" w:cs="Arial" w:eastAsia="Arial" w:hAnsi="Arial"/>
@@ -35418,7 +35418,7 @@
               <w:spacing w:after="10" w:before="0"/>
               <w:ind w:left="120"/>
             </w:pPr>
-            <w:hyperlink w:history="1" r:id="rIdtqli4asyzvxc2wx2ycgza">
+            <w:hyperlink w:history="1" r:id="rId77x7v0s4l6nozrymqakfw">
               <w:r>
                 <w:rPr>
                   <w:rFonts w:ascii="Arial" w:cs="Arial" w:eastAsia="Arial" w:hAnsi="Arial"/>
@@ -35765,7 +35765,7 @@
             <w:pPr>
               <w:spacing w:after="20" w:before="0"/>
             </w:pPr>
-            <w:hyperlink w:history="1" r:id="rId9cd-d8qlxouo9mgkfnroj">
+            <w:hyperlink w:history="1" r:id="rIdzn1rgabirxtjyybge9orq">
               <w:r>
                 <w:rPr>
                   <w:rFonts w:ascii="Arial" w:cs="Arial" w:eastAsia="Arial" w:hAnsi="Arial"/>
@@ -35798,7 +35798,7 @@
               <w:spacing w:after="10" w:before="0"/>
               <w:ind w:left="120"/>
             </w:pPr>
-            <w:hyperlink w:history="1" r:id="rIdcepyma0x-3-vi8hbesusl">
+            <w:hyperlink w:history="1" r:id="rIdf6k0hmwlu63ucahedfdbj">
               <w:r>
                 <w:rPr>
                   <w:rFonts w:ascii="Arial" w:cs="Arial" w:eastAsia="Arial" w:hAnsi="Arial"/>
@@ -35843,7 +35843,7 @@
             <w:pPr>
               <w:spacing w:after="20" w:before="0"/>
             </w:pPr>
-            <w:hyperlink w:history="1" r:id="rIdib87ku8urhfwmumbnmgyn">
+            <w:hyperlink w:history="1" r:id="rIdcuovliebq-x8obhqhxuba">
               <w:r>
                 <w:rPr>
                   <w:rFonts w:ascii="Arial" w:cs="Arial" w:eastAsia="Arial" w:hAnsi="Arial"/>
@@ -35876,7 +35876,7 @@
               <w:spacing w:after="10" w:before="0"/>
               <w:ind w:left="120"/>
             </w:pPr>
-            <w:hyperlink w:history="1" r:id="rIdrqdjqm82rn3vveq3-017c">
+            <w:hyperlink w:history="1" r:id="rIdb0ltu9px7duqs5vi0jidg">
               <w:r>
                 <w:rPr>
                   <w:rFonts w:ascii="Arial" w:cs="Arial" w:eastAsia="Arial" w:hAnsi="Arial"/>
@@ -36375,7 +36375,7 @@
             <w:pPr>
               <w:spacing w:after="20" w:before="0"/>
             </w:pPr>
-            <w:hyperlink w:history="1" r:id="rIdui3az0-t1bklcg9lb8qi4">
+            <w:hyperlink w:history="1" r:id="rId-7xqrymclzp9spdj9smhb">
               <w:r>
                 <w:rPr>
                   <w:rFonts w:ascii="Arial" w:cs="Arial" w:eastAsia="Arial" w:hAnsi="Arial"/>
@@ -36408,7 +36408,7 @@
               <w:spacing w:after="10" w:before="0"/>
               <w:ind w:left="120"/>
             </w:pPr>
-            <w:hyperlink w:history="1" r:id="rIdyros6lkk966vzdw8dz8h1">
+            <w:hyperlink w:history="1" r:id="rIdi3hug7eqbsf1gfsvwhm7m">
               <w:r>
                 <w:rPr>
                   <w:rFonts w:ascii="Arial" w:cs="Arial" w:eastAsia="Arial" w:hAnsi="Arial"/>
@@ -36453,7 +36453,7 @@
             <w:pPr>
               <w:spacing w:after="20" w:before="0"/>
             </w:pPr>
-            <w:hyperlink w:history="1" r:id="rIddfqv1is1tzx-fsfsxp94s">
+            <w:hyperlink w:history="1" r:id="rIdwvhugk-7nckrv763b648n">
               <w:r>
                 <w:rPr>
                   <w:rFonts w:ascii="Arial" w:cs="Arial" w:eastAsia="Arial" w:hAnsi="Arial"/>
@@ -36486,7 +36486,7 @@
               <w:spacing w:after="10" w:before="0"/>
               <w:ind w:left="120"/>
             </w:pPr>
-            <w:hyperlink w:history="1" r:id="rIdjsdtpndhcyca0flpvwdux">
+            <w:hyperlink w:history="1" r:id="rIdc-nhr37vqn8e8p8onwivm">
               <w:r>
                 <w:rPr>
                   <w:rFonts w:ascii="Arial" w:cs="Arial" w:eastAsia="Arial" w:hAnsi="Arial"/>
@@ -36890,7 +36890,7 @@
             <w:pPr>
               <w:spacing w:after="20" w:before="0"/>
             </w:pPr>
-            <w:hyperlink w:history="1" r:id="rIdoliimxzo_vb9pihnmkqrv">
+            <w:hyperlink w:history="1" r:id="rIdctvcoymdivfjnd5c6wkfi">
               <w:r>
                 <w:rPr>
                   <w:rFonts w:ascii="Arial" w:cs="Arial" w:eastAsia="Arial" w:hAnsi="Arial"/>
@@ -36923,7 +36923,7 @@
               <w:spacing w:after="10" w:before="0"/>
               <w:ind w:left="120"/>
             </w:pPr>
-            <w:hyperlink w:history="1" r:id="rIdra_tqfgbrpuhhzaods_zu">
+            <w:hyperlink w:history="1" r:id="rId8dywcrx9c2khlgnjo8ya_">
               <w:r>
                 <w:rPr>
                   <w:rFonts w:ascii="Arial" w:cs="Arial" w:eastAsia="Arial" w:hAnsi="Arial"/>
@@ -36968,7 +36968,7 @@
             <w:pPr>
               <w:spacing w:after="20" w:before="0"/>
             </w:pPr>
-            <w:hyperlink w:history="1" r:id="rId9wfvs2bun2fjnnezr2j7d">
+            <w:hyperlink w:history="1" r:id="rIdynrgizhpwsp6qci_qf-aa">
               <w:r>
                 <w:rPr>
                   <w:rFonts w:ascii="Arial" w:cs="Arial" w:eastAsia="Arial" w:hAnsi="Arial"/>
@@ -37001,7 +37001,7 @@
               <w:spacing w:after="10" w:before="0"/>
               <w:ind w:left="120"/>
             </w:pPr>
-            <w:hyperlink w:history="1" r:id="rId2tf7wybetybkmo8npfc7q">
+            <w:hyperlink w:history="1" r:id="rIdpvt4dhb-jwdltlzw5zzuy">
               <w:r>
                 <w:rPr>
                   <w:rFonts w:ascii="Arial" w:cs="Arial" w:eastAsia="Arial" w:hAnsi="Arial"/>
@@ -37443,7 +37443,7 @@
             <w:pPr>
               <w:spacing w:after="20" w:before="0"/>
             </w:pPr>
-            <w:hyperlink w:history="1" r:id="rIdakhiq7ehgchwkclmmfesr">
+            <w:hyperlink w:history="1" r:id="rIdbmqx-jhapqmfjn3_seiyc">
               <w:r>
                 <w:rPr>
                   <w:rFonts w:ascii="Arial" w:cs="Arial" w:eastAsia="Arial" w:hAnsi="Arial"/>
@@ -37476,7 +37476,7 @@
               <w:spacing w:after="10" w:before="0"/>
               <w:ind w:left="120"/>
             </w:pPr>
-            <w:hyperlink w:history="1" r:id="rIdy7sqc8pba9juj2wh1mflu">
+            <w:hyperlink w:history="1" r:id="rIdjosownpitwlqo07uehkd0">
               <w:r>
                 <w:rPr>
                   <w:rFonts w:ascii="Arial" w:cs="Arial" w:eastAsia="Arial" w:hAnsi="Arial"/>
@@ -37521,7 +37521,7 @@
             <w:pPr>
               <w:spacing w:after="20" w:before="0"/>
             </w:pPr>
-            <w:hyperlink w:history="1" r:id="rId_h1ksgjnmcwbhpzpoeweu">
+            <w:hyperlink w:history="1" r:id="rIdmg_rsvr3eilpympmzfyef">
               <w:r>
                 <w:rPr>
                   <w:rFonts w:ascii="Arial" w:cs="Arial" w:eastAsia="Arial" w:hAnsi="Arial"/>
@@ -37554,7 +37554,7 @@
               <w:spacing w:after="10" w:before="0"/>
               <w:ind w:left="120"/>
             </w:pPr>
-            <w:hyperlink w:history="1" r:id="rId6v7m_ixtvzjir_yfqxlky">
+            <w:hyperlink w:history="1" r:id="rIdfgdyknyorbgpknqxvlyx6">
               <w:r>
                 <w:rPr>
                   <w:rFonts w:ascii="Arial" w:cs="Arial" w:eastAsia="Arial" w:hAnsi="Arial"/>

</xml_diff>